<commit_message>
Integrate scene and configuration graphs into final report discussion
</commit_message>
<xml_diff>
--- a/Documents/Informe_Final_Trabajo_de_Grado_AssistiveVision.docx
+++ b/Documents/Informe_Final_Trabajo_de_Grado_AssistiveVision.docx
@@ -1445,10 +1445,10 @@
           <w:szCs w:val="44"/>
         </w:rPr>
         <w:sectPr>
-          <w:footerReference w:type="first" r:id="rId51"/>
-          <w:footerReference w:type="even" r:id="rId51"/>
+          <w:footerReference w:type="first" r:id="rId53"/>
+          <w:footerReference w:type="even" r:id="rId53"/>
           <w:headerReference w:type="first" r:id="rId15"/>
-          <w:footerReference w:type="default" r:id="rId51"/>
+          <w:footerReference w:type="default" r:id="rId53"/>
           <w:type w:val="oddPage"/>
           <w:pgSz w:w="12240" w:h="15840" w:code="1"/>
           <w:pgMar w:top="426" w:right="1467" w:bottom="1440" w:left="2041" w:header="709" w:footer="709" w:gutter="0"/>
@@ -2336,9 +2336,9 @@
         <w:t>4.4 Escenario 3: rango de profundidad de detección</w:t>
         <w:tab/>
       </w:r>
-      <w:fldSimple w:instr=" PAGEREF report_1063 \h ">
+      <w:fldSimple w:instr=" PAGEREF report_1064 \h ">
         <w:r>
-          <w:t>33</w:t>
+          <w:t>34</w:t>
         </w:r>
       </w:fldSimple>
     </w:p>
@@ -2355,9 +2355,9 @@
         <w:t>4.5 Métricas complementarias de detección</w:t>
         <w:tab/>
       </w:r>
-      <w:fldSimple w:instr=" PAGEREF report_1066 \h ">
+      <w:fldSimple w:instr=" PAGEREF report_1067 \h ">
         <w:r>
-          <w:t>35</w:t>
+          <w:t>36</w:t>
         </w:r>
       </w:fldSimple>
     </w:p>
@@ -2374,9 +2374,9 @@
         <w:t>4.6 Consideraciones de validez</w:t>
         <w:tab/>
       </w:r>
-      <w:fldSimple w:instr=" PAGEREF report_1068 \h ">
+      <w:fldSimple w:instr=" PAGEREF report_1070 \h ">
         <w:r>
-          <w:t>36</w:t>
+          <w:t>38</w:t>
         </w:r>
       </w:fldSimple>
     </w:p>
@@ -2393,9 +2393,9 @@
         <w:t>5. Conclusiones</w:t>
         <w:tab/>
       </w:r>
-      <w:fldSimple w:instr=" PAGEREF report_1069 \h ">
+      <w:fldSimple w:instr=" PAGEREF report_1071 \h ">
         <w:r>
-          <w:t>39</w:t>
+          <w:t>41</w:t>
         </w:r>
       </w:fldSimple>
     </w:p>
@@ -2412,9 +2412,9 @@
         <w:t>5.1 Conclusiones</w:t>
         <w:tab/>
       </w:r>
-      <w:fldSimple w:instr=" PAGEREF report_1070 \h ">
+      <w:fldSimple w:instr=" PAGEREF report_1072 \h ">
         <w:r>
-          <w:t>39</w:t>
+          <w:t>41</w:t>
         </w:r>
       </w:fldSimple>
     </w:p>
@@ -2431,9 +2431,9 @@
         <w:t>5.2 Recomendaciones</w:t>
         <w:tab/>
       </w:r>
-      <w:fldSimple w:instr=" PAGEREF report_1071 \h ">
+      <w:fldSimple w:instr=" PAGEREF report_1073 \h ">
         <w:r>
-          <w:t>39</w:t>
+          <w:t>41</w:t>
         </w:r>
       </w:fldSimple>
     </w:p>
@@ -2450,9 +2450,9 @@
         <w:t>5.3 Trabajo futuro</w:t>
         <w:tab/>
       </w:r>
-      <w:fldSimple w:instr=" PAGEREF report_1072 \h ">
+      <w:fldSimple w:instr=" PAGEREF report_1074 \h ">
         <w:r>
-          <w:t>40</w:t>
+          <w:t>42</w:t>
         </w:r>
       </w:fldSimple>
     </w:p>
@@ -2472,9 +2472,9 @@
         <w:t>Anexo A: Scripts de evaluación de modelos</w:t>
         <w:tab/>
       </w:r>
-      <w:fldSimple w:instr=" PAGEREF report_1073 \h ">
+      <w:fldSimple w:instr=" PAGEREF report_1075 \h ">
         <w:r>
-          <w:t>42</w:t>
+          <w:t>44</w:t>
         </w:r>
       </w:fldSimple>
     </w:p>
@@ -2494,9 +2494,9 @@
         <w:t>Anexo B: Pruebas unitarias del prototipo</w:t>
         <w:tab/>
       </w:r>
-      <w:fldSimple w:instr=" PAGEREF report_1074 \h ">
+      <w:fldSimple w:instr=" PAGEREF report_1076 \h ">
         <w:r>
-          <w:t>43</w:t>
+          <w:t>45</w:t>
         </w:r>
       </w:fldSimple>
     </w:p>
@@ -2516,9 +2516,9 @@
         <w:t>Anexo C: Manuales técnico y de usuario</w:t>
         <w:tab/>
       </w:r>
-      <w:fldSimple w:instr=" PAGEREF report_1075 \h ">
+      <w:fldSimple w:instr=" PAGEREF report_1077 \h ">
         <w:r>
-          <w:t>44</w:t>
+          <w:t>46</w:t>
         </w:r>
       </w:fldSimple>
     </w:p>
@@ -2535,9 +2535,9 @@
         <w:t>Bibliografía</w:t>
         <w:tab/>
       </w:r>
-      <w:fldSimple w:instr=" PAGEREF report_1076 \h ">
+      <w:fldSimple w:instr=" PAGEREF report_1078 \h ">
         <w:r>
-          <w:t>45</w:t>
+          <w:t>47</w:t>
         </w:r>
       </w:fldSimple>
     </w:p>
@@ -2704,45 +2704,14 @@
         <w:rPr>
           <w:b w:val="0"/>
         </w:rPr>
-        <w:t>Figura 4.3. Recall por distancia estimada e intervalo bootstrap del 95 %.</w:t>
+        <w:t>Figura 4.3. Conteos visibles, correctos y falsos en los 33 grupos de captura.</w:t>
         <w:tab/>
       </w:r>
-      <w:fldSimple w:instr=" PAGEREF report_1065 \h ">
+      <w:fldSimple w:instr=" PAGEREF report_1063 \h ">
         <w:r>
-          <w:t>34</w:t>
+          <w:t>33</w:t>
         </w:r>
       </w:fldSimple>
-    </w:p>
-    <w:p>
-      <w:pPr>
-        <w:spacing w:line="360" w:lineRule="auto"/>
-        <w:rPr>
-          <w:rFonts w:cs="Arial"/>
-          <w:lang w:val="es-ES" w:eastAsia="es-ES"/>
-        </w:rPr>
-      </w:pPr>
-    </w:p>
-    <w:p>
-      <w:bookmarkStart w:id="1004" w:name="report_1004"/>
-      <w:pPr>
-        <w:pStyle w:val="Ttulospreliminares2"/>
-        <w:pageBreakBefore/>
-      </w:pPr>
-      <w:bookmarkStart w:id="20" w:name="_Toc492993328"/>
-      <w:r>
-        <w:lastRenderedPageBreak/>
-        <w:t>Lista de tablas</w:t>
-      </w:r>
-      <w:bookmarkEnd w:id="20"/>
-      <w:bookmarkEnd w:id="1004"/>
-    </w:p>
-    <w:p>
-      <w:pPr>
-        <w:pStyle w:val="TDC1"/>
-      </w:pPr>
-      <w:r>
-        <w:t>Pág.</w:t>
-      </w:r>
     </w:p>
     <w:p>
       <w:pPr>
@@ -2757,12 +2726,12 @@
         <w:rPr>
           <w:b w:val="0"/>
         </w:rPr>
-        <w:t>Tabla 2.1. Resultados de evaluación en equipo de escritorio.</w:t>
+        <w:t>Figura 4.4. Recall por distancia estimada e intervalo bootstrap del 95 %.</w:t>
         <w:tab/>
       </w:r>
-      <w:fldSimple w:instr=" PAGEREF report_1026 \h ">
+      <w:fldSimple w:instr=" PAGEREF report_1066 \h ">
         <w:r>
-          <w:t>15</w:t>
+          <w:t>35</w:t>
         </w:r>
       </w:fldSimple>
     </w:p>
@@ -2779,14 +2748,45 @@
         <w:rPr>
           <w:b w:val="0"/>
         </w:rPr>
-        <w:t>Tabla 2.2. Desglose de AP50 por clase para cada modelo.</w:t>
+        <w:t>Figura 4.5. Precisión, recall y F1 del detector y de la lista de hasta dos objetos.</w:t>
         <w:tab/>
       </w:r>
-      <w:fldSimple w:instr=" PAGEREF report_1027 \h ">
+      <w:fldSimple w:instr=" PAGEREF report_1069 \h ">
         <w:r>
-          <w:t>16</w:t>
+          <w:t>37</w:t>
         </w:r>
       </w:fldSimple>
+    </w:p>
+    <w:p>
+      <w:pPr>
+        <w:spacing w:line="360" w:lineRule="auto"/>
+        <w:rPr>
+          <w:rFonts w:cs="Arial"/>
+          <w:lang w:val="es-ES" w:eastAsia="es-ES"/>
+        </w:rPr>
+      </w:pPr>
+    </w:p>
+    <w:p>
+      <w:bookmarkStart w:id="1004" w:name="report_1004"/>
+      <w:pPr>
+        <w:pStyle w:val="Ttulospreliminares2"/>
+        <w:pageBreakBefore/>
+      </w:pPr>
+      <w:bookmarkStart w:id="20" w:name="_Toc492993328"/>
+      <w:r>
+        <w:lastRenderedPageBreak/>
+        <w:t>Lista de tablas</w:t>
+      </w:r>
+      <w:bookmarkEnd w:id="20"/>
+      <w:bookmarkEnd w:id="1004"/>
+    </w:p>
+    <w:p>
+      <w:pPr>
+        <w:pStyle w:val="TDC1"/>
+      </w:pPr>
+      <w:r>
+        <w:t>Pág.</w:t>
+      </w:r>
     </w:p>
     <w:p>
       <w:pPr>
@@ -2801,12 +2801,12 @@
         <w:rPr>
           <w:b w:val="0"/>
         </w:rPr>
-        <w:t>Tabla 2.3. Resultados de benchmark en Android utilizando CPU.</w:t>
+        <w:t>Tabla 2.1. Resultados de evaluación en equipo de escritorio.</w:t>
         <w:tab/>
       </w:r>
-      <w:fldSimple w:instr=" PAGEREF report_1028 \h ">
+      <w:fldSimple w:instr=" PAGEREF report_1026 \h ">
         <w:r>
-          <w:t>16</w:t>
+          <w:t>15</w:t>
         </w:r>
       </w:fldSimple>
     </w:p>
@@ -2823,12 +2823,12 @@
         <w:rPr>
           <w:b w:val="0"/>
         </w:rPr>
-        <w:t>Tabla 2.4. Resultados de benchmark en Android utilizando GPU Delegate.</w:t>
+        <w:t>Tabla 2.2. Desglose de AP50 por clase para cada modelo.</w:t>
         <w:tab/>
       </w:r>
-      <w:fldSimple w:instr=" PAGEREF report_1029 \h ">
+      <w:fldSimple w:instr=" PAGEREF report_1027 \h ">
         <w:r>
-          <w:t>17</w:t>
+          <w:t>16</w:t>
         </w:r>
       </w:fldSimple>
     </w:p>
@@ -2845,12 +2845,12 @@
         <w:rPr>
           <w:b w:val="0"/>
         </w:rPr>
-        <w:t>Tabla 2.5. Comparación de candidatos finales.</w:t>
+        <w:t>Tabla 2.3. Resultados de benchmark en Android utilizando CPU.</w:t>
         <w:tab/>
       </w:r>
-      <w:fldSimple w:instr=" PAGEREF report_1032 \h ">
+      <w:fldSimple w:instr=" PAGEREF report_1028 \h ">
         <w:r>
-          <w:t>19</w:t>
+          <w:t>16</w:t>
         </w:r>
       </w:fldSimple>
     </w:p>
@@ -2867,12 +2867,12 @@
         <w:rPr>
           <w:b w:val="0"/>
         </w:rPr>
-        <w:t>Tabla 3.1. Clases de objetos prioritarias anunciadas por el sistema.</w:t>
+        <w:t>Tabla 2.4. Resultados de benchmark en Android utilizando GPU Delegate.</w:t>
         <w:tab/>
       </w:r>
-      <w:fldSimple w:instr=" PAGEREF report_1040 \h ">
+      <w:fldSimple w:instr=" PAGEREF report_1029 \h ">
         <w:r>
-          <w:t>22</w:t>
+          <w:t>17</w:t>
         </w:r>
       </w:fldSimple>
     </w:p>
@@ -2889,12 +2889,12 @@
         <w:rPr>
           <w:b w:val="0"/>
         </w:rPr>
-        <w:t>Tabla 3.2. Zonas de localización espacial y descriptores asociados.</w:t>
+        <w:t>Tabla 2.5. Comparación de candidatos finales.</w:t>
         <w:tab/>
       </w:r>
-      <w:fldSimple w:instr=" PAGEREF report_1042 \h ">
+      <w:fldSimple w:instr=" PAGEREF report_1032 \h ">
         <w:r>
-          <w:t>22</w:t>
+          <w:t>19</w:t>
         </w:r>
       </w:fldSimple>
     </w:p>
@@ -2911,12 +2911,12 @@
         <w:rPr>
           <w:b w:val="0"/>
         </w:rPr>
-        <w:t>Tabla 3.3. Parámetros configurables del sistema.</w:t>
+        <w:t>Tabla 3.1. Clases de objetos prioritarias anunciadas por el sistema.</w:t>
         <w:tab/>
       </w:r>
-      <w:fldSimple w:instr=" PAGEREF report_1048 \h ">
+      <w:fldSimple w:instr=" PAGEREF report_1040 \h ">
         <w:r>
-          <w:t>24</w:t>
+          <w:t>22</w:t>
         </w:r>
       </w:fldSimple>
     </w:p>
@@ -2933,12 +2933,12 @@
         <w:rPr>
           <w:b w:val="0"/>
         </w:rPr>
-        <w:t>Tabla 4.1. Diseño y unidades de análisis.</w:t>
+        <w:t>Tabla 3.2. Zonas de localización espacial y descriptores asociados.</w:t>
         <w:tab/>
       </w:r>
-      <w:fldSimple w:instr=" PAGEREF report_1054 \h ">
+      <w:fldSimple w:instr=" PAGEREF report_1042 \h ">
         <w:r>
-          <w:t>29</w:t>
+          <w:t>22</w:t>
         </w:r>
       </w:fldSimple>
     </w:p>
@@ -2955,12 +2955,12 @@
         <w:rPr>
           <w:b w:val="0"/>
         </w:rPr>
-        <w:t>Tabla 4.2. Resultados agrupados por montaje.</w:t>
+        <w:t>Tabla 3.3. Parámetros configurables del sistema.</w:t>
         <w:tab/>
       </w:r>
-      <w:fldSimple w:instr=" PAGEREF report_1056 \h ">
+      <w:fldSimple w:instr=" PAGEREF report_1048 \h ">
         <w:r>
-          <w:t>29</w:t>
+          <w:t>24</w:t>
         </w:r>
       </w:fldSimple>
     </w:p>
@@ -2977,10 +2977,10 @@
         <w:rPr>
           <w:b w:val="0"/>
         </w:rPr>
-        <w:t>Tabla 4.3. Pruebas t pareadas por montaje.</w:t>
+        <w:t>Tabla 4.1. Diseño y unidades de análisis.</w:t>
         <w:tab/>
       </w:r>
-      <w:fldSimple w:instr=" PAGEREF report_1057 \h ">
+      <w:fldSimple w:instr=" PAGEREF report_1054 \h ">
         <w:r>
           <w:t>29</w:t>
         </w:r>
@@ -2999,12 +2999,12 @@
         <w:rPr>
           <w:b w:val="0"/>
         </w:rPr>
-        <w:t>Tabla 4.4. Resultados por configuración.</w:t>
+        <w:t>Tabla 4.2. Resultados agrupados por montaje.</w:t>
         <w:tab/>
       </w:r>
-      <w:fldSimple w:instr=" PAGEREF report_1060 \h ">
+      <w:fldSimple w:instr=" PAGEREF report_1056 \h ">
         <w:r>
-          <w:t>31</w:t>
+          <w:t>29</w:t>
         </w:r>
       </w:fldSimple>
     </w:p>
@@ -3021,12 +3021,12 @@
         <w:rPr>
           <w:b w:val="0"/>
         </w:rPr>
-        <w:t>Tabla 4.5. Comparación de conteos con Gorillapod 0,5x.</w:t>
+        <w:t>Tabla 4.3. Pruebas t pareadas por montaje.</w:t>
         <w:tab/>
       </w:r>
-      <w:fldSimple w:instr=" PAGEREF report_1061 \h ">
+      <w:fldSimple w:instr=" PAGEREF report_1057 \h ">
         <w:r>
-          <w:t>32</w:t>
+          <w:t>29</w:t>
         </w:r>
       </w:fldSimple>
     </w:p>
@@ -3043,12 +3043,12 @@
         <w:rPr>
           <w:b w:val="0"/>
         </w:rPr>
-        <w:t>Tabla 4.6. Recall por banda de distancia estimada.</w:t>
+        <w:t>Tabla 4.4. Resultados por configuración.</w:t>
         <w:tab/>
       </w:r>
-      <w:fldSimple w:instr=" PAGEREF report_1064 \h ">
+      <w:fldSimple w:instr=" PAGEREF report_1060 \h ">
         <w:r>
-          <w:t>33</w:t>
+          <w:t>31</w:t>
         </w:r>
       </w:fldSimple>
     </w:p>
@@ -3065,12 +3065,56 @@
         <w:rPr>
           <w:b w:val="0"/>
         </w:rPr>
+        <w:t>Tabla 4.5. Comparación de conteos con Gorillapod 0,5x.</w:t>
+        <w:tab/>
+      </w:r>
+      <w:fldSimple w:instr=" PAGEREF report_1061 \h ">
+        <w:r>
+          <w:t>32</w:t>
+        </w:r>
+      </w:fldSimple>
+    </w:p>
+    <w:p>
+      <w:pPr>
+        <w:pStyle w:val="TDC1"/>
+        <w:tabs>
+          <w:tab w:pos="8755" w:val="right" w:leader="dot"/>
+        </w:tabs>
+        <w:spacing w:line="240" w:lineRule="auto" w:after="80"/>
+        <w:jc w:val="left"/>
+      </w:pPr>
+      <w:r>
+        <w:rPr>
+          <w:b w:val="0"/>
+        </w:rPr>
+        <w:t>Tabla 4.6. Recall por banda de distancia estimada.</w:t>
+        <w:tab/>
+      </w:r>
+      <w:fldSimple w:instr=" PAGEREF report_1065 \h ">
+        <w:r>
+          <w:t>34</w:t>
+        </w:r>
+      </w:fldSimple>
+    </w:p>
+    <w:p>
+      <w:pPr>
+        <w:pStyle w:val="TDC1"/>
+        <w:tabs>
+          <w:tab w:pos="8755" w:val="right" w:leader="dot"/>
+        </w:tabs>
+        <w:spacing w:line="240" w:lineRule="auto" w:after="80"/>
+        <w:jc w:val="left"/>
+      </w:pPr>
+      <w:r>
+        <w:rPr>
+          <w:b w:val="0"/>
+        </w:rPr>
         <w:t>Tabla 4.7. Resultados por clase en el conjunto completo.</w:t>
         <w:tab/>
       </w:r>
-      <w:fldSimple w:instr=" PAGEREF report_1067 \h ">
+      <w:fldSimple w:instr=" PAGEREF report_1068 \h ">
         <w:r>
-          <w:t>35</w:t>
+          <w:t>36</w:t>
         </w:r>
       </w:fldSimple>
     </w:p>
@@ -3318,9 +3362,9 @@
           <w:lang w:val="es-ES"/>
         </w:rPr>
         <w:sectPr>
-          <w:footerReference w:type="first" r:id="rId52"/>
-          <w:footerReference w:type="even" r:id="rId52"/>
-          <w:footerReference w:type="default" r:id="rId52"/>
+          <w:footerReference w:type="first" r:id="rId54"/>
+          <w:footerReference w:type="even" r:id="rId54"/>
+          <w:footerReference w:type="default" r:id="rId54"/>
           <w:pgSz w:w="12240" w:h="15840" w:code="1"/>
           <w:pgMar w:top="426" w:right="1418" w:bottom="1418" w:left="2268" w:header="709" w:footer="709" w:gutter="0"/>
           <w:pgNumType w:fmt="upperRoman"/>
@@ -3577,12 +3621,12 @@
           <w:rFonts w:cs="Arial"/>
         </w:rPr>
         <w:sectPr>
-          <w:footerReference w:type="first" r:id="rId53"/>
-          <w:footerReference w:type="even" r:id="rId53"/>
+          <w:footerReference w:type="first" r:id="rId55"/>
+          <w:footerReference w:type="even" r:id="rId55"/>
           <w:headerReference w:type="even" r:id="rId16"/>
           <w:headerReference w:type="default" r:id="rId17"/>
           <w:headerReference w:type="first" r:id="rId18"/>
-          <w:footerReference w:type="default" r:id="rId53"/>
+          <w:footerReference w:type="default" r:id="rId55"/>
           <w:pgSz w:w="12240" w:h="15840" w:code="1"/>
           <w:pgMar w:top="1440" w:right="1440" w:bottom="1440" w:left="2041" w:header="709" w:footer="709" w:gutter="0"/>
           <w:pgNumType w:start="1"/>
@@ -17134,16 +17178,62 @@
         <w:jc w:val="both"/>
       </w:pPr>
       <w:r>
-        <w:t>La elección definitiva depende del objetivo del sistema: para maximizar los objetos anunciados al usuario, el Gorillapod 0,5x es el candidato provisional; para maximizar el equilibrio precisión/recall por fotograma, el arnés de pecho 1x. En ambos casos los intervalos no descartan todas las alternativas, por lo que la confirmación en escenas nuevas forma parte del plan de validación (sección 4.6).</w:t>
+        <w:t>El boxplot de la Figura 4.2 resume la distribución de aciertos, pero no permite identificar en qué grupos cambia la ventaja. La Figura 4.3 desagrega las 33 escenas y coloca, en el mismo orden, las instancias visibles, las detecciones correctas y las predicciones falsas. Cada fila representa un grupo de seis capturas sucesivas; las columnas conservan el orden cabeza 1x, cabeza 0,5x, pecho 1x, pecho 0,5x, Gorillapod 1x y Gorillapod 0,5x. Los números son conteos y cada panel usa su propia escala de color, por lo que la intensidad no debe compararse entre paneles.</w:t>
+      </w:r>
+    </w:p>
+    <w:p>
+      <w:pPr>
+        <w:keepNext/>
+        <w:spacing w:line="240" w:lineRule="auto"/>
+        <w:jc w:val="center"/>
+      </w:pPr>
+      <w:r>
+        <w:drawing>
+          <wp:inline>
+            <wp:extent cx="5166360" cy="5608220"/>
+            <wp:docPr id="50" name="Picture 50"/>
+            <wp:cNvGraphicFramePr>
+              <ns4:graphicFrameLocks noChangeAspect="1"/>
+            </wp:cNvGraphicFramePr>
+            <ns4:graphic>
+              <ns4:graphicData uri="http://schemas.openxmlformats.org/drawingml/2006/picture">
+                <ns5:pic>
+                  <ns5:nvPicPr>
+                    <ns5:cNvPr id="0" name="seleccion_escenas.png"/>
+                    <ns5:cNvPicPr/>
+                  </ns5:nvPicPr>
+                  <ns5:blipFill>
+                    <ns4:blip r:embed="rId50"/>
+                    <ns4:stretch>
+                      <ns4:fillRect/>
+                    </ns4:stretch>
+                  </ns5:blipFill>
+                  <ns5:spPr>
+                    <ns4:xfrm>
+                      <ns4:off x="0" y="0"/>
+                      <ns4:ext cx="5166360" cy="5608220"/>
+                    </ns4:xfrm>
+                    <ns4:prstGeom prst="rect"/>
+                  </ns5:spPr>
+                </ns5:pic>
+              </ns4:graphicData>
+            </ns4:graphic>
+          </wp:inline>
+        </w:drawing>
       </w:r>
     </w:p>
     <w:p>
       <w:bookmarkStart w:id="1063" w:name="report_1063"/>
       <w:pPr>
-        <w:pStyle w:val="Ttulo2"/>
-      </w:pPr>
-      <w:r>
-        <w:t>4.4 Escenario 3: rango de profundidad de detección</w:t>
+        <w:pStyle w:val="Descripcin"/>
+        <w:spacing w:line="240" w:lineRule="auto" w:after="160" w:before="160"/>
+        <w:jc w:val="center"/>
+      </w:pPr>
+      <w:r>
+        <w:rPr>
+          <w:sz w:val="20"/>
+        </w:rPr>
+        <w:t>Figura 4.3. Conteos visibles, correctos y falsos en los 33 grupos de captura.</w:t>
       </w:r>
       <w:bookmarkEnd w:id="1063"/>
     </w:p>
@@ -17153,7 +17243,7 @@
         <w:jc w:val="both"/>
       </w:pPr>
       <w:r>
-        <w:t>Para caracterizar el rango de profundidad útil del sistema se estima la distancia entre el objeto y la cámara para cada instancia anotada de las mismas 198 fotografías, sin capturas adicionales. El modelo estenopeico de la cámara entrega d ≈ f_px · H_cls / h_px, donde f_px es la distancia focal en píxeles —calculada del campo FocalLengthIn35mmFilm del EXIF (equivalente a 25 mm para el lente 1x y a 14 mm para el 0,5x; se registraron seis discrepancias de grupo de lente y una variación menor de 25 a 26 mm y se adoptó el valor del EXIF)—, h_px es la altura de la caja anotada en píxeles y H_cls es una altura de referencia fija por clase (persona 1,70 m; nevera 1,75 m; silla 0,90 m; sofá 0,85 m; inodoro 0,78 m; mesa de comedor 0,76 m; lavamanos 0,80 m; televisor 0,60 m; cama 0,60 m; computador portátil 0,25 m). Las distancias resultantes son aproximaciones, no mediciones, por lo que el análisis se reporta exclusivamente en bandas.</w:t>
+        <w:t>La comparación por fila muestra por qué el mayor total no implica ganar en todas las escenas. En el grupo 12, Gorillapod 0,5x recupera nueve objetos correctos de diez visibles, frente a siete de diez de pecho 0,5x. En el grupo 23, Gorillapod 1x recupera seis de diez y Gorillapod 0,5x tres de once. El grupo 28 concentra numerosos objetos: cabeza 0,5x contiene 42 instancias y recupera once, mientras Gorillapod 0,5x contiene 36 y recupera diez. Estos ejemplos vinculan cobertura, dificultad y conteo; además, muestran la influencia de escenas densas sobre los totales. Las filas identifican grupos de captura, no objetos físicos seguidos entre vistas. La Tabla 4.5 cuantifica las diferencias pareadas y sus intervalos; el mapa de conteos aporta su contexto visual.</w:t>
       </w:r>
     </w:p>
     <w:p>
@@ -17162,11 +17252,39 @@
         <w:jc w:val="both"/>
       </w:pPr>
       <w:r>
+        <w:t>La elección definitiva depende del objetivo del sistema: para maximizar los objetos anunciados al usuario, el Gorillapod 0,5x es el candidato provisional; para maximizar el equilibrio precisión/recall por fotograma, el arnés de pecho 1x. En ambos casos los intervalos no descartan todas las alternativas, por lo que la confirmación en escenas nuevas forma parte del plan de validación (sección 4.6).</w:t>
+      </w:r>
+    </w:p>
+    <w:p>
+      <w:bookmarkStart w:id="1064" w:name="report_1064"/>
+      <w:pPr>
+        <w:pStyle w:val="Ttulo2"/>
+      </w:pPr>
+      <w:r>
+        <w:t>4.4 Escenario 3: rango de profundidad de detección</w:t>
+      </w:r>
+      <w:bookmarkEnd w:id="1064"/>
+    </w:p>
+    <w:p>
+      <w:pPr>
+        <w:spacing w:line="360" w:lineRule="auto"/>
+        <w:jc w:val="both"/>
+      </w:pPr>
+      <w:r>
+        <w:t>Para caracterizar el rango de profundidad útil del sistema se estima la distancia entre el objeto y la cámara para cada instancia anotada de las mismas 198 fotografías, sin capturas adicionales. El modelo estenopeico de la cámara entrega d ≈ f_px · H_cls / h_px, donde f_px es la distancia focal en píxeles —calculada del campo FocalLengthIn35mmFilm del EXIF (equivalente a 25 mm para el lente 1x y a 14 mm para el 0,5x; se registraron seis discrepancias de grupo de lente y una variación menor de 25 a 26 mm y se adoptó el valor del EXIF)—, h_px es la altura de la caja anotada en píxeles y H_cls es una altura de referencia fija por clase (persona 1,70 m; nevera 1,75 m; silla 0,90 m; sofá 0,85 m; inodoro 0,78 m; mesa de comedor 0,76 m; lavamanos 0,80 m; televisor 0,60 m; cama 0,60 m; computador portátil 0,25 m). Las distancias resultantes son aproximaciones, no mediciones, por lo que el análisis se reporta exclusivamente en bandas.</w:t>
+      </w:r>
+    </w:p>
+    <w:p>
+      <w:pPr>
+        <w:spacing w:line="360" w:lineRule="auto"/>
+        <w:jc w:val="both"/>
+      </w:pPr>
+      <w:r>
         <w:t>La tabla siguiente resume el recall del detector por banda de distancia estimada agregando las seis configuraciones. "Recall" se calcula agrupando todas las instancias de la banda; "Media bootstrap" y su IC 95 % se obtienen remuestreando los 33 grupos de captura completos y calculando el recall agrupado en cada remuestra (10 000 remuestreos, semilla 20261013); no son una media de recalls igualmente ponderados por escena.</w:t>
       </w:r>
     </w:p>
     <w:p>
-      <w:bookmarkStart w:id="1064" w:name="report_1064"/>
+      <w:bookmarkStart w:id="1065" w:name="report_1065"/>
       <w:pPr>
         <w:pStyle w:val="Descripcin"/>
         <w:keepNext/>
@@ -17179,7 +17297,7 @@
         </w:rPr>
         <w:t>Tabla 4.6. Recall por banda de distancia estimada.</w:t>
       </w:r>
-      <w:bookmarkEnd w:id="1064"/>
+      <w:bookmarkEnd w:id="1065"/>
     </w:p>
     <w:tbl>
       <w:tblPr>
@@ -18309,7 +18427,7 @@
         <w:drawing>
           <wp:inline>
             <wp:extent cx="5166360" cy="3321231"/>
-            <wp:docPr id="50" name="Picture 50"/>
+            <wp:docPr id="51" name="Picture 51"/>
             <wp:cNvGraphicFramePr>
               <ns4:graphicFrameLocks noChangeAspect="1"/>
             </wp:cNvGraphicFramePr>
@@ -18321,7 +18439,7 @@
                     <ns5:cNvPicPr/>
                   </ns5:nvPicPr>
                   <ns5:blipFill>
-                    <ns4:blip r:embed="rId50"/>
+                    <ns4:blip r:embed="rId51"/>
                     <ns4:stretch>
                       <ns4:fillRect/>
                     </ns4:stretch>
@@ -18341,7 +18459,7 @@
       </w:r>
     </w:p>
     <w:p>
-      <w:bookmarkStart w:id="1065" w:name="report_1065"/>
+      <w:bookmarkStart w:id="1066" w:name="report_1066"/>
       <w:pPr>
         <w:pStyle w:val="Descripcin"/>
         <w:spacing w:line="240" w:lineRule="auto" w:after="160" w:before="160"/>
@@ -18351,9 +18469,9 @@
         <w:rPr>
           <w:sz w:val="20"/>
         </w:rPr>
-        <w:t>Figura 4.3. Recall por distancia estimada e intervalo bootstrap del 95 %.</w:t>
-      </w:r>
-      <w:bookmarkEnd w:id="1065"/>
+        <w:t>Figura 4.4. Recall por distancia estimada e intervalo bootstrap del 95 %.</w:t>
+      </w:r>
+      <w:bookmarkEnd w:id="1066"/>
     </w:p>
     <w:p>
       <w:pPr>
@@ -18383,14 +18501,14 @@
       </w:r>
     </w:p>
     <w:p>
-      <w:bookmarkStart w:id="1066" w:name="report_1066"/>
+      <w:bookmarkStart w:id="1067" w:name="report_1067"/>
       <w:pPr>
         <w:pStyle w:val="Ttulo2"/>
       </w:pPr>
       <w:r>
         <w:t>4.5 Métricas complementarias de detección</w:t>
       </w:r>
-      <w:bookmarkEnd w:id="1066"/>
+      <w:bookmarkEnd w:id="1067"/>
     </w:p>
     <w:p>
       <w:pPr>
@@ -18402,7 +18520,7 @@
       </w:r>
     </w:p>
     <w:p>
-      <w:bookmarkStart w:id="1067" w:name="report_1067"/>
+      <w:bookmarkStart w:id="1068" w:name="report_1068"/>
       <w:pPr>
         <w:pStyle w:val="Descripcin"/>
         <w:keepNext/>
@@ -18415,7 +18533,7 @@
         </w:rPr>
         <w:t>Tabla 4.7. Resultados por clase en el conjunto completo.</w:t>
       </w:r>
-      <w:bookmarkEnd w:id="1067"/>
+      <w:bookmarkEnd w:id="1068"/>
     </w:p>
     <w:tbl>
       <w:tblPr>
@@ -19986,8 +20104,64 @@
         <w:jc w:val="both"/>
       </w:pPr>
       <w:r>
-        <w:t>Dos observaciones atraviesan la tabla. Primera: recall y conteo medio se separan porque las vistas amplias contienen más instancias —el Gorillapod 0,5x tiene la mayor media de visibles por foto (5,27) y recupera la mayor media de objetos (2,48)—, pero su recall relativo (47,1%) queda por debajo del del arnés de pecho 1x (52,4%); el encuadre cambia el denominador y la dificultad de los objetos, por lo que se informa cobertura junto con recall. Segunda: la caída entre AP50 (60,5%) y AP50-95 (42,2%) indica que las cajas correctas son a menudo imprecisas, sin que este experimento aísle la causa de esa diferencia. El efecto del ajuste de las cajas sobre la zona anunciada requiere evaluación específica.</w:t>
-      </w:r>
+        <w:t>Los resultados por clase de la Tabla 4.7 describen qué objetos resultan más difíciles; la Figura 4.5 complementa ese desglose comparando precisión, recall y F1 de las seis configuraciones. En cada panel se distinguen el detector y la lista de hasta dos objetos por fotografía. Ambos se evalúan con confianza 0,30, coincidencia de clase e IoU mínimo de 0,50, y el recall conserva como denominador todas las instancias anotadas visibles. Cada configuración reúne 33 fotografías; la escala común de 0 a 100 % permite comparar las magnitudes sin alterar sus definiciones.</w:t>
+      </w:r>
+    </w:p>
+    <w:p>
+      <w:pPr>
+        <w:keepNext/>
+        <w:spacing w:line="240" w:lineRule="auto"/>
+        <w:jc w:val="center"/>
+      </w:pPr>
+      <w:r>
+        <w:drawing>
+          <wp:inline>
+            <wp:extent cx="5166360" cy="5608220"/>
+            <wp:docPr id="52" name="Picture 52"/>
+            <wp:cNvGraphicFramePr>
+              <ns4:graphicFrameLocks noChangeAspect="1"/>
+            </wp:cNvGraphicFramePr>
+            <ns4:graphic>
+              <ns4:graphicData uri="http://schemas.openxmlformats.org/drawingml/2006/picture">
+                <ns5:pic>
+                  <ns5:nvPicPr>
+                    <ns5:cNvPr id="0" name="seleccion_metricas.png"/>
+                    <ns5:cNvPicPr/>
+                  </ns5:nvPicPr>
+                  <ns5:blipFill>
+                    <ns4:blip r:embed="rId52"/>
+                    <ns4:stretch>
+                      <ns4:fillRect/>
+                    </ns4:stretch>
+                  </ns5:blipFill>
+                  <ns5:spPr>
+                    <ns4:xfrm>
+                      <ns4:off x="0" y="0"/>
+                      <ns4:ext cx="5166360" cy="5608220"/>
+                    </ns4:xfrm>
+                    <ns4:prstGeom prst="rect"/>
+                  </ns5:spPr>
+                </ns5:pic>
+              </ns4:graphicData>
+            </ns4:graphic>
+          </wp:inline>
+        </w:drawing>
+      </w:r>
+    </w:p>
+    <w:p>
+      <w:bookmarkStart w:id="1069" w:name="report_1069"/>
+      <w:pPr>
+        <w:pStyle w:val="Descripcin"/>
+        <w:spacing w:line="240" w:lineRule="auto" w:after="160" w:before="160"/>
+        <w:jc w:val="center"/>
+      </w:pPr>
+      <w:r>
+        <w:rPr>
+          <w:sz w:val="20"/>
+        </w:rPr>
+        <w:t>Figura 4.5. Precisión, recall y F1 del detector y de la lista de hasta dos objetos.</w:t>
+      </w:r>
+      <w:bookmarkEnd w:id="1069"/>
     </w:p>
     <w:p>
       <w:pPr>
@@ -19995,18 +20169,27 @@
         <w:jc w:val="both"/>
       </w:pPr>
       <w:r>
-        <w:t>Finalmente, el límite de dos objetos eleva la precisión de la lista por encima del 80 % en todas las configuraciones. La precisión de la lista mide correspondencia con anotaciones y no la calidad perceptiva de cada anuncio. Este experimento no mide la claridad del habla, cuyo desempeño corresponde al módulo de descriptores de audio.</w:t>
-      </w:r>
-    </w:p>
-    <w:p>
-      <w:bookmarkStart w:id="1068" w:name="report_1068"/>
+        <w:t>La Figura 4.5 permite interpretar el costo de limitar la información anunciada. Para Gorillapod 0,5x, la precisión pasa de 72,6 % en el detector a 90,7 % en la lista, mientras el recall baja de 47,1 % a 28,2 %: se conservan 49 selecciones correctas frente a las 82 detecciones correctas previas al límite. Pecho 1x mantiene la mayor F1 del detector (61,9 %), aunque recupera menos objetos correctos en total. La lista prioriza las puntuaciones más altas y reduce la cantidad recuperada; su mayor precisión no demuestra por sí sola mejor comprensión o utilidad del mensaje. Por ello, la elección combina esta figura con los conteos de la sección 4.3 y conserva la selección de Gorillapod 0,5x como provisional cuando se prioriza cantidad.</w:t>
+      </w:r>
+    </w:p>
+    <w:p>
+      <w:pPr>
+        <w:spacing w:line="360" w:lineRule="auto"/>
+        <w:jc w:val="both"/>
+      </w:pPr>
+      <w:r>
+        <w:t>La Tabla 4.4 aporta una dimensión adicional: AP50-95 promedia umbrales de IoU más exigentes que AP50. En pecho 1x se obtienen 60,5 % y 42,2 %, respectivamente; la diferencia describe la sensibilidad de la evaluación al ajuste de las cajas y no aísla su causa. La Figura 4.5 utiliza un IoU fijo de 0,50, por lo que complementa ese resultado sin sustituirlo. El efecto de las imprecisiones de las cajas sobre la zona espacial anunciada requiere una evaluación específica.</w:t>
+      </w:r>
+    </w:p>
+    <w:p>
+      <w:bookmarkStart w:id="1070" w:name="report_1070"/>
       <w:pPr>
         <w:pStyle w:val="Ttulo2"/>
       </w:pPr>
       <w:r>
         <w:t>4.6 Consideraciones de validez</w:t>
       </w:r>
-      <w:bookmarkEnd w:id="1068"/>
+      <w:bookmarkEnd w:id="1070"/>
     </w:p>
     <w:p>
       <w:pPr>
@@ -20122,7 +20305,7 @@
       </w:pPr>
     </w:p>
     <w:p>
-      <w:bookmarkStart w:id="1069" w:name="report_1069"/>
+      <w:bookmarkStart w:id="1071" w:name="report_1071"/>
       <w:pPr>
         <w:pStyle w:val="Ttulo1"/>
       </w:pPr>
@@ -20163,17 +20346,17 @@
       <w:r>
         <w:t xml:space="preserve"> </w:t>
       </w:r>
-      <w:bookmarkEnd w:id="1069"/>
-    </w:p>
-    <w:p>
-      <w:bookmarkStart w:id="1070" w:name="report_1070"/>
+      <w:bookmarkEnd w:id="1071"/>
+    </w:p>
+    <w:p>
+      <w:bookmarkStart w:id="1072" w:name="report_1072"/>
       <w:pPr>
         <w:pStyle w:val="Ttulo2"/>
       </w:pPr>
       <w:r>
         <w:t xml:space="preserve">5.1 Conclusiones</w:t>
       </w:r>
-      <w:bookmarkEnd w:id="1070"/>
+      <w:bookmarkEnd w:id="1072"/>
     </w:p>
     <w:p>
       <w:pPr>
@@ -20216,14 +20399,14 @@
       </w:r>
     </w:p>
     <w:p>
-      <w:bookmarkStart w:id="1071" w:name="report_1071"/>
+      <w:bookmarkStart w:id="1073" w:name="report_1073"/>
       <w:pPr>
         <w:pStyle w:val="Ttulo2"/>
       </w:pPr>
       <w:r>
         <w:t xml:space="preserve">5.2 Recomendaciones</w:t>
       </w:r>
-      <w:bookmarkEnd w:id="1071"/>
+      <w:bookmarkEnd w:id="1073"/>
     </w:p>
     <w:p>
       <w:pPr>
@@ -20236,14 +20419,14 @@
       </w:r>
     </w:p>
     <w:p>
-      <w:bookmarkStart w:id="1072" w:name="report_1072"/>
+      <w:bookmarkStart w:id="1074" w:name="report_1074"/>
       <w:pPr>
         <w:pStyle w:val="Ttulo2"/>
       </w:pPr>
       <w:r>
         <w:t xml:space="preserve">5.3 Trabajo futuro</w:t>
       </w:r>
-      <w:bookmarkEnd w:id="1072"/>
+      <w:bookmarkEnd w:id="1074"/>
     </w:p>
     <w:p>
       <w:pPr>
@@ -20275,7 +20458,7 @@
       </w:pPr>
     </w:p>
     <w:p>
-      <w:bookmarkStart w:id="1073" w:name="report_1073"/>
+      <w:bookmarkStart w:id="1075" w:name="report_1075"/>
       <w:pPr>
         <w:pStyle w:val="Subttulo"/>
         <w:spacing w:line="360" w:lineRule="auto"/>
@@ -20297,7 +20480,7 @@
       <w:bookmarkEnd w:id="85"/>
       <w:bookmarkEnd w:id="86"/>
       <w:bookmarkEnd w:id="87"/>
-      <w:bookmarkEnd w:id="1073"/>
+      <w:bookmarkEnd w:id="1075"/>
     </w:p>
     <w:p>
       <w:pPr>
@@ -20368,7 +20551,7 @@
       </w:pPr>
     </w:p>
     <w:p>
-      <w:bookmarkStart w:id="1074" w:name="report_1074"/>
+      <w:bookmarkStart w:id="1076" w:name="report_1076"/>
       <w:pPr>
         <w:pStyle w:val="Subttulo"/>
         <w:spacing w:line="360" w:lineRule="auto"/>
@@ -20390,7 +20573,7 @@
       <w:bookmarkEnd w:id="89"/>
       <w:bookmarkEnd w:id="90"/>
       <w:bookmarkEnd w:id="91"/>
-      <w:bookmarkEnd w:id="1074"/>
+      <w:bookmarkEnd w:id="1076"/>
     </w:p>
     <w:p>
       <w:pPr>
@@ -20433,7 +20616,7 @@
       </w:r>
     </w:p>
     <w:p>
-      <w:bookmarkStart w:id="1075" w:name="report_1075"/>
+      <w:bookmarkStart w:id="1077" w:name="report_1077"/>
       <w:pPr>
         <w:pStyle w:val="Subttulo"/>
         <w:pageBreakBefore/>
@@ -20444,7 +20627,7 @@
       <w:r>
         <w:t xml:space="preserve">Anexo C: Manuales técnico y de usuario</w:t>
       </w:r>
-      <w:bookmarkEnd w:id="1075"/>
+      <w:bookmarkEnd w:id="1077"/>
     </w:p>
     <w:p>
       <w:pPr>
@@ -20486,7 +20669,7 @@
       </w:pPr>
     </w:p>
     <w:p>
-      <w:bookmarkStart w:id="1076" w:name="report_1076"/>
+      <w:bookmarkStart w:id="1078" w:name="report_1078"/>
       <w:pPr>
         <w:pStyle w:val="Ttulosposteriores"/>
         <w:pageBreakBefore/>
@@ -20503,7 +20686,7 @@
       <w:bookmarkEnd w:id="93"/>
       <w:bookmarkEnd w:id="94"/>
       <w:bookmarkEnd w:id="95"/>
-      <w:bookmarkEnd w:id="1076"/>
+      <w:bookmarkEnd w:id="1078"/>
     </w:p>
     <w:p>
       <w:pPr>

</xml_diff>

<commit_message>
docs: remove redundant scene-count heatmap from final report
</commit_message>
<xml_diff>
--- a/Documents/Informe_Final_Trabajo_de_Grado_AssistiveVision.docx
+++ b/Documents/Informe_Final_Trabajo_de_Grado_AssistiveVision.docx
@@ -1413,10 +1413,10 @@
           <w:szCs w:val="44"/>
         </w:rPr>
         <w:sectPr>
-          <w:footerReference w:type="first" r:id="rId53"/>
-          <w:footerReference w:type="even" r:id="rId53"/>
+          <w:footerReference w:type="first" r:id="rId52"/>
+          <w:footerReference w:type="even" r:id="rId52"/>
           <w:headerReference w:type="first" r:id="rId15"/>
-          <w:footerReference w:type="default" r:id="rId53"/>
+          <w:footerReference w:type="default" r:id="rId52"/>
           <w:type w:val="oddPage"/>
           <w:pgSz w:w="12240" w:h="15840" w:code="1"/>
           <w:pgMar w:top="426" w:right="1467" w:bottom="1440" w:left="2041" w:header="709" w:footer="709" w:gutter="0"/>
@@ -2323,9 +2323,9 @@
         <w:t>4.4 Escenario 3: rango de profundidad de detección</w:t>
         <w:tab/>
       </w:r>
-      <w:fldSimple w:instr=" PAGEREF report_1066 \h ">
+      <w:fldSimple w:instr=" PAGEREF report_1065 \h ">
         <w:r>
-          <w:t>37</w:t>
+          <w:t>35</w:t>
         </w:r>
       </w:fldSimple>
     </w:p>
@@ -2342,9 +2342,9 @@
         <w:t>4.5 Métricas complementarias de detección</w:t>
         <w:tab/>
       </w:r>
-      <w:fldSimple w:instr=" PAGEREF report_1069 \h ">
+      <w:fldSimple w:instr=" PAGEREF report_1068 \h ">
         <w:r>
-          <w:t>39</w:t>
+          <w:t>38</w:t>
         </w:r>
       </w:fldSimple>
     </w:p>
@@ -2361,9 +2361,9 @@
         <w:t>4.6 Consideraciones de validez</w:t>
         <w:tab/>
       </w:r>
-      <w:fldSimple w:instr=" PAGEREF report_1072 \h ">
+      <w:fldSimple w:instr=" PAGEREF report_1071 \h ">
         <w:r>
-          <w:t>42</w:t>
+          <w:t>40</w:t>
         </w:r>
       </w:fldSimple>
     </w:p>
@@ -2380,9 +2380,9 @@
         <w:t>4.7 Distribución del tiempo de procesamiento</w:t>
         <w:tab/>
       </w:r>
-      <w:fldSimple w:instr=" PAGEREF report_1073 \h ">
+      <w:fldSimple w:instr=" PAGEREF report_1072 \h ">
         <w:r>
-          <w:t>44</w:t>
+          <w:t>42</w:t>
         </w:r>
       </w:fldSimple>
     </w:p>
@@ -2399,9 +2399,9 @@
         <w:t>4.8 Brillo de las imágenes y alcance del análisis de oclusión</w:t>
         <w:tab/>
       </w:r>
-      <w:fldSimple w:instr=" PAGEREF report_1075 \h ">
+      <w:fldSimple w:instr=" PAGEREF report_1074 \h ">
         <w:r>
-          <w:t>44</w:t>
+          <w:t>42</w:t>
         </w:r>
       </w:fldSimple>
     </w:p>
@@ -2418,9 +2418,9 @@
         <w:t>4.9 Correspondencia con las actividades de la propuesta</w:t>
         <w:tab/>
       </w:r>
-      <w:fldSimple w:instr=" PAGEREF report_1077 \h ">
+      <w:fldSimple w:instr=" PAGEREF report_1076 \h ">
         <w:r>
-          <w:t>46</w:t>
+          <w:t>44</w:t>
         </w:r>
       </w:fldSimple>
     </w:p>
@@ -2437,9 +2437,9 @@
         <w:t>5. Conclusiones</w:t>
         <w:tab/>
       </w:r>
-      <w:fldSimple w:instr=" PAGEREF report_1079 \h ">
+      <w:fldSimple w:instr=" PAGEREF report_1078 \h ">
         <w:r>
-          <w:t>49</w:t>
+          <w:t>47</w:t>
         </w:r>
       </w:fldSimple>
     </w:p>
@@ -2456,9 +2456,9 @@
         <w:t>5.1 Conclusiones</w:t>
         <w:tab/>
       </w:r>
-      <w:fldSimple w:instr=" PAGEREF report_1080 \h ">
+      <w:fldSimple w:instr=" PAGEREF report_1079 \h ">
         <w:r>
-          <w:t>49</w:t>
+          <w:t>47</w:t>
         </w:r>
       </w:fldSimple>
     </w:p>
@@ -2475,9 +2475,9 @@
         <w:t>5.2 Recomendaciones</w:t>
         <w:tab/>
       </w:r>
-      <w:fldSimple w:instr=" PAGEREF report_1081 \h ">
+      <w:fldSimple w:instr=" PAGEREF report_1080 \h ">
         <w:r>
-          <w:t>50</w:t>
+          <w:t>48</w:t>
         </w:r>
       </w:fldSimple>
     </w:p>
@@ -2494,9 +2494,9 @@
         <w:t>5.3 Trabajo futuro</w:t>
         <w:tab/>
       </w:r>
-      <w:fldSimple w:instr=" PAGEREF report_1082 \h ">
+      <w:fldSimple w:instr=" PAGEREF report_1081 \h ">
         <w:r>
-          <w:t>50</w:t>
+          <w:t>48</w:t>
         </w:r>
       </w:fldSimple>
     </w:p>
@@ -2516,9 +2516,9 @@
         <w:t>Anexo A: Scripts de evaluación de modelos</w:t>
         <w:tab/>
       </w:r>
-      <w:fldSimple w:instr=" PAGEREF report_1083 \h ">
+      <w:fldSimple w:instr=" PAGEREF report_1082 \h ">
         <w:r>
-          <w:t>53</w:t>
+          <w:t>51</w:t>
         </w:r>
       </w:fldSimple>
     </w:p>
@@ -2538,9 +2538,9 @@
         <w:t>Anexo B: Pruebas unitarias del prototipo</w:t>
         <w:tab/>
       </w:r>
-      <w:fldSimple w:instr=" PAGEREF report_1084 \h ">
+      <w:fldSimple w:instr=" PAGEREF report_1083 \h ">
         <w:r>
-          <w:t>55</w:t>
+          <w:t>53</w:t>
         </w:r>
       </w:fldSimple>
     </w:p>
@@ -2560,9 +2560,9 @@
         <w:t>Anexo C: Manuales técnico y de usuario</w:t>
         <w:tab/>
       </w:r>
-      <w:fldSimple w:instr=" PAGEREF report_1085 \h ">
+      <w:fldSimple w:instr=" PAGEREF report_1084 \h ">
         <w:r>
-          <w:t>56</w:t>
+          <w:t>54</w:t>
         </w:r>
       </w:fldSimple>
     </w:p>
@@ -2579,9 +2579,9 @@
         <w:t>Bibliografía</w:t>
         <w:tab/>
       </w:r>
-      <w:fldSimple w:instr=" PAGEREF report_1086 \h ">
+      <w:fldSimple w:instr=" PAGEREF report_1085 \h ">
         <w:r>
-          <w:t>57</w:t>
+          <w:t>55</w:t>
         </w:r>
       </w:fldSimple>
     </w:p>
@@ -2748,12 +2748,12 @@
         <w:rPr>
           <w:b w:val="0"/>
         </w:rPr>
-        <w:t>Figura 4.3. Conteos visibles, correctos y falsos en los 33 grupos de captura.</w:t>
+        <w:t>Figura 4.3. Recall por distancia estimada e intervalo bootstrap del 95 %.</w:t>
         <w:tab/>
       </w:r>
-      <w:fldSimple w:instr=" PAGEREF report_1065 \h ">
+      <w:fldSimple w:instr=" PAGEREF report_1067 \h ">
         <w:r>
-          <w:t>36</w:t>
+          <w:t>37</w:t>
         </w:r>
       </w:fldSimple>
     </w:p>
@@ -2770,14 +2770,45 @@
         <w:rPr>
           <w:b w:val="0"/>
         </w:rPr>
-        <w:t>Figura 4.4. Recall por distancia estimada e intervalo bootstrap del 95 %.</w:t>
+        <w:t>Figura 4.4. Precisión, recall y F1 del detector y de la lista de hasta dos objetos.</w:t>
         <w:tab/>
       </w:r>
-      <w:fldSimple w:instr=" PAGEREF report_1068 \h ">
+      <w:fldSimple w:instr=" PAGEREF report_1070 \h ">
         <w:r>
-          <w:t>38</w:t>
+          <w:t>39</w:t>
         </w:r>
       </w:fldSimple>
+    </w:p>
+    <w:p>
+      <w:pPr>
+        <w:spacing w:line="360" w:lineRule="auto"/>
+        <w:rPr>
+          <w:rFonts w:cs="Arial"/>
+          <w:lang w:val="es-ES" w:eastAsia="es-ES"/>
+        </w:rPr>
+      </w:pPr>
+    </w:p>
+    <w:p>
+      <w:bookmarkStart w:id="1004" w:name="report_1004"/>
+      <w:pPr>
+        <w:pStyle w:val="Ttulospreliminares2"/>
+        <w:pageBreakBefore/>
+      </w:pPr>
+      <w:bookmarkStart w:id="20" w:name="_Toc492993328"/>
+      <w:r>
+        <w:lastRenderedPageBreak/>
+        <w:t>Lista de tablas</w:t>
+      </w:r>
+      <w:bookmarkEnd w:id="20"/>
+      <w:bookmarkEnd w:id="1004"/>
+    </w:p>
+    <w:p>
+      <w:pPr>
+        <w:pStyle w:val="TDC1"/>
+      </w:pPr>
+      <w:r>
+        <w:t>Pág.</w:t>
+      </w:r>
     </w:p>
     <w:p>
       <w:pPr>
@@ -2792,45 +2823,14 @@
         <w:rPr>
           <w:b w:val="0"/>
         </w:rPr>
-        <w:t>Figura 4.5. Precisión, recall y F1 del detector y de la lista de hasta dos objetos.</w:t>
+        <w:t>Tabla 2.1. Resultados de evaluación en equipo de escritorio.</w:t>
         <w:tab/>
       </w:r>
-      <w:fldSimple w:instr=" PAGEREF report_1071 \h ">
+      <w:fldSimple w:instr=" PAGEREF report_1026 \h ">
         <w:r>
-          <w:t>41</w:t>
+          <w:t>16</w:t>
         </w:r>
       </w:fldSimple>
-    </w:p>
-    <w:p>
-      <w:pPr>
-        <w:spacing w:line="360" w:lineRule="auto"/>
-        <w:rPr>
-          <w:rFonts w:cs="Arial"/>
-          <w:lang w:val="es-ES" w:eastAsia="es-ES"/>
-        </w:rPr>
-      </w:pPr>
-    </w:p>
-    <w:p>
-      <w:bookmarkStart w:id="1004" w:name="report_1004"/>
-      <w:pPr>
-        <w:pStyle w:val="Ttulospreliminares2"/>
-        <w:pageBreakBefore/>
-      </w:pPr>
-      <w:bookmarkStart w:id="20" w:name="_Toc492993328"/>
-      <w:r>
-        <w:lastRenderedPageBreak/>
-        <w:t>Lista de tablas</w:t>
-      </w:r>
-      <w:bookmarkEnd w:id="20"/>
-      <w:bookmarkEnd w:id="1004"/>
-    </w:p>
-    <w:p>
-      <w:pPr>
-        <w:pStyle w:val="TDC1"/>
-      </w:pPr>
-      <w:r>
-        <w:t>Pág.</w:t>
-      </w:r>
     </w:p>
     <w:p>
       <w:pPr>
@@ -2845,10 +2845,10 @@
         <w:rPr>
           <w:b w:val="0"/>
         </w:rPr>
-        <w:t>Tabla 2.1. Resultados de evaluación en equipo de escritorio.</w:t>
+        <w:t>Tabla 2.2. Desglose de AP50 por clase para cada modelo.</w:t>
         <w:tab/>
       </w:r>
-      <w:fldSimple w:instr=" PAGEREF report_1026 \h ">
+      <w:fldSimple w:instr=" PAGEREF report_1027 \h ">
         <w:r>
           <w:t>16</w:t>
         </w:r>
@@ -2867,12 +2867,12 @@
         <w:rPr>
           <w:b w:val="0"/>
         </w:rPr>
-        <w:t>Tabla 2.2. Desglose de AP50 por clase para cada modelo.</w:t>
+        <w:t>Tabla 2.3. Resultados de benchmark en Android utilizando CPU.</w:t>
         <w:tab/>
       </w:r>
-      <w:fldSimple w:instr=" PAGEREF report_1027 \h ">
+      <w:fldSimple w:instr=" PAGEREF report_1028 \h ">
         <w:r>
-          <w:t>16</w:t>
+          <w:t>17</w:t>
         </w:r>
       </w:fldSimple>
     </w:p>
@@ -2889,10 +2889,10 @@
         <w:rPr>
           <w:b w:val="0"/>
         </w:rPr>
-        <w:t>Tabla 2.3. Resultados de benchmark en Android utilizando CPU.</w:t>
+        <w:t>Tabla 2.4. Resultados de benchmark en Android utilizando GPU Delegate.</w:t>
         <w:tab/>
       </w:r>
-      <w:fldSimple w:instr=" PAGEREF report_1028 \h ">
+      <w:fldSimple w:instr=" PAGEREF report_1029 \h ">
         <w:r>
           <w:t>17</w:t>
         </w:r>
@@ -2911,12 +2911,12 @@
         <w:rPr>
           <w:b w:val="0"/>
         </w:rPr>
-        <w:t>Tabla 2.4. Resultados de benchmark en Android utilizando GPU Delegate.</w:t>
+        <w:t>Tabla 2.5. Comparación de candidatos finales.</w:t>
         <w:tab/>
       </w:r>
-      <w:fldSimple w:instr=" PAGEREF report_1029 \h ">
+      <w:fldSimple w:instr=" PAGEREF report_1032 \h ">
         <w:r>
-          <w:t>17</w:t>
+          <w:t>20</w:t>
         </w:r>
       </w:fldSimple>
     </w:p>
@@ -2933,12 +2933,12 @@
         <w:rPr>
           <w:b w:val="0"/>
         </w:rPr>
-        <w:t>Tabla 2.5. Comparación de candidatos finales.</w:t>
+        <w:t>Tabla 3.1. Clases de objetos prioritarias anunciadas por el sistema.</w:t>
         <w:tab/>
       </w:r>
-      <w:fldSimple w:instr=" PAGEREF report_1032 \h ">
+      <w:fldSimple w:instr=" PAGEREF report_1040 \h ">
         <w:r>
-          <w:t>20</w:t>
+          <w:t>23</w:t>
         </w:r>
       </w:fldSimple>
     </w:p>
@@ -2955,10 +2955,10 @@
         <w:rPr>
           <w:b w:val="0"/>
         </w:rPr>
-        <w:t>Tabla 3.1. Clases de objetos prioritarias anunciadas por el sistema.</w:t>
+        <w:t>Tabla 3.2. Zonas de localización espacial y descriptores asociados.</w:t>
         <w:tab/>
       </w:r>
-      <w:fldSimple w:instr=" PAGEREF report_1040 \h ">
+      <w:fldSimple w:instr=" PAGEREF report_1042 \h ">
         <w:r>
           <w:t>23</w:t>
         </w:r>
@@ -2977,12 +2977,12 @@
         <w:rPr>
           <w:b w:val="0"/>
         </w:rPr>
-        <w:t>Tabla 3.2. Zonas de localización espacial y descriptores asociados.</w:t>
+        <w:t>Tabla 3.3. Parámetros configurables del sistema.</w:t>
         <w:tab/>
       </w:r>
-      <w:fldSimple w:instr=" PAGEREF report_1042 \h ">
+      <w:fldSimple w:instr=" PAGEREF report_1048 \h ">
         <w:r>
-          <w:t>23</w:t>
+          <w:t>26</w:t>
         </w:r>
       </w:fldSimple>
     </w:p>
@@ -2999,12 +2999,12 @@
         <w:rPr>
           <w:b w:val="0"/>
         </w:rPr>
-        <w:t>Tabla 3.3. Parámetros configurables del sistema.</w:t>
+        <w:t>Tabla 3.4. Requerimientos operativos y evidencia de verificación.</w:t>
         <w:tab/>
       </w:r>
-      <w:fldSimple w:instr=" PAGEREF report_1048 \h ">
+      <w:fldSimple w:instr=" PAGEREF report_1053 \h ">
         <w:r>
-          <w:t>26</w:t>
+          <w:t>28</w:t>
         </w:r>
       </w:fldSimple>
     </w:p>
@@ -3021,12 +3021,12 @@
         <w:rPr>
           <w:b w:val="0"/>
         </w:rPr>
-        <w:t>Tabla 3.4. Requerimientos operativos y evidencia de verificación.</w:t>
+        <w:t>Tabla 4.1. Diseño y unidades de análisis.</w:t>
         <w:tab/>
       </w:r>
-      <w:fldSimple w:instr=" PAGEREF report_1053 \h ">
+      <w:fldSimple w:instr=" PAGEREF report_1056 \h ">
         <w:r>
-          <w:t>28</w:t>
+          <w:t>31</w:t>
         </w:r>
       </w:fldSimple>
     </w:p>
@@ -3043,10 +3043,10 @@
         <w:rPr>
           <w:b w:val="0"/>
         </w:rPr>
-        <w:t>Tabla 4.1. Diseño y unidades de análisis.</w:t>
+        <w:t>Tabla 4.2. Resultados agrupados por montaje.</w:t>
         <w:tab/>
       </w:r>
-      <w:fldSimple w:instr=" PAGEREF report_1056 \h ">
+      <w:fldSimple w:instr=" PAGEREF report_1058 \h ">
         <w:r>
           <w:t>31</w:t>
         </w:r>
@@ -3065,12 +3065,12 @@
         <w:rPr>
           <w:b w:val="0"/>
         </w:rPr>
-        <w:t>Tabla 4.2. Resultados agrupados por montaje.</w:t>
+        <w:t>Tabla 4.3. Pruebas t pareadas por montaje.</w:t>
         <w:tab/>
       </w:r>
-      <w:fldSimple w:instr=" PAGEREF report_1058 \h ">
+      <w:fldSimple w:instr=" PAGEREF report_1059 \h ">
         <w:r>
-          <w:t>31</w:t>
+          <w:t>32</w:t>
         </w:r>
       </w:fldSimple>
     </w:p>
@@ -3087,12 +3087,12 @@
         <w:rPr>
           <w:b w:val="0"/>
         </w:rPr>
-        <w:t>Tabla 4.3. Pruebas t pareadas por montaje.</w:t>
+        <w:t>Tabla 4.4. Resultados por configuración.</w:t>
         <w:tab/>
       </w:r>
-      <w:fldSimple w:instr=" PAGEREF report_1059 \h ">
+      <w:fldSimple w:instr=" PAGEREF report_1062 \h ">
         <w:r>
-          <w:t>32</w:t>
+          <w:t>34</w:t>
         </w:r>
       </w:fldSimple>
     </w:p>
@@ -3109,10 +3109,10 @@
         <w:rPr>
           <w:b w:val="0"/>
         </w:rPr>
-        <w:t>Tabla 4.4. Resultados por configuración.</w:t>
+        <w:t>Tabla 4.5. Comparación de conteos con Gorillapod 0,5x.</w:t>
         <w:tab/>
       </w:r>
-      <w:fldSimple w:instr=" PAGEREF report_1062 \h ">
+      <w:fldSimple w:instr=" PAGEREF report_1063 \h ">
         <w:r>
           <w:t>34</w:t>
         </w:r>
@@ -3131,12 +3131,12 @@
         <w:rPr>
           <w:b w:val="0"/>
         </w:rPr>
-        <w:t>Tabla 4.5. Comparación de conteos con Gorillapod 0,5x.</w:t>
+        <w:t>Tabla 4.6. Recall por banda de distancia estimada.</w:t>
         <w:tab/>
       </w:r>
-      <w:fldSimple w:instr=" PAGEREF report_1063 \h ">
+      <w:fldSimple w:instr=" PAGEREF report_1066 \h ">
         <w:r>
-          <w:t>34</w:t>
+          <w:t>36</w:t>
         </w:r>
       </w:fldSimple>
     </w:p>
@@ -3153,10 +3153,10 @@
         <w:rPr>
           <w:b w:val="0"/>
         </w:rPr>
-        <w:t>Tabla 4.6. Recall por banda de distancia estimada.</w:t>
+        <w:t>Tabla 4.7. Resultados por clase en el conjunto completo.</w:t>
         <w:tab/>
       </w:r>
-      <w:fldSimple w:instr=" PAGEREF report_1067 \h ">
+      <w:fldSimple w:instr=" PAGEREF report_1069 \h ">
         <w:r>
           <w:t>38</w:t>
         </w:r>
@@ -3175,12 +3175,12 @@
         <w:rPr>
           <w:b w:val="0"/>
         </w:rPr>
-        <w:t>Tabla 4.7. Resultados por clase en el conjunto completo.</w:t>
+        <w:t>Tabla 4.8. Distribución de tiempos de reproducción en emulador en milisegundos.</w:t>
         <w:tab/>
       </w:r>
-      <w:fldSimple w:instr=" PAGEREF report_1070 \h ">
+      <w:fldSimple w:instr=" PAGEREF report_1073 \h ">
         <w:r>
-          <w:t>40</w:t>
+          <w:t>42</w:t>
         </w:r>
       </w:fldSimple>
     </w:p>
@@ -3197,12 +3197,12 @@
         <w:rPr>
           <w:b w:val="0"/>
         </w:rPr>
-        <w:t>Tabla 4.8. Distribución de tiempos de reproducción en emulador en milisegundos.</w:t>
+        <w:t>Tabla 4.9. Detección agrupada por brillo digital de las fotografías.</w:t>
         <w:tab/>
       </w:r>
-      <w:fldSimple w:instr=" PAGEREF report_1074 \h ">
+      <w:fldSimple w:instr=" PAGEREF report_1075 \h ">
         <w:r>
-          <w:t>44</w:t>
+          <w:t>43</w:t>
         </w:r>
       </w:fldSimple>
     </w:p>
@@ -3219,34 +3219,12 @@
         <w:rPr>
           <w:b w:val="0"/>
         </w:rPr>
-        <w:t>Tabla 4.9. Detección agrupada por brillo digital de las fotografías.</w:t>
-        <w:tab/>
-      </w:r>
-      <w:fldSimple w:instr=" PAGEREF report_1076 \h ">
-        <w:r>
-          <w:t>45</w:t>
-        </w:r>
-      </w:fldSimple>
-    </w:p>
-    <w:p>
-      <w:pPr>
-        <w:pStyle w:val="TDC1"/>
-        <w:tabs>
-          <w:tab w:pos="8755" w:val="right" w:leader="dot"/>
-        </w:tabs>
-        <w:spacing w:line="240" w:lineRule="auto" w:after="80"/>
-        <w:jc w:val="left"/>
-      </w:pPr>
-      <w:r>
-        <w:rPr>
-          <w:b w:val="0"/>
-        </w:rPr>
         <w:t>Tabla 4.10. Evidencias y alcance de las actividades de la pasantía.</w:t>
         <w:tab/>
       </w:r>
-      <w:fldSimple w:instr=" PAGEREF report_1078 \h ">
+      <w:fldSimple w:instr=" PAGEREF report_1077 \h ">
         <w:r>
-          <w:t>46</w:t>
+          <w:t>44</w:t>
         </w:r>
       </w:fldSimple>
     </w:p>
@@ -3494,9 +3472,9 @@
           <w:lang w:val="es-ES"/>
         </w:rPr>
         <w:sectPr>
-          <w:footerReference w:type="first" r:id="rId54"/>
-          <w:footerReference w:type="even" r:id="rId54"/>
-          <w:footerReference w:type="default" r:id="rId54"/>
+          <w:footerReference w:type="first" r:id="rId53"/>
+          <w:footerReference w:type="even" r:id="rId53"/>
+          <w:footerReference w:type="default" r:id="rId53"/>
           <w:pgSz w:w="12240" w:h="15840" w:code="1"/>
           <w:pgMar w:top="426" w:right="1418" w:bottom="1418" w:left="2268" w:header="709" w:footer="709" w:gutter="0"/>
           <w:pgNumType w:fmt="upperRoman"/>
@@ -3803,12 +3781,12 @@
           <w:rFonts w:cs="Arial"/>
         </w:rPr>
         <w:sectPr>
-          <w:footerReference w:type="first" r:id="rId55"/>
-          <w:footerReference w:type="even" r:id="rId55"/>
+          <w:footerReference w:type="first" r:id="rId54"/>
+          <w:footerReference w:type="even" r:id="rId54"/>
           <w:headerReference w:type="even" r:id="rId16"/>
           <w:headerReference w:type="default" r:id="rId17"/>
           <w:headerReference w:type="first" r:id="rId18"/>
-          <w:footerReference w:type="default" r:id="rId55"/>
+          <w:footerReference w:type="default" r:id="rId54"/>
           <w:pgSz w:w="12240" w:h="15840" w:code="1"/>
           <w:pgMar w:top="1440" w:right="1440" w:bottom="1440" w:left="2041" w:header="709" w:footer="709" w:gutter="0"/>
           <w:pgNumType w:start="1"/>
@@ -19147,96 +19125,6 @@
         <w:jc w:val="both"/>
       </w:pPr>
       <w:r>
-        <w:t>El boxplot de la Figura 4.2 resume la distribución de aciertos, pero no permite identificar en qué grupos cambia la ventaja. La Figura 4.3 desagrega las 33 escenas y coloca, en el mismo orden, las instancias visibles, las detecciones correctas y las predicciones falsas. Cada fila representa un grupo de seis capturas sucesivas; las columnas conservan el orden cabeza 1x, cabeza 0,5x, pecho 1x, pecho 0,5x, Gorillapod 1x y Gorillapod 0,5x. Los números son conteos y cada panel usa su propia escala de color, por lo que la intensidad no debe compararse entre paneles.</w:t>
-      </w:r>
-    </w:p>
-    <w:p>
-      <w:pPr>
-        <w:keepNext/>
-        <w:spacing w:line="240" w:lineRule="auto"/>
-        <w:jc w:val="center"/>
-      </w:pPr>
-      <w:r>
-        <w:drawing>
-          <wp:inline>
-            <wp:extent cx="5166360" cy="5608220"/>
-            <wp:docPr id="50" name="Picture 50"/>
-            <wp:cNvGraphicFramePr>
-              <ns4:graphicFrameLocks noChangeAspect="1"/>
-            </wp:cNvGraphicFramePr>
-            <ns4:graphic>
-              <ns4:graphicData uri="http://schemas.openxmlformats.org/drawingml/2006/picture">
-                <ns5:pic>
-                  <ns5:nvPicPr>
-                    <ns5:cNvPr id="0" name="seleccion_escenas.png"/>
-                    <ns5:cNvPicPr/>
-                  </ns5:nvPicPr>
-                  <ns5:blipFill>
-                    <ns4:blip r:embed="rId50"/>
-                    <ns4:stretch>
-                      <ns4:fillRect/>
-                    </ns4:stretch>
-                  </ns5:blipFill>
-                  <ns5:spPr>
-                    <ns4:xfrm>
-                      <ns4:off x="0" y="0"/>
-                      <ns4:ext cx="5166360" cy="5608220"/>
-                    </ns4:xfrm>
-                    <ns4:prstGeom prst="rect"/>
-                  </ns5:spPr>
-                </ns5:pic>
-              </ns4:graphicData>
-            </ns4:graphic>
-          </wp:inline>
-        </w:drawing>
-      </w:r>
-    </w:p>
-    <w:p>
-      <w:bookmarkStart w:id="1065" w:name="report_1065"/>
-      <w:pPr>
-        <w:pStyle w:val="Descripcin"/>
-        <w:keepNext/>
-        <w:spacing w:line="240" w:lineRule="auto" w:after="160" w:before="160"/>
-        <w:jc w:val="center"/>
-      </w:pPr>
-      <w:r>
-        <w:rPr>
-          <w:sz w:val="20"/>
-        </w:rPr>
-        <w:t>Figura 4.3. Conteos visibles, correctos y falsos en los 33 grupos de captura.</w:t>
-      </w:r>
-      <w:bookmarkEnd w:id="1065"/>
-    </w:p>
-    <w:p>
-      <w:pPr>
-        <w:spacing w:line="240" w:lineRule="auto" w:after="160"/>
-        <w:jc w:val="center"/>
-      </w:pPr>
-      <w:r>
-        <w:rPr>
-          <w:rFonts w:ascii="Arial" w:hAnsi="Arial"/>
-          <w:sz w:val="20"/>
-        </w:rPr>
-        <w:t>Fuente: elaboración propia a partir del diseño y los resultados del proyecto.</w:t>
-      </w:r>
-    </w:p>
-    <w:p>
-      <w:pPr>
-        <w:widowControl/>
-        <w:spacing w:line="360" w:lineRule="auto" w:after="330"/>
-        <w:jc w:val="both"/>
-      </w:pPr>
-      <w:r>
-        <w:t>La comparación por fila muestra por qué el mayor total no implica ganar en todas las escenas. En el grupo 12, Gorillapod 0,5x recupera nueve objetos correctos de diez visibles, frente a siete de diez de pecho 0,5x. En el grupo 23, Gorillapod 1x recupera seis de diez y Gorillapod 0,5x tres de once. El grupo 28 concentra numerosos objetos: cabeza 0,5x contiene 42 instancias y recupera once, mientras Gorillapod 0,5x contiene 36 y recupera diez. Estos ejemplos vinculan cobertura, dificultad y conteo; además, muestran la influencia de escenas densas sobre los totales. Las filas identifican grupos de captura, no objetos físicos seguidos entre vistas. La Tabla 4.5 cuantifica las diferencias pareadas y sus intervalos; el mapa de conteos aporta su contexto visual.</w:t>
-      </w:r>
-    </w:p>
-    <w:p>
-      <w:pPr>
-        <w:widowControl/>
-        <w:spacing w:line="360" w:lineRule="auto" w:after="330"/>
-        <w:jc w:val="both"/>
-      </w:pPr>
-      <w:r>
         <w:t>La elección definitiva depende del objetivo del sistema: para maximizar los objetos anunciados al usuario, el Gorillapod 0,5x es el candidato provisional; para maximizar el equilibrio precisión/</w:t>
       </w:r>
       <w:r>
@@ -19250,14 +19138,14 @@
       </w:r>
     </w:p>
     <w:p>
-      <w:bookmarkStart w:id="1066" w:name="report_1066"/>
+      <w:bookmarkStart w:id="1065" w:name="report_1065"/>
       <w:pPr>
         <w:pStyle w:val="Ttulo2"/>
       </w:pPr>
       <w:r>
         <w:t>4.4 Escenario 3: rango de profundidad de detección</w:t>
       </w:r>
-      <w:bookmarkEnd w:id="1066"/>
+      <w:bookmarkEnd w:id="1065"/>
     </w:p>
     <w:p>
       <w:pPr>
@@ -19316,7 +19204,7 @@
       </w:r>
     </w:p>
     <w:p>
-      <w:bookmarkStart w:id="1067" w:name="report_1067"/>
+      <w:bookmarkStart w:id="1066" w:name="report_1066"/>
       <w:pPr>
         <w:pStyle w:val="Descripcin"/>
         <w:keepNext/>
@@ -19342,7 +19230,7 @@
         </w:rPr>
         <w:t xml:space="preserve"> por banda de distancia estimada.</w:t>
       </w:r>
-      <w:bookmarkEnd w:id="1067"/>
+      <w:bookmarkEnd w:id="1066"/>
     </w:p>
     <w:tbl>
       <w:tblPr>
@@ -20534,7 +20422,7 @@
         <w:drawing>
           <wp:inline>
             <wp:extent cx="5166360" cy="3321231"/>
-            <wp:docPr id="51" name="Picture 51"/>
+            <wp:docPr id="50" name="Picture 50"/>
             <wp:cNvGraphicFramePr>
               <ns4:graphicFrameLocks noChangeAspect="1"/>
             </wp:cNvGraphicFramePr>
@@ -20546,7 +20434,7 @@
                     <ns5:cNvPicPr/>
                   </ns5:nvPicPr>
                   <ns5:blipFill>
-                    <ns4:blip r:embed="rId51"/>
+                    <ns4:blip r:embed="rId50"/>
                     <ns4:stretch>
                       <ns4:fillRect/>
                     </ns4:stretch>
@@ -20566,7 +20454,7 @@
       </w:r>
     </w:p>
     <w:p>
-      <w:bookmarkStart w:id="1068" w:name="report_1068"/>
+      <w:bookmarkStart w:id="1067" w:name="report_1067"/>
       <w:pPr>
         <w:pStyle w:val="Descripcin"/>
         <w:keepNext/>
@@ -20577,7 +20465,7 @@
         <w:rPr>
           <w:sz w:val="20"/>
         </w:rPr>
-        <w:t xml:space="preserve">Figura 4.4. </w:t>
+        <w:t xml:space="preserve">Figura 4.3. </w:t>
       </w:r>
       <w:r>
         <w:rPr>
@@ -20605,7 +20493,7 @@
         </w:rPr>
         <w:t xml:space="preserve"> del 95 %.</w:t>
       </w:r>
-      <w:bookmarkEnd w:id="1068"/>
+      <w:bookmarkEnd w:id="1067"/>
     </w:p>
     <w:p>
       <w:pPr>
@@ -20696,14 +20584,14 @@
       </w:r>
     </w:p>
     <w:p>
-      <w:bookmarkStart w:id="1069" w:name="report_1069"/>
+      <w:bookmarkStart w:id="1068" w:name="report_1068"/>
       <w:pPr>
         <w:pStyle w:val="Ttulo2"/>
       </w:pPr>
       <w:r>
         <w:t>4.5 Métricas complementarias de detección</w:t>
       </w:r>
-      <w:bookmarkEnd w:id="1069"/>
+      <w:bookmarkEnd w:id="1068"/>
     </w:p>
     <w:p>
       <w:pPr>
@@ -20725,7 +20613,7 @@
       </w:r>
     </w:p>
     <w:p>
-      <w:bookmarkStart w:id="1070" w:name="report_1070"/>
+      <w:bookmarkStart w:id="1069" w:name="report_1069"/>
       <w:pPr>
         <w:pStyle w:val="Descripcin"/>
         <w:keepNext/>
@@ -20738,7 +20626,7 @@
         </w:rPr>
         <w:t>Tabla 4.7. Resultados por clase en el conjunto completo.</w:t>
       </w:r>
-      <w:bookmarkEnd w:id="1070"/>
+      <w:bookmarkEnd w:id="1069"/>
     </w:p>
     <w:tbl>
       <w:tblPr>
@@ -22400,7 +22288,7 @@
         <w:jc w:val="both"/>
       </w:pPr>
       <w:r>
-        <w:t xml:space="preserve">Los resultados por clase de la Tabla 4.7 describen qué objetos resultan más difíciles; la Figura 4.5 complementa ese desglose comparando precisión, </w:t>
+        <w:t xml:space="preserve">Los resultados por clase de la Tabla 4.7 describen qué objetos resultan más difíciles; la Figura 4.4 complementa ese desglose comparando precisión, </w:t>
       </w:r>
       <w:r>
         <w:rPr>
@@ -22431,7 +22319,7 @@
         <w:drawing>
           <wp:inline>
             <wp:extent cx="5166360" cy="5608220"/>
-            <wp:docPr id="52" name="Picture 52"/>
+            <wp:docPr id="51" name="Picture 51"/>
             <wp:cNvGraphicFramePr>
               <ns4:graphicFrameLocks noChangeAspect="1"/>
             </wp:cNvGraphicFramePr>
@@ -22443,7 +22331,7 @@
                     <ns5:cNvPicPr/>
                   </ns5:nvPicPr>
                   <ns5:blipFill>
-                    <ns4:blip r:embed="rId52"/>
+                    <ns4:blip r:embed="rId51"/>
                     <ns4:stretch>
                       <ns4:fillRect/>
                     </ns4:stretch>
@@ -22463,7 +22351,7 @@
       </w:r>
     </w:p>
     <w:p>
-      <w:bookmarkStart w:id="1071" w:name="report_1071"/>
+      <w:bookmarkStart w:id="1070" w:name="report_1070"/>
       <w:pPr>
         <w:pStyle w:val="Descripcin"/>
         <w:keepNext/>
@@ -22474,7 +22362,7 @@
         <w:rPr>
           <w:sz w:val="20"/>
         </w:rPr>
-        <w:t xml:space="preserve">Figura 4.5. Precisión, </w:t>
+        <w:t xml:space="preserve">Figura 4.4. Precisión, </w:t>
       </w:r>
       <w:r>
         <w:rPr>
@@ -22489,7 +22377,7 @@
         </w:rPr>
         <w:t xml:space="preserve"> y F1 del detector y de la lista de hasta dos objetos.</w:t>
       </w:r>
-      <w:bookmarkEnd w:id="1071"/>
+      <w:bookmarkEnd w:id="1070"/>
     </w:p>
     <w:p>
       <w:pPr>
@@ -22511,7 +22399,7 @@
         <w:jc w:val="both"/>
       </w:pPr>
       <w:r>
-        <w:t xml:space="preserve">La Figura 4.5 permite interpretar el costo de limitar la información anunciada. Para Gorillapod 0,5x, la precisión pasa de 72,6 % en el detector a 90,7 % en la lista, mientras el </w:t>
+        <w:t xml:space="preserve">La Figura 4.4 permite interpretar el costo de limitar la información anunciada. Para Gorillapod 0,5x, la precisión pasa de 72,6 % en el detector a 90,7 % en la lista, mientras el </w:t>
       </w:r>
       <w:r>
         <w:rPr>
@@ -22530,18 +22418,18 @@
         <w:jc w:val="both"/>
       </w:pPr>
       <w:r>
-        <w:t>La Tabla 4.4 aporta una dimensión adicional: AP50-95 promedia umbrales de IoU más exigentes que AP50. En pecho 1x se obtienen 60,5 % y 42,2 %, respectivamente; la diferencia describe la sensibilidad de la evaluación al ajuste de las cajas y no aísla su causa. La Figura 4.5 utiliza un IoU fijo de 0,50, por lo que complementa ese resultado sin sustituirlo. El efecto de las imprecisiones de las cajas sobre la zona espacial anunciada requiere una evaluación específica.</w:t>
-      </w:r>
-    </w:p>
-    <w:p>
-      <w:bookmarkStart w:id="1072" w:name="report_1072"/>
+        <w:t>La Tabla 4.4 aporta una dimensión adicional: AP50-95 promedia umbrales de IoU más exigentes que AP50. En pecho 1x se obtienen 60,5 % y 42,2 %, respectivamente; la diferencia describe la sensibilidad de la evaluación al ajuste de las cajas y no aísla su causa. La Figura 4.4 utiliza un IoU fijo de 0,50, por lo que complementa ese resultado sin sustituirlo. El efecto de las imprecisiones de las cajas sobre la zona espacial anunciada requiere una evaluación específica.</w:t>
+      </w:r>
+    </w:p>
+    <w:p>
+      <w:bookmarkStart w:id="1071" w:name="report_1071"/>
       <w:pPr>
         <w:pStyle w:val="Ttulo2"/>
       </w:pPr>
       <w:r>
         <w:t>4.6 Consideraciones de validez</w:t>
       </w:r>
-      <w:bookmarkEnd w:id="1072"/>
+      <w:bookmarkEnd w:id="1071"/>
     </w:p>
     <w:p>
       <w:pPr>
@@ -22662,14 +22550,14 @@
       </w:r>
     </w:p>
     <w:p>
-      <w:bookmarkStart w:id="1073" w:name="report_1073"/>
+      <w:bookmarkStart w:id="1072" w:name="report_1072"/>
       <w:pPr>
         <w:pStyle w:val="Ttulo2"/>
       </w:pPr>
       <w:r>
         <w:t>4.7 Distribución del tiempo de procesamiento</w:t>
       </w:r>
-      <w:bookmarkEnd w:id="1073"/>
+      <w:bookmarkEnd w:id="1072"/>
     </w:p>
     <w:p>
       <w:pPr>
@@ -22691,7 +22579,7 @@
       </w:r>
     </w:p>
     <w:p>
-      <w:bookmarkStart w:id="1074" w:name="report_1074"/>
+      <w:bookmarkStart w:id="1073" w:name="report_1073"/>
       <w:pPr>
         <w:pStyle w:val="Descripcin"/>
         <w:keepNext/>
@@ -22704,7 +22592,7 @@
         </w:rPr>
         <w:t>Tabla 4.8. Distribución de tiempos de reproducción en emulador en milisegundos.</w:t>
       </w:r>
-      <w:bookmarkEnd w:id="1074"/>
+      <w:bookmarkEnd w:id="1073"/>
     </w:p>
     <w:tbl>
       <w:tblPr>
@@ -23178,14 +23066,14 @@
       </w:r>
     </w:p>
     <w:p>
-      <w:bookmarkStart w:id="1075" w:name="report_1075"/>
+      <w:bookmarkStart w:id="1074" w:name="report_1074"/>
       <w:pPr>
         <w:pStyle w:val="Ttulo2"/>
       </w:pPr>
       <w:r>
         <w:t>4.8 Brillo de las imágenes y alcance del análisis de oclusión</w:t>
       </w:r>
-      <w:bookmarkEnd w:id="1075"/>
+      <w:bookmarkEnd w:id="1074"/>
     </w:p>
     <w:p>
       <w:pPr>
@@ -23198,7 +23086,7 @@
       </w:r>
     </w:p>
     <w:p>
-      <w:bookmarkStart w:id="1076" w:name="report_1076"/>
+      <w:bookmarkStart w:id="1075" w:name="report_1075"/>
       <w:pPr>
         <w:pStyle w:val="Descripcin"/>
         <w:keepNext/>
@@ -23211,7 +23099,7 @@
         </w:rPr>
         <w:t>Tabla 4.9. Detección agrupada por brillo digital de las fotografías.</w:t>
       </w:r>
-      <w:bookmarkEnd w:id="1076"/>
+      <w:bookmarkEnd w:id="1075"/>
     </w:p>
     <w:tbl>
       <w:tblPr>
@@ -23814,14 +23702,14 @@
       </w:r>
     </w:p>
     <w:p>
-      <w:bookmarkStart w:id="1077" w:name="report_1077"/>
+      <w:bookmarkStart w:id="1076" w:name="report_1076"/>
       <w:pPr>
         <w:pStyle w:val="Ttulo2"/>
       </w:pPr>
       <w:r>
         <w:t>4.9 Correspondencia con las actividades de la propuesta</w:t>
       </w:r>
-      <w:bookmarkEnd w:id="1077"/>
+      <w:bookmarkEnd w:id="1076"/>
     </w:p>
     <w:p>
       <w:pPr>
@@ -23834,7 +23722,7 @@
       </w:r>
     </w:p>
     <w:p>
-      <w:bookmarkStart w:id="1078" w:name="report_1078"/>
+      <w:bookmarkStart w:id="1077" w:name="report_1077"/>
       <w:pPr>
         <w:pStyle w:val="Descripcin"/>
         <w:keepNext/>
@@ -23847,7 +23735,7 @@
         </w:rPr>
         <w:t>Tabla 4.10. Evidencias y alcance de las actividades de la pasantía.</w:t>
       </w:r>
-      <w:bookmarkEnd w:id="1078"/>
+      <w:bookmarkEnd w:id="1077"/>
     </w:p>
     <w:tbl>
       <w:tblPr>
@@ -24891,7 +24779,7 @@
       </w:pPr>
     </w:p>
     <w:p>
-      <w:bookmarkStart w:id="1079" w:name="report_1079"/>
+      <w:bookmarkStart w:id="1078" w:name="report_1078"/>
       <w:pPr>
         <w:pStyle w:val="Ttulo1"/>
       </w:pPr>
@@ -24932,17 +24820,17 @@
       <w:r>
         <w:t xml:space="preserve"> </w:t>
       </w:r>
+      <w:bookmarkEnd w:id="1078"/>
+    </w:p>
+    <w:p>
+      <w:bookmarkStart w:id="1079" w:name="report_1079"/>
+      <w:pPr>
+        <w:pStyle w:val="Ttulo2"/>
+      </w:pPr>
+      <w:r>
+        <w:t xml:space="preserve">5.1 Conclusiones</w:t>
+      </w:r>
       <w:bookmarkEnd w:id="1079"/>
-    </w:p>
-    <w:p>
-      <w:bookmarkStart w:id="1080" w:name="report_1080"/>
-      <w:pPr>
-        <w:pStyle w:val="Ttulo2"/>
-      </w:pPr>
-      <w:r>
-        <w:t xml:space="preserve">5.1 Conclusiones</w:t>
-      </w:r>
-      <w:bookmarkEnd w:id="1080"/>
     </w:p>
     <w:p>
       <w:pPr>
@@ -25053,14 +24941,14 @@
       </w:r>
     </w:p>
     <w:p>
-      <w:bookmarkStart w:id="1081" w:name="report_1081"/>
+      <w:bookmarkStart w:id="1080" w:name="report_1080"/>
       <w:pPr>
         <w:pStyle w:val="Ttulo2"/>
       </w:pPr>
       <w:r>
         <w:t xml:space="preserve">5.2 Recomendaciones</w:t>
       </w:r>
-      <w:bookmarkEnd w:id="1081"/>
+      <w:bookmarkEnd w:id="1080"/>
     </w:p>
     <w:p>
       <w:pPr>
@@ -25083,14 +24971,14 @@
       </w:r>
     </w:p>
     <w:p>
-      <w:bookmarkStart w:id="1082" w:name="report_1082"/>
+      <w:bookmarkStart w:id="1081" w:name="report_1081"/>
       <w:pPr>
         <w:pStyle w:val="Ttulo2"/>
       </w:pPr>
       <w:r>
         <w:t xml:space="preserve">5.3 Trabajo futuro</w:t>
       </w:r>
-      <w:bookmarkEnd w:id="1082"/>
+      <w:bookmarkEnd w:id="1081"/>
     </w:p>
     <w:p>
       <w:pPr>
@@ -25133,7 +25021,7 @@
       </w:pPr>
     </w:p>
     <w:p>
-      <w:bookmarkStart w:id="1083" w:name="report_1083"/>
+      <w:bookmarkStart w:id="1082" w:name="report_1082"/>
       <w:pPr>
         <w:pStyle w:val="Subttulo"/>
         <w:spacing w:line="360" w:lineRule="auto"/>
@@ -25155,7 +25043,7 @@
       <w:bookmarkEnd w:id="85"/>
       <w:bookmarkEnd w:id="86"/>
       <w:bookmarkEnd w:id="87"/>
-      <w:bookmarkEnd w:id="1083"/>
+      <w:bookmarkEnd w:id="1082"/>
     </w:p>
     <w:p>
       <w:pPr>
@@ -25267,7 +25155,7 @@
       </w:pPr>
     </w:p>
     <w:p>
-      <w:bookmarkStart w:id="1084" w:name="report_1084"/>
+      <w:bookmarkStart w:id="1083" w:name="report_1083"/>
       <w:pPr>
         <w:pStyle w:val="Subttulo"/>
         <w:spacing w:line="360" w:lineRule="auto"/>
@@ -25289,7 +25177,7 @@
       <w:bookmarkEnd w:id="89"/>
       <w:bookmarkEnd w:id="90"/>
       <w:bookmarkEnd w:id="91"/>
-      <w:bookmarkEnd w:id="1084"/>
+      <w:bookmarkEnd w:id="1083"/>
     </w:p>
     <w:p>
       <w:pPr>
@@ -25354,7 +25242,7 @@
       </w:r>
     </w:p>
     <w:p>
-      <w:bookmarkStart w:id="1085" w:name="report_1085"/>
+      <w:bookmarkStart w:id="1084" w:name="report_1084"/>
       <w:pPr>
         <w:pStyle w:val="Subttulo"/>
         <w:pageBreakBefore/>
@@ -25365,7 +25253,7 @@
       <w:r>
         <w:t xml:space="preserve">Anexo C: Manuales técnico y de usuario</w:t>
       </w:r>
-      <w:bookmarkEnd w:id="1085"/>
+      <w:bookmarkEnd w:id="1084"/>
     </w:p>
     <w:p>
       <w:pPr>
@@ -25409,7 +25297,7 @@
       </w:pPr>
     </w:p>
     <w:p>
-      <w:bookmarkStart w:id="1086" w:name="report_1086"/>
+      <w:bookmarkStart w:id="1085" w:name="report_1085"/>
       <w:pPr>
         <w:pStyle w:val="Ttulosposteriores"/>
         <w:pageBreakBefore/>
@@ -25426,7 +25314,7 @@
       <w:bookmarkEnd w:id="93"/>
       <w:bookmarkEnd w:id="94"/>
       <w:bookmarkEnd w:id="95"/>
-      <w:bookmarkEnd w:id="1086"/>
+      <w:bookmarkEnd w:id="1085"/>
     </w:p>
     <w:p>
       <w:pPr>

</xml_diff>

<commit_message>
docs: move proposal activity tracking out of final report
</commit_message>
<xml_diff>
--- a/Documents/Informe_Final_Trabajo_de_Grado_AssistiveVision.docx
+++ b/Documents/Informe_Final_Trabajo_de_Grado_AssistiveVision.docx
@@ -2407,6 +2407,25 @@
     </w:p>
     <w:p>
       <w:pPr>
+        <w:pStyle w:val="TDC1"/>
+        <w:tabs>
+          <w:tab w:pos="8755" w:val="right" w:leader="dot"/>
+        </w:tabs>
+        <w:spacing w:line="240" w:lineRule="auto" w:after="80"/>
+        <w:jc w:val="left"/>
+      </w:pPr>
+      <w:r>
+        <w:t>5. Conclusiones</w:t>
+        <w:tab/>
+      </w:r>
+      <w:fldSimple w:instr=" PAGEREF report_1076 \h ">
+        <w:r>
+          <w:t>45</w:t>
+        </w:r>
+      </w:fldSimple>
+    </w:p>
+    <w:p>
+      <w:pPr>
         <w:pStyle w:val="TDC2"/>
         <w:tabs>
           <w:tab w:pos="8755" w:val="right" w:leader="dot"/>
@@ -2415,31 +2434,12 @@
         <w:jc w:val="left"/>
       </w:pPr>
       <w:r>
-        <w:t>4.9 Correspondencia con las actividades de la propuesta</w:t>
+        <w:t>5.1 Conclusiones</w:t>
         <w:tab/>
       </w:r>
-      <w:fldSimple w:instr=" PAGEREF report_1076 \h ">
+      <w:fldSimple w:instr=" PAGEREF report_1077 \h ">
         <w:r>
-          <w:t>44</w:t>
-        </w:r>
-      </w:fldSimple>
-    </w:p>
-    <w:p>
-      <w:pPr>
-        <w:pStyle w:val="TDC1"/>
-        <w:tabs>
-          <w:tab w:pos="8755" w:val="right" w:leader="dot"/>
-        </w:tabs>
-        <w:spacing w:line="240" w:lineRule="auto" w:after="80"/>
-        <w:jc w:val="left"/>
-      </w:pPr>
-      <w:r>
-        <w:t>5. Conclusiones</w:t>
-        <w:tab/>
-      </w:r>
-      <w:fldSimple w:instr=" PAGEREF report_1078 \h ">
-        <w:r>
-          <w:t>47</w:t>
+          <w:t>45</w:t>
         </w:r>
       </w:fldSimple>
     </w:p>
@@ -2453,12 +2453,12 @@
         <w:jc w:val="left"/>
       </w:pPr>
       <w:r>
-        <w:t>5.1 Conclusiones</w:t>
+        <w:t>5.2 Recomendaciones</w:t>
         <w:tab/>
       </w:r>
-      <w:fldSimple w:instr=" PAGEREF report_1079 \h ">
+      <w:fldSimple w:instr=" PAGEREF report_1078 \h ">
         <w:r>
-          <w:t>47</w:t>
+          <w:t>46</w:t>
         </w:r>
       </w:fldSimple>
     </w:p>
@@ -2472,31 +2472,12 @@
         <w:jc w:val="left"/>
       </w:pPr>
       <w:r>
-        <w:t>5.2 Recomendaciones</w:t>
-        <w:tab/>
-      </w:r>
-      <w:fldSimple w:instr=" PAGEREF report_1080 \h ">
-        <w:r>
-          <w:t>48</w:t>
-        </w:r>
-      </w:fldSimple>
-    </w:p>
-    <w:p>
-      <w:pPr>
-        <w:pStyle w:val="TDC2"/>
-        <w:tabs>
-          <w:tab w:pos="8755" w:val="right" w:leader="dot"/>
-        </w:tabs>
-        <w:spacing w:line="240" w:lineRule="auto" w:after="80"/>
-        <w:jc w:val="left"/>
-      </w:pPr>
-      <w:r>
         <w:t>5.3 Trabajo futuro</w:t>
         <w:tab/>
       </w:r>
-      <w:fldSimple w:instr=" PAGEREF report_1081 \h ">
+      <w:fldSimple w:instr=" PAGEREF report_1079 \h ">
         <w:r>
-          <w:t>48</w:t>
+          <w:t>46</w:t>
         </w:r>
       </w:fldSimple>
     </w:p>
@@ -2516,9 +2497,9 @@
         <w:t>Anexo A: Scripts de evaluación de modelos</w:t>
         <w:tab/>
       </w:r>
-      <w:fldSimple w:instr=" PAGEREF report_1082 \h ">
+      <w:fldSimple w:instr=" PAGEREF report_1080 \h ">
         <w:r>
-          <w:t>51</w:t>
+          <w:t>49</w:t>
         </w:r>
       </w:fldSimple>
     </w:p>
@@ -2538,9 +2519,9 @@
         <w:t>Anexo B: Pruebas unitarias del prototipo</w:t>
         <w:tab/>
       </w:r>
-      <w:fldSimple w:instr=" PAGEREF report_1083 \h ">
+      <w:fldSimple w:instr=" PAGEREF report_1081 \h ">
         <w:r>
-          <w:t>53</w:t>
+          <w:t>51</w:t>
         </w:r>
       </w:fldSimple>
     </w:p>
@@ -2560,9 +2541,9 @@
         <w:t>Anexo C: Manuales técnico y de usuario</w:t>
         <w:tab/>
       </w:r>
-      <w:fldSimple w:instr=" PAGEREF report_1084 \h ">
+      <w:fldSimple w:instr=" PAGEREF report_1082 \h ">
         <w:r>
-          <w:t>54</w:t>
+          <w:t>52</w:t>
         </w:r>
       </w:fldSimple>
     </w:p>
@@ -2579,9 +2560,9 @@
         <w:t>Bibliografía</w:t>
         <w:tab/>
       </w:r>
-      <w:fldSimple w:instr=" PAGEREF report_1085 \h ">
+      <w:fldSimple w:instr=" PAGEREF report_1083 \h ">
         <w:r>
-          <w:t>55</w:t>
+          <w:t>53</w:t>
         </w:r>
       </w:fldSimple>
     </w:p>
@@ -3203,28 +3184,6 @@
       <w:fldSimple w:instr=" PAGEREF report_1075 \h ">
         <w:r>
           <w:t>43</w:t>
-        </w:r>
-      </w:fldSimple>
-    </w:p>
-    <w:p>
-      <w:pPr>
-        <w:pStyle w:val="TDC1"/>
-        <w:tabs>
-          <w:tab w:pos="8755" w:val="right" w:leader="dot"/>
-        </w:tabs>
-        <w:spacing w:line="240" w:lineRule="auto" w:after="80"/>
-        <w:jc w:val="left"/>
-      </w:pPr>
-      <w:r>
-        <w:rPr>
-          <w:b w:val="0"/>
-        </w:rPr>
-        <w:t>Tabla 4.10. Evidencias y alcance de las actividades de la pasantía.</w:t>
-        <w:tab/>
-      </w:r>
-      <w:fldSimple w:instr=" PAGEREF report_1077 \h ">
-        <w:r>
-          <w:t>44</w:t>
         </w:r>
       </w:fldSimple>
     </w:p>
@@ -3720,7 +3679,7 @@
         <w:jc w:val="both"/>
       </w:pPr>
       <w:r>
-        <w:t>La correspondencia entre actividades, evidencias y límites se sintetiza en la sección 4.9. La evaluación de la fase 3 cubre detección y procesamiento de imágenes; la iluminación se explora mediante brillo digital, sin mediciones de iluminancia, y la oclusión no cuenta con etiquetas específicas. La claridad auditiva, el tiempo hasta escuchar el mensaje y el efecto sobre la autonomía requieren evaluación adicional. El análisis geométrico de distancia es complementario y no sustituye estas actividades.</w:t>
+        <w:t>La evaluación de la fase 3 cubre detección y procesamiento de imágenes; la iluminación se explora mediante brillo digital, sin mediciones de iluminancia, y la oclusión no cuenta con etiquetas específicas. La claridad auditiva, el tiempo hasta escuchar el mensaje y el efecto sobre la autonomía requieren evaluación adicional. El análisis geométrico de distancia es complementario y no sustituye estas actividades.</w:t>
       </w:r>
     </w:p>
     <w:p>
@@ -23702,1064 +23661,6 @@
       </w:r>
     </w:p>
     <w:p>
-      <w:bookmarkStart w:id="1076" w:name="report_1076"/>
-      <w:pPr>
-        <w:pStyle w:val="Ttulo2"/>
-      </w:pPr>
-      <w:r>
-        <w:t>4.9 Correspondencia con las actividades de la propuesta</w:t>
-      </w:r>
-      <w:bookmarkEnd w:id="1076"/>
-    </w:p>
-    <w:p>
-      <w:pPr>
-        <w:widowControl/>
-        <w:spacing w:line="360" w:lineRule="auto" w:after="330"/>
-        <w:jc w:val="both"/>
-      </w:pPr>
-      <w:r>
-        <w:t>La Tabla 4.10 relaciona las catorce actividades de las tres fases con los resultados del informe. «Documentada» indica evidencia del análisis o diseño; «implementada» indica disponibilidad técnica; «parcial» identifica componentes evaluados junto con criterios todavía pendientes. Ninguno de estos estados equivale a demostrar autonomía, seguridad de navegación o aceptación por usuarios.</w:t>
-      </w:r>
-    </w:p>
-    <w:p>
-      <w:bookmarkStart w:id="1077" w:name="report_1077"/>
-      <w:pPr>
-        <w:pStyle w:val="Descripcin"/>
-        <w:keepNext/>
-        <w:spacing w:line="240" w:lineRule="auto" w:before="160" w:after="160"/>
-        <w:jc w:val="center"/>
-      </w:pPr>
-      <w:r>
-        <w:rPr>
-          <w:sz w:val="20"/>
-        </w:rPr>
-        <w:t>Tabla 4.10. Evidencias y alcance de las actividades de la pasantía.</w:t>
-      </w:r>
-      <w:bookmarkEnd w:id="1077"/>
-    </w:p>
-    <w:tbl>
-      <w:tblPr>
-        <w:tblW w:type="auto" w:w="0"/>
-        <w:tblLayout w:type="fixed"/>
-        <w:tblLook w:firstColumn="1" w:firstRow="1" w:lastColumn="0" w:lastRow="0" w:noHBand="0" w:noVBand="1" w:val="04A0"/>
-        <w:tblBorders>
-          <w:top w:val="single" w:sz="4" w:color="D9D9D9"/>
-          <w:left w:val="single" w:sz="4" w:color="D9D9D9"/>
-          <w:bottom w:val="single" w:sz="4" w:color="D9D9D9"/>
-          <w:right w:val="single" w:sz="4" w:color="D9D9D9"/>
-          <w:insideH w:val="single" w:sz="4" w:color="D9D9D9"/>
-          <w:insideV w:val="single" w:sz="4" w:color="D9D9D9"/>
-        </w:tblBorders>
-      </w:tblPr>
-      <w:tblGrid>
-        <w:gridCol w:w="3024"/>
-        <w:gridCol w:w="3528"/>
-        <w:gridCol w:w="2203"/>
-      </w:tblGrid>
-      <w:tr>
-        <w:trPr>
-          <w:cantSplit/>
-          <w:tblHeader/>
-        </w:trPr>
-        <w:tc>
-          <w:tcPr>
-            <w:tcW w:type="dxa" w:w="3024"/>
-            <w:vAlign w:val="center"/>
-            <w:shd w:fill="EEEEEE"/>
-          </w:tcPr>
-          <w:p>
-            <w:pPr>
-              <w:keepNext/>
-              <w:spacing w:line="240" w:lineRule="auto" w:after="60"/>
-            </w:pPr>
-            <w:r>
-              <w:rPr>
-                <w:rFonts w:ascii="Arial" w:hAnsi="Arial"/>
-                <w:b/>
-                <w:sz w:val="20"/>
-              </w:rPr>
-              <w:t>Fase y actividad</w:t>
-            </w:r>
-          </w:p>
-        </w:tc>
-        <w:tc>
-          <w:tcPr>
-            <w:tcW w:type="dxa" w:w="3528"/>
-            <w:vAlign w:val="center"/>
-            <w:shd w:fill="EEEEEE"/>
-          </w:tcPr>
-          <w:p>
-            <w:pPr>
-              <w:keepNext/>
-              <w:spacing w:line="240" w:lineRule="auto" w:after="60"/>
-            </w:pPr>
-            <w:r>
-              <w:rPr>
-                <w:rFonts w:ascii="Arial" w:hAnsi="Arial"/>
-                <w:b/>
-                <w:sz w:val="20"/>
-              </w:rPr>
-              <w:t>Evidencia</w:t>
-            </w:r>
-          </w:p>
-        </w:tc>
-        <w:tc>
-          <w:tcPr>
-            <w:tcW w:type="dxa" w:w="2203"/>
-            <w:vAlign w:val="center"/>
-            <w:shd w:fill="EEEEEE"/>
-          </w:tcPr>
-          <w:p>
-            <w:pPr>
-              <w:keepNext/>
-              <w:spacing w:line="240" w:lineRule="auto" w:after="60"/>
-            </w:pPr>
-            <w:r>
-              <w:rPr>
-                <w:rFonts w:ascii="Arial" w:hAnsi="Arial"/>
-                <w:b/>
-                <w:sz w:val="20"/>
-              </w:rPr>
-              <w:t>Estado</w:t>
-            </w:r>
-          </w:p>
-        </w:tc>
-      </w:tr>
-      <w:tr>
-        <w:trPr>
-          <w:cantSplit/>
-        </w:trPr>
-        <w:tc>
-          <w:tcPr>
-            <w:tcW w:type="dxa" w:w="3024"/>
-            <w:vAlign w:val="center"/>
-          </w:tcPr>
-          <w:p>
-            <w:pPr>
-              <w:keepNext/>
-              <w:spacing w:line="240" w:lineRule="auto" w:after="60"/>
-            </w:pPr>
-            <w:r>
-              <w:rPr>
-                <w:rFonts w:ascii="Arial" w:hAnsi="Arial"/>
-                <w:b w:val="0"/>
-                <w:sz w:val="20"/>
-              </w:rPr>
-              <w:t>1. Revisión teórica y problema</w:t>
-            </w:r>
-          </w:p>
-        </w:tc>
-        <w:tc>
-          <w:tcPr>
-            <w:tcW w:type="dxa" w:w="3528"/>
-            <w:vAlign w:val="center"/>
-          </w:tcPr>
-          <w:p>
-            <w:pPr>
-              <w:keepNext/>
-              <w:spacing w:line="240" w:lineRule="auto" w:after="60"/>
-            </w:pPr>
-            <w:r>
-              <w:rPr>
-                <w:rFonts w:ascii="Arial" w:hAnsi="Arial"/>
-                <w:b w:val="0"/>
-                <w:sz w:val="20"/>
-              </w:rPr>
-              <w:t>Capítulo 1 y antecedentes de la introducción.</w:t>
-            </w:r>
-          </w:p>
-        </w:tc>
-        <w:tc>
-          <w:tcPr>
-            <w:tcW w:type="dxa" w:w="2203"/>
-            <w:vAlign w:val="center"/>
-          </w:tcPr>
-          <w:p>
-            <w:pPr>
-              <w:keepNext/>
-              <w:spacing w:line="240" w:lineRule="auto" w:after="60"/>
-            </w:pPr>
-            <w:r>
-              <w:rPr>
-                <w:rFonts w:ascii="Arial" w:hAnsi="Arial"/>
-                <w:b w:val="0"/>
-                <w:sz w:val="20"/>
-              </w:rPr>
-              <w:t>Documentada</w:t>
-            </w:r>
-          </w:p>
-        </w:tc>
-      </w:tr>
-      <w:tr>
-        <w:trPr>
-          <w:cantSplit/>
-        </w:trPr>
-        <w:tc>
-          <w:tcPr>
-            <w:tcW w:type="dxa" w:w="3024"/>
-            <w:vAlign w:val="center"/>
-          </w:tcPr>
-          <w:p>
-            <w:pPr>
-              <w:keepNext/>
-              <w:spacing w:line="240" w:lineRule="auto" w:after="60"/>
-            </w:pPr>
-            <w:r>
-              <w:rPr>
-                <w:rFonts w:ascii="Arial" w:hAnsi="Arial"/>
-                <w:b w:val="0"/>
-                <w:sz w:val="20"/>
-              </w:rPr>
-              <w:t>1. Requerimientos y diseño conceptual</w:t>
-            </w:r>
-          </w:p>
-        </w:tc>
-        <w:tc>
-          <w:tcPr>
-            <w:tcW w:type="dxa" w:w="3528"/>
-            <w:vAlign w:val="center"/>
-          </w:tcPr>
-          <w:p>
-            <w:pPr>
-              <w:keepNext/>
-              <w:spacing w:line="240" w:lineRule="auto" w:after="60"/>
-            </w:pPr>
-            <w:r>
-              <w:rPr>
-                <w:rFonts w:ascii="Arial" w:hAnsi="Arial"/>
-                <w:b w:val="0"/>
-                <w:sz w:val="20"/>
-              </w:rPr>
-              <w:t>Arquitectura, alcance y Tabla 3.4.</w:t>
-            </w:r>
-          </w:p>
-        </w:tc>
-        <w:tc>
-          <w:tcPr>
-            <w:tcW w:type="dxa" w:w="2203"/>
-            <w:vAlign w:val="center"/>
-          </w:tcPr>
-          <w:p>
-            <w:pPr>
-              <w:keepNext/>
-              <w:spacing w:line="240" w:lineRule="auto" w:after="60"/>
-            </w:pPr>
-            <w:r>
-              <w:rPr>
-                <w:rFonts w:ascii="Arial" w:hAnsi="Arial"/>
-                <w:b w:val="0"/>
-                <w:sz w:val="20"/>
-              </w:rPr>
-              <w:t>Documentada; sin consulta a usuarios</w:t>
-            </w:r>
-          </w:p>
-        </w:tc>
-      </w:tr>
-      <w:tr>
-        <w:trPr>
-          <w:cantSplit/>
-        </w:trPr>
-        <w:tc>
-          <w:tcPr>
-            <w:tcW w:type="dxa" w:w="3024"/>
-            <w:vAlign w:val="center"/>
-          </w:tcPr>
-          <w:p>
-            <w:pPr>
-              <w:keepNext/>
-              <w:spacing w:line="240" w:lineRule="auto" w:after="60"/>
-            </w:pPr>
-            <w:r>
-              <w:rPr>
-                <w:rFonts w:ascii="Arial" w:hAnsi="Arial"/>
-                <w:b w:val="0"/>
-                <w:sz w:val="20"/>
-              </w:rPr>
-              <w:t>1. Selección y evaluación DNN</w:t>
-            </w:r>
-          </w:p>
-        </w:tc>
-        <w:tc>
-          <w:tcPr>
-            <w:tcW w:type="dxa" w:w="3528"/>
-            <w:vAlign w:val="center"/>
-          </w:tcPr>
-          <w:p>
-            <w:pPr>
-              <w:keepNext/>
-              <w:spacing w:line="240" w:lineRule="auto" w:after="60"/>
-            </w:pPr>
-            <w:r>
-              <w:rPr>
-                <w:rFonts w:ascii="Arial" w:hAnsi="Arial"/>
-                <w:b w:val="0"/>
-                <w:sz w:val="20"/>
-              </w:rPr>
-              <w:t>Seis configuraciones, 80 imágenes, benchmark en Redmi; capítulo 2.</w:t>
-            </w:r>
-          </w:p>
-        </w:tc>
-        <w:tc>
-          <w:tcPr>
-            <w:tcW w:type="dxa" w:w="2203"/>
-            <w:vAlign w:val="center"/>
-          </w:tcPr>
-          <w:p>
-            <w:pPr>
-              <w:keepNext/>
-              <w:spacing w:line="240" w:lineRule="auto" w:after="60"/>
-            </w:pPr>
-            <w:r>
-              <w:rPr>
-                <w:rFonts w:ascii="Arial" w:hAnsi="Arial"/>
-                <w:b w:val="0"/>
-                <w:sz w:val="20"/>
-              </w:rPr>
-              <w:t>Evaluada en el entorno descrito</w:t>
-            </w:r>
-          </w:p>
-        </w:tc>
-      </w:tr>
-      <w:tr>
-        <w:trPr>
-          <w:cantSplit/>
-        </w:trPr>
-        <w:tc>
-          <w:tcPr>
-            <w:tcW w:type="dxa" w:w="3024"/>
-            <w:vAlign w:val="center"/>
-          </w:tcPr>
-          <w:p>
-            <w:pPr>
-              <w:keepNext/>
-              <w:spacing w:line="240" w:lineRule="auto" w:after="60"/>
-            </w:pPr>
-            <w:r>
-              <w:rPr>
-                <w:rFonts w:ascii="Arial" w:hAnsi="Arial"/>
-                <w:b w:val="0"/>
-                <w:sz w:val="20"/>
-              </w:rPr>
-              <w:t>1. Objetos prioritarios</w:t>
-            </w:r>
-          </w:p>
-        </w:tc>
-        <w:tc>
-          <w:tcPr>
-            <w:tcW w:type="dxa" w:w="3528"/>
-            <w:vAlign w:val="center"/>
-          </w:tcPr>
-          <w:p>
-            <w:pPr>
-              <w:keepNext/>
-              <w:spacing w:line="240" w:lineRule="auto" w:after="60"/>
-            </w:pPr>
-            <w:r>
-              <w:rPr>
-                <w:rFonts w:ascii="Arial" w:hAnsi="Arial"/>
-                <w:b w:val="0"/>
-                <w:sz w:val="20"/>
-              </w:rPr>
-              <w:t>Diez clases COCO, Tabla 3.1 y sección 3.7.</w:t>
-            </w:r>
-          </w:p>
-        </w:tc>
-        <w:tc>
-          <w:tcPr>
-            <w:tcW w:type="dxa" w:w="2203"/>
-            <w:vAlign w:val="center"/>
-          </w:tcPr>
-          <w:p>
-            <w:pPr>
-              <w:keepNext/>
-              <w:spacing w:line="240" w:lineRule="auto" w:after="60"/>
-            </w:pPr>
-            <w:r>
-              <w:rPr>
-                <w:rFonts w:ascii="Arial" w:hAnsi="Arial"/>
-                <w:b w:val="0"/>
-                <w:sz w:val="20"/>
-              </w:rPr>
-              <w:t>Parcial; sin puertas ni validación de prioridades</w:t>
-            </w:r>
-          </w:p>
-        </w:tc>
-      </w:tr>
-      <w:tr>
-        <w:trPr>
-          <w:cantSplit/>
-        </w:trPr>
-        <w:tc>
-          <w:tcPr>
-            <w:tcW w:type="dxa" w:w="3024"/>
-            <w:vAlign w:val="center"/>
-          </w:tcPr>
-          <w:p>
-            <w:pPr>
-              <w:keepNext/>
-              <w:spacing w:line="240" w:lineRule="auto" w:after="60"/>
-            </w:pPr>
-            <w:r>
-              <w:rPr>
-                <w:rFonts w:ascii="Arial" w:hAnsi="Arial"/>
-                <w:b w:val="0"/>
-                <w:sz w:val="20"/>
-              </w:rPr>
-              <w:t>1. Diseño de descriptores</w:t>
-            </w:r>
-          </w:p>
-        </w:tc>
-        <w:tc>
-          <w:tcPr>
-            <w:tcW w:type="dxa" w:w="3528"/>
-            <w:vAlign w:val="center"/>
-          </w:tcPr>
-          <w:p>
-            <w:pPr>
-              <w:keepNext/>
-              <w:spacing w:line="240" w:lineRule="auto" w:after="60"/>
-            </w:pPr>
-            <w:r>
-              <w:rPr>
-                <w:rFonts w:ascii="Arial" w:hAnsi="Arial"/>
-                <w:b w:val="0"/>
-                <w:sz w:val="20"/>
-              </w:rPr>
-              <w:t>Seis zonas y composición textual, secciones 3.6 y 3.8.</w:t>
-            </w:r>
-          </w:p>
-        </w:tc>
-        <w:tc>
-          <w:tcPr>
-            <w:tcW w:type="dxa" w:w="2203"/>
-            <w:vAlign w:val="center"/>
-          </w:tcPr>
-          <w:p>
-            <w:pPr>
-              <w:keepNext/>
-              <w:spacing w:line="240" w:lineRule="auto" w:after="60"/>
-            </w:pPr>
-            <w:r>
-              <w:rPr>
-                <w:rFonts w:ascii="Arial" w:hAnsi="Arial"/>
-                <w:b w:val="0"/>
-                <w:sz w:val="20"/>
-              </w:rPr>
-              <w:t>Documentada; comprensión pendiente</w:t>
-            </w:r>
-          </w:p>
-        </w:tc>
-      </w:tr>
-      <w:tr>
-        <w:trPr>
-          <w:cantSplit/>
-        </w:trPr>
-        <w:tc>
-          <w:tcPr>
-            <w:tcW w:type="dxa" w:w="3024"/>
-            <w:vAlign w:val="center"/>
-          </w:tcPr>
-          <w:p>
-            <w:pPr>
-              <w:keepNext/>
-              <w:spacing w:line="240" w:lineRule="auto" w:after="60"/>
-            </w:pPr>
-            <w:r>
-              <w:rPr>
-                <w:rFonts w:ascii="Arial" w:hAnsi="Arial"/>
-                <w:b w:val="0"/>
-                <w:sz w:val="20"/>
-              </w:rPr>
-              <w:t>2. Sistema integrado y posición</w:t>
-            </w:r>
-          </w:p>
-        </w:tc>
-        <w:tc>
-          <w:tcPr>
-            <w:tcW w:type="dxa" w:w="3528"/>
-            <w:vAlign w:val="center"/>
-          </w:tcPr>
-          <w:p>
-            <w:pPr>
-              <w:keepNext/>
-              <w:spacing w:line="240" w:lineRule="auto" w:after="60"/>
-            </w:pPr>
-            <w:r>
-              <w:rPr>
-                <w:rFonts w:ascii="Arial" w:hAnsi="Arial"/>
-                <w:b w:val="0"/>
-                <w:sz w:val="20"/>
-              </w:rPr>
-              <w:t>Flujo modular y seis configuraciones, secciones 3.1 y 3.2.</w:t>
-            </w:r>
-          </w:p>
-        </w:tc>
-        <w:tc>
-          <w:tcPr>
-            <w:tcW w:type="dxa" w:w="2203"/>
-            <w:vAlign w:val="center"/>
-          </w:tcPr>
-          <w:p>
-            <w:pPr>
-              <w:keepNext/>
-              <w:spacing w:line="240" w:lineRule="auto" w:after="60"/>
-            </w:pPr>
-            <w:r>
-              <w:rPr>
-                <w:rFonts w:ascii="Arial" w:hAnsi="Arial"/>
-                <w:b w:val="0"/>
-                <w:sz w:val="20"/>
-              </w:rPr>
-              <w:t>Implementada; ergonomía pendiente</w:t>
-            </w:r>
-          </w:p>
-        </w:tc>
-      </w:tr>
-      <w:tr>
-        <w:trPr>
-          <w:cantSplit/>
-        </w:trPr>
-        <w:tc>
-          <w:tcPr>
-            <w:tcW w:type="dxa" w:w="3024"/>
-            <w:vAlign w:val="center"/>
-          </w:tcPr>
-          <w:p>
-            <w:pPr>
-              <w:keepNext/>
-              <w:spacing w:line="240" w:lineRule="auto" w:after="60"/>
-            </w:pPr>
-            <w:r>
-              <w:rPr>
-                <w:rFonts w:ascii="Arial" w:hAnsi="Arial"/>
-                <w:b w:val="0"/>
-                <w:sz w:val="20"/>
-              </w:rPr>
-              <w:t>2. Interfaz de captura</w:t>
-            </w:r>
-          </w:p>
-        </w:tc>
-        <w:tc>
-          <w:tcPr>
-            <w:tcW w:type="dxa" w:w="3528"/>
-            <w:vAlign w:val="center"/>
-          </w:tcPr>
-          <w:p>
-            <w:pPr>
-              <w:keepNext/>
-              <w:spacing w:line="240" w:lineRule="auto" w:after="60"/>
-            </w:pPr>
-            <w:r>
-              <w:rPr>
-                <w:rFonts w:ascii="Arial" w:hAnsi="Arial"/>
-                <w:b w:val="0"/>
-                <w:sz w:val="20"/>
-              </w:rPr>
-              <w:t>CameraX, captura manual y estados, secciones 3.3 y 3.11.</w:t>
-            </w:r>
-          </w:p>
-        </w:tc>
-        <w:tc>
-          <w:tcPr>
-            <w:tcW w:type="dxa" w:w="2203"/>
-            <w:vAlign w:val="center"/>
-          </w:tcPr>
-          <w:p>
-            <w:pPr>
-              <w:keepNext/>
-              <w:spacing w:line="240" w:lineRule="auto" w:after="60"/>
-            </w:pPr>
-            <w:r>
-              <w:rPr>
-                <w:rFonts w:ascii="Arial" w:hAnsi="Arial"/>
-                <w:b w:val="0"/>
-                <w:sz w:val="20"/>
-              </w:rPr>
-              <w:t>Implementada</w:t>
-            </w:r>
-          </w:p>
-        </w:tc>
-      </w:tr>
-      <w:tr>
-        <w:trPr>
-          <w:cantSplit/>
-        </w:trPr>
-        <w:tc>
-          <w:tcPr>
-            <w:tcW w:type="dxa" w:w="3024"/>
-            <w:vAlign w:val="center"/>
-          </w:tcPr>
-          <w:p>
-            <w:pPr>
-              <w:keepNext/>
-              <w:spacing w:line="240" w:lineRule="auto" w:after="60"/>
-            </w:pPr>
-            <w:r>
-              <w:rPr>
-                <w:rFonts w:ascii="Arial" w:hAnsi="Arial"/>
-                <w:b w:val="0"/>
-                <w:sz w:val="20"/>
-              </w:rPr>
-              <w:t>2. Adaptación e integración DNN</w:t>
-            </w:r>
-          </w:p>
-        </w:tc>
-        <w:tc>
-          <w:tcPr>
-            <w:tcW w:type="dxa" w:w="3528"/>
-            <w:vAlign w:val="center"/>
-          </w:tcPr>
-          <w:p>
-            <w:pPr>
-              <w:keepNext/>
-              <w:spacing w:line="240" w:lineRule="auto" w:after="60"/>
-            </w:pPr>
-            <w:r>
-              <w:rPr>
-                <w:rFonts w:ascii="Arial" w:hAnsi="Arial"/>
-                <w:b w:val="0"/>
-                <w:sz w:val="20"/>
-              </w:rPr>
-              <w:t>Modelo TFLite, letterbox y coordenadas, secciones 3.4 y 3.5.</w:t>
-            </w:r>
-          </w:p>
-        </w:tc>
-        <w:tc>
-          <w:tcPr>
-            <w:tcW w:type="dxa" w:w="2203"/>
-            <w:vAlign w:val="center"/>
-          </w:tcPr>
-          <w:p>
-            <w:pPr>
-              <w:keepNext/>
-              <w:spacing w:line="240" w:lineRule="auto" w:after="60"/>
-            </w:pPr>
-            <w:r>
-              <w:rPr>
-                <w:rFonts w:ascii="Arial" w:hAnsi="Arial"/>
-                <w:b w:val="0"/>
-                <w:sz w:val="20"/>
-              </w:rPr>
-              <w:t>Implementada; sin entrenamiento nuevo</w:t>
-            </w:r>
-          </w:p>
-        </w:tc>
-      </w:tr>
-      <w:tr>
-        <w:trPr>
-          <w:cantSplit/>
-        </w:trPr>
-        <w:tc>
-          <w:tcPr>
-            <w:tcW w:type="dxa" w:w="3024"/>
-            <w:vAlign w:val="center"/>
-          </w:tcPr>
-          <w:p>
-            <w:pPr>
-              <w:keepNext/>
-              <w:spacing w:line="240" w:lineRule="auto" w:after="60"/>
-            </w:pPr>
-            <w:r>
-              <w:rPr>
-                <w:rFonts w:ascii="Arial" w:hAnsi="Arial"/>
-                <w:b w:val="0"/>
-                <w:sz w:val="20"/>
-              </w:rPr>
-              <w:t>2. Módulo de audio</w:t>
-            </w:r>
-          </w:p>
-        </w:tc>
-        <w:tc>
-          <w:tcPr>
-            <w:tcW w:type="dxa" w:w="3528"/>
-            <w:vAlign w:val="center"/>
-          </w:tcPr>
-          <w:p>
-            <w:pPr>
-              <w:keepNext/>
-              <w:spacing w:line="240" w:lineRule="auto" w:after="60"/>
-            </w:pPr>
-            <w:r>
-              <w:rPr>
-                <w:rFonts w:ascii="Arial" w:hAnsi="Arial"/>
-                <w:b w:val="0"/>
-                <w:sz w:val="20"/>
-              </w:rPr>
-              <w:t>Síntesis local y formato de mensajes, sección 3.8.</w:t>
-            </w:r>
-          </w:p>
-        </w:tc>
-        <w:tc>
-          <w:tcPr>
-            <w:tcW w:type="dxa" w:w="2203"/>
-            <w:vAlign w:val="center"/>
-          </w:tcPr>
-          <w:p>
-            <w:pPr>
-              <w:keepNext/>
-              <w:spacing w:line="240" w:lineRule="auto" w:after="60"/>
-            </w:pPr>
-            <w:r>
-              <w:rPr>
-                <w:rFonts w:ascii="Arial" w:hAnsi="Arial"/>
-                <w:b w:val="0"/>
-                <w:sz w:val="20"/>
-              </w:rPr>
-              <w:t>Implementada; claridad no evaluada</w:t>
-            </w:r>
-          </w:p>
-        </w:tc>
-      </w:tr>
-      <w:tr>
-        <w:trPr>
-          <w:cantSplit/>
-        </w:trPr>
-        <w:tc>
-          <w:tcPr>
-            <w:tcW w:type="dxa" w:w="3024"/>
-            <w:vAlign w:val="center"/>
-          </w:tcPr>
-          <w:p>
-            <w:pPr>
-              <w:keepNext/>
-              <w:spacing w:line="240" w:lineRule="auto" w:after="60"/>
-            </w:pPr>
-            <w:r>
-              <w:rPr>
-                <w:rFonts w:ascii="Arial" w:hAnsi="Arial"/>
-                <w:b w:val="0"/>
-                <w:sz w:val="20"/>
-              </w:rPr>
-              <w:t>2. Prototipo móvil</w:t>
-            </w:r>
-          </w:p>
-        </w:tc>
-        <w:tc>
-          <w:tcPr>
-            <w:tcW w:type="dxa" w:w="3528"/>
-            <w:vAlign w:val="center"/>
-          </w:tcPr>
-          <w:p>
-            <w:pPr>
-              <w:keepNext/>
-              <w:spacing w:line="240" w:lineRule="auto" w:after="60"/>
-            </w:pPr>
-            <w:r>
-              <w:rPr>
-                <w:rFonts w:ascii="Arial" w:hAnsi="Arial"/>
-                <w:b w:val="0"/>
-                <w:sz w:val="20"/>
-              </w:rPr>
-              <w:t>Integración Android y pruebas, sección 3.12 y anexo B.</w:t>
-            </w:r>
-          </w:p>
-        </w:tc>
-        <w:tc>
-          <w:tcPr>
-            <w:tcW w:type="dxa" w:w="2203"/>
-            <w:vAlign w:val="center"/>
-          </w:tcPr>
-          <w:p>
-            <w:pPr>
-              <w:keepNext/>
-              <w:spacing w:line="240" w:lineRule="auto" w:after="60"/>
-            </w:pPr>
-            <w:r>
-              <w:rPr>
-                <w:rFonts w:ascii="Arial" w:hAnsi="Arial"/>
-                <w:b w:val="0"/>
-                <w:sz w:val="20"/>
-              </w:rPr>
-              <w:t>Implementada; no validada con usuarios</w:t>
-            </w:r>
-          </w:p>
-        </w:tc>
-      </w:tr>
-      <w:tr>
-        <w:trPr>
-          <w:cantSplit/>
-        </w:trPr>
-        <w:tc>
-          <w:tcPr>
-            <w:tcW w:type="dxa" w:w="3024"/>
-            <w:vAlign w:val="center"/>
-          </w:tcPr>
-          <w:p>
-            <w:pPr>
-              <w:keepNext/>
-              <w:spacing w:line="240" w:lineRule="auto" w:after="60"/>
-            </w:pPr>
-            <w:r>
-              <w:rPr>
-                <w:rFonts w:ascii="Arial" w:hAnsi="Arial"/>
-                <w:b w:val="0"/>
-                <w:sz w:val="20"/>
-              </w:rPr>
-              <w:t>3. Posicionamiento del dispositivo</w:t>
-            </w:r>
-          </w:p>
-        </w:tc>
-        <w:tc>
-          <w:tcPr>
-            <w:tcW w:type="dxa" w:w="3528"/>
-            <w:vAlign w:val="center"/>
-          </w:tcPr>
-          <w:p>
-            <w:pPr>
-              <w:keepNext/>
-              <w:spacing w:line="240" w:lineRule="auto" w:after="60"/>
-            </w:pPr>
-            <w:r>
-              <w:rPr>
-                <w:rFonts w:ascii="Arial" w:hAnsi="Arial"/>
-                <w:b w:val="0"/>
-                <w:sz w:val="20"/>
-              </w:rPr>
-              <w:t>33 grupos y seis configuraciones, secciones 4.2 y 4.3.</w:t>
-            </w:r>
-          </w:p>
-        </w:tc>
-        <w:tc>
-          <w:tcPr>
-            <w:tcW w:type="dxa" w:w="2203"/>
-            <w:vAlign w:val="center"/>
-          </w:tcPr>
-          <w:p>
-            <w:pPr>
-              <w:keepNext/>
-              <w:spacing w:line="240" w:lineRule="auto" w:after="60"/>
-            </w:pPr>
-            <w:r>
-              <w:rPr>
-                <w:rFonts w:ascii="Arial" w:hAnsi="Arial"/>
-                <w:b w:val="0"/>
-                <w:sz w:val="20"/>
-              </w:rPr>
-              <w:t>Parcial; sin estabilidad ni comodidad</w:t>
-            </w:r>
-          </w:p>
-        </w:tc>
-      </w:tr>
-      <w:tr>
-        <w:trPr>
-          <w:cantSplit/>
-        </w:trPr>
-        <w:tc>
-          <w:tcPr>
-            <w:tcW w:type="dxa" w:w="3024"/>
-            <w:vAlign w:val="center"/>
-          </w:tcPr>
-          <w:p>
-            <w:pPr>
-              <w:keepNext/>
-              <w:spacing w:line="240" w:lineRule="auto" w:after="60"/>
-            </w:pPr>
-            <w:r>
-              <w:rPr>
-                <w:rFonts w:ascii="Arial" w:hAnsi="Arial"/>
-                <w:b w:val="0"/>
-                <w:sz w:val="20"/>
-              </w:rPr>
-              <w:t>3. Escenarios según objetos</w:t>
-            </w:r>
-          </w:p>
-        </w:tc>
-        <w:tc>
-          <w:tcPr>
-            <w:tcW w:type="dxa" w:w="3528"/>
-            <w:vAlign w:val="center"/>
-          </w:tcPr>
-          <w:p>
-            <w:pPr>
-              <w:keepNext/>
-              <w:spacing w:line="240" w:lineRule="auto" w:after="60"/>
-            </w:pPr>
-            <w:r>
-              <w:rPr>
-                <w:rFonts w:ascii="Arial" w:hAnsi="Arial"/>
-                <w:b w:val="0"/>
-                <w:sz w:val="20"/>
-              </w:rPr>
-              <w:t>198 fotografías, 889 instancias y diez clases, secciones 4.1 y 4.5.</w:t>
-            </w:r>
-          </w:p>
-        </w:tc>
-        <w:tc>
-          <w:tcPr>
-            <w:tcW w:type="dxa" w:w="2203"/>
-            <w:vAlign w:val="center"/>
-          </w:tcPr>
-          <w:p>
-            <w:pPr>
-              <w:keepNext/>
-              <w:spacing w:line="240" w:lineRule="auto" w:after="60"/>
-            </w:pPr>
-            <w:r>
-              <w:rPr>
-                <w:rFonts w:ascii="Arial" w:hAnsi="Arial"/>
-                <w:b w:val="0"/>
-                <w:sz w:val="20"/>
-              </w:rPr>
-              <w:t>Documentada; predominan sillas</w:t>
-            </w:r>
-          </w:p>
-        </w:tc>
-      </w:tr>
-      <w:tr>
-        <w:trPr>
-          <w:cantSplit/>
-        </w:trPr>
-        <w:tc>
-          <w:tcPr>
-            <w:tcW w:type="dxa" w:w="3024"/>
-            <w:vAlign w:val="center"/>
-          </w:tcPr>
-          <w:p>
-            <w:pPr>
-              <w:keepNext/>
-              <w:spacing w:line="240" w:lineRule="auto" w:after="60"/>
-            </w:pPr>
-            <w:r>
-              <w:rPr>
-                <w:rFonts w:ascii="Arial" w:hAnsi="Arial"/>
-                <w:b w:val="0"/>
-                <w:sz w:val="20"/>
-              </w:rPr>
-              <w:t>3. Oclusión, iluminación y respuesta</w:t>
-            </w:r>
-          </w:p>
-        </w:tc>
-        <w:tc>
-          <w:tcPr>
-            <w:tcW w:type="dxa" w:w="3528"/>
-            <w:vAlign w:val="center"/>
-          </w:tcPr>
-          <w:p>
-            <w:pPr>
-              <w:keepNext/>
-              <w:spacing w:line="240" w:lineRule="auto" w:after="60"/>
-            </w:pPr>
-            <w:r>
-              <w:rPr>
-                <w:rFonts w:ascii="Arial" w:hAnsi="Arial"/>
-                <w:b w:val="0"/>
-                <w:sz w:val="20"/>
-              </w:rPr>
-              <w:t>Métricas, tiempos y brillo, secciones 4.5, 4.7 y 4.8.</w:t>
-            </w:r>
-          </w:p>
-        </w:tc>
-        <w:tc>
-          <w:tcPr>
-            <w:tcW w:type="dxa" w:w="2203"/>
-            <w:vAlign w:val="center"/>
-          </w:tcPr>
-          <w:p>
-            <w:pPr>
-              <w:keepNext/>
-              <w:spacing w:line="240" w:lineRule="auto" w:after="60"/>
-            </w:pPr>
-            <w:r>
-              <w:rPr>
-                <w:rFonts w:ascii="Arial" w:hAnsi="Arial"/>
-                <w:b w:val="0"/>
-                <w:sz w:val="20"/>
-              </w:rPr>
-              <w:t>Parcial; faltan oclusión, lux y latencia con voz</w:t>
-            </w:r>
-          </w:p>
-        </w:tc>
-      </w:tr>
-      <w:tr>
-        <w:trPr>
-          <w:cantSplit/>
-        </w:trPr>
-        <w:tc>
-          <w:tcPr>
-            <w:tcW w:type="dxa" w:w="3024"/>
-            <w:vAlign w:val="center"/>
-          </w:tcPr>
-          <w:p>
-            <w:pPr>
-              <w:keepNext w:val="0"/>
-              <w:spacing w:line="240" w:lineRule="auto" w:after="60"/>
-            </w:pPr>
-            <w:r>
-              <w:rPr>
-                <w:rFonts w:ascii="Arial" w:hAnsi="Arial"/>
-                <w:b w:val="0"/>
-                <w:sz w:val="20"/>
-              </w:rPr>
-              <w:t>3. Informe y recomendaciones</w:t>
-            </w:r>
-          </w:p>
-        </w:tc>
-        <w:tc>
-          <w:tcPr>
-            <w:tcW w:type="dxa" w:w="3528"/>
-            <w:vAlign w:val="center"/>
-          </w:tcPr>
-          <w:p>
-            <w:pPr>
-              <w:keepNext w:val="0"/>
-              <w:spacing w:line="240" w:lineRule="auto" w:after="60"/>
-            </w:pPr>
-            <w:r>
-              <w:rPr>
-                <w:rFonts w:ascii="Arial" w:hAnsi="Arial"/>
-                <w:b w:val="0"/>
-                <w:sz w:val="20"/>
-              </w:rPr>
-              <w:t>Resultados, límites, conclusiones y trabajo futuro.</w:t>
-            </w:r>
-          </w:p>
-        </w:tc>
-        <w:tc>
-          <w:tcPr>
-            <w:tcW w:type="dxa" w:w="2203"/>
-            <w:vAlign w:val="center"/>
-          </w:tcPr>
-          <w:p>
-            <w:pPr>
-              <w:keepNext w:val="0"/>
-              <w:spacing w:line="240" w:lineRule="auto" w:after="60"/>
-            </w:pPr>
-            <w:r>
-              <w:rPr>
-                <w:rFonts w:ascii="Arial" w:hAnsi="Arial"/>
-                <w:b w:val="0"/>
-                <w:sz w:val="20"/>
-              </w:rPr>
-              <w:t>Documentada; cierre institucional pendiente</w:t>
-            </w:r>
-          </w:p>
-        </w:tc>
-      </w:tr>
-    </w:tbl>
-    <w:p>
-      <w:pPr>
-        <w:spacing w:line="240" w:lineRule="auto" w:after="160"/>
-        <w:jc w:val="center"/>
-      </w:pPr>
-      <w:r>
-        <w:rPr>
-          <w:rFonts w:ascii="Arial" w:hAnsi="Arial"/>
-          <w:sz w:val="20"/>
-        </w:rPr>
-        <w:t>Fuente: elaboración propia con datos y especificaciones del proyecto.</w:t>
-      </w:r>
-    </w:p>
-    <w:p>
-      <w:pPr>
-        <w:widowControl/>
-        <w:spacing w:line="360" w:lineRule="auto" w:after="330"/>
-        <w:jc w:val="both"/>
-      </w:pPr>
-      <w:r>
-        <w:t>El primer objetivo específico cuenta con comparación experimental y selección explícita; el segundo, con un prototipo integrado y verificación técnica. El tercero dispone de resultados de detección y tiempos de procesamiento parciales, pero no de claridad auditiva ni de ensayos controlados de oclusión e iluminación. En consecuencia, el informe sustenta desarrollo y evaluación técnica parcial; el cierre de la evaluación con usuarios debe mantenerse como una actividad pendiente, en correspondencia con el objetivo original.</w:t>
-      </w:r>
-    </w:p>
-    <w:p>
       <w:pPr>
         <w:pStyle w:val="Prrafodelista"/>
         <w:rPr>
@@ -24779,7 +23680,7 @@
       </w:pPr>
     </w:p>
     <w:p>
-      <w:bookmarkStart w:id="1078" w:name="report_1078"/>
+      <w:bookmarkStart w:id="1076" w:name="report_1076"/>
       <w:pPr>
         <w:pStyle w:val="Ttulo1"/>
       </w:pPr>
@@ -24820,17 +23721,17 @@
       <w:r>
         <w:t xml:space="preserve"> </w:t>
       </w:r>
-      <w:bookmarkEnd w:id="1078"/>
-    </w:p>
-    <w:p>
-      <w:bookmarkStart w:id="1079" w:name="report_1079"/>
+      <w:bookmarkEnd w:id="1076"/>
+    </w:p>
+    <w:p>
+      <w:bookmarkStart w:id="1077" w:name="report_1077"/>
       <w:pPr>
         <w:pStyle w:val="Ttulo2"/>
       </w:pPr>
       <w:r>
         <w:t xml:space="preserve">5.1 Conclusiones</w:t>
       </w:r>
-      <w:bookmarkEnd w:id="1079"/>
+      <w:bookmarkEnd w:id="1077"/>
     </w:p>
     <w:p>
       <w:pPr>
@@ -24941,14 +23842,14 @@
       </w:r>
     </w:p>
     <w:p>
-      <w:bookmarkStart w:id="1080" w:name="report_1080"/>
+      <w:bookmarkStart w:id="1078" w:name="report_1078"/>
       <w:pPr>
         <w:pStyle w:val="Ttulo2"/>
       </w:pPr>
       <w:r>
         <w:t xml:space="preserve">5.2 Recomendaciones</w:t>
       </w:r>
-      <w:bookmarkEnd w:id="1080"/>
+      <w:bookmarkEnd w:id="1078"/>
     </w:p>
     <w:p>
       <w:pPr>
@@ -24971,14 +23872,14 @@
       </w:r>
     </w:p>
     <w:p>
-      <w:bookmarkStart w:id="1081" w:name="report_1081"/>
+      <w:bookmarkStart w:id="1079" w:name="report_1079"/>
       <w:pPr>
         <w:pStyle w:val="Ttulo2"/>
       </w:pPr>
       <w:r>
         <w:t xml:space="preserve">5.3 Trabajo futuro</w:t>
       </w:r>
-      <w:bookmarkEnd w:id="1081"/>
+      <w:bookmarkEnd w:id="1079"/>
     </w:p>
     <w:p>
       <w:pPr>
@@ -25021,7 +23922,7 @@
       </w:pPr>
     </w:p>
     <w:p>
-      <w:bookmarkStart w:id="1082" w:name="report_1082"/>
+      <w:bookmarkStart w:id="1080" w:name="report_1080"/>
       <w:pPr>
         <w:pStyle w:val="Subttulo"/>
         <w:spacing w:line="360" w:lineRule="auto"/>
@@ -25043,7 +23944,7 @@
       <w:bookmarkEnd w:id="85"/>
       <w:bookmarkEnd w:id="86"/>
       <w:bookmarkEnd w:id="87"/>
-      <w:bookmarkEnd w:id="1082"/>
+      <w:bookmarkEnd w:id="1080"/>
     </w:p>
     <w:p>
       <w:pPr>
@@ -25155,7 +24056,7 @@
       </w:pPr>
     </w:p>
     <w:p>
-      <w:bookmarkStart w:id="1083" w:name="report_1083"/>
+      <w:bookmarkStart w:id="1081" w:name="report_1081"/>
       <w:pPr>
         <w:pStyle w:val="Subttulo"/>
         <w:spacing w:line="360" w:lineRule="auto"/>
@@ -25177,7 +24078,7 @@
       <w:bookmarkEnd w:id="89"/>
       <w:bookmarkEnd w:id="90"/>
       <w:bookmarkEnd w:id="91"/>
-      <w:bookmarkEnd w:id="1083"/>
+      <w:bookmarkEnd w:id="1081"/>
     </w:p>
     <w:p>
       <w:pPr>
@@ -25242,7 +24143,7 @@
       </w:r>
     </w:p>
     <w:p>
-      <w:bookmarkStart w:id="1084" w:name="report_1084"/>
+      <w:bookmarkStart w:id="1082" w:name="report_1082"/>
       <w:pPr>
         <w:pStyle w:val="Subttulo"/>
         <w:pageBreakBefore/>
@@ -25253,7 +24154,7 @@
       <w:r>
         <w:t xml:space="preserve">Anexo C: Manuales técnico y de usuario</w:t>
       </w:r>
-      <w:bookmarkEnd w:id="1084"/>
+      <w:bookmarkEnd w:id="1082"/>
     </w:p>
     <w:p>
       <w:pPr>
@@ -25297,7 +24198,7 @@
       </w:pPr>
     </w:p>
     <w:p>
-      <w:bookmarkStart w:id="1085" w:name="report_1085"/>
+      <w:bookmarkStart w:id="1083" w:name="report_1083"/>
       <w:pPr>
         <w:pStyle w:val="Ttulosposteriores"/>
         <w:pageBreakBefore/>
@@ -25314,7 +24215,7 @@
       <w:bookmarkEnd w:id="93"/>
       <w:bookmarkEnd w:id="94"/>
       <w:bookmarkEnd w:id="95"/>
-      <w:bookmarkEnd w:id="1085"/>
+      <w:bookmarkEnd w:id="1083"/>
     </w:p>
     <w:p>
       <w:pPr>

</xml_diff>

<commit_message>
analysis: label and evaluate occlusion with reviewable AI-assisted annotations
</commit_message>
<xml_diff>
--- a/Documents/Informe_Final_Trabajo_de_Grado_AssistiveVision.docx
+++ b/Documents/Informe_Final_Trabajo_de_Grado_AssistiveVision.docx
@@ -2418,9 +2418,9 @@
         <w:t>5. Conclusiones</w:t>
         <w:tab/>
       </w:r>
-      <w:fldSimple w:instr=" PAGEREF report_1076 \h ">
+      <w:fldSimple w:instr=" PAGEREF report_1077 \h ">
         <w:r>
-          <w:t>45</w:t>
+          <w:t>47</w:t>
         </w:r>
       </w:fldSimple>
     </w:p>
@@ -2437,9 +2437,9 @@
         <w:t>5.1 Conclusiones</w:t>
         <w:tab/>
       </w:r>
-      <w:fldSimple w:instr=" PAGEREF report_1077 \h ">
+      <w:fldSimple w:instr=" PAGEREF report_1078 \h ">
         <w:r>
-          <w:t>45</w:t>
+          <w:t>47</w:t>
         </w:r>
       </w:fldSimple>
     </w:p>
@@ -2456,9 +2456,9 @@
         <w:t>5.2 Recomendaciones</w:t>
         <w:tab/>
       </w:r>
-      <w:fldSimple w:instr=" PAGEREF report_1078 \h ">
+      <w:fldSimple w:instr=" PAGEREF report_1079 \h ">
         <w:r>
-          <w:t>46</w:t>
+          <w:t>48</w:t>
         </w:r>
       </w:fldSimple>
     </w:p>
@@ -2475,9 +2475,9 @@
         <w:t>5.3 Trabajo futuro</w:t>
         <w:tab/>
       </w:r>
-      <w:fldSimple w:instr=" PAGEREF report_1079 \h ">
+      <w:fldSimple w:instr=" PAGEREF report_1080 \h ">
         <w:r>
-          <w:t>46</w:t>
+          <w:t>48</w:t>
         </w:r>
       </w:fldSimple>
     </w:p>
@@ -2497,9 +2497,9 @@
         <w:t>Anexo A: Scripts de evaluación de modelos</w:t>
         <w:tab/>
       </w:r>
-      <w:fldSimple w:instr=" PAGEREF report_1080 \h ">
+      <w:fldSimple w:instr=" PAGEREF report_1081 \h ">
         <w:r>
-          <w:t>49</w:t>
+          <w:t>51</w:t>
         </w:r>
       </w:fldSimple>
     </w:p>
@@ -2519,9 +2519,9 @@
         <w:t>Anexo B: Pruebas unitarias del prototipo</w:t>
         <w:tab/>
       </w:r>
-      <w:fldSimple w:instr=" PAGEREF report_1081 \h ">
+      <w:fldSimple w:instr=" PAGEREF report_1082 \h ">
         <w:r>
-          <w:t>51</w:t>
+          <w:t>53</w:t>
         </w:r>
       </w:fldSimple>
     </w:p>
@@ -2541,9 +2541,9 @@
         <w:t>Anexo C: Manuales técnico y de usuario</w:t>
         <w:tab/>
       </w:r>
-      <w:fldSimple w:instr=" PAGEREF report_1082 \h ">
+      <w:fldSimple w:instr=" PAGEREF report_1083 \h ">
         <w:r>
-          <w:t>52</w:t>
+          <w:t>54</w:t>
         </w:r>
       </w:fldSimple>
     </w:p>
@@ -2560,9 +2560,9 @@
         <w:t>Bibliografía</w:t>
         <w:tab/>
       </w:r>
-      <w:fldSimple w:instr=" PAGEREF report_1083 \h ">
+      <w:fldSimple w:instr=" PAGEREF report_1084 \h ">
         <w:r>
-          <w:t>53</w:t>
+          <w:t>55</w:t>
         </w:r>
       </w:fldSimple>
     </w:p>
@@ -3184,6 +3184,28 @@
       <w:fldSimple w:instr=" PAGEREF report_1075 \h ">
         <w:r>
           <w:t>43</w:t>
+        </w:r>
+      </w:fldSimple>
+    </w:p>
+    <w:p>
+      <w:pPr>
+        <w:pStyle w:val="TDC1"/>
+        <w:tabs>
+          <w:tab w:pos="8755" w:val="right" w:leader="dot"/>
+        </w:tabs>
+        <w:spacing w:line="240" w:lineRule="auto" w:after="80"/>
+        <w:jc w:val="left"/>
+      </w:pPr>
+      <w:r>
+        <w:rPr>
+          <w:b w:val="0"/>
+        </w:rPr>
+        <w:t>Tabla 4.10. Recall por nivel de oclusión con etiquetas asistidas por IA.</w:t>
+        <w:tab/>
+      </w:r>
+      <w:fldSimple w:instr=" PAGEREF report_1076 \h ">
+        <w:r>
+          <w:t>44</w:t>
         </w:r>
       </w:fldSimple>
     </w:p>
@@ -3679,7 +3701,7 @@
         <w:jc w:val="both"/>
       </w:pPr>
       <w:r>
-        <w:t>La evaluación de la fase 3 cubre detección y procesamiento de imágenes; la iluminación se explora mediante brillo digital, sin mediciones de iluminancia, y la oclusión no cuenta con etiquetas específicas. La claridad auditiva, el tiempo hasta escuchar el mensaje y el efecto sobre la autonomía requieren evaluación adicional. El análisis geométrico de distancia es complementario y no sustituye estas actividades.</w:t>
+        <w:t>La evaluación de la fase 3 cubre detección y procesamiento de imágenes; la iluminación se explora mediante brillo digital, sin mediciones de iluminancia, y la oclusión se explora con etiquetas suplementarias asistidas por IA, sujetas a revisión del autor. La claridad auditiva, el tiempo hasta escuchar el mensaje y el efecto sobre la autonomía requieren evaluación adicional. El análisis geométrico de distancia es complementario y no sustituye estas actividades.</w:t>
       </w:r>
     </w:p>
     <w:p>
@@ -23041,7 +23063,7 @@
         <w:jc w:val="both"/>
       </w:pPr>
       <w:r>
-        <w:t>La propuesta incluye iluminación y oclusión como condiciones de evaluación [34]. Las fotografías no tienen registros de lux ni etiquetas de oclusión. Como análisis posterior disponible, se calculó el brillo digital medio de cada JPEG a resolución original mediante la conversión RGB a escala de grises de ocho bits de Pillow [35]. Se dividió la muestra en tres grupos mediante los cuantiles 1/3 y 2/3 del brillo medio. Son grupos relativos a esta muestra; no se denominan iluminación baja, normal o alta, porque el brillo depende también de exposición, superficies y composición de la escena.</w:t>
+        <w:t>La propuesta incluye iluminación y oclusión como condiciones de evaluación [34]. Las fotografías no tienen registros de lux; la oclusión se analiza posteriormente con etiquetas suplementarias asistidas por IA. Como análisis posterior disponible, se calculó el brillo digital medio de cada JPEG a resolución original mediante la conversión RGB a escala de grises de ocho bits de Pillow [35]. Se dividió la muestra en tres grupos mediante los cuantiles 1/3 y 2/3 del brillo medio. Son grupos relativos a esta muestra; no se denominan iluminación baja, normal o alta, porque el brillo depende también de exposición, superficies y composición de la escena.</w:t>
       </w:r>
     </w:p>
     <w:p>
@@ -23652,12 +23674,803 @@
     </w:p>
     <w:p>
       <w:pPr>
+        <w:pStyle w:val="Ttulo3"/>
+      </w:pPr>
+      <w:r>
+        <w:t>4.8.1 Análisis observacional de oclusión</w:t>
+      </w:r>
+    </w:p>
+    <w:p>
+      <w:pPr>
         <w:widowControl/>
         <w:spacing w:line="360" w:lineRule="auto" w:after="330"/>
         <w:jc w:val="both"/>
       </w:pPr>
       <w:r>
-        <w:t>La oclusión requiere una revisión adicional de las imágenes originales. Las cajas COCO disponibles no incluyen fracción visible, límites completos de objetos ocultos ni etiquetas de severidad. El área de una caja pequeña puede deberse a distancia, tamaño físico u oclusión, por lo que no se usa como sustituto de oclusión. Con las fotografías actuales se puede crear una anotación manual de ausencia, oclusión parcial y truncamiento por borde, con definiciones previas y revisión independiente, y después estratificar detección por clase y tamaño aparente. Esa anotación no se presenta como realizada. Las pruebas con iluminación controlada y distancias medidas requieren capturas nuevas.</w:t>
+        <w:t>Se inspeccionaron las 198 fotografías y se asignó una etiqueta suplementaria a cada una de las 889 instancias COCO, sin modificar sus cajas ni volver a ejecutar el detector. Dos lotes disjuntos fueron revisados visualmente con GPT-6 Astra y razonamiento High, sin mostrar predicciones durante el etiquetado. El protocolo distingue ausencia de obstrucción externa, oclusión parcial y fuerte; los casos ambiguos se conservan como inciertos. El truncamiento por borde se registra aparte, y el tamaño pequeño o la perspectiva no se consideran por sí solos oclusión. La severidad es cualitativa y no corresponde a porcentajes medidos de superficie oculta.</w:t>
+      </w:r>
+    </w:p>
+    <w:p>
+      <w:pPr>
+        <w:widowControl/>
+        <w:spacing w:line="360" w:lineRule="auto" w:after="330"/>
+        <w:jc w:val="both"/>
+      </w:pPr>
+      <w:r>
+        <w:t xml:space="preserve">Las etiquetas son asistidas por IA y provisionales hasta la revisión del autor; los dos lotes no constituyen doble revisión independiente. Se registra motivo, confianza e identificador de anotación, y se proporciona una interfaz local para corregir los casos. El análisis utiliza el emparejamiento del </w:t>
+      </w:r>
+      <w:r>
+        <w:rPr>
+          <w:i/>
+        </w:rPr>
+        <w:t>benchmark</w:t>
+      </w:r>
+      <w:r>
+        <w:t xml:space="preserve"> con confianza 0,30, IoU mínimo 0,50 y coincidencia de clase. Se calcula </w:t>
+      </w:r>
+      <w:r>
+        <w:rPr>
+          <w:i/>
+        </w:rPr>
+        <w:t>recall</w:t>
+      </w:r>
+      <w:r>
+        <w:t xml:space="preserve"> por nivel; los falsos positivos sin objeto de referencia no reciben una etiqueta de oclusión.</w:t>
+      </w:r>
+    </w:p>
+    <w:p>
+      <w:bookmarkStart w:id="1076" w:name="report_1076"/>
+      <w:pPr>
+        <w:pStyle w:val="Descripcin"/>
+        <w:keepNext/>
+        <w:spacing w:line="240" w:lineRule="auto" w:before="160" w:after="160"/>
+        <w:jc w:val="center"/>
+      </w:pPr>
+      <w:r>
+        <w:rPr>
+          <w:sz w:val="20"/>
+        </w:rPr>
+        <w:t xml:space="preserve">Tabla 4.10. </w:t>
+      </w:r>
+      <w:r>
+        <w:rPr>
+          <w:i/>
+          <w:sz w:val="20"/>
+        </w:rPr>
+        <w:t>Recall</w:t>
+      </w:r>
+      <w:r>
+        <w:rPr>
+          <w:sz w:val="20"/>
+        </w:rPr>
+        <w:t xml:space="preserve"> por nivel de oclusión con etiquetas asistidas por IA.</w:t>
+      </w:r>
+      <w:bookmarkEnd w:id="1076"/>
+    </w:p>
+    <w:tbl>
+      <w:tblPr>
+        <w:tblW w:type="auto" w:w="0"/>
+        <w:tblLayout w:type="fixed"/>
+        <w:tblLook w:firstColumn="1" w:firstRow="1" w:lastColumn="0" w:lastRow="0" w:noHBand="0" w:noVBand="1" w:val="04A0"/>
+        <w:tblBorders>
+          <w:top w:val="single" w:sz="4" w:color="D9D9D9"/>
+          <w:left w:val="single" w:sz="4" w:color="D9D9D9"/>
+          <w:bottom w:val="single" w:sz="4" w:color="D9D9D9"/>
+          <w:right w:val="single" w:sz="4" w:color="D9D9D9"/>
+          <w:insideH w:val="single" w:sz="4" w:color="D9D9D9"/>
+          <w:insideV w:val="single" w:sz="4" w:color="D9D9D9"/>
+        </w:tblBorders>
+      </w:tblPr>
+      <w:tblGrid>
+        <w:gridCol w:w="1944"/>
+        <w:gridCol w:w="864"/>
+        <w:gridCol w:w="864"/>
+        <w:gridCol w:w="864"/>
+        <w:gridCol w:w="1224"/>
+        <w:gridCol w:w="2995"/>
+      </w:tblGrid>
+      <w:tr>
+        <w:trPr>
+          <w:cantSplit/>
+          <w:tblHeader/>
+        </w:trPr>
+        <w:tc>
+          <w:tcPr>
+            <w:tcW w:type="dxa" w:w="1944"/>
+            <w:vAlign w:val="center"/>
+            <w:shd w:fill="EEEEEE"/>
+          </w:tcPr>
+          <w:p>
+            <w:pPr>
+              <w:keepNext/>
+              <w:spacing w:line="240" w:lineRule="auto" w:after="60"/>
+            </w:pPr>
+            <w:r>
+              <w:rPr>
+                <w:rFonts w:ascii="Arial" w:hAnsi="Arial"/>
+                <w:b/>
+                <w:sz w:val="18"/>
+              </w:rPr>
+              <w:t>Oclusión</w:t>
+            </w:r>
+          </w:p>
+        </w:tc>
+        <w:tc>
+          <w:tcPr>
+            <w:tcW w:type="dxa" w:w="864"/>
+            <w:vAlign w:val="center"/>
+            <w:shd w:fill="EEEEEE"/>
+          </w:tcPr>
+          <w:p>
+            <w:pPr>
+              <w:keepNext/>
+              <w:spacing w:line="240" w:lineRule="auto" w:after="60"/>
+            </w:pPr>
+            <w:r>
+              <w:rPr>
+                <w:rFonts w:ascii="Arial" w:hAnsi="Arial"/>
+                <w:b/>
+                <w:sz w:val="18"/>
+              </w:rPr>
+              <w:t>GT</w:t>
+            </w:r>
+          </w:p>
+        </w:tc>
+        <w:tc>
+          <w:tcPr>
+            <w:tcW w:type="dxa" w:w="864"/>
+            <w:vAlign w:val="center"/>
+            <w:shd w:fill="EEEEEE"/>
+          </w:tcPr>
+          <w:p>
+            <w:pPr>
+              <w:keepNext/>
+              <w:spacing w:line="240" w:lineRule="auto" w:after="60"/>
+            </w:pPr>
+            <w:r>
+              <w:rPr>
+                <w:rFonts w:ascii="Arial" w:hAnsi="Arial"/>
+                <w:b/>
+                <w:sz w:val="18"/>
+              </w:rPr>
+              <w:t>TP</w:t>
+            </w:r>
+          </w:p>
+        </w:tc>
+        <w:tc>
+          <w:tcPr>
+            <w:tcW w:type="dxa" w:w="864"/>
+            <w:vAlign w:val="center"/>
+            <w:shd w:fill="EEEEEE"/>
+          </w:tcPr>
+          <w:p>
+            <w:pPr>
+              <w:keepNext/>
+              <w:spacing w:line="240" w:lineRule="auto" w:after="60"/>
+            </w:pPr>
+            <w:r>
+              <w:rPr>
+                <w:rFonts w:ascii="Arial" w:hAnsi="Arial"/>
+                <w:b/>
+                <w:sz w:val="18"/>
+              </w:rPr>
+              <w:t>FN</w:t>
+            </w:r>
+          </w:p>
+        </w:tc>
+        <w:tc>
+          <w:tcPr>
+            <w:tcW w:type="dxa" w:w="1224"/>
+            <w:vAlign w:val="center"/>
+            <w:shd w:fill="EEEEEE"/>
+          </w:tcPr>
+          <w:p>
+            <w:pPr>
+              <w:keepNext/>
+              <w:spacing w:line="240" w:lineRule="auto" w:after="60"/>
+            </w:pPr>
+            <w:r>
+              <w:rPr>
+                <w:rFonts w:ascii="Arial" w:hAnsi="Arial"/>
+                <w:b/>
+                <w:sz w:val="18"/>
+              </w:rPr>
+              <w:t>Recall</w:t>
+            </w:r>
+          </w:p>
+        </w:tc>
+        <w:tc>
+          <w:tcPr>
+            <w:tcW w:type="dxa" w:w="2995"/>
+            <w:vAlign w:val="center"/>
+            <w:shd w:fill="EEEEEE"/>
+          </w:tcPr>
+          <w:p>
+            <w:pPr>
+              <w:keepNext/>
+              <w:spacing w:line="240" w:lineRule="auto" w:after="60"/>
+            </w:pPr>
+            <w:r>
+              <w:rPr>
+                <w:rFonts w:ascii="Arial" w:hAnsi="Arial"/>
+                <w:b/>
+                <w:sz w:val="18"/>
+              </w:rPr>
+              <w:t>IC 95 %</w:t>
+            </w:r>
+          </w:p>
+        </w:tc>
+      </w:tr>
+      <w:tr>
+        <w:trPr>
+          <w:cantSplit/>
+        </w:trPr>
+        <w:tc>
+          <w:tcPr>
+            <w:tcW w:type="dxa" w:w="1944"/>
+            <w:vAlign w:val="center"/>
+          </w:tcPr>
+          <w:p>
+            <w:pPr>
+              <w:keepNext/>
+              <w:spacing w:line="240" w:lineRule="auto" w:after="60"/>
+            </w:pPr>
+            <w:r>
+              <w:rPr>
+                <w:rFonts w:ascii="Arial" w:hAnsi="Arial"/>
+                <w:b w:val="0"/>
+                <w:sz w:val="18"/>
+              </w:rPr>
+              <w:t>Sin oclusión</w:t>
+            </w:r>
+          </w:p>
+        </w:tc>
+        <w:tc>
+          <w:tcPr>
+            <w:tcW w:type="dxa" w:w="864"/>
+            <w:vAlign w:val="center"/>
+          </w:tcPr>
+          <w:p>
+            <w:pPr>
+              <w:keepNext/>
+              <w:spacing w:line="240" w:lineRule="auto" w:after="60"/>
+            </w:pPr>
+            <w:r>
+              <w:rPr>
+                <w:rFonts w:ascii="Arial" w:hAnsi="Arial"/>
+                <w:b w:val="0"/>
+                <w:sz w:val="18"/>
+              </w:rPr>
+              <w:t>274</w:t>
+            </w:r>
+          </w:p>
+        </w:tc>
+        <w:tc>
+          <w:tcPr>
+            <w:tcW w:type="dxa" w:w="864"/>
+            <w:vAlign w:val="center"/>
+          </w:tcPr>
+          <w:p>
+            <w:pPr>
+              <w:keepNext/>
+              <w:spacing w:line="240" w:lineRule="auto" w:after="60"/>
+            </w:pPr>
+            <w:r>
+              <w:rPr>
+                <w:rFonts w:ascii="Arial" w:hAnsi="Arial"/>
+                <w:b w:val="0"/>
+                <w:sz w:val="18"/>
+              </w:rPr>
+              <w:t>186</w:t>
+            </w:r>
+          </w:p>
+        </w:tc>
+        <w:tc>
+          <w:tcPr>
+            <w:tcW w:type="dxa" w:w="864"/>
+            <w:vAlign w:val="center"/>
+          </w:tcPr>
+          <w:p>
+            <w:pPr>
+              <w:keepNext/>
+              <w:spacing w:line="240" w:lineRule="auto" w:after="60"/>
+            </w:pPr>
+            <w:r>
+              <w:rPr>
+                <w:rFonts w:ascii="Arial" w:hAnsi="Arial"/>
+                <w:b w:val="0"/>
+                <w:sz w:val="18"/>
+              </w:rPr>
+              <w:t>88</w:t>
+            </w:r>
+          </w:p>
+        </w:tc>
+        <w:tc>
+          <w:tcPr>
+            <w:tcW w:type="dxa" w:w="1224"/>
+            <w:vAlign w:val="center"/>
+          </w:tcPr>
+          <w:p>
+            <w:pPr>
+              <w:keepNext/>
+              <w:spacing w:line="240" w:lineRule="auto" w:after="60"/>
+            </w:pPr>
+            <w:r>
+              <w:rPr>
+                <w:rFonts w:ascii="Arial" w:hAnsi="Arial"/>
+                <w:b w:val="0"/>
+                <w:sz w:val="18"/>
+              </w:rPr>
+              <w:t>67,9 %</w:t>
+            </w:r>
+          </w:p>
+        </w:tc>
+        <w:tc>
+          <w:tcPr>
+            <w:tcW w:type="dxa" w:w="2995"/>
+            <w:vAlign w:val="center"/>
+          </w:tcPr>
+          <w:p>
+            <w:pPr>
+              <w:keepNext/>
+              <w:spacing w:line="240" w:lineRule="auto" w:after="60"/>
+            </w:pPr>
+            <w:r>
+              <w:rPr>
+                <w:rFonts w:ascii="Arial" w:hAnsi="Arial"/>
+                <w:b w:val="0"/>
+                <w:sz w:val="18"/>
+              </w:rPr>
+              <w:t>[60,0 %; 75,5 %]</w:t>
+            </w:r>
+          </w:p>
+        </w:tc>
+      </w:tr>
+      <w:tr>
+        <w:trPr>
+          <w:cantSplit/>
+        </w:trPr>
+        <w:tc>
+          <w:tcPr>
+            <w:tcW w:type="dxa" w:w="1944"/>
+            <w:vAlign w:val="center"/>
+          </w:tcPr>
+          <w:p>
+            <w:pPr>
+              <w:keepNext/>
+              <w:spacing w:line="240" w:lineRule="auto" w:after="60"/>
+            </w:pPr>
+            <w:r>
+              <w:rPr>
+                <w:rFonts w:ascii="Arial" w:hAnsi="Arial"/>
+                <w:b w:val="0"/>
+                <w:sz w:val="18"/>
+              </w:rPr>
+              <w:t>Parcial</w:t>
+            </w:r>
+          </w:p>
+        </w:tc>
+        <w:tc>
+          <w:tcPr>
+            <w:tcW w:type="dxa" w:w="864"/>
+            <w:vAlign w:val="center"/>
+          </w:tcPr>
+          <w:p>
+            <w:pPr>
+              <w:keepNext/>
+              <w:spacing w:line="240" w:lineRule="auto" w:after="60"/>
+            </w:pPr>
+            <w:r>
+              <w:rPr>
+                <w:rFonts w:ascii="Arial" w:hAnsi="Arial"/>
+                <w:b w:val="0"/>
+                <w:sz w:val="18"/>
+              </w:rPr>
+              <w:t>417</w:t>
+            </w:r>
+          </w:p>
+        </w:tc>
+        <w:tc>
+          <w:tcPr>
+            <w:tcW w:type="dxa" w:w="864"/>
+            <w:vAlign w:val="center"/>
+          </w:tcPr>
+          <w:p>
+            <w:pPr>
+              <w:keepNext/>
+              <w:spacing w:line="240" w:lineRule="auto" w:after="60"/>
+            </w:pPr>
+            <w:r>
+              <w:rPr>
+                <w:rFonts w:ascii="Arial" w:hAnsi="Arial"/>
+                <w:b w:val="0"/>
+                <w:sz w:val="18"/>
+              </w:rPr>
+              <w:t>218</w:t>
+            </w:r>
+          </w:p>
+        </w:tc>
+        <w:tc>
+          <w:tcPr>
+            <w:tcW w:type="dxa" w:w="864"/>
+            <w:vAlign w:val="center"/>
+          </w:tcPr>
+          <w:p>
+            <w:pPr>
+              <w:keepNext/>
+              <w:spacing w:line="240" w:lineRule="auto" w:after="60"/>
+            </w:pPr>
+            <w:r>
+              <w:rPr>
+                <w:rFonts w:ascii="Arial" w:hAnsi="Arial"/>
+                <w:b w:val="0"/>
+                <w:sz w:val="18"/>
+              </w:rPr>
+              <w:t>199</w:t>
+            </w:r>
+          </w:p>
+        </w:tc>
+        <w:tc>
+          <w:tcPr>
+            <w:tcW w:type="dxa" w:w="1224"/>
+            <w:vAlign w:val="center"/>
+          </w:tcPr>
+          <w:p>
+            <w:pPr>
+              <w:keepNext/>
+              <w:spacing w:line="240" w:lineRule="auto" w:after="60"/>
+            </w:pPr>
+            <w:r>
+              <w:rPr>
+                <w:rFonts w:ascii="Arial" w:hAnsi="Arial"/>
+                <w:b w:val="0"/>
+                <w:sz w:val="18"/>
+              </w:rPr>
+              <w:t>52,3 %</w:t>
+            </w:r>
+          </w:p>
+        </w:tc>
+        <w:tc>
+          <w:tcPr>
+            <w:tcW w:type="dxa" w:w="2995"/>
+            <w:vAlign w:val="center"/>
+          </w:tcPr>
+          <w:p>
+            <w:pPr>
+              <w:keepNext/>
+              <w:spacing w:line="240" w:lineRule="auto" w:after="60"/>
+            </w:pPr>
+            <w:r>
+              <w:rPr>
+                <w:rFonts w:ascii="Arial" w:hAnsi="Arial"/>
+                <w:b w:val="0"/>
+                <w:sz w:val="18"/>
+              </w:rPr>
+              <w:t>[45,9 %; 62,0 %]</w:t>
+            </w:r>
+          </w:p>
+        </w:tc>
+      </w:tr>
+      <w:tr>
+        <w:trPr>
+          <w:cantSplit/>
+        </w:trPr>
+        <w:tc>
+          <w:tcPr>
+            <w:tcW w:type="dxa" w:w="1944"/>
+            <w:vAlign w:val="center"/>
+          </w:tcPr>
+          <w:p>
+            <w:pPr>
+              <w:keepNext/>
+              <w:spacing w:line="240" w:lineRule="auto" w:after="60"/>
+            </w:pPr>
+            <w:r>
+              <w:rPr>
+                <w:rFonts w:ascii="Arial" w:hAnsi="Arial"/>
+                <w:b w:val="0"/>
+                <w:sz w:val="18"/>
+              </w:rPr>
+              <w:t>Fuerte</w:t>
+            </w:r>
+          </w:p>
+        </w:tc>
+        <w:tc>
+          <w:tcPr>
+            <w:tcW w:type="dxa" w:w="864"/>
+            <w:vAlign w:val="center"/>
+          </w:tcPr>
+          <w:p>
+            <w:pPr>
+              <w:keepNext/>
+              <w:spacing w:line="240" w:lineRule="auto" w:after="60"/>
+            </w:pPr>
+            <w:r>
+              <w:rPr>
+                <w:rFonts w:ascii="Arial" w:hAnsi="Arial"/>
+                <w:b w:val="0"/>
+                <w:sz w:val="18"/>
+              </w:rPr>
+              <w:t>159</w:t>
+            </w:r>
+          </w:p>
+        </w:tc>
+        <w:tc>
+          <w:tcPr>
+            <w:tcW w:type="dxa" w:w="864"/>
+            <w:vAlign w:val="center"/>
+          </w:tcPr>
+          <w:p>
+            <w:pPr>
+              <w:keepNext/>
+              <w:spacing w:line="240" w:lineRule="auto" w:after="60"/>
+            </w:pPr>
+            <w:r>
+              <w:rPr>
+                <w:rFonts w:ascii="Arial" w:hAnsi="Arial"/>
+                <w:b w:val="0"/>
+                <w:sz w:val="18"/>
+              </w:rPr>
+              <w:t>17</w:t>
+            </w:r>
+          </w:p>
+        </w:tc>
+        <w:tc>
+          <w:tcPr>
+            <w:tcW w:type="dxa" w:w="864"/>
+            <w:vAlign w:val="center"/>
+          </w:tcPr>
+          <w:p>
+            <w:pPr>
+              <w:keepNext/>
+              <w:spacing w:line="240" w:lineRule="auto" w:after="60"/>
+            </w:pPr>
+            <w:r>
+              <w:rPr>
+                <w:rFonts w:ascii="Arial" w:hAnsi="Arial"/>
+                <w:b w:val="0"/>
+                <w:sz w:val="18"/>
+              </w:rPr>
+              <w:t>142</w:t>
+            </w:r>
+          </w:p>
+        </w:tc>
+        <w:tc>
+          <w:tcPr>
+            <w:tcW w:type="dxa" w:w="1224"/>
+            <w:vAlign w:val="center"/>
+          </w:tcPr>
+          <w:p>
+            <w:pPr>
+              <w:keepNext/>
+              <w:spacing w:line="240" w:lineRule="auto" w:after="60"/>
+            </w:pPr>
+            <w:r>
+              <w:rPr>
+                <w:rFonts w:ascii="Arial" w:hAnsi="Arial"/>
+                <w:b w:val="0"/>
+                <w:sz w:val="18"/>
+              </w:rPr>
+              <w:t>10,7 %</w:t>
+            </w:r>
+          </w:p>
+        </w:tc>
+        <w:tc>
+          <w:tcPr>
+            <w:tcW w:type="dxa" w:w="2995"/>
+            <w:vAlign w:val="center"/>
+          </w:tcPr>
+          <w:p>
+            <w:pPr>
+              <w:keepNext/>
+              <w:spacing w:line="240" w:lineRule="auto" w:after="60"/>
+            </w:pPr>
+            <w:r>
+              <w:rPr>
+                <w:rFonts w:ascii="Arial" w:hAnsi="Arial"/>
+                <w:b w:val="0"/>
+                <w:sz w:val="18"/>
+              </w:rPr>
+              <w:t>[4,3 %; 22,7 %]</w:t>
+            </w:r>
+          </w:p>
+        </w:tc>
+      </w:tr>
+      <w:tr>
+        <w:trPr>
+          <w:cantSplit/>
+        </w:trPr>
+        <w:tc>
+          <w:tcPr>
+            <w:tcW w:type="dxa" w:w="1944"/>
+            <w:vAlign w:val="center"/>
+          </w:tcPr>
+          <w:p>
+            <w:pPr>
+              <w:keepNext w:val="0"/>
+              <w:spacing w:line="240" w:lineRule="auto" w:after="60"/>
+            </w:pPr>
+            <w:r>
+              <w:rPr>
+                <w:rFonts w:ascii="Arial" w:hAnsi="Arial"/>
+                <w:b w:val="0"/>
+                <w:sz w:val="18"/>
+              </w:rPr>
+              <w:t>Incierta</w:t>
+            </w:r>
+          </w:p>
+        </w:tc>
+        <w:tc>
+          <w:tcPr>
+            <w:tcW w:type="dxa" w:w="864"/>
+            <w:vAlign w:val="center"/>
+          </w:tcPr>
+          <w:p>
+            <w:pPr>
+              <w:keepNext w:val="0"/>
+              <w:spacing w:line="240" w:lineRule="auto" w:after="60"/>
+            </w:pPr>
+            <w:r>
+              <w:rPr>
+                <w:rFonts w:ascii="Arial" w:hAnsi="Arial"/>
+                <w:b w:val="0"/>
+                <w:sz w:val="18"/>
+              </w:rPr>
+              <w:t>39</w:t>
+            </w:r>
+          </w:p>
+        </w:tc>
+        <w:tc>
+          <w:tcPr>
+            <w:tcW w:type="dxa" w:w="864"/>
+            <w:vAlign w:val="center"/>
+          </w:tcPr>
+          <w:p>
+            <w:pPr>
+              <w:keepNext w:val="0"/>
+              <w:spacing w:line="240" w:lineRule="auto" w:after="60"/>
+            </w:pPr>
+            <w:r>
+              <w:rPr>
+                <w:rFonts w:ascii="Arial" w:hAnsi="Arial"/>
+                <w:b w:val="0"/>
+                <w:sz w:val="18"/>
+              </w:rPr>
+              <w:t>4</w:t>
+            </w:r>
+          </w:p>
+        </w:tc>
+        <w:tc>
+          <w:tcPr>
+            <w:tcW w:type="dxa" w:w="864"/>
+            <w:vAlign w:val="center"/>
+          </w:tcPr>
+          <w:p>
+            <w:pPr>
+              <w:keepNext w:val="0"/>
+              <w:spacing w:line="240" w:lineRule="auto" w:after="60"/>
+            </w:pPr>
+            <w:r>
+              <w:rPr>
+                <w:rFonts w:ascii="Arial" w:hAnsi="Arial"/>
+                <w:b w:val="0"/>
+                <w:sz w:val="18"/>
+              </w:rPr>
+              <w:t>35</w:t>
+            </w:r>
+          </w:p>
+        </w:tc>
+        <w:tc>
+          <w:tcPr>
+            <w:tcW w:type="dxa" w:w="1224"/>
+            <w:vAlign w:val="center"/>
+          </w:tcPr>
+          <w:p>
+            <w:pPr>
+              <w:keepNext w:val="0"/>
+              <w:spacing w:line="240" w:lineRule="auto" w:after="60"/>
+            </w:pPr>
+            <w:r>
+              <w:rPr>
+                <w:rFonts w:ascii="Arial" w:hAnsi="Arial"/>
+                <w:b w:val="0"/>
+                <w:sz w:val="18"/>
+              </w:rPr>
+              <w:t>10,3 %</w:t>
+            </w:r>
+          </w:p>
+        </w:tc>
+        <w:tc>
+          <w:tcPr>
+            <w:tcW w:type="dxa" w:w="2995"/>
+            <w:vAlign w:val="center"/>
+          </w:tcPr>
+          <w:p>
+            <w:pPr>
+              <w:keepNext w:val="0"/>
+              <w:spacing w:line="240" w:lineRule="auto" w:after="60"/>
+            </w:pPr>
+            <w:r>
+              <w:rPr>
+                <w:rFonts w:ascii="Arial" w:hAnsi="Arial"/>
+                <w:b w:val="0"/>
+                <w:sz w:val="18"/>
+              </w:rPr>
+              <w:t>[0,0 %; 34,4 %]</w:t>
+            </w:r>
+          </w:p>
+        </w:tc>
+      </w:tr>
+    </w:tbl>
+    <w:p>
+      <w:pPr>
+        <w:spacing w:line="240" w:lineRule="auto" w:after="160"/>
+        <w:jc w:val="center"/>
+      </w:pPr>
+      <w:r>
+        <w:rPr>
+          <w:rFonts w:ascii="Arial" w:hAnsi="Arial"/>
+          <w:sz w:val="20"/>
+        </w:rPr>
+        <w:t>Fuente: elaboración propia con datos y especificaciones del proyecto.</w:t>
+      </w:r>
+    </w:p>
+    <w:p>
+      <w:pPr>
+        <w:widowControl/>
+        <w:spacing w:line="360" w:lineRule="auto" w:after="330"/>
+        <w:jc w:val="both"/>
+      </w:pPr>
+      <w:r>
+        <w:t>Los intervalos percentiles del 95 % se obtienen con 10 000 remuestreos de los 33 grupos completos (semilla 20261013). Los casos inciertos se muestran por separado y no se mezclan con los tres niveles de severidad. Los intervalos reflejan variación entre grupos, pero no incertidumbre del etiquetado ni posibles errores de la verdad de campo. El análisis incluye únicamente instancias ya anotadas, por lo que no cubre objetos completamente ocultos y ausentes de la anotación.</w:t>
+      </w:r>
+    </w:p>
+    <w:p>
+      <w:pPr>
+        <w:widowControl/>
+        <w:spacing w:line="360" w:lineRule="auto" w:after="330"/>
+        <w:jc w:val="both"/>
+      </w:pPr>
+      <w:r>
+        <w:t xml:space="preserve">El </w:t>
+      </w:r>
+      <w:r>
+        <w:rPr>
+          <w:i/>
+        </w:rPr>
+        <w:t>recall</w:t>
+      </w:r>
+      <w:r>
+        <w:t xml:space="preserve"> observado es 67,9 % sin oclusión, 52,3 % con oclusión parcial y 10,7 % con oclusión fuerte. Estos valores describen asociaciones del conjunto; no aíslan el efecto causal de la oclusión. Se conservan desgloses por clase y tamaño aparente conjunto, configuración y truncamiento, además de análisis de sensibilidad con etiquetas de alta confianza y objetos no truncados. El tamaño aparente se define por área de caja dividida entre área de imagen: pequeño &lt; 0,01, mediano de 0,01 a &lt; 0,10 y grande ≥ 0,10; no representa el área completa de la parte oculta.</w:t>
+      </w:r>
+    </w:p>
+    <w:p>
+      <w:pPr>
+        <w:widowControl/>
+        <w:spacing w:line="360" w:lineRule="auto" w:after="330"/>
+        <w:jc w:val="both"/>
+      </w:pPr>
+      <w:r>
+        <w:t xml:space="preserve">La composición limita la interpretación del gradiente: 130 de las 159 instancias con oclusión fuerte son sillas y 133 tienen caja pequeña, frente a 51 de 274 sin oclusión. Dentro de sillas de tamaño mediano, el </w:t>
+      </w:r>
+      <w:r>
+        <w:rPr>
+          <w:i/>
+        </w:rPr>
+        <w:t>recall</w:t>
+      </w:r>
+      <w:r>
+        <w:t xml:space="preserve"> es 75,0 % (54/72), 62,0 % (62/100), 27,3 % (6/22) para ausencia de oclusión, parcial y fuerte, respectivamente; aún varían escena, pose y tamaño dentro de la banda. En camas se obtiene 66,7 % sin oclusión y 89,7 % con oclusión parcial, por lo que el gradiente agrupado no debe asumirse universal. Al excluir objetos truncados, los valores agrupados son 77,6 %, 48,7 %, 10,5 %; con etiquetas de alta confianza son 70,2 %, 53,9 %, 11,0 %, en el mismo orden de severidad. Estas comprobaciones describen sensibilidad, pero no eliminan la confusión ni sustituyen la revisión de etiquetas.</w:t>
+      </w:r>
+    </w:p>
+    <w:p>
+      <w:pPr>
+        <w:widowControl/>
+        <w:spacing w:line="360" w:lineRule="auto" w:after="330"/>
+        <w:jc w:val="both"/>
+      </w:pPr>
+      <w:r>
+        <w:t>La inspección señaló posibles inconsistencias de clase, cajas que abarcan más de una instancia y duplicados; se registraron como incidencias para revisión sin corregir automáticamente la referencia original. Las celdas con menos de 15 instancias se identifican como escasas. Antes de formular conclusiones definitivas, deben revisarse las etiquetas ambiguas y las incidencias GT, y recalcularse los resultados si cambia la referencia. Las tablas detalladas, los hashes y el protocolo se conservan en Build/Testing/occlusion/.</w:t>
       </w:r>
     </w:p>
     <w:p>
@@ -23680,7 +24493,7 @@
       </w:pPr>
     </w:p>
     <w:p>
-      <w:bookmarkStart w:id="1076" w:name="report_1076"/>
+      <w:bookmarkStart w:id="1077" w:name="report_1077"/>
       <w:pPr>
         <w:pStyle w:val="Ttulo1"/>
       </w:pPr>
@@ -23721,17 +24534,17 @@
       <w:r>
         <w:t xml:space="preserve"> </w:t>
       </w:r>
-      <w:bookmarkEnd w:id="1076"/>
-    </w:p>
-    <w:p>
-      <w:bookmarkStart w:id="1077" w:name="report_1077"/>
+      <w:bookmarkEnd w:id="1077"/>
+    </w:p>
+    <w:p>
+      <w:bookmarkStart w:id="1078" w:name="report_1078"/>
       <w:pPr>
         <w:pStyle w:val="Ttulo2"/>
       </w:pPr>
       <w:r>
         <w:t xml:space="preserve">5.1 Conclusiones</w:t>
       </w:r>
-      <w:bookmarkEnd w:id="1077"/>
+      <w:bookmarkEnd w:id="1078"/>
     </w:p>
     <w:p>
       <w:pPr>
@@ -23838,18 +24651,18 @@
         <w:jc w:val="both"/>
       </w:pPr>
       <w:r>
-        <w:t>Respecto a las fases propuestas, se documentaron la revisión, la selección del modelo y el desarrollo integrado. La evaluación permanece parcial para claridad auditiva, oclusión, iluminación controlada y tiempo completo de respuesta. El análisis adicional de tiempos obtuvo una mediana de 352,4 ms y un P95 de 419,9 ms para decodificación, preprocesamiento y detección en emulador; el brillo digital permitió describir heterogeneidad sin atribuirla a iluminancia física. Estas ampliaciones aprovechan los datos archivados y delimitan qué evidencia debe obtener el siguiente experimento.</w:t>
-      </w:r>
-    </w:p>
-    <w:p>
-      <w:bookmarkStart w:id="1078" w:name="report_1078"/>
+        <w:t>Respecto a las fases propuestas, se documentaron la revisión, la selección del modelo y el desarrollo integrado. La evaluación incluye un análisis observacional de oclusión con etiquetas asistidas por IA pendientes de revisión; permanecen por evaluar claridad auditiva, iluminación controlada y tiempo completo de respuesta. El análisis adicional de tiempos obtuvo una mediana de 352,4 ms y un P95 de 419,9 ms para decodificación, preprocesamiento y detección en emulador; el brillo digital permitió describir heterogeneidad sin atribuirla a iluminancia física. Estas ampliaciones aprovechan los datos archivados y delimitan qué evidencia debe obtener el siguiente experimento.</w:t>
+      </w:r>
+    </w:p>
+    <w:p>
+      <w:bookmarkStart w:id="1079" w:name="report_1079"/>
       <w:pPr>
         <w:pStyle w:val="Ttulo2"/>
       </w:pPr>
       <w:r>
         <w:t xml:space="preserve">5.2 Recomendaciones</w:t>
       </w:r>
-      <w:bookmarkEnd w:id="1078"/>
+      <w:bookmarkEnd w:id="1079"/>
     </w:p>
     <w:p>
       <w:pPr>
@@ -23872,14 +24685,14 @@
       </w:r>
     </w:p>
     <w:p>
-      <w:bookmarkStart w:id="1079" w:name="report_1079"/>
+      <w:bookmarkStart w:id="1080" w:name="report_1080"/>
       <w:pPr>
         <w:pStyle w:val="Ttulo2"/>
       </w:pPr>
       <w:r>
         <w:t xml:space="preserve">5.3 Trabajo futuro</w:t>
       </w:r>
-      <w:bookmarkEnd w:id="1079"/>
+      <w:bookmarkEnd w:id="1080"/>
     </w:p>
     <w:p>
       <w:pPr>
@@ -23899,7 +24712,7 @@
         <w:jc w:val="both"/>
       </w:pPr>
       <w:r>
-        <w:t>Como aprendizaje metodológico, conservar anotaciones, predicciones, temporizaciones y versiones permitió ampliar el informe sin alterar la ejecución original. La ausencia de un protocolo previo de oclusión, lux y escucha limita el cumplimiento de la fase 3. Para próximos proyectos del programa, conviene definir desde el inicio los criterios de aceptación y los instrumentos de medición, separar pruebas técnicas de evaluación con usuarios y reservar un conjunto de escenas independiente para confirmar la configuración seleccionada.</w:t>
+        <w:t>Como aprendizaje metodológico, conservar anotaciones, predicciones, temporizaciones y versiones permitió ampliar el informe sin alterar la ejecución original. El etiquetado posterior de oclusión amplía el análisis observacional, mientras que la iluminación física y la escucha requieren protocolos adicionales. Para próximos proyectos del programa, conviene definir desde el inicio los criterios de aceptación y los instrumentos de medición, separar pruebas técnicas de evaluación con usuarios y reservar un conjunto de escenas independiente para confirmar la configuración seleccionada.</w:t>
       </w:r>
     </w:p>
     <w:p>
@@ -23922,7 +24735,7 @@
       </w:pPr>
     </w:p>
     <w:p>
-      <w:bookmarkStart w:id="1080" w:name="report_1080"/>
+      <w:bookmarkStart w:id="1081" w:name="report_1081"/>
       <w:pPr>
         <w:pStyle w:val="Subttulo"/>
         <w:spacing w:line="360" w:lineRule="auto"/>
@@ -23944,7 +24757,7 @@
       <w:bookmarkEnd w:id="85"/>
       <w:bookmarkEnd w:id="86"/>
       <w:bookmarkEnd w:id="87"/>
-      <w:bookmarkEnd w:id="1080"/>
+      <w:bookmarkEnd w:id="1081"/>
     </w:p>
     <w:p>
       <w:pPr>
@@ -24056,7 +24869,7 @@
       </w:pPr>
     </w:p>
     <w:p>
-      <w:bookmarkStart w:id="1081" w:name="report_1081"/>
+      <w:bookmarkStart w:id="1082" w:name="report_1082"/>
       <w:pPr>
         <w:pStyle w:val="Subttulo"/>
         <w:spacing w:line="360" w:lineRule="auto"/>
@@ -24078,7 +24891,7 @@
       <w:bookmarkEnd w:id="89"/>
       <w:bookmarkEnd w:id="90"/>
       <w:bookmarkEnd w:id="91"/>
-      <w:bookmarkEnd w:id="1081"/>
+      <w:bookmarkEnd w:id="1082"/>
     </w:p>
     <w:p>
       <w:pPr>
@@ -24143,7 +24956,7 @@
       </w:r>
     </w:p>
     <w:p>
-      <w:bookmarkStart w:id="1082" w:name="report_1082"/>
+      <w:bookmarkStart w:id="1083" w:name="report_1083"/>
       <w:pPr>
         <w:pStyle w:val="Subttulo"/>
         <w:pageBreakBefore/>
@@ -24154,7 +24967,7 @@
       <w:r>
         <w:t xml:space="preserve">Anexo C: Manuales técnico y de usuario</w:t>
       </w:r>
-      <w:bookmarkEnd w:id="1082"/>
+      <w:bookmarkEnd w:id="1083"/>
     </w:p>
     <w:p>
       <w:pPr>
@@ -24198,7 +25011,7 @@
       </w:pPr>
     </w:p>
     <w:p>
-      <w:bookmarkStart w:id="1083" w:name="report_1083"/>
+      <w:bookmarkStart w:id="1084" w:name="report_1084"/>
       <w:pPr>
         <w:pStyle w:val="Ttulosposteriores"/>
         <w:pageBreakBefore/>
@@ -24215,7 +25028,7 @@
       <w:bookmarkEnd w:id="93"/>
       <w:bookmarkEnd w:id="94"/>
       <w:bookmarkEnd w:id="95"/>
-      <w:bookmarkEnd w:id="1083"/>
+      <w:bookmarkEnd w:id="1084"/>
     </w:p>
     <w:p>
       <w:pPr>

</xml_diff>

<commit_message>
Incorporate author occlusion review and refresh final report
</commit_message>
<xml_diff>
--- a/Documents/Informe_Final_Trabajo_de_Grado_AssistiveVision.docx
+++ b/Documents/Informe_Final_Trabajo_de_Grado_AssistiveVision.docx
@@ -3701,7 +3701,7 @@
         <w:jc w:val="both"/>
       </w:pPr>
       <w:r>
-        <w:t>La evaluación de la fase 3 cubre detección y procesamiento de imágenes; la iluminación se explora mediante brillo digital, sin mediciones de iluminancia, y la oclusión se explora con etiquetas suplementarias asistidas por IA, sujetas a revisión del autor. La claridad auditiva, el tiempo hasta escuchar el mensaje y el efecto sobre la autonomía requieren evaluación adicional. El análisis geométrico de distancia es complementario y no sustituye estas actividades.</w:t>
+        <w:t>La evaluación de la fase 3 cubre detección y procesamiento de imágenes; la iluminación se explora mediante brillo digital, sin mediciones de iluminancia, y la oclusión se explora con etiquetas suplementarias asistidas por IA, con revisión parcial del autor. La claridad auditiva, el tiempo hasta escuchar el mensaje y el efecto sobre la autonomía requieren evaluación adicional. El análisis geométrico de distancia es complementario y no sustituye estas actividades.</w:t>
       </w:r>
     </w:p>
     <w:p>
@@ -23697,7 +23697,7 @@
         <w:jc w:val="both"/>
       </w:pPr>
       <w:r>
-        <w:t xml:space="preserve">Las etiquetas son asistidas por IA y provisionales hasta la revisión del autor; los dos lotes no constituyen doble revisión independiente. Se registra motivo, confianza e identificador de anotación, y se proporciona una interfaz local para corregir los casos. El análisis utiliza el emparejamiento del </w:t>
+        <w:t xml:space="preserve">El autor revisó 215 de las 889 etiquetas mediante la interfaz local; se conservaron las otras 674 etiquetas asistidas por IA sin revisión individual adicional. Los dos lotes iniciales no constituyen doble revisión independiente. Se registra motivo, confianza e identificador de anotación, y se proporciona una interfaz local para corregir los casos. El análisis utiliza el emparejamiento del </w:t>
       </w:r>
       <w:r>
         <w:rPr>
@@ -24066,7 +24066,7 @@
                 <w:b w:val="0"/>
                 <w:sz w:val="18"/>
               </w:rPr>
-              <w:t>417</w:t>
+              <w:t>408</w:t>
             </w:r>
           </w:p>
         </w:tc>
@@ -24086,7 +24086,7 @@
                 <w:b w:val="0"/>
                 <w:sz w:val="18"/>
               </w:rPr>
-              <w:t>218</w:t>
+              <w:t>217</w:t>
             </w:r>
           </w:p>
         </w:tc>
@@ -24106,7 +24106,7 @@
                 <w:b w:val="0"/>
                 <w:sz w:val="18"/>
               </w:rPr>
-              <w:t>199</w:t>
+              <w:t>191</w:t>
             </w:r>
           </w:p>
         </w:tc>
@@ -24126,7 +24126,7 @@
                 <w:b w:val="0"/>
                 <w:sz w:val="18"/>
               </w:rPr>
-              <w:t>52,3 %</w:t>
+              <w:t>53,2 %</w:t>
             </w:r>
           </w:p>
         </w:tc>
@@ -24146,7 +24146,7 @@
                 <w:b w:val="0"/>
                 <w:sz w:val="18"/>
               </w:rPr>
-              <w:t>[45,9 %; 62,0 %]</w:t>
+              <w:t>[46,6 %; 63,3 %]</w:t>
             </w:r>
           </w:p>
         </w:tc>
@@ -24191,7 +24191,7 @@
                 <w:b w:val="0"/>
                 <w:sz w:val="18"/>
               </w:rPr>
-              <w:t>159</w:t>
+              <w:t>168</w:t>
             </w:r>
           </w:p>
         </w:tc>
@@ -24211,7 +24211,7 @@
                 <w:b w:val="0"/>
                 <w:sz w:val="18"/>
               </w:rPr>
-              <w:t>17</w:t>
+              <w:t>18</w:t>
             </w:r>
           </w:p>
         </w:tc>
@@ -24231,7 +24231,7 @@
                 <w:b w:val="0"/>
                 <w:sz w:val="18"/>
               </w:rPr>
-              <w:t>142</w:t>
+              <w:t>150</w:t>
             </w:r>
           </w:p>
         </w:tc>
@@ -24271,7 +24271,7 @@
                 <w:b w:val="0"/>
                 <w:sz w:val="18"/>
               </w:rPr>
-              <w:t>[4,3 %; 22,7 %]</w:t>
+              <w:t>[5,4 %; 21,9 %]</w:t>
             </w:r>
           </w:p>
         </w:tc>
@@ -24396,7 +24396,7 @@
                 <w:b w:val="0"/>
                 <w:sz w:val="18"/>
               </w:rPr>
-              <w:t>[0,0 %; 34,4 %]</w:t>
+              <w:t>[0,0 %; 33,3 %]</w:t>
             </w:r>
           </w:p>
         </w:tc>
@@ -24441,7 +24441,7 @@
         <w:t>recall</w:t>
       </w:r>
       <w:r>
-        <w:t xml:space="preserve"> observado es 67,9 % sin oclusión, 52,3 % con oclusión parcial y 10,7 % con oclusión fuerte. Estos valores describen asociaciones del conjunto; no aíslan el efecto causal de la oclusión. Se conservan desgloses por clase y tamaño aparente conjunto, configuración y truncamiento, además de análisis de sensibilidad con etiquetas de alta confianza y objetos no truncados. El tamaño aparente se define por área de caja dividida entre área de imagen: pequeño &lt; 0,01, mediano de 0,01 a &lt; 0,10 y grande ≥ 0,10; no representa el área completa de la parte oculta.</w:t>
+        <w:t xml:space="preserve"> observado es 67,9 % sin oclusión, 53,2 % con oclusión parcial y 10,7 % con oclusión fuerte. Estos valores describen asociaciones del conjunto; no aíslan el efecto causal de la oclusión. Se conservan desgloses por clase y tamaño aparente conjunto, configuración y truncamiento, además de análisis de sensibilidad con etiquetas de alta confianza y objetos no truncados. El tamaño aparente se define por área de caja dividida entre área de imagen: pequeño &lt; 0,01, mediano de 0,01 a &lt; 0,10 y grande ≥ 0,10; no representa el área completa de la parte oculta.</w:t>
       </w:r>
     </w:p>
     <w:p>
@@ -24451,7 +24451,7 @@
         <w:jc w:val="both"/>
       </w:pPr>
       <w:r>
-        <w:t xml:space="preserve">La composición limita la interpretación del gradiente: 130 de las 159 instancias con oclusión fuerte son sillas y 133 tienen caja pequeña, frente a 51 de 274 sin oclusión. Dentro de sillas de tamaño mediano, el </w:t>
+        <w:t xml:space="preserve">La composición limita la interpretación del gradiente: 130 de las 168 instancias con oclusión fuerte son sillas y 137 tienen caja pequeña, frente a 51 de 274 sin oclusión. Dentro de sillas de tamaño mediano, el </w:t>
       </w:r>
       <w:r>
         <w:rPr>
@@ -24460,7 +24460,7 @@
         <w:t>recall</w:t>
       </w:r>
       <w:r>
-        <w:t xml:space="preserve"> es 75,0 % (54/72), 62,0 % (62/100), 27,3 % (6/22) para ausencia de oclusión, parcial y fuerte, respectivamente; aún varían escena, pose y tamaño dentro de la banda. En camas se obtiene 66,7 % sin oclusión y 89,7 % con oclusión parcial, por lo que el gradiente agrupado no debe asumirse universal. Al excluir objetos truncados, los valores agrupados son 77,6 %, 48,7 %, 10,5 %; con etiquetas de alta confianza son 70,2 %, 53,9 %, 11,0 %, en el mismo orden de severidad. Estas comprobaciones describen sensibilidad, pero no eliminan la confusión ni sustituyen la revisión de etiquetas.</w:t>
+        <w:t xml:space="preserve"> es 75,0 % (54/72), 62,0 % (62/100), 27,3 % (6/22) para ausencia de oclusión, parcial y fuerte, respectivamente; aún varían escena, pose y tamaño dentro de la banda. En camas se obtiene 66,7 % sin oclusión y 89,7 % con oclusión parcial, por lo que el gradiente agrupado no debe asumirse universal. Al excluir objetos truncados, los valores agrupados son 77,6 %, 49,7 %, 10,7 %; con etiquetas de alta confianza son 69,9 %, 54,8 %, 11,1 %, en el mismo orden de severidad. Estas comprobaciones describen sensibilidad, pero no eliminan la confusión ni sustituyen la revisión de etiquetas.</w:t>
       </w:r>
     </w:p>
     <w:p>
@@ -24470,7 +24470,7 @@
         <w:jc w:val="both"/>
       </w:pPr>
       <w:r>
-        <w:t>La inspección señaló posibles inconsistencias de clase, cajas que abarcan más de una instancia y duplicados; se registraron como incidencias para revisión sin corregir automáticamente la referencia original. Las celdas con menos de 15 instancias se identifican como escasas. Antes de formular conclusiones definitivas, deben revisarse las etiquetas ambiguas y las incidencias GT, y recalcularse los resultados si cambia la referencia. Las tablas detalladas, los hashes y el protocolo se conservan en Build/Testing/occlusion/.</w:t>
+        <w:t>La inspección señaló posibles inconsistencias de clase, cajas que abarcan más de una instancia y duplicados; se registraron como incidencias para revisión sin corregir automáticamente la referencia original. Las celdas con menos de 15 instancias se identifican como escasas. La revisión de etiquetas no modifica las cajas ni clases originales. Antes de formular conclusiones definitivas, deben resolverse las etiquetas ambiguas y las incidencias GT, y recalcularse los resultados si cambia la referencia. Las tablas detalladas, los hashes y el protocolo se conservan en Build/Testing/occlusion/.</w:t>
       </w:r>
     </w:p>
     <w:p>
@@ -24651,7 +24651,7 @@
         <w:jc w:val="both"/>
       </w:pPr>
       <w:r>
-        <w:t>Respecto a las fases propuestas, se documentaron la revisión, la selección del modelo y el desarrollo integrado. La evaluación incluye un análisis observacional de oclusión con etiquetas asistidas por IA pendientes de revisión; permanecen por evaluar claridad auditiva, iluminación controlada y tiempo completo de respuesta. El análisis adicional de tiempos obtuvo una mediana de 352,4 ms y un P95 de 419,9 ms para decodificación, preprocesamiento y detección en emulador; el brillo digital permitió describir heterogeneidad sin atribuirla a iluminancia física. Estas ampliaciones aprovechan los datos archivados y delimitan qué evidencia debe obtener el siguiente experimento.</w:t>
+        <w:t>Respecto a las fases propuestas, se documentaron la revisión, la selección del modelo y el desarrollo integrado. La evaluación incluye un análisis observacional de oclusión con etiquetas asistidas por IA con revisión parcial del autor; permanecen por evaluar claridad auditiva, iluminación controlada y tiempo completo de respuesta. El análisis adicional de tiempos obtuvo una mediana de 352,4 ms y un P95 de 419,9 ms para decodificación, preprocesamiento y detección en emulador; el brillo digital permitió describir heterogeneidad sin atribuirla a iluminancia física. Estas ampliaciones aprovechan los datos archivados y delimitan qué evidencia debe obtener el siguiente experimento.</w:t>
       </w:r>
     </w:p>
     <w:p>

</xml_diff>

<commit_message>
Describir orientación del Gorillapod y enlazar citas y bibliografía
</commit_message>
<xml_diff>
--- a/Documents/Informe_Final_Trabajo_de_Grado_AssistiveVision.docx
+++ b/Documents/Informe_Final_Trabajo_de_Grado_AssistiveVision.docx
@@ -3497,7 +3497,15 @@
         <w:jc w:val="both"/>
       </w:pPr>
       <w:r>
-        <w:t xml:space="preserve">La discapacidad visual constituye una limitación significativa para la autonomía de quienes la padecen, en particular cuando se trata de desplazarse e interactuar en espacios interiores, donde la densidad de obstáculos, el mobiliario y la variabilidad de las escenas dificultan la anticipación del entorno. De acuerdo con la Organización Mundial de la Salud, al menos 2,2 mil millones de personas presentan deficiencia visual o ceguera, y de ellas al menos 1.000 millones tienen una condición que podría haberse prevenido o aún no ha sido atendida [2]. Frente a esta situación, los sistemas de asistencia basados en visión por computador se han consolidado como una alternativa tecnológica viable para apoyar la percepción del entorno, al convertir la información visual capturada por una cámara en descripciones auditivas útiles para el usuario.</w:t>
+        <w:t xml:space="preserve">La discapacidad visual constituye una limitación significativa para la autonomía de quienes la padecen, en particular cuando se trata de desplazarse e interactuar en espacios interiores, donde la densidad de obstáculos, el mobiliario y la variabilidad de las escenas dificultan la anticipación del entorno. De acuerdo con la Organización Mundial de la Salud, al menos 2,2 mil millones de personas presentan deficiencia visual o ceguera, y de ellas al menos 1.000 millones tienen una condición que podría haberse prevenido o aún no ha sido atendida </w:t>
+      </w:r>
+      <w:hyperlink w:anchor="bib_ref_2" w:history="1">
+        <w:r>
+          <w:t xml:space="preserve">[2]</w:t>
+        </w:r>
+      </w:hyperlink>
+      <w:r>
+        <w:t xml:space="preserve">. Frente a esta situación, los sistemas de asistencia basados en visión por computador se han consolidado como una alternativa tecnológica viable para apoyar la percepción del entorno, al convertir la información visual capturada por una cámara en descripciones auditivas útiles para el usuario.</w:t>
       </w:r>
     </w:p>
     <w:p>
@@ -3517,7 +3525,15 @@
         <w:t>frameworks</w:t>
       </w:r>
       <w:r>
-        <w:t xml:space="preserve"> de inferencia local como TensorFlow Lite [3], ha permitido ejecutar tareas de visión por computador directamente sobre teléfonos inteligentes de gama media, sin depender de conectividad a internet ni de servidores externos. Este avance abre la posibilidad de construir ayudas técnicas de bajo costo, portátiles y funcionales para personas con discapacidad visual, especialmente en contextos donde el acceso a soluciones comerciales especializadas es limitado.</w:t>
+        <w:t xml:space="preserve"> de inferencia local como TensorFlow Lite </w:t>
+      </w:r>
+      <w:hyperlink w:anchor="bib_ref_3" w:history="1">
+        <w:r>
+          <w:t xml:space="preserve">[3]</w:t>
+        </w:r>
+      </w:hyperlink>
+      <w:r>
+        <w:t xml:space="preserve">, ha permitido ejecutar tareas de visión por computador directamente sobre teléfonos inteligentes de gama media, sin depender de conectividad a internet ni de servidores externos. Este avance abre la posibilidad de construir ayudas técnicas de bajo costo, portátiles y funcionales para personas con discapacidad visual, especialmente en contextos donde el acceso a soluciones comerciales especializadas es limitado.</w:t>
       </w:r>
     </w:p>
     <w:p>
@@ -3549,7 +3565,47 @@
         <w:jc w:val="both"/>
       </w:pPr>
       <w:r>
-        <w:t xml:space="preserve">La detección de objetos mediante redes neuronales profundas ha evolucionado desde arquitecturas de dos etapas, como Faster R-CNN [4], hasta detectores de una etapa orientados al tiempo real, como YOLO [5], SSD [6] y EfficientDet [7], que ofrecen diferentes compromisos entre exactitud y costo computacional. En el ámbito de las tecnologías de asistencia, trabajos recientes han demostrado la viabilidad de ejecutar detectores de objetos sobre Android con fines de apoyo a personas con discapacidad visual; es el caso del sistema propuesto por More et al. [8], que integra un modelo YOLOv8 convertido a TensorFlow Lite con retroalimentación auditiva. Estos antecedentes evidencian tanto la pertinencia del problema como la necesidad de comparar experimentalmente los modelos bajo condiciones de despliegue concretas.</w:t>
+        <w:t xml:space="preserve">La detección de objetos mediante redes neuronales profundas ha evolucionado desde arquitecturas de dos etapas, como Faster R-CNN </w:t>
+      </w:r>
+      <w:hyperlink w:anchor="bib_ref_4" w:history="1">
+        <w:r>
+          <w:t xml:space="preserve">[4]</w:t>
+        </w:r>
+      </w:hyperlink>
+      <w:r>
+        <w:t xml:space="preserve">, hasta detectores de una etapa orientados al tiempo real, como YOLO </w:t>
+      </w:r>
+      <w:hyperlink w:anchor="bib_ref_5" w:history="1">
+        <w:r>
+          <w:t xml:space="preserve">[5]</w:t>
+        </w:r>
+      </w:hyperlink>
+      <w:r>
+        <w:t xml:space="preserve">, SSD </w:t>
+      </w:r>
+      <w:hyperlink w:anchor="bib_ref_6" w:history="1">
+        <w:r>
+          <w:t xml:space="preserve">[6]</w:t>
+        </w:r>
+      </w:hyperlink>
+      <w:r>
+        <w:t xml:space="preserve"> y EfficientDet </w:t>
+      </w:r>
+      <w:hyperlink w:anchor="bib_ref_7" w:history="1">
+        <w:r>
+          <w:t xml:space="preserve">[7]</w:t>
+        </w:r>
+      </w:hyperlink>
+      <w:r>
+        <w:t xml:space="preserve">, que ofrecen diferentes compromisos entre exactitud y costo computacional. En el ámbito de las tecnologías de asistencia, trabajos recientes han demostrado la viabilidad de ejecutar detectores de objetos sobre Android con fines de apoyo a personas con discapacidad visual; es el caso del sistema propuesto por More et al. </w:t>
+      </w:r>
+      <w:hyperlink w:anchor="bib_ref_8" w:history="1">
+        <w:r>
+          <w:t xml:space="preserve">[8]</w:t>
+        </w:r>
+      </w:hyperlink>
+      <w:r>
+        <w:t xml:space="preserve">, que integra un modelo YOLOv8 convertido a TensorFlow Lite con retroalimentación auditiva. Estos antecedentes evidencian tanto la pertinencia del problema como la necesidad de comparar experimentalmente los modelos bajo condiciones de despliegue concretas.</w:t>
       </w:r>
     </w:p>
     <w:p>
@@ -3682,7 +3738,15 @@
         <w:jc w:val="both"/>
       </w:pPr>
       <w:r>
-        <w:t xml:space="preserve">La metodología conserva las tres fases de la propuesta de pasantía [34]. La fase 1 comprende revisión de literatura, análisis del problema, requerimientos, selección del modelo, delimitación de objetos y diseño de descriptores. La comparación inicial de seis configuraciones sobre 80 imágenes y 257 anotaciones pertenece a esta fase y se presenta en el capítulo 2. La fase 2 corresponde al diseño integrado y al desarrollo del prototipo Android, descritos en el capítulo 3. La fase 3 evalúa el posicionamiento y el desempeño con 198 fotografías organizadas en 33 grupos; sus resultados se presentan en el capítulo 4. El </w:t>
+        <w:t xml:space="preserve">La metodología conserva las tres fases de la propuesta de pasantía </w:t>
+      </w:r>
+      <w:hyperlink w:anchor="bib_ref_34" w:history="1">
+        <w:r>
+          <w:t xml:space="preserve">[34]</w:t>
+        </w:r>
+      </w:hyperlink>
+      <w:r>
+        <w:t xml:space="preserve">. La fase 1 comprende revisión de literatura, análisis del problema, requerimientos, selección del modelo, delimitación de objetos y diseño de descriptores. La comparación inicial de seis configuraciones sobre 80 imágenes y 257 anotaciones pertenece a esta fase y se presenta en el capítulo 2. La fase 2 corresponde al diseño integrado y al desarrollo del prototipo Android, descritos en el capítulo 3. La fase 3 evalúa el posicionamiento y el desempeño con 198 fotografías organizadas en 33 grupos; sus resultados se presentan en el capítulo 4. El </w:t>
       </w:r>
       <w:r>
         <w:rPr>
@@ -3731,7 +3795,23 @@
         <w:t>pipeline</w:t>
       </w:r>
       <w:r>
-        <w:t xml:space="preserve"> completo de detección, localización espacial y descripción auditiva de escenas interiores sobre un teléfono inteligente de gama media, sentando las bases para una ayuda técnica de apoyo a la percepción del entorno para personas con discapacidad visual. En el contexto institucional, este propósito se relaciona con los compromisos de la Universidad del Magdalena con la innovación tecnológica, la investigación y la inclusión, expresados en el Plan de Desarrollo UNIMAGDALENA Comprometida 2020-2030 [9] y en el Plan de Gobierno Rectoral 2024-2028 [10]. El prototipo constituye, además, una base para trabajos futuros de evaluación con usuarios finales.</w:t>
+        <w:t xml:space="preserve"> completo de detección, localización espacial y descripción auditiva de escenas interiores sobre un teléfono inteligente de gama media, sentando las bases para una ayuda técnica de apoyo a la percepción del entorno para personas con discapacidad visual. En el contexto institucional, este propósito se relaciona con los compromisos de la Universidad del Magdalena con la innovación tecnológica, la investigación y la inclusión, expresados en el Plan de Desarrollo UNIMAGDALENA Comprometida 2020-2030 </w:t>
+      </w:r>
+      <w:hyperlink w:anchor="bib_ref_9" w:history="1">
+        <w:r>
+          <w:t xml:space="preserve">[9]</w:t>
+        </w:r>
+      </w:hyperlink>
+      <w:r>
+        <w:t xml:space="preserve"> y en el Plan de Gobierno Rectoral 2024-2028 </w:t>
+      </w:r>
+      <w:hyperlink w:anchor="bib_ref_10" w:history="1">
+        <w:r>
+          <w:t xml:space="preserve">[10]</w:t>
+        </w:r>
+      </w:hyperlink>
+      <w:r>
+        <w:t xml:space="preserve">. El prototipo constituye, además, una base para trabajos futuros de evaluación con usuarios finales.</w:t>
       </w:r>
     </w:p>
     <w:p>
@@ -3827,7 +3907,15 @@
         <w:jc w:val="both"/>
       </w:pPr>
       <w:r>
-        <w:t xml:space="preserve">Meenakshi et al. desarrollaron una aplicación móvil para Android orientada a apoyar la movilidad de personas con discapacidad visual mediante YOLOv3 [11]. El sistema integra identificación de objetos, estimación aproximada de la distancia, determinación de la dirección y generación de instrucciones de voz. El trabajo propone el uso del teléfono en un soporte corporal, como un cinturón de pecho, y demuestra la pertinencia de integrar detección y retroalimentación en un dispositivo de uso cotidiano. Sin embargo, sus cálculos de distancia dependen del tamaño aparente del objeto y de una calibración aproximada; además, los autores reconocen limitaciones para el mapeo completo de la ruta.</w:t>
+        <w:t xml:space="preserve">Meenakshi et al. desarrollaron una aplicación móvil para Android orientada a apoyar la movilidad de personas con discapacidad visual mediante YOLOv3 </w:t>
+      </w:r>
+      <w:hyperlink w:anchor="bib_ref_11" w:history="1">
+        <w:r>
+          <w:t xml:space="preserve">[11]</w:t>
+        </w:r>
+      </w:hyperlink>
+      <w:r>
+        <w:t xml:space="preserve">. El sistema integra identificación de objetos, estimación aproximada de la distancia, determinación de la dirección y generación de instrucciones de voz. El trabajo propone el uso del teléfono en un soporte corporal, como un cinturón de pecho, y demuestra la pertinencia de integrar detección y retroalimentación en un dispositivo de uso cotidiano. Sin embargo, sus cálculos de distancia dependen del tamaño aparente del objeto y de una calibración aproximada; además, los autores reconocen limitaciones para el mapeo completo de la ruta.</w:t>
       </w:r>
     </w:p>
     <w:p>
@@ -3838,7 +3926,23 @@
         <w:jc w:val="both"/>
       </w:pPr>
       <w:r>
-        <w:t xml:space="preserve">Guravaiah et al. presentaron Third Eye, un sistema que utiliza YOLOv5 para reconocer objetos y convertir las etiquetas detectadas en voz mediante las bibliotecas pyttsx3 y gTTS [12]. El conjunto combina MS COCO con quince clases adicionales de interés para el entorno cotidiano, como puertas, ventanas, casilleros y señales, para un total de noventa y cinco clases [13]. El aporte principal es la integración explícita entre detección y síntesis de voz; no obstante, la implementación se plantea en Python y no resuelve de manera métrica la profundidad ni la localización espacial detallada.</w:t>
+        <w:t xml:space="preserve">Guravaiah et al. presentaron Third Eye, un sistema que utiliza YOLOv5 para reconocer objetos y convertir las etiquetas detectadas en voz mediante las bibliotecas pyttsx3 y gTTS </w:t>
+      </w:r>
+      <w:hyperlink w:anchor="bib_ref_12" w:history="1">
+        <w:r>
+          <w:t xml:space="preserve">[12]</w:t>
+        </w:r>
+      </w:hyperlink>
+      <w:r>
+        <w:t xml:space="preserve">. El conjunto combina MS COCO con quince clases adicionales de interés para el entorno cotidiano, como puertas, ventanas, casilleros y señales, para un total de noventa y cinco clases </w:t>
+      </w:r>
+      <w:hyperlink w:anchor="bib_ref_13" w:history="1">
+        <w:r>
+          <w:t xml:space="preserve">[13]</w:t>
+        </w:r>
+      </w:hyperlink>
+      <w:r>
+        <w:t xml:space="preserve">. El aporte principal es la integración explícita entre detección y síntesis de voz; no obstante, la implementación se plantea en Python y no resuelve de manera métrica la profundidad ni la localización espacial detallada.</w:t>
       </w:r>
     </w:p>
     <w:p>
@@ -3849,7 +3953,15 @@
         <w:jc w:val="both"/>
       </w:pPr>
       <w:r>
-        <w:t xml:space="preserve">Pawar estudió una aplicación Android basada en TensorFlow Object Detection API y SSD MobileNet, ajustada mediante transferencia de aprendizaje para reconocer ochenta categorías [14]. El sistema utiliza más de mil imágenes anotadas, aumento de datos y retroalimentación mediante texto a voz. El artículo reporta una exactitud aproximada del noventa por ciento y destaca la operación sin conexión como una ventaja de accesibilidad. Para el presente trabajo, este antecedente confirma la viabilidad de SSD MobileNet en aplicaciones móviles, pero también resalta la necesidad de separar la exactitud reportada en un conjunto propio de la medición reproducible de mAP, precisión, </w:t>
+        <w:t xml:space="preserve">Pawar estudió una aplicación Android basada en TensorFlow Object Detection API y SSD MobileNet, ajustada mediante transferencia de aprendizaje para reconocer ochenta categorías </w:t>
+      </w:r>
+      <w:hyperlink w:anchor="bib_ref_14" w:history="1">
+        <w:r>
+          <w:t xml:space="preserve">[14]</w:t>
+        </w:r>
+      </w:hyperlink>
+      <w:r>
+        <w:t xml:space="preserve">. El sistema utiliza más de mil imágenes anotadas, aumento de datos y retroalimentación mediante texto a voz. El artículo reporta una exactitud aproximada del noventa por ciento y destaca la operación sin conexión como una ventaja de accesibilidad. Para el presente trabajo, este antecedente confirma la viabilidad de SSD MobileNet en aplicaciones móviles, pero también resalta la necesidad de separar la exactitud reportada en un conjunto propio de la medición reproducible de mAP, precisión, </w:t>
       </w:r>
       <w:r>
         <w:rPr>
@@ -3869,7 +3981,15 @@
         <w:jc w:val="both"/>
       </w:pPr>
       <w:r>
-        <w:t xml:space="preserve">Figura, Kuźmiczuk y Badurowicz compararon Faster R-CNN ResNet-101 v1, YOLOv8s, SSD MobileNetV2 y EfficientDet-Lite2 en un entorno simulado de gafas de realidad aumentada [15]. Evaluaron velocidad, precisión, consumo de recursos y eficiencia energética. Sus resultados muestran que los detectores de una etapa son más apropiados para ejecución directa en el dispositivo; YOLOv8s obtuvo la mejor combinación de precisión y velocidad entre los modelos analizados, mientras EfficientDet-Lite2 y SSD MobileNetV2 presentaron ventajas de rapidez. Este estudio es especialmente cercano al problema de selección abordado en el capítulo 2 porque compara dos de los candidatos considerados en este trabajo.</w:t>
+        <w:t xml:space="preserve">Figura, Kuźmiczuk y Badurowicz compararon Faster R-CNN ResNet-101 v1, YOLOv8s, SSD MobileNetV2 y EfficientDet-Lite2 en un entorno simulado de gafas de realidad aumentada </w:t>
+      </w:r>
+      <w:hyperlink w:anchor="bib_ref_15" w:history="1">
+        <w:r>
+          <w:t xml:space="preserve">[15]</w:t>
+        </w:r>
+      </w:hyperlink>
+      <w:r>
+        <w:t xml:space="preserve">. Evaluaron velocidad, precisión, consumo de recursos y eficiencia energética. Sus resultados muestran que los detectores de una etapa son más apropiados para ejecución directa en el dispositivo; YOLOv8s obtuvo la mejor combinación de precisión y velocidad entre los modelos analizados, mientras EfficientDet-Lite2 y SSD MobileNetV2 presentaron ventajas de rapidez. Este estudio es especialmente cercano al problema de selección abordado en el capítulo 2 porque compara dos de los candidatos considerados en este trabajo.</w:t>
       </w:r>
     </w:p>
     <w:p>
@@ -3880,7 +4000,15 @@
         <w:jc w:val="both"/>
       </w:pPr>
       <w:r>
-        <w:t xml:space="preserve">More et al. propusieron una aplicación Android para personas con discapacidad visual que convierte YOLOv8 a TensorFlow Lite y añade retroalimentación auditiva [8]. En sus pruebas, el modelo YOLOv8n a 640×640 alcanzó un mAP50 de 79,9 % y un mAP50-95 de 57,1 %, con un tiempo medio de inferencia de 350 ms; el modelo mediano obtuvo valores superiores de exactitud, pero con un costo temporal mayor. El resultado ilustra el compromiso entre tamaño del modelo, resolución, exactitud y latencia que debe considerarse antes de desplegar un detector en un teléfono.</w:t>
+        <w:t xml:space="preserve">More et al. propusieron una aplicación Android para personas con discapacidad visual que convierte YOLOv8 a TensorFlow Lite y añade retroalimentación auditiva </w:t>
+      </w:r>
+      <w:hyperlink w:anchor="bib_ref_8" w:history="1">
+        <w:r>
+          <w:t xml:space="preserve">[8]</w:t>
+        </w:r>
+      </w:hyperlink>
+      <w:r>
+        <w:t xml:space="preserve">. En sus pruebas, el modelo YOLOv8n a 640×640 alcanzó un mAP50 de 79,9 % y un mAP50-95 de 57,1 %, con un tiempo medio de inferencia de 350 ms; el modelo mediano obtuvo valores superiores de exactitud, pero con un costo temporal mayor. El resultado ilustra el compromiso entre tamaño del modelo, resolución, exactitud y latencia que debe considerarse antes de desplegar un detector en un teléfono.</w:t>
       </w:r>
     </w:p>
     <w:p>
@@ -3927,7 +4055,15 @@
         <w:jc w:val="both"/>
       </w:pPr>
       <w:r>
-        <w:t xml:space="preserve">Los modelos de detección de objetos basados en redes neuronales profundas se clasifican en dos grandes categorías según su arquitectura [1].</w:t>
+        <w:t xml:space="preserve">Los modelos de detección de objetos basados en redes neuronales profundas se clasifican en dos grandes categorías según su arquitectura </w:t>
+      </w:r>
+      <w:hyperlink w:anchor="bib_ref_1" w:history="1">
+        <w:r>
+          <w:t xml:space="preserve">[1]</w:t>
+        </w:r>
+      </w:hyperlink>
+      <w:r>
+        <w:t xml:space="preserve">.</w:t>
       </w:r>
     </w:p>
     <w:p>
@@ -3947,7 +4083,15 @@
         <w:t>bounding box</w:t>
       </w:r>
       <w:r>
-        <w:t xml:space="preserve"> [4]. Ejemplos de esta arquitectura incluyen la familia R-CNN, específicamente Faster R-CNN y Mask R-CNN.</w:t>
+        <w:t xml:space="preserve"> </w:t>
+      </w:r>
+      <w:hyperlink w:anchor="bib_ref_4" w:history="1">
+        <w:r>
+          <w:t xml:space="preserve">[4]</w:t>
+        </w:r>
+      </w:hyperlink>
+      <w:r>
+        <w:t xml:space="preserve">. Ejemplos de esta arquitectura incluyen la familia R-CNN, específicamente Faster R-CNN y Mask R-CNN.</w:t>
       </w:r>
     </w:p>
     <w:p>
@@ -3967,7 +4111,47 @@
         <w:t>bounding boxes</w:t>
       </w:r>
       <w:r>
-        <w:t xml:space="preserve"> simultáneamente como un problema de regresión directa [5], [6]. Una red convolucional extrae mapas de características espaciales y semánticas, sobre los cuales el modelo predice coordenadas y probabilidades de clase. YOLO prioriza la velocidad [5], SSD utiliza mapas multiescala y cajas predefinidas [6], y EfficientDet incorpora una fusión bidireccional de características y un escalamiento compuesto [7].</w:t>
+        <w:t xml:space="preserve"> simultáneamente como un problema de regresión directa </w:t>
+      </w:r>
+      <w:hyperlink w:anchor="bib_ref_5" w:history="1">
+        <w:r>
+          <w:t xml:space="preserve">[5]</w:t>
+        </w:r>
+      </w:hyperlink>
+      <w:r>
+        <w:t xml:space="preserve">, </w:t>
+      </w:r>
+      <w:hyperlink w:anchor="bib_ref_6" w:history="1">
+        <w:r>
+          <w:t xml:space="preserve">[6]</w:t>
+        </w:r>
+      </w:hyperlink>
+      <w:r>
+        <w:t xml:space="preserve">. Una red convolucional extrae mapas de características espaciales y semánticas, sobre los cuales el modelo predice coordenadas y probabilidades de clase. YOLO prioriza la velocidad </w:t>
+      </w:r>
+      <w:hyperlink w:anchor="bib_ref_5" w:history="1">
+        <w:r>
+          <w:t xml:space="preserve">[5]</w:t>
+        </w:r>
+      </w:hyperlink>
+      <w:r>
+        <w:t xml:space="preserve">, SSD utiliza mapas multiescala y cajas predefinidas </w:t>
+      </w:r>
+      <w:hyperlink w:anchor="bib_ref_6" w:history="1">
+        <w:r>
+          <w:t xml:space="preserve">[6]</w:t>
+        </w:r>
+      </w:hyperlink>
+      <w:r>
+        <w:t xml:space="preserve">, y EfficientDet incorpora una fusión bidireccional de características y un escalamiento compuesto </w:t>
+      </w:r>
+      <w:hyperlink w:anchor="bib_ref_7" w:history="1">
+        <w:r>
+          <w:t xml:space="preserve">[7]</w:t>
+        </w:r>
+      </w:hyperlink>
+      <w:r>
+        <w:t xml:space="preserve">.</w:t>
       </w:r>
     </w:p>
     <w:p>
@@ -4008,7 +4192,15 @@
         <w:jc w:val="both"/>
       </w:pPr>
       <w:r>
-        <w:t xml:space="preserve">Howard et al. propusieron MobileNets como una familia de redes para visión móvil basada en convoluciones separables en profundidad [16]. La factorización reduce de manera importante las operaciones y los parámetros frente a una convolución convencional. Además, los multiplicadores de ancho y resolución permiten ajustar el costo computacional a las capacidades del dispositivo, lo que explica la amplia adopción de MobileNet como </w:t>
+        <w:t xml:space="preserve">Howard et al. propusieron MobileNets como una familia de redes para visión móvil basada en convoluciones separables en profundidad </w:t>
+      </w:r>
+      <w:hyperlink w:anchor="bib_ref_16" w:history="1">
+        <w:r>
+          <w:t xml:space="preserve">[16]</w:t>
+        </w:r>
+      </w:hyperlink>
+      <w:r>
+        <w:t xml:space="preserve">. La factorización reduce de manera importante las operaciones y los parámetros frente a una convolución convencional. Además, los multiplicadores de ancho y resolución permiten ajustar el costo computacional a las capacidades del dispositivo, lo que explica la amplia adopción de MobileNet como </w:t>
       </w:r>
       <w:r>
         <w:rPr>
@@ -4028,7 +4220,15 @@
         <w:jc w:val="both"/>
       </w:pPr>
       <w:r>
-        <w:t xml:space="preserve">MobileNetV2, presentada por Sandler et al., introduce residuos invertidos y cuellos de botella lineales para mejorar la relación entre expresividad y costo [17]. Al combinarse con SSDLite, la arquitectura reporta una reducción sustancial de operaciones y parámetros frente a YOLOv2, manteniendo un desempeño competitivo en detección sobre COCO. Este antecedente explica por qué las variantes SSD MobileNet son candidatos naturales para aplicaciones Android.</w:t>
+        <w:t xml:space="preserve">MobileNetV2, presentada por Sandler et al., introduce residuos invertidos y cuellos de botella lineales para mejorar la relación entre expresividad y costo </w:t>
+      </w:r>
+      <w:hyperlink w:anchor="bib_ref_17" w:history="1">
+        <w:r>
+          <w:t xml:space="preserve">[17]</w:t>
+        </w:r>
+      </w:hyperlink>
+      <w:r>
+        <w:t xml:space="preserve">. Al combinarse con SSDLite, la arquitectura reporta una reducción sustancial de operaciones y parámetros frente a YOLOv2, manteniendo un desempeño competitivo en detección sobre COCO. Este antecedente explica por qué las variantes SSD MobileNet son candidatos naturales para aplicaciones Android.</w:t>
       </w:r>
     </w:p>
     <w:p>
@@ -4039,7 +4239,15 @@
         <w:jc w:val="both"/>
       </w:pPr>
       <w:r>
-        <w:t xml:space="preserve">Dai estudió la ejecución de detectores en dispositivos de borde mediante TensorFlow Lite y la conversión de modelos Float32 a uint8 [18]. En sus experimentos sobre MS COCO, SSD300 alcanzó 58 FPS con un mAP de 72,1 %, mientras SSD500 alcanzó 23 FPS con un mAP de 75,1 %; Faster R-CNN obtuvo 7 FPS con un mAP de 73,2 %. Aunque las condiciones de hardware y el protocolo no son idénticos a los de este trabajo, la comparación evidencia el efecto de la cuantización y del tamaño de entrada sobre la velocidad.</w:t>
+        <w:t xml:space="preserve">Dai estudió la ejecución de detectores en dispositivos de borde mediante TensorFlow Lite y la conversión de modelos Float32 a uint8 </w:t>
+      </w:r>
+      <w:hyperlink w:anchor="bib_ref_18" w:history="1">
+        <w:r>
+          <w:t xml:space="preserve">[18]</w:t>
+        </w:r>
+      </w:hyperlink>
+      <w:r>
+        <w:t xml:space="preserve">. En sus experimentos sobre MS COCO, SSD300 alcanzó 58 FPS con un mAP de 72,1 %, mientras SSD500 alcanzó 23 FPS con un mAP de 75,1 %; Faster R-CNN obtuvo 7 FPS con un mAP de 73,2 %. Aunque las condiciones de hardware y el protocolo no son idénticos a los de este trabajo, la comparación evidencia el efecto de la cuantización y del tamaño de entrada sobre la velocidad.</w:t>
       </w:r>
     </w:p>
     <w:p>
@@ -4050,7 +4258,15 @@
         <w:jc w:val="both"/>
       </w:pPr>
       <w:r>
-        <w:t xml:space="preserve">Magdy et al. analizaron la compresión de Faster R-CNN mediante entrenamiento con precisión mixta FP16, poda no estructurada y cuantización dinámica [19]. En conjuntos de imágenes de teledetección, la estrategia redujo en promedio el tamaño del modelo un 25,6 % y el número de parámetros un 56,6 %, manteniendo el mAP. Aunque el dominio es diferente, el resultado muestra que un detector de dos etapas puede optimizarse; aun así, la complejidad de ese proceso debe contrastarse con la disponibilidad de modelos ligeros preentrenados para el caso de uso móvil.</w:t>
+        <w:t xml:space="preserve">Magdy et al. analizaron la compresión de Faster R-CNN mediante entrenamiento con precisión mixta FP16, poda no estructurada y cuantización dinámica </w:t>
+      </w:r>
+      <w:hyperlink w:anchor="bib_ref_19" w:history="1">
+        <w:r>
+          <w:t xml:space="preserve">[19]</w:t>
+        </w:r>
+      </w:hyperlink>
+      <w:r>
+        <w:t xml:space="preserve">. En conjuntos de imágenes de teledetección, la estrategia redujo en promedio el tamaño del modelo un 25,6 % y el número de parámetros un 56,6 %, manteniendo el mAP. Aunque el dominio es diferente, el resultado muestra que un detector de dos etapas puede optimizarse; aun así, la complejidad de ese proceso debe contrastarse con la disponibilidad de modelos ligeros preentrenados para el caso de uso móvil.</w:t>
       </w:r>
     </w:p>
     <w:p>
@@ -4093,7 +4309,15 @@
         <w:jc w:val="both"/>
       </w:pPr>
       <w:r>
-        <w:t xml:space="preserve">Faster R-CNN representa la alternativa de dos etapas y ofrece alta precisión mediante una Red de Propuesta de Regiones, pero su costo de inferencia y memoria puede limitar el tiempo real en un teléfono. Las estrategias de compresión descritas por Magdy et al. muestran posibilidades de optimización [19], aunque el prototipo de este trabajo no entrena ni comprime este modelo.</w:t>
+        <w:t xml:space="preserve">Faster R-CNN representa la alternativa de dos etapas y ofrece alta precisión mediante una Red de Propuesta de Regiones, pero su costo de inferencia y memoria puede limitar el tiempo real en un teléfono. Las estrategias de compresión descritas por Magdy et al. muestran posibilidades de optimización </w:t>
+      </w:r>
+      <w:hyperlink w:anchor="bib_ref_19" w:history="1">
+        <w:r>
+          <w:t xml:space="preserve">[19]</w:t>
+        </w:r>
+      </w:hyperlink>
+      <w:r>
+        <w:t xml:space="preserve">, aunque el prototipo de este trabajo no entrena ni comprime este modelo.</w:t>
       </w:r>
     </w:p>
     <w:p>
@@ -4113,7 +4337,31 @@
         <w:t>backbone</w:t>
       </w:r>
       <w:r>
-        <w:t xml:space="preserve"> ligero. SSD predice objetos en mapas de características de diferentes escalas y MobileNet reduce el costo de las convoluciones [6], [16], [17]. Esta combinación favorece la velocidad, pero su precisión de localización debe verificarse para las clases y escenas interiores del conjunto propio.</w:t>
+        <w:t xml:space="preserve"> ligero. SSD predice objetos en mapas de características de diferentes escalas y MobileNet reduce el costo de las convoluciones </w:t>
+      </w:r>
+      <w:hyperlink w:anchor="bib_ref_6" w:history="1">
+        <w:r>
+          <w:t xml:space="preserve">[6]</w:t>
+        </w:r>
+      </w:hyperlink>
+      <w:r>
+        <w:t xml:space="preserve">, </w:t>
+      </w:r>
+      <w:hyperlink w:anchor="bib_ref_16" w:history="1">
+        <w:r>
+          <w:t xml:space="preserve">[16]</w:t>
+        </w:r>
+      </w:hyperlink>
+      <w:r>
+        <w:t xml:space="preserve">, </w:t>
+      </w:r>
+      <w:hyperlink w:anchor="bib_ref_17" w:history="1">
+        <w:r>
+          <w:t xml:space="preserve">[17]</w:t>
+        </w:r>
+      </w:hyperlink>
+      <w:r>
+        <w:t xml:space="preserve">. Esta combinación favorece la velocidad, pero su precisión de localización debe verificarse para las clases y escenas interiores del conjunto propio.</w:t>
       </w:r>
     </w:p>
     <w:p>
@@ -4124,7 +4372,15 @@
         <w:jc w:val="both"/>
       </w:pPr>
       <w:r>
-        <w:t xml:space="preserve">EfficientDet es una familia de detectores de una etapa basada en EfficientNet, BiFPN y escalamiento compuesto [7]. Sus variantes Lite fueron diseñadas para dispositivos móviles y </w:t>
+        <w:t xml:space="preserve">EfficientDet es una familia de detectores de una etapa basada en EfficientNet, BiFPN y escalamiento compuesto </w:t>
+      </w:r>
+      <w:hyperlink w:anchor="bib_ref_7" w:history="1">
+        <w:r>
+          <w:t xml:space="preserve">[7]</w:t>
+        </w:r>
+      </w:hyperlink>
+      <w:r>
+        <w:t xml:space="preserve">. Sus variantes Lite fueron diseñadas para dispositivos móviles y </w:t>
       </w:r>
       <w:r>
         <w:rPr>
@@ -4144,7 +4400,15 @@
         <w:jc w:val="both"/>
       </w:pPr>
       <w:r>
-        <w:t xml:space="preserve">YOLO realiza la detección en una sola pasada y dispone de variantes con diferentes tamaños, desde modelos pequeños hasta modelos de mayor capacidad [5]. Su ventaja principal es la velocidad, mientras que el tamaño de la variante y la resolución de entrada determinan el costo real de ejecución en Android.</w:t>
+        <w:t xml:space="preserve">YOLO realiza la detección en una sola pasada y dispone de variantes con diferentes tamaños, desde modelos pequeños hasta modelos de mayor capacidad </w:t>
+      </w:r>
+      <w:hyperlink w:anchor="bib_ref_5" w:history="1">
+        <w:r>
+          <w:t xml:space="preserve">[5]</w:t>
+        </w:r>
+      </w:hyperlink>
+      <w:r>
+        <w:t xml:space="preserve">. Su ventaja principal es la velocidad, mientras que el tamaño de la variante y la resolución de entrada determinan el costo real de ejecución en Android.</w:t>
       </w:r>
     </w:p>
     <w:p>
@@ -4155,7 +4419,23 @@
         <w:jc w:val="both"/>
       </w:pPr>
       <w:r>
-        <w:t xml:space="preserve">Las clases prioritarias del prototipo se relacionan con categorías disponibles en MS COCO, conjunto que contiene anotaciones para detección y segmentación en escenas cotidianas [13]. También se revisó Open Images como fuente de categorías y anotaciones de gran escala [20]. En la implementación final se mantuvo MS COCO porque EfficientDet-Lite2 ya dispone de pesos compatibles con sus categorías y no fue necesario entrenar un modelo propio.</w:t>
+        <w:t xml:space="preserve">Las clases prioritarias del prototipo se relacionan con categorías disponibles en MS COCO, conjunto que contiene anotaciones para detección y segmentación en escenas cotidianas </w:t>
+      </w:r>
+      <w:hyperlink w:anchor="bib_ref_13" w:history="1">
+        <w:r>
+          <w:t xml:space="preserve">[13]</w:t>
+        </w:r>
+      </w:hyperlink>
+      <w:r>
+        <w:t xml:space="preserve">. También se revisó Open Images como fuente de categorías y anotaciones de gran escala </w:t>
+      </w:r>
+      <w:hyperlink w:anchor="bib_ref_20" w:history="1">
+        <w:r>
+          <w:t xml:space="preserve">[20]</w:t>
+        </w:r>
+      </w:hyperlink>
+      <w:r>
+        <w:t xml:space="preserve">. En la implementación final se mantuvo MS COCO porque EfficientDet-Lite2 ya dispone de pesos compatibles con sus categorías y no fue necesario entrenar un modelo propio.</w:t>
       </w:r>
     </w:p>
     <w:p>
@@ -4166,7 +4446,31 @@
         <w:jc w:val="both"/>
       </w:pPr>
       <w:r>
-        <w:t xml:space="preserve">La portabilidad de los modelos también depende del formato de inferencia. TensorFlow Lite permite ejecutar archivos .tflite en el dispositivo [3], mientras ONNX Runtime y ExecuTorch representan alternativas para otros ecosistemas de despliegue [21], [22]. AssistiveVision utiliza TensorFlow Lite por su integración directa con el modelo EfficientDet-Lite2 seleccionado.</w:t>
+        <w:t xml:space="preserve">La portabilidad de los modelos también depende del formato de inferencia. TensorFlow Lite permite ejecutar archivos .tflite en el dispositivo </w:t>
+      </w:r>
+      <w:hyperlink w:anchor="bib_ref_3" w:history="1">
+        <w:r>
+          <w:t xml:space="preserve">[3]</w:t>
+        </w:r>
+      </w:hyperlink>
+      <w:r>
+        <w:t xml:space="preserve">, mientras ONNX Runtime y ExecuTorch representan alternativas para otros ecosistemas de despliegue </w:t>
+      </w:r>
+      <w:hyperlink w:anchor="bib_ref_21" w:history="1">
+        <w:r>
+          <w:t xml:space="preserve">[21]</w:t>
+        </w:r>
+      </w:hyperlink>
+      <w:r>
+        <w:t xml:space="preserve">, </w:t>
+      </w:r>
+      <w:hyperlink w:anchor="bib_ref_22" w:history="1">
+        <w:r>
+          <w:t xml:space="preserve">[22]</w:t>
+        </w:r>
+      </w:hyperlink>
+      <w:r>
+        <w:t xml:space="preserve">. AssistiveVision utiliza TensorFlow Lite por su integración directa con el modelo EfficientDet-Lite2 seleccionado.</w:t>
       </w:r>
     </w:p>
     <w:p>
@@ -4187,7 +4491,15 @@
         <w:jc w:val="both"/>
       </w:pPr>
       <w:r>
-        <w:t xml:space="preserve">DETR (DEtection TRansformer) introduce un paradigma basado en transformers para realizar detección de objetos de extremo a extremo [23]. El modelo procesa la imagen completa y utiliza object queries para producir predicciones directas, sin seguir explícitamente el esquema clásico de una o dos etapas. Su formulación reduce componentes como las cajas predefinidas y la supresión no máxima, pero su costo computacional y la exigencia de datos y hardware limitan su conveniencia para el teléfono de gama media utilizado en este proyecto.</w:t>
+        <w:t xml:space="preserve">DETR (DEtection TRansformer) introduce un paradigma basado en transformers para realizar detección de objetos de extremo a extremo </w:t>
+      </w:r>
+      <w:hyperlink w:anchor="bib_ref_23" w:history="1">
+        <w:r>
+          <w:t xml:space="preserve">[23]</w:t>
+        </w:r>
+      </w:hyperlink>
+      <w:r>
+        <w:t xml:space="preserve">. El modelo procesa la imagen completa y utiliza object queries para producir predicciones directas, sin seguir explícitamente el esquema clásico de una o dos etapas. Su formulación reduce componentes como las cajas predefinidas y la supresión no máxima, pero su costo computacional y la exigencia de datos y hardware limitan su conveniencia para el teléfono de gama media utilizado en este proyecto.</w:t>
       </w:r>
     </w:p>
     <w:p>
@@ -4331,7 +4643,15 @@
         <w:t>recall</w:t>
       </w:r>
       <w:r>
-        <w:t xml:space="preserve"> y promedia las categorías evaluables. Un error de clase produce una predicción falsa y deja sin recuperar la anotación de la clase correcta [13].</w:t>
+        <w:t xml:space="preserve"> y promedia las categorías evaluables. Un error de clase produce una predicción falsa y deja sin recuperar la anotación de la clase correcta </w:t>
+      </w:r>
+      <w:hyperlink w:anchor="bib_ref_13" w:history="1">
+        <w:r>
+          <w:t xml:space="preserve">[13]</w:t>
+        </w:r>
+      </w:hyperlink>
+      <w:r>
+        <w:t xml:space="preserve">.</w:t>
       </w:r>
     </w:p>
     <w:p>
@@ -4351,7 +4671,15 @@
         <w:t>bounding boxes</w:t>
       </w:r>
       <w:r>
-        <w:t xml:space="preserve"> no se ajustan con precisión al objeto detectado. Al igual que mAP50, la evaluación se realiza por clase, por lo que un error de clasificación penaliza ambas métricas por igual. Para el sistema propuesto, mAP50-95 indica la precisión geométrica de las detecciones [13].</w:t>
+        <w:t xml:space="preserve"> no se ajustan con precisión al objeto detectado. Al igual que mAP50, la evaluación se realiza por clase, por lo que un error de clasificación penaliza ambas métricas por igual. Para el sistema propuesto, mAP50-95 indica la precisión geométrica de las detecciones </w:t>
+      </w:r>
+      <w:hyperlink w:anchor="bib_ref_13" w:history="1">
+        <w:r>
+          <w:t xml:space="preserve">[13]</w:t>
+        </w:r>
+      </w:hyperlink>
+      <w:r>
+        <w:t xml:space="preserve">.</w:t>
       </w:r>
     </w:p>
     <w:p>
@@ -4362,7 +4690,15 @@
         <w:jc w:val="both"/>
       </w:pPr>
       <w:r>
-        <w:t xml:space="preserve">Precisión (Precision). La precisión indica, de todas las detecciones realizadas por el modelo, qué porcentaje fue correcto, midiendo la tasa de falsos positivos: Precision = TP / (TP + FP), donde TP corresponde a verdaderos positivos y FP a falsos positivos. Para el sistema propuesto, si el modelo anuncia la presencia de una silla cuando no hay ninguna silla en la escena, el usuario recibe una indicación errónea y pierde confianza en el sistema, por lo que una precisión alta resulta fundamental [1].</w:t>
+        <w:t xml:space="preserve">Precisión (Precision). La precisión indica, de todas las detecciones realizadas por el modelo, qué porcentaje fue correcto, midiendo la tasa de falsos positivos: Precision = TP / (TP + FP), donde TP corresponde a verdaderos positivos y FP a falsos positivos. Para el sistema propuesto, si el modelo anuncia la presencia de una silla cuando no hay ninguna silla en la escena, el usuario recibe una indicación errónea y pierde confianza en el sistema, por lo que una precisión alta resulta fundamental </w:t>
+      </w:r>
+      <w:hyperlink w:anchor="bib_ref_1" w:history="1">
+        <w:r>
+          <w:t xml:space="preserve">[1]</w:t>
+        </w:r>
+      </w:hyperlink>
+      <w:r>
+        <w:t xml:space="preserve">.</w:t>
       </w:r>
     </w:p>
     <w:p>
@@ -4426,7 +4762,15 @@
         <w:t>Recall</w:t>
       </w:r>
       <w:r>
-        <w:t>). A diferencia de la media aritmética, penaliza el desequilibrio entre ambas métricas, por lo que resulta útil como métrica única de exactitud global cuando se requiere un compromiso entre falsos positivos y falsos negativos [1].</w:t>
+        <w:t xml:space="preserve">). A diferencia de la media aritmética, penaliza el desequilibrio entre ambas métricas, por lo que resulta útil como métrica única de exactitud global cuando se requiere un compromiso entre falsos positivos y falsos negativos </w:t>
+      </w:r>
+      <w:hyperlink w:anchor="bib_ref_1" w:history="1">
+        <w:r>
+          <w:t xml:space="preserve">[1]</w:t>
+        </w:r>
+      </w:hyperlink>
+      <w:r>
+        <w:t xml:space="preserve">.</w:t>
       </w:r>
     </w:p>
     <w:p>
@@ -4457,7 +4801,15 @@
         <w:t>Benchmark</w:t>
       </w:r>
       <w:r>
-        <w:t xml:space="preserve"> Tool [24].</w:t>
+        <w:t xml:space="preserve"> Tool </w:t>
+      </w:r>
+      <w:hyperlink w:anchor="bib_ref_24" w:history="1">
+        <w:r>
+          <w:t xml:space="preserve">[24]</w:t>
+        </w:r>
+      </w:hyperlink>
+      <w:r>
+        <w:t xml:space="preserve">.</w:t>
       </w:r>
     </w:p>
     <w:p>
@@ -4468,7 +4820,15 @@
         <w:jc w:val="both"/>
       </w:pPr>
       <w:r>
-        <w:t xml:space="preserve">Tiempo de inicialización. El tiempo de inicialización corresponde al intervalo requerido para cargar el modelo en memoria, crear el intérprete y preparar los delegados de hardware antes de la primera inferencia. Esta métrica afecta directamente el tiempo que transcurre desde que el usuario abre la aplicación hasta que el sistema de detección está listo para operar [24].</w:t>
+        <w:t xml:space="preserve">Tiempo de inicialización. El tiempo de inicialización corresponde al intervalo requerido para cargar el modelo en memoria, crear el intérprete y preparar los delegados de hardware antes de la primera inferencia. Esta métrica afecta directamente el tiempo que transcurre desde que el usuario abre la aplicación hasta que el sistema de detección está listo para operar </w:t>
+      </w:r>
+      <w:hyperlink w:anchor="bib_ref_24" w:history="1">
+        <w:r>
+          <w:t xml:space="preserve">[24]</w:t>
+        </w:r>
+      </w:hyperlink>
+      <w:r>
+        <w:t xml:space="preserve">.</w:t>
       </w:r>
     </w:p>
     <w:p>
@@ -4487,7 +4847,15 @@
         <w:jc w:val="both"/>
       </w:pPr>
       <w:r>
-        <w:t>La reducción de precisión numérica, por ejemplo de pesos Float32 a Float16, puede disminuir el tamaño del archivo. Su efecto sobre la latencia y la exactitud depende del modelo, del backend y del hardware; requiere medición. La cuantización entera, como INT8, introduce además escalas y desplazamientos que deben respetarse durante la inferencia. El formato de los pesos y el tipo del tensor de entrada son propiedades distintas [3].</w:t>
+        <w:t xml:space="preserve">La reducción de precisión numérica, por ejemplo de pesos Float32 a Float16, puede disminuir el tamaño del archivo. Su efecto sobre la latencia y la exactitud depende del modelo, del backend y del hardware; requiere medición. La cuantización entera, como INT8, introduce además escalas y desplazamientos que deben respetarse durante la inferencia. El formato de los pesos y el tipo del tensor de entrada son propiedades distintas </w:t>
+      </w:r>
+      <w:hyperlink w:anchor="bib_ref_3" w:history="1">
+        <w:r>
+          <w:t xml:space="preserve">[3]</w:t>
+        </w:r>
+      </w:hyperlink>
+      <w:r>
+        <w:t xml:space="preserve">.</w:t>
       </w:r>
     </w:p>
     <w:p>
@@ -4515,7 +4883,15 @@
         <w:t>framework</w:t>
       </w:r>
       <w:r>
-        <w:t xml:space="preserve"> de inferencia de Google optimizado para dispositivos móviles y embebidos. Ejecuta modelos en formato .tflite directamente en el dispositivo, sin requerir conexión a internet ni servidores externos [3].</w:t>
+        <w:t xml:space="preserve"> de inferencia de Google optimizado para dispositivos móviles y embebidos. Ejecuta modelos en formato .tflite directamente en el dispositivo, sin requerir conexión a internet ni servidores externos </w:t>
+      </w:r>
+      <w:hyperlink w:anchor="bib_ref_3" w:history="1">
+        <w:r>
+          <w:t xml:space="preserve">[3]</w:t>
+        </w:r>
+      </w:hyperlink>
+      <w:r>
+        <w:t xml:space="preserve">.</w:t>
       </w:r>
     </w:p>
     <w:p>
@@ -4535,7 +4911,15 @@
         <w:t>recall</w:t>
       </w:r>
       <w:r>
-        <w:t xml:space="preserve"> y F1 mediante emparejamiento por clase e IoU. El protocolo COCO y el cálculo de métricas a un umbral fijo se documentan por separado para distinguir la evaluación de la curva de puntuaciones de la operación del prototipo [13].</w:t>
+        <w:t xml:space="preserve"> y F1 mediante emparejamiento por clase e IoU. El protocolo COCO y el cálculo de métricas a un umbral fijo se documentan por separado para distinguir la evaluación de la curva de puntuaciones de la operación del prototipo </w:t>
+      </w:r>
+      <w:hyperlink w:anchor="bib_ref_13" w:history="1">
+        <w:r>
+          <w:t xml:space="preserve">[13]</w:t>
+        </w:r>
+      </w:hyperlink>
+      <w:r>
+        <w:t xml:space="preserve">.</w:t>
       </w:r>
     </w:p>
     <w:p>
@@ -4555,7 +4939,15 @@
         <w:t>Benchmark</w:t>
       </w:r>
       <w:r>
-        <w:t xml:space="preserve"> Tool, específicamente el binario compilado android_aarch64_benchmark_model, ejecutado vía ADB. Este binario en C++ permite medir el tiempo de inferencia directamente sobre el dispositivo con soporte para aceleración por GPU, sin incluir captura de cámara ni postprocesado de resultados, garantizando mediciones aisladas y reproducibles. Se ejecutaron 50 iteraciones por modelo con 4 hilos de procesamiento [24].</w:t>
+        <w:t xml:space="preserve"> Tool, específicamente el binario compilado android_aarch64_benchmark_model, ejecutado vía ADB. Este binario en C++ permite medir el tiempo de inferencia directamente sobre el dispositivo con soporte para aceleración por GPU, sin incluir captura de cámara ni postprocesado de resultados, garantizando mediciones aisladas y reproducibles. Se ejecutaron 50 iteraciones por modelo con 4 hilos de procesamiento </w:t>
+      </w:r>
+      <w:hyperlink w:anchor="bib_ref_24" w:history="1">
+        <w:r>
+          <w:t xml:space="preserve">[24]</w:t>
+        </w:r>
+      </w:hyperlink>
+      <w:r>
+        <w:t xml:space="preserve">.</w:t>
       </w:r>
     </w:p>
     <w:p>
@@ -4575,7 +4967,15 @@
         <w:t>benchmark</w:t>
       </w:r>
       <w:r>
-        <w:t xml:space="preserve"> sobre el dispositivo se realizó mediante Android Debug Bridge (ADB), la herramienta oficial de línea de comandos de la plataforma Android que permite transferir los modelos y el binario al dispositivo, lanzar las mediciones y recopilar los resultados desde el equipo de desarrollo, garantizando un procedimiento reproducible sin intervención manual sobre el teléfono [25].</w:t>
+        <w:t xml:space="preserve"> sobre el dispositivo se realizó mediante Android Debug Bridge (ADB), la herramienta oficial de línea de comandos de la plataforma Android que permite transferir los modelos y el binario al dispositivo, lanzar las mediciones y recopilar los resultados desde el equipo de desarrollo, garantizando un procedimiento reproducible sin intervención manual sobre el teléfono </w:t>
+      </w:r>
+      <w:hyperlink w:anchor="bib_ref_25" w:history="1">
+        <w:r>
+          <w:t xml:space="preserve">[25]</w:t>
+        </w:r>
+      </w:hyperlink>
+      <w:r>
+        <w:t xml:space="preserve">.</w:t>
       </w:r>
     </w:p>
     <w:p>
@@ -4586,7 +4986,15 @@
         <w:jc w:val="both"/>
       </w:pPr>
       <w:r>
-        <w:t xml:space="preserve">El GPU Delegate es una extensión de TFLite que redirige los cálculos de la CPU a la GPU del dispositivo mediante la API OpenCL. El objetivo es aprovechar el paralelismo masivo de la GPU para acelerar la inferencia. Sin embargo, no todas las operaciones son compatibles con el GPU Delegate: operaciones personalizadas como TFLite_Detection_PostProcess (presente en SSD y EfficientDet) deben ejecutarse en CPU, creando un cuello de botella por la transferencia de datos entre ambos procesadores [26].</w:t>
+        <w:t xml:space="preserve">El GPU Delegate es una extensión de TFLite que redirige los cálculos de la CPU a la GPU del dispositivo mediante la API OpenCL. El objetivo es aprovechar el paralelismo masivo de la GPU para acelerar la inferencia. Sin embargo, no todas las operaciones son compatibles con el GPU Delegate: operaciones personalizadas como TFLite_Detection_PostProcess (presente en SSD y EfficientDet) deben ejecutarse en CPU, creando un cuello de botella por la transferencia de datos entre ambos procesadores </w:t>
+      </w:r>
+      <w:hyperlink w:anchor="bib_ref_26" w:history="1">
+        <w:r>
+          <w:t xml:space="preserve">[26]</w:t>
+        </w:r>
+      </w:hyperlink>
+      <w:r>
+        <w:t xml:space="preserve">.</w:t>
       </w:r>
     </w:p>
     <w:p>
@@ -4683,7 +5091,39 @@
         <w:t>dataset</w:t>
       </w:r>
       <w:r>
-        <w:t xml:space="preserve"> MS COCO: YOLOv8s en variantes Float32 y Float16 [5], YOLO11n en variantes Float32 y Float16 [5], SSD MobileNetV1 [6] y EfficientDet-Lite2 [7]. La selección de estas configuraciones responde a los criterios definidos en la sección 2.1.</w:t>
+        <w:t xml:space="preserve"> MS COCO: YOLOv8s en variantes Float32 y Float16 </w:t>
+      </w:r>
+      <w:hyperlink w:anchor="bib_ref_5" w:history="1">
+        <w:r>
+          <w:t xml:space="preserve">[5]</w:t>
+        </w:r>
+      </w:hyperlink>
+      <w:r>
+        <w:t xml:space="preserve">, YOLO11n en variantes Float32 y Float16 </w:t>
+      </w:r>
+      <w:hyperlink w:anchor="bib_ref_5" w:history="1">
+        <w:r>
+          <w:t xml:space="preserve">[5]</w:t>
+        </w:r>
+      </w:hyperlink>
+      <w:r>
+        <w:t xml:space="preserve">, SSD MobileNetV1 </w:t>
+      </w:r>
+      <w:hyperlink w:anchor="bib_ref_6" w:history="1">
+        <w:r>
+          <w:t xml:space="preserve">[6]</w:t>
+        </w:r>
+      </w:hyperlink>
+      <w:r>
+        <w:t xml:space="preserve"> y EfficientDet-Lite2 </w:t>
+      </w:r>
+      <w:hyperlink w:anchor="bib_ref_7" w:history="1">
+        <w:r>
+          <w:t xml:space="preserve">[7]</w:t>
+        </w:r>
+      </w:hyperlink>
+      <w:r>
+        <w:t xml:space="preserve">. La selección de estas configuraciones responde a los criterios definidos en la sección 2.1.</w:t>
       </w:r>
     </w:p>
     <w:p>
@@ -4711,7 +5151,23 @@
         <w:jc w:val="both"/>
       </w:pPr>
       <w:r>
-        <w:t xml:space="preserve">La evaluación de precisión se realizó sobre un conjunto de imágenes propias capturadas en entornos interiores reales, complementadas con imágenes de dominio público. Las imágenes fueron anotadas manualmente mediante la plataforma Roboflow [27], generando un total de 80 imágenes con 257 anotaciones en formato COCO JSON [13].</w:t>
+        <w:t xml:space="preserve">La evaluación de precisión se realizó sobre un conjunto de imágenes propias capturadas en entornos interiores reales, complementadas con imágenes de dominio público. Las imágenes fueron anotadas manualmente mediante la plataforma Roboflow </w:t>
+      </w:r>
+      <w:hyperlink w:anchor="bib_ref_27" w:history="1">
+        <w:r>
+          <w:t xml:space="preserve">[27]</w:t>
+        </w:r>
+      </w:hyperlink>
+      <w:r>
+        <w:t xml:space="preserve">, generando un total de 80 imágenes con 257 anotaciones en formato COCO JSON </w:t>
+      </w:r>
+      <w:hyperlink w:anchor="bib_ref_13" w:history="1">
+        <w:r>
+          <w:t xml:space="preserve">[13]</w:t>
+        </w:r>
+      </w:hyperlink>
+      <w:r>
+        <w:t xml:space="preserve">.</w:t>
       </w:r>
     </w:p>
     <w:p>
@@ -4722,7 +5178,15 @@
         <w:jc w:val="both"/>
       </w:pPr>
       <w:r>
-        <w:t xml:space="preserve">Las categorías evaluadas fueron: persona (38 anotaciones), silla (81 anotaciones), sofá (20 anotaciones), cama (16 anotaciones), mesa (29 anotaciones), inodoro (13 anotaciones), televisor (20 anotaciones), computador portátil (13 anotaciones), lavamanos (16 anotaciones) y refrigerador (11 anotaciones), correspondientes a los identificadores COCO [13].</w:t>
+        <w:t xml:space="preserve">Las categorías evaluadas fueron: persona (38 anotaciones), silla (81 anotaciones), sofá (20 anotaciones), cama (16 anotaciones), mesa (29 anotaciones), inodoro (13 anotaciones), televisor (20 anotaciones), computador portátil (13 anotaciones), lavamanos (16 anotaciones) y refrigerador (11 anotaciones), correspondientes a los identificadores COCO </w:t>
+      </w:r>
+      <w:hyperlink w:anchor="bib_ref_13" w:history="1">
+        <w:r>
+          <w:t xml:space="preserve">[13]</w:t>
+        </w:r>
+      </w:hyperlink>
+      <w:r>
+        <w:t xml:space="preserve">.</w:t>
       </w:r>
     </w:p>
     <w:p>
@@ -4733,7 +5197,15 @@
         <w:jc w:val="both"/>
       </w:pPr>
       <w:r>
-        <w:t xml:space="preserve">Las métricas de precisión fueron calculadas mediante la librería pycocotools, que implementa el protocolo oficial de evaluación COCO [13].</w:t>
+        <w:t xml:space="preserve">Las métricas de precisión fueron calculadas mediante la librería pycocotools, que implementa el protocolo oficial de evaluación COCO </w:t>
+      </w:r>
+      <w:hyperlink w:anchor="bib_ref_13" w:history="1">
+        <w:r>
+          <w:t xml:space="preserve">[13]</w:t>
+        </w:r>
+      </w:hyperlink>
+      <w:r>
+        <w:t xml:space="preserve">.</w:t>
       </w:r>
     </w:p>
     <w:p>
@@ -10583,7 +11055,23 @@
         <w:t>kernels</w:t>
       </w:r>
       <w:r>
-        <w:t xml:space="preserve"> OpenCL [28] en la GPU Adreno 610 [26].</w:t>
+        <w:t xml:space="preserve"> OpenCL </w:t>
+      </w:r>
+      <w:hyperlink w:anchor="bib_ref_28" w:history="1">
+        <w:r>
+          <w:t xml:space="preserve">[28]</w:t>
+        </w:r>
+      </w:hyperlink>
+      <w:r>
+        <w:t xml:space="preserve"> en la GPU Adreno 610 </w:t>
+      </w:r>
+      <w:hyperlink w:anchor="bib_ref_26" w:history="1">
+        <w:r>
+          <w:t xml:space="preserve">[26]</w:t>
+        </w:r>
+      </w:hyperlink>
+      <w:r>
+        <w:t xml:space="preserve">.</w:t>
       </w:r>
     </w:p>
     <w:p>
@@ -11521,7 +12009,7 @@
         <w:jc w:val="both"/>
       </w:pPr>
       <w:r>
-        <w:t>Se compararon arnés de cabeza, arnés de pecho y soporte flexible Gorillapod. Las capturas de evaluación son verticales y combinan dos campos visuales nominales, 1x y 0,5x. La altura y la inclinación no se registraron como mediciones experimentales, por lo que no se prescribe un ángulo o una altura óptima. El capítulo 4 compara su cobertura y detecciones a partir de los grupos de fotografías disponibles.</w:t>
+        <w:t>Se compararon arnés de cabeza, arnés de pecho y soporte flexible Gorillapod. Este soporte permite al usuario orientar libremente el celular y elegir qué parte de la escena explorar. En las capturas de este estudio se apuntó la cámara hacia los objetos de interés. Las capturas de evaluación son verticales y combinan dos campos visuales nominales, 1x y 0,5x. La altura y la inclinación no se registraron como mediciones experimentales, por lo que no se prescribe un ángulo o una altura óptima. El capítulo 4 compara su cobertura y detecciones a partir de los grupos de fotografías disponibles.</w:t>
       </w:r>
     </w:p>
     <w:p>
@@ -11542,7 +12030,15 @@
         <w:jc w:val="both"/>
       </w:pPr>
       <w:r>
-        <w:t>CameraX 1.6.1 gestiona la cámara y su ciclo de vida [29]. Preview mantiene la vista de la escena e ImageAnalysis entrega fotogramas RGBA_8888 con STRATEGY_KEEP_ONLY_LATEST. FrameStore conserva una copia utilizable del fotograma más reciente. La política de selección de cámara distingue la cámara trasera principal de alternativas de campo amplio, sujetas a las capacidades del dispositivo; el 0,5x del conjunto iPhone no demuestra una focal equivalente en Android.</w:t>
+        <w:t xml:space="preserve">CameraX 1.6.1 gestiona la cámara y su ciclo de vida </w:t>
+      </w:r>
+      <w:hyperlink w:anchor="bib_ref_29" w:history="1">
+        <w:r>
+          <w:t xml:space="preserve">[29]</w:t>
+        </w:r>
+      </w:hyperlink>
+      <w:r>
+        <w:t xml:space="preserve">. Preview mantiene la vista de la escena e ImageAnalysis entrega fotogramas RGBA_8888 con STRATEGY_KEEP_ONLY_LATEST. FrameStore conserva una copia utilizable del fotograma más reciente. La política de selección de cámara distingue la cámara trasera principal de alternativas de campo amplio, sujetas a las capacidades del dispositivo; el 0,5x del conjunto iPhone no demuestra una focal equivalente en Android.</w:t>
       </w:r>
     </w:p>
     <w:p>
@@ -11604,7 +12100,15 @@
         <w:jc w:val="both"/>
       </w:pPr>
       <w:r>
-        <w:t>DetectionModule utiliza la API Interpreter del paquete LiteRT 1.4.2 y el archivo efficientdet-lite2-detection-metadata.tflite, cargado mediante un MappedByteBuffer [32]. La inferencia se ejecuta en CPU. Se leen cajas normalizadas, clases, puntuaciones y número de detecciones; el intérprete valida la forma del tensor de cajas al inicializarse.</w:t>
+        <w:t xml:space="preserve">DetectionModule utiliza la API Interpreter del paquete LiteRT 1.4.2 y el archivo efficientdet-lite2-detection-metadata.tflite, cargado mediante un MappedByteBuffer </w:t>
+      </w:r>
+      <w:hyperlink w:anchor="bib_ref_32" w:history="1">
+        <w:r>
+          <w:t xml:space="preserve">[32]</w:t>
+        </w:r>
+      </w:hyperlink>
+      <w:r>
+        <w:t xml:space="preserve">. La inferencia se ejecuta en CPU. Se leen cajas normalizadas, clases, puntuaciones y número de detecciones; el intérprete valida la forma del tensor de cajas al inicializarse.</w:t>
       </w:r>
     </w:p>
     <w:p>
@@ -13403,7 +13907,23 @@
         <w:jc w:val="both"/>
       </w:pPr>
       <w:r>
-        <w:t xml:space="preserve">La prioridad de las diez clases de la Tabla 3.1 responde a una delimitación técnica para explorar mobiliario, equipamiento doméstico y presencia de personas, junto con la disponibilidad de etiquetas COCO [13]. No procede de un estudio de necesidades con usuarios ni establece una jerarquía clínica o de riesgo. La propuesta menciona puertas, sillas y escritorios como ejemplos [34]; la clase silla está incluida, pero el vocabulario COCO empleado no contiene una clase puerta ni una clase independiente escritorio. La etiqueta </w:t>
+        <w:t xml:space="preserve">La prioridad de las diez clases de la Tabla 3.1 responde a una delimitación técnica para explorar mobiliario, equipamiento doméstico y presencia de personas, junto con la disponibilidad de etiquetas COCO </w:t>
+      </w:r>
+      <w:hyperlink w:anchor="bib_ref_13" w:history="1">
+        <w:r>
+          <w:t xml:space="preserve">[13]</w:t>
+        </w:r>
+      </w:hyperlink>
+      <w:r>
+        <w:t xml:space="preserve">. No procede de un estudio de necesidades con usuarios ni establece una jerarquía clínica o de riesgo. La propuesta menciona puertas, sillas y escritorios como ejemplos </w:t>
+      </w:r>
+      <w:hyperlink w:anchor="bib_ref_34" w:history="1">
+        <w:r>
+          <w:t xml:space="preserve">[34]</w:t>
+        </w:r>
+      </w:hyperlink>
+      <w:r>
+        <w:t xml:space="preserve">; la clase silla está incluida, pero el vocabulario COCO empleado no contiene una clase puerta ni una clase independiente escritorio. La etiqueta </w:t>
       </w:r>
       <w:r>
         <w:rPr>
@@ -13412,7 +13932,15 @@
         <w:t>dining table</w:t>
       </w:r>
       <w:r>
-        <w:t xml:space="preserve"> corresponde a mesa de comedor y no permite afirmar detección general de escritorios. Open Images se consideró como alternativa de vocabulario [20], pero no se entrenó ni evaluó aquí un detector con ese conjunto. Incorporar puertas exige seleccionar o adaptar un modelo compatible, anotar ejemplos y evaluar su desempeño.</w:t>
+        <w:t xml:space="preserve"> corresponde a mesa de comedor y no permite afirmar detección general de escritorios. Open Images se consideró como alternativa de vocabulario </w:t>
+      </w:r>
+      <w:hyperlink w:anchor="bib_ref_20" w:history="1">
+        <w:r>
+          <w:t xml:space="preserve">[20]</w:t>
+        </w:r>
+      </w:hyperlink>
+      <w:r>
+        <w:t xml:space="preserve">, pero no se entrenó ni evaluó aquí un detector con ese conjunto. Incorporar puertas exige seleccionar o adaptar un modelo compatible, anotar ejemplos y evaluar su desempeño.</w:t>
       </w:r>
     </w:p>
     <w:p>
@@ -13433,7 +13961,15 @@
         <w:jc w:val="both"/>
       </w:pPr>
       <w:r>
-        <w:t>AudioModule utiliza sherpa-onnx v1.13.6 para sintetizar voz local a partir de modelos VITS/Piper empaquetados con la aplicación [31]. El catálogo incluye es_MX-claude-high-int8 para español y en_US-amy-low-int8 para inglés, junto con los datos de fonemización necesarios. La implementación actual no depende del servicio TextToSpeech de Android ni de una solicitud de síntesis por red.</w:t>
+        <w:t xml:space="preserve">AudioModule utiliza sherpa-onnx v1.13.6 para sintetizar voz local a partir de modelos VITS/Piper empaquetados con la aplicación </w:t>
+      </w:r>
+      <w:hyperlink w:anchor="bib_ref_31" w:history="1">
+        <w:r>
+          <w:t xml:space="preserve">[31]</w:t>
+        </w:r>
+      </w:hyperlink>
+      <w:r>
+        <w:t xml:space="preserve">. El catálogo incluye es_MX-claude-high-int8 para español y en_US-amy-low-int8 para inglés, junto con los datos de fonemización necesarios. La implementación actual no depende del servicio TextToSpeech de Android ni de una solicitud de síntesis por red.</w:t>
       </w:r>
     </w:p>
     <w:p>
@@ -14843,16 +15379,16 @@
         <w:jc w:val="both"/>
       </w:pPr>
       <w:r>
-        <w:t xml:space="preserve">El escenario 1 manipula la posición de montaje del dispositivo con tres niveles: arnés de cabeza, arnés de pecho y soporte Gorillapod (mini trípode flex a la altura del pecho). El escenario 2 cruza ese factor con el lente con el que se fotografía (principal de 1x, equivalente a 25 mm; ultra gran angular de 0,5x, equivalente a 14 mm), para seis configuraciones de captura. El diseño es intra-grupo con emparejamiento por escena: la misma escena se fotografía seis veces seguidas, una por configuración, formando 33 grupos de captura pareados (198 fotografías en total). El escenario 3 no añade capturas nuevas: estima la distancia entre el objeto y la cámara dentro de las mismas 198 fotografías mediante el modelo estenopeico con la distancia focal del EXIF, clasifica las instancias anotadas en bandas de distancia y analiza el </w:t>
+        <w:t xml:space="preserve">El escenario 1 manipula la posición de montaje del dispositivo con tres niveles: arnés de cabeza, arnés de pecho y soporte Gorillapod. En este último se orientó libremente la cámara hacia los objetos de interés; la altura y la inclinación no se midieron. El escenario 2 cruza ese factor con el lente con el que se fotografía (principal de 1x, equivalente a 25 mm; ultra gran angular de 0,5x, equivalente a 14 mm), para seis configuraciones de captura. El diseño es intra-grupo con emparejamiento por escena: la misma escena se fotografía seis veces seguidas, una por configuración, formando 33 grupos de captura pareados (198 fotografías en total). El escenario 3 no añade capturas nuevas: estima la distancia entre el objeto y la cámara dentro de las mismas 198 fotografías mediante el modelo estenopeico con la distancia focal del EXIF, clasifica las instancias anotadas en bandas de distancia y analiza el recall por banda.</w:t>
       </w:r>
       <w:r>
         <w:rPr>
           <w:i/>
         </w:rPr>
-        <w:t>recall</w:t>
-      </w:r>
-      <w:r>
-        <w:t xml:space="preserve"> por banda.</w:t>
+        <w:t/>
+      </w:r>
+      <w:r>
+        <w:t xml:space="preserve"/>
       </w:r>
     </w:p>
     <w:p>
@@ -22427,7 +22963,7 @@
         <w:jc w:val="both"/>
       </w:pPr>
       <w:r>
-        <w:t>El emparejamiento por escena aproxima un contexto común entre las seis capturas de cada grupo; es la fortaleza principal del diseño. Las amenazas principales son: (a) la verdad de campo se revisó una única vez por el autor del proyecto sobre un borrador asistido por modelo, sin auditoría de un segundo revisor independiente; (b) el emparejamiento por grupos proviene del orden ascendente de archivo y debe verificarse contra las notas de captura; (c) seleccionar la mejor configuración sobre este mismo conjunto lo convierte en conjunto de selección, sesgando a favor del ganador observado; (d) los remuestreos de grupos pueden compartir habitación entre grupos vecinos, con lo que la varianza queda subestimada; y (e) ninguna comparación se ajusta por comparaciones múltiples.</w:t>
+        <w:t>El emparejamiento por escena aproxima un contexto común entre las seis capturas de cada grupo; es la fortaleza principal del diseño. Las amenazas principales son: (a) la verdad de campo se revisó una única vez por el autor del proyecto sobre un borrador asistido por modelo, sin auditoría de un segundo revisor independiente; (b) el emparejamiento por grupos proviene del orden ascendente de archivo y debe verificarse contra las notas de captura; (c) seleccionar la mejor configuración sobre este mismo conjunto lo convierte en conjunto de selección, sesgando a favor del ganador observado; (d) los remuestreos de grupos pueden compartir habitación entre grupos vecinos, con lo que la varianza queda subestimada; y (e) ninguna comparación se ajusta por comparaciones múltiples. Además, la orientación dirigida hacia los objetos con el Gorillapod forma parte de la condición evaluada: la comparación combina soporte y estrategia de encuadre, sin aislar sus efectos.</w:t>
       </w:r>
     </w:p>
     <w:p>
@@ -23063,7 +23599,23 @@
         <w:jc w:val="both"/>
       </w:pPr>
       <w:r>
-        <w:t>La propuesta incluye iluminación y oclusión como condiciones de evaluación [34]. Las fotografías no tienen registros de lux; la oclusión se analiza posteriormente con etiquetas suplementarias asistidas por IA. Como análisis posterior disponible, se calculó el brillo digital medio de cada JPEG a resolución original mediante la conversión RGB a escala de grises de ocho bits de Pillow [35]. Se dividió la muestra en tres grupos mediante los cuantiles 1/3 y 2/3 del brillo medio. Son grupos relativos a esta muestra; no se denominan iluminación baja, normal o alta, porque el brillo depende también de exposición, superficies y composición de la escena.</w:t>
+        <w:t xml:space="preserve">La propuesta incluye iluminación y oclusión como condiciones de evaluación </w:t>
+      </w:r>
+      <w:hyperlink w:anchor="bib_ref_34" w:history="1">
+        <w:r>
+          <w:t xml:space="preserve">[34]</w:t>
+        </w:r>
+      </w:hyperlink>
+      <w:r>
+        <w:t xml:space="preserve">. Las fotografías no tienen registros de lux; la oclusión se analiza posteriormente con etiquetas suplementarias asistidas por IA. Como análisis posterior disponible, se calculó el brillo digital medio de cada JPEG a resolución original mediante la conversión RGB a escala de grises de ocho bits de Pillow </w:t>
+      </w:r>
+      <w:hyperlink w:anchor="bib_ref_35" w:history="1">
+        <w:r>
+          <w:t xml:space="preserve">[35]</w:t>
+        </w:r>
+      </w:hyperlink>
+      <w:r>
+        <w:t xml:space="preserve">. Se dividió la muestra en tres grupos mediante los cuantiles 1/3 y 2/3 del brillo medio. Son grupos relativos a esta muestra; no se denominan iluminación baja, normal o alta, porque el brillo depende también de exposición, superficies y composición de la escena.</w:t>
       </w:r>
     </w:p>
     <w:p>
@@ -24583,16 +25135,16 @@
         <w:jc w:val="both"/>
       </w:pPr>
       <w:r>
-        <w:t>La evaluación de captura completó 198 fotografías, 889 anotaciones revisadas y 33 grupos pareados. Gorillapod 0,5x produjo 82 detecciones correctas y recuperó al menos un objeto en 29 escenas; el arnés de pecho 1x obtuvo la mayor F1, de 61,9 %. La elección por cantidad favorece provisionalmente Gorillapod 0,5x, mientras la elección por equilibrio precisión-</w:t>
+        <w:t>La evaluación de captura completó 198 fotografías, 889 anotaciones revisadas y 33 grupos pareados. Gorillapod 0,5x produjo 82 detecciones correctas y recuperó al menos un objeto en 29 escenas; el arnés de pecho 1x obtuvo la mayor F1, de 61,9 %. Bajo la orientación hacia los objetos utilizada en estas capturas, la elección por cantidad favorece provisionalmente Gorillapod 0,5x, mientras la elección por equilibrio precisión-recall favorece pecho 1x. Las comparaciones no establecen un ganador universal y deben confirmarse en escenas nuevas.</w:t>
       </w:r>
       <w:r>
         <w:rPr>
           <w:i/>
         </w:rPr>
-        <w:t>recall</w:t>
-      </w:r>
-      <w:r>
-        <w:t xml:space="preserve"> favorece pecho 1x. Las comparaciones no establecen un ganador universal y deben confirmarse en escenas nuevas.</w:t>
+        <w:t/>
+      </w:r>
+      <w:r>
+        <w:t xml:space="preserve"/>
       </w:r>
     </w:p>
     <w:p>
@@ -25037,9 +25589,19 @@
         <w:jc w:val="left"/>
         <w:ind w:left="720" w:hanging="720"/>
       </w:pPr>
-      <w:r>
-        <w:t xml:space="preserve">[1] R. Szeliski, “Computer Vision: Algorithms and Applications,” Springer-Verlag, Heidelberg, Berlin, 2010. [Online]. Available: https://dl.acm.org/doi/book/10.5555/1941882.</w:t>
-      </w:r>
+      <w:bookmarkStart w:id="1085" w:name="bib_ref_1"/>
+      <w:r>
+        <w:t xml:space="preserve">[1] R. Szeliski, “Computer Vision: Algorithms and Applications,” Springer-Verlag, Heidelberg, Berlin, 2010. [Online]. Available: </w:t>
+      </w:r>
+      <w:hyperlink r:id="rIdBib1" w:history="1">
+        <w:r>
+          <w:t xml:space="preserve">https://dl.acm.org/doi/book/10.5555/1941882</w:t>
+        </w:r>
+      </w:hyperlink>
+      <w:r>
+        <w:t xml:space="preserve">.</w:t>
+      </w:r>
+      <w:bookmarkEnd w:id="1085"/>
     </w:p>
     <w:p>
       <w:pPr>
@@ -25048,9 +25610,19 @@
         <w:jc w:val="left"/>
         <w:ind w:left="720" w:hanging="720"/>
       </w:pPr>
-      <w:r>
-        <w:t xml:space="preserve">[2] World Health Organization, “World report on vision,” Geneva, Switzerland: World Health Organization, 2019. [Online]. Available: https://www.who.int/publications-detail/world-report-on-vision.</w:t>
-      </w:r>
+      <w:bookmarkStart w:id="1086" w:name="bib_ref_2"/>
+      <w:r>
+        <w:t xml:space="preserve">[2] World Health Organization, “World report on vision,” Geneva, Switzerland: World Health Organization, 2019. [Online]. Available: </w:t>
+      </w:r>
+      <w:hyperlink r:id="rIdBib2" w:history="1">
+        <w:r>
+          <w:t xml:space="preserve">https://www.who.int/publications-detail/world-report-on-vision</w:t>
+        </w:r>
+      </w:hyperlink>
+      <w:r>
+        <w:t xml:space="preserve">.</w:t>
+      </w:r>
+      <w:bookmarkEnd w:id="1086"/>
     </w:p>
     <w:p>
       <w:pPr>
@@ -25059,9 +25631,19 @@
         <w:jc w:val="left"/>
         <w:ind w:left="720" w:hanging="720"/>
       </w:pPr>
-      <w:r>
-        <w:t xml:space="preserve">[3] TensorFlow, “TensorFlow Lite,” TensorFlow. [Online]. Available: https://www.tensorflow.org/lite/guide.</w:t>
-      </w:r>
+      <w:bookmarkStart w:id="1087" w:name="bib_ref_3"/>
+      <w:r>
+        <w:t xml:space="preserve">[3] TensorFlow, “TensorFlow Lite,” TensorFlow. [Online]. Available: </w:t>
+      </w:r>
+      <w:hyperlink r:id="rIdBib3" w:history="1">
+        <w:r>
+          <w:t xml:space="preserve">https://www.tensorflow.org/lite/guide</w:t>
+        </w:r>
+      </w:hyperlink>
+      <w:r>
+        <w:t xml:space="preserve">.</w:t>
+      </w:r>
+      <w:bookmarkEnd w:id="1087"/>
     </w:p>
     <w:p>
       <w:pPr>
@@ -25070,9 +25652,27 @@
         <w:jc w:val="left"/>
         <w:ind w:left="720" w:hanging="720"/>
       </w:pPr>
-      <w:r>
-        <w:t xml:space="preserve">[4] S. Ren, K. He, R. Girshick, and J. Sun, “Faster R-CNN: Towards Real-Time Object Detection with Region Proposal Networks,” Jan. 06, 2016, arXiv:1506.01497. doi: 10.48550/arXiv.1506.01497.</w:t>
-      </w:r>
+      <w:bookmarkStart w:id="1088" w:name="bib_ref_4"/>
+      <w:r>
+        <w:t xml:space="preserve">[4] S. Ren, K. He, R. Girshick, and J. Sun, “Faster R-CNN: Towards Real-Time Object Detection with Region Proposal Networks,” Jan. 06, 2016, </w:t>
+      </w:r>
+      <w:hyperlink r:id="rIdBib4" w:history="1">
+        <w:r>
+          <w:t xml:space="preserve">arXiv:1506.01497</w:t>
+        </w:r>
+      </w:hyperlink>
+      <w:r>
+        <w:t xml:space="preserve">. doi: </w:t>
+      </w:r>
+      <w:hyperlink r:id="rIdBib5" w:history="1">
+        <w:r>
+          <w:t xml:space="preserve">10.48550/arXiv.1506.01497</w:t>
+        </w:r>
+      </w:hyperlink>
+      <w:r>
+        <w:t xml:space="preserve">.</w:t>
+      </w:r>
+      <w:bookmarkEnd w:id="1088"/>
     </w:p>
     <w:p>
       <w:pPr>
@@ -25081,9 +25681,19 @@
         <w:jc w:val="left"/>
         <w:ind w:left="720" w:hanging="720"/>
       </w:pPr>
-      <w:r>
-        <w:t xml:space="preserve">[5] J. Redmon, S. Divvala, R. Girshick, and A. Farhadi, “You Only Look Once: Unified, Real-Time Object Detection,” in 2016 IEEE Conference on Computer Vision and Pattern Recognition (CVPR), Jun. 2016, pp. 779–788. doi: 10.1109/CVPR.2016.91.</w:t>
-      </w:r>
+      <w:bookmarkStart w:id="1089" w:name="bib_ref_5"/>
+      <w:r>
+        <w:t xml:space="preserve">[5] J. Redmon, S. Divvala, R. Girshick, and A. Farhadi, “You Only Look Once: Unified, Real-Time Object Detection,” in 2016 IEEE Conference on Computer Vision and Pattern Recognition (CVPR), Jun. 2016, pp. 779–788. doi: </w:t>
+      </w:r>
+      <w:hyperlink r:id="rIdBib6" w:history="1">
+        <w:r>
+          <w:t xml:space="preserve">10.1109/CVPR.2016.91</w:t>
+        </w:r>
+      </w:hyperlink>
+      <w:r>
+        <w:t xml:space="preserve">.</w:t>
+      </w:r>
+      <w:bookmarkEnd w:id="1089"/>
     </w:p>
     <w:p>
       <w:pPr>
@@ -25092,9 +25702,19 @@
         <w:jc w:val="left"/>
         <w:ind w:left="720" w:hanging="720"/>
       </w:pPr>
-      <w:r>
-        <w:t xml:space="preserve">[6] W. Liu et al., “SSD: Single Shot MultiBox Detector,” in Computer Vision – ECCV 2016, Cham: Springer International Publishing, 2016, pp. 21–37. doi: 10.1007/978-3-319-46448-0_2.</w:t>
-      </w:r>
+      <w:bookmarkStart w:id="1090" w:name="bib_ref_6"/>
+      <w:r>
+        <w:t xml:space="preserve">[6] W. Liu et al., “SSD: Single Shot MultiBox Detector,” in Computer Vision – ECCV 2016, Cham: Springer International Publishing, 2016, pp. 21–37. doi: </w:t>
+      </w:r>
+      <w:hyperlink r:id="rIdBib7" w:history="1">
+        <w:r>
+          <w:t xml:space="preserve">10.1007/978-3-319-46448-0_2</w:t>
+        </w:r>
+      </w:hyperlink>
+      <w:r>
+        <w:t xml:space="preserve">.</w:t>
+      </w:r>
+      <w:bookmarkEnd w:id="1090"/>
     </w:p>
     <w:p>
       <w:pPr>
@@ -25103,9 +25723,19 @@
         <w:jc w:val="left"/>
         <w:ind w:left="720" w:hanging="720"/>
       </w:pPr>
-      <w:r>
-        <w:t xml:space="preserve">[7] M. Tan, R. Pang, and Q. V. Le, “EfficientDet: Scalable and Efficient Object Detection,” in 2020 IEEE/CVF Conference on Computer Vision and Pattern Recognition (CVPR), Jun. 2020, pp. 10781–10790. doi: 10.1109/CVPR42600.2020.01079.</w:t>
-      </w:r>
+      <w:bookmarkStart w:id="1091" w:name="bib_ref_7"/>
+      <w:r>
+        <w:t xml:space="preserve">[7] M. Tan, R. Pang, and Q. V. Le, “EfficientDet: Scalable and Efficient Object Detection,” in 2020 IEEE/CVF Conference on Computer Vision and Pattern Recognition (CVPR), Jun. 2020, pp. 10781–10790. doi: </w:t>
+      </w:r>
+      <w:hyperlink r:id="rIdBib8" w:history="1">
+        <w:r>
+          <w:t xml:space="preserve">10.1109/CVPR42600.2020.01079</w:t>
+        </w:r>
+      </w:hyperlink>
+      <w:r>
+        <w:t xml:space="preserve">.</w:t>
+      </w:r>
+      <w:bookmarkEnd w:id="1091"/>
     </w:p>
     <w:p>
       <w:pPr>
@@ -25114,9 +25744,19 @@
         <w:jc w:val="left"/>
         <w:ind w:left="720" w:hanging="720"/>
       </w:pPr>
-      <w:r>
-        <w:t xml:space="preserve">[8] S. S. More, N. Patil, V. B. Lobo, N. Shet, D. Goswami, and P. Rane, “Empowering the Visually Impaired: YOLOv8-based Object Detection in Android Applications,” Procedia Computer Science, vol. 252, pp. 457–469, 2025. doi: 10.1016/j.procs.2025.01.054.</w:t>
-      </w:r>
+      <w:bookmarkStart w:id="1092" w:name="bib_ref_8"/>
+      <w:r>
+        <w:t xml:space="preserve">[8] S. S. More, N. Patil, V. B. Lobo, N. Shet, D. Goswami, and P. Rane, “Empowering the Visually Impaired: YOLOv8-based Object Detection in Android Applications,” Procedia Computer Science, vol. 252, pp. 457–469, 2025. doi: </w:t>
+      </w:r>
+      <w:hyperlink r:id="rIdBib9" w:history="1">
+        <w:r>
+          <w:t xml:space="preserve">10.1016/j.procs.2025.01.054</w:t>
+        </w:r>
+      </w:hyperlink>
+      <w:r>
+        <w:t xml:space="preserve">.</w:t>
+      </w:r>
+      <w:bookmarkEnd w:id="1092"/>
     </w:p>
     <w:p>
       <w:pPr>
@@ -25125,9 +25765,11 @@
         <w:jc w:val="left"/>
         <w:ind w:left="720" w:hanging="720"/>
       </w:pPr>
+      <w:bookmarkStart w:id="1093" w:name="bib_ref_9"/>
       <w:r>
         <w:t xml:space="preserve">[9] Universidad del Magdalena, “Plan de Desarrollo UNIMAGDALENA Comprometida 2020–2030,” Santa Marta, Colombia, 2020.</w:t>
       </w:r>
+      <w:bookmarkEnd w:id="1093"/>
     </w:p>
     <w:p>
       <w:pPr>
@@ -25136,9 +25778,11 @@
         <w:jc w:val="left"/>
         <w:ind w:left="720" w:hanging="720"/>
       </w:pPr>
+      <w:bookmarkStart w:id="1094" w:name="bib_ref_10"/>
       <w:r>
         <w:t xml:space="preserve">[10] Universidad del Magdalena, “Plan de Gobierno Rectoral 2024–2028,” Santa Marta, Colombia, 2024.</w:t>
       </w:r>
+      <w:bookmarkEnd w:id="1094"/>
     </w:p>
     <w:p>
       <w:pPr>
@@ -25147,9 +25791,19 @@
         <w:jc w:val="left"/>
         <w:ind w:left="720" w:hanging="720"/>
       </w:pPr>
-      <w:r>
-        <w:t xml:space="preserve">[11] R. Meenakshi, R. Ponnusamy, S. Alghamdi, O. I. Khalaf, and Y. Alotaibi, “Development of Mobile App to Support the Mobility of Visually Impaired People,” Computers, Materials &amp; Continua, vol. 73, no. 2, pp. 3473–3495, 2022. doi: 10.32604/cmc.2022.028540.</w:t>
-      </w:r>
+      <w:bookmarkStart w:id="1095" w:name="bib_ref_11"/>
+      <w:r>
+        <w:t xml:space="preserve">[11] R. Meenakshi, R. Ponnusamy, S. Alghamdi, O. I. Khalaf, and Y. Alotaibi, “Development of Mobile App to Support the Mobility of Visually Impaired People,” Computers, Materials &amp; Continua, vol. 73, no. 2, pp. 3473–3495, 2022. doi: </w:t>
+      </w:r>
+      <w:hyperlink r:id="rIdBib10" w:history="1">
+        <w:r>
+          <w:t xml:space="preserve">10.32604/cmc.2022.028540</w:t>
+        </w:r>
+      </w:hyperlink>
+      <w:r>
+        <w:t xml:space="preserve">.</w:t>
+      </w:r>
+      <w:bookmarkEnd w:id="1095"/>
     </w:p>
     <w:p>
       <w:pPr>
@@ -25158,9 +25812,19 @@
         <w:jc w:val="left"/>
         <w:ind w:left="720" w:hanging="720"/>
       </w:pPr>
-      <w:r>
-        <w:t xml:space="preserve">[12] K. Guravaiah, Y. S. Bhavadeesha, P. Shwejana, A. H. Vardhan, and L. Saa, “Third Eye: Object Recognition and Speech Generation for Visually Impaired,” Procedia Computer Science, vol. 218, pp. 1144–1155, 2023. doi: 10.1016/j.procs.2023.01.093.</w:t>
-      </w:r>
+      <w:bookmarkStart w:id="1096" w:name="bib_ref_12"/>
+      <w:r>
+        <w:t xml:space="preserve">[12] K. Guravaiah, Y. S. Bhavadeesha, P. Shwejana, A. H. Vardhan, and L. Saa, “Third Eye: Object Recognition and Speech Generation for Visually Impaired,” Procedia Computer Science, vol. 218, pp. 1144–1155, 2023. doi: </w:t>
+      </w:r>
+      <w:hyperlink r:id="rIdBib11" w:history="1">
+        <w:r>
+          <w:t xml:space="preserve">10.1016/j.procs.2023.01.093</w:t>
+        </w:r>
+      </w:hyperlink>
+      <w:r>
+        <w:t xml:space="preserve">.</w:t>
+      </w:r>
+      <w:bookmarkEnd w:id="1096"/>
     </w:p>
     <w:p>
       <w:pPr>
@@ -25169,9 +25833,19 @@
         <w:jc w:val="left"/>
         <w:ind w:left="720" w:hanging="720"/>
       </w:pPr>
-      <w:r>
-        <w:t xml:space="preserve">[13] T.-Y. Lin et al., “Microsoft COCO: Common Objects in Context,” in Computer Vision – ECCV 2014, Cham: Springer International Publishing, 2014, pp. 740–755. doi: 10.1007/978-3-319-10602-1_48.</w:t>
-      </w:r>
+      <w:bookmarkStart w:id="1097" w:name="bib_ref_13"/>
+      <w:r>
+        <w:t xml:space="preserve">[13] T.-Y. Lin et al., “Microsoft COCO: Common Objects in Context,” in Computer Vision – ECCV 2014, Cham: Springer International Publishing, 2014, pp. 740–755. doi: </w:t>
+      </w:r>
+      <w:hyperlink r:id="rIdBib12" w:history="1">
+        <w:r>
+          <w:t xml:space="preserve">10.1007/978-3-319-10602-1_48</w:t>
+        </w:r>
+      </w:hyperlink>
+      <w:r>
+        <w:t xml:space="preserve">.</w:t>
+      </w:r>
+      <w:bookmarkEnd w:id="1097"/>
     </w:p>
     <w:p>
       <w:pPr>
@@ -25180,9 +25854,11 @@
         <w:jc w:val="left"/>
         <w:ind w:left="720" w:hanging="720"/>
       </w:pPr>
+      <w:bookmarkStart w:id="1098" w:name="bib_ref_14"/>
       <w:r>
         <w:t xml:space="preserve">[14] D. R. Pawar, “Deep Learning-Driven Assistive Technology for Blind Users: Real-Time Object Detection and Speech Feedback on Android,” 2025.</w:t>
       </w:r>
+      <w:bookmarkEnd w:id="1098"/>
     </w:p>
     <w:p>
       <w:pPr>
@@ -25191,9 +25867,11 @@
         <w:jc w:val="left"/>
         <w:ind w:left="720" w:hanging="720"/>
       </w:pPr>
+      <w:bookmarkStart w:id="1099" w:name="bib_ref_15"/>
       <w:r>
         <w:t xml:space="preserve">[15] J. Figura, R. Kuźmiczuk, and M. Badurowicz, “Analysis of object recognition systems using augmented reality glasses,” Journal of Computer Sciences Institute, vol. 34, pp. 8–13, 2025.</w:t>
       </w:r>
+      <w:bookmarkEnd w:id="1099"/>
     </w:p>
     <w:p>
       <w:pPr>
@@ -25202,9 +25880,19 @@
         <w:jc w:val="left"/>
         <w:ind w:left="720" w:hanging="720"/>
       </w:pPr>
-      <w:r>
-        <w:t xml:space="preserve">[16] A. G. Howard, M. Zhu, B. Chen, D. Kalenichenko, W. Wang, T. Weyand, M. Andreetto, and H. Adam, “MobileNets: Efficient Convolutional Neural Networks for Mobile Vision Applications,” arXiv:1704.04861, 2017.</w:t>
-      </w:r>
+      <w:bookmarkStart w:id="1100" w:name="bib_ref_16"/>
+      <w:r>
+        <w:t xml:space="preserve">[16] A. G. Howard, M. Zhu, B. Chen, D. Kalenichenko, W. Wang, T. Weyand, M. Andreetto, and H. Adam, “MobileNets: Efficient Convolutional Neural Networks for Mobile Vision Applications,” </w:t>
+      </w:r>
+      <w:hyperlink r:id="rIdBib13" w:history="1">
+        <w:r>
+          <w:t xml:space="preserve">arXiv:1704.04861</w:t>
+        </w:r>
+      </w:hyperlink>
+      <w:r>
+        <w:t xml:space="preserve">, 2017.</w:t>
+      </w:r>
+      <w:bookmarkEnd w:id="1100"/>
     </w:p>
     <w:p>
       <w:pPr>
@@ -25213,9 +25901,19 @@
         <w:jc w:val="left"/>
         <w:ind w:left="720" w:hanging="720"/>
       </w:pPr>
-      <w:r>
-        <w:t xml:space="preserve">[17] M. Sandler, A. Howard, M. Zhu, A. Zhmoginov, and L.-C. Chen, “MobileNetV2: Inverted Residuals and Linear Bottlenecks,” in 2018 IEEE/CVF Conference on Computer Vision and Pattern Recognition (CVPR), Jun. 2018, pp. 4510–4520. doi: 10.1109/CVPR.2018.00474.</w:t>
-      </w:r>
+      <w:bookmarkStart w:id="1101" w:name="bib_ref_17"/>
+      <w:r>
+        <w:t xml:space="preserve">[17] M. Sandler, A. Howard, M. Zhu, A. Zhmoginov, and L.-C. Chen, “MobileNetV2: Inverted Residuals and Linear Bottlenecks,” in 2018 IEEE/CVF Conference on Computer Vision and Pattern Recognition (CVPR), Jun. 2018, pp. 4510–4520. doi: </w:t>
+      </w:r>
+      <w:hyperlink r:id="rIdBib14" w:history="1">
+        <w:r>
+          <w:t xml:space="preserve">10.1109/CVPR.2018.00474</w:t>
+        </w:r>
+      </w:hyperlink>
+      <w:r>
+        <w:t xml:space="preserve">.</w:t>
+      </w:r>
+      <w:bookmarkEnd w:id="1101"/>
     </w:p>
     <w:p>
       <w:pPr>
@@ -25224,9 +25922,19 @@
         <w:jc w:val="left"/>
         <w:ind w:left="720" w:hanging="720"/>
       </w:pPr>
-      <w:r>
-        <w:t xml:space="preserve">[18] J. Dai, “Real-time and accurate object detection on edge device with TensorFlow Lite,” Journal of Physics: Conference Series, vol. 1651, no. 1, Art. no. 012114, 2020. doi: 10.1088/1742-6596/1651/1/012114.</w:t>
-      </w:r>
+      <w:bookmarkStart w:id="1102" w:name="bib_ref_18"/>
+      <w:r>
+        <w:t xml:space="preserve">[18] J. Dai, “Real-time and accurate object detection on edge device with TensorFlow Lite,” Journal of Physics: Conference Series, vol. 1651, no. 1, Art. no. 012114, 2020. doi: </w:t>
+      </w:r>
+      <w:hyperlink r:id="rIdBib15" w:history="1">
+        <w:r>
+          <w:t xml:space="preserve">10.1088/1742-6596/1651/1/012114</w:t>
+        </w:r>
+      </w:hyperlink>
+      <w:r>
+        <w:t xml:space="preserve">.</w:t>
+      </w:r>
+      <w:bookmarkEnd w:id="1102"/>
     </w:p>
     <w:p>
       <w:pPr>
@@ -25235,9 +25943,19 @@
         <w:jc w:val="left"/>
         <w:ind w:left="720" w:hanging="720"/>
       </w:pPr>
-      <w:r>
-        <w:t xml:space="preserve">[19] A. Magdy, M. S. Moustafa, H. M. Ebied, and M. F. Tolba, “Lightweight faster R-CNN for object detection in optical remote sensing images,” Scientific Reports, vol. 15, Art. no. 16163, 2025. doi: 10.1038/s41598-025-99242-y.</w:t>
-      </w:r>
+      <w:bookmarkStart w:id="1103" w:name="bib_ref_19"/>
+      <w:r>
+        <w:t xml:space="preserve">[19] A. Magdy, M. S. Moustafa, H. M. Ebied, and M. F. Tolba, “Lightweight faster R-CNN for object detection in optical remote sensing images,” Scientific Reports, vol. 15, Art. no. 16163, 2025. doi: </w:t>
+      </w:r>
+      <w:hyperlink r:id="rIdBib16" w:history="1">
+        <w:r>
+          <w:t xml:space="preserve">10.1038/s41598-025-99242-y</w:t>
+        </w:r>
+      </w:hyperlink>
+      <w:r>
+        <w:t xml:space="preserve">.</w:t>
+      </w:r>
+      <w:bookmarkEnd w:id="1103"/>
     </w:p>
     <w:p>
       <w:pPr>
@@ -25246,9 +25964,19 @@
         <w:jc w:val="left"/>
         <w:ind w:left="720" w:hanging="720"/>
       </w:pPr>
-      <w:r>
-        <w:t xml:space="preserve">[20] A. Kuznetsova et al., “The Open Images Dataset V4: Unified image classification, object detection, and visual relationship detection at scale,” International Journal of Computer Vision, vol. 128, pp. 1956–1981, 2020. doi: 10.1007/s11263-020-01316-z.</w:t>
-      </w:r>
+      <w:bookmarkStart w:id="1104" w:name="bib_ref_20"/>
+      <w:r>
+        <w:t xml:space="preserve">[20] A. Kuznetsova et al., “The Open Images Dataset V4: Unified image classification, object detection, and visual relationship detection at scale,” International Journal of Computer Vision, vol. 128, pp. 1956–1981, 2020. doi: </w:t>
+      </w:r>
+      <w:hyperlink r:id="rIdBib17" w:history="1">
+        <w:r>
+          <w:t xml:space="preserve">10.1007/s11263-020-01316-z</w:t>
+        </w:r>
+      </w:hyperlink>
+      <w:r>
+        <w:t xml:space="preserve">.</w:t>
+      </w:r>
+      <w:bookmarkEnd w:id="1104"/>
     </w:p>
     <w:p>
       <w:pPr>
@@ -25257,9 +25985,19 @@
         <w:jc w:val="left"/>
         <w:ind w:left="720" w:hanging="720"/>
       </w:pPr>
-      <w:r>
-        <w:t xml:space="preserve">[21] “ONNX Runtime,” ONNX Runtime. [Online]. Available: https://onnxruntime.ai/docs/.</w:t>
-      </w:r>
+      <w:bookmarkStart w:id="1105" w:name="bib_ref_21"/>
+      <w:r>
+        <w:t xml:space="preserve">[21] “ONNX Runtime,” ONNX Runtime. [Online]. Available: </w:t>
+      </w:r>
+      <w:hyperlink r:id="rIdBib18" w:history="1">
+        <w:r>
+          <w:t xml:space="preserve">https://onnxruntime.ai/docs/</w:t>
+        </w:r>
+      </w:hyperlink>
+      <w:r>
+        <w:t xml:space="preserve">.</w:t>
+      </w:r>
+      <w:bookmarkEnd w:id="1105"/>
     </w:p>
     <w:p>
       <w:pPr>
@@ -25268,9 +26006,19 @@
         <w:jc w:val="left"/>
         <w:ind w:left="720" w:hanging="720"/>
       </w:pPr>
-      <w:r>
-        <w:t xml:space="preserve">[22] “ExecuTorch Documentation,” PyTorch. [Online]. Available: https://pytorch.org/executorch/stable/.</w:t>
-      </w:r>
+      <w:bookmarkStart w:id="1106" w:name="bib_ref_22"/>
+      <w:r>
+        <w:t xml:space="preserve">[22] “ExecuTorch Documentation,” PyTorch. [Online]. Available: </w:t>
+      </w:r>
+      <w:hyperlink r:id="rIdBib19" w:history="1">
+        <w:r>
+          <w:t xml:space="preserve">https://pytorch.org/executorch/stable/</w:t>
+        </w:r>
+      </w:hyperlink>
+      <w:r>
+        <w:t xml:space="preserve">.</w:t>
+      </w:r>
+      <w:bookmarkEnd w:id="1106"/>
     </w:p>
     <w:p>
       <w:pPr>
@@ -25279,9 +26027,19 @@
         <w:jc w:val="left"/>
         <w:ind w:left="720" w:hanging="720"/>
       </w:pPr>
-      <w:r>
-        <w:t xml:space="preserve">[23] N. Carion, F. Massa, G. Synnaeve, N. Usunier, A. Kirillov, and S. Zagoruyko, “End-to-End Object Detection with Transformers,” in Computer Vision – ECCV 2020, Cham: Springer International Publishing, 2020, pp. 213–229. doi: 10.1007/978-3-030-58452-8_13.</w:t>
-      </w:r>
+      <w:bookmarkStart w:id="1107" w:name="bib_ref_23"/>
+      <w:r>
+        <w:t xml:space="preserve">[23] N. Carion, F. Massa, G. Synnaeve, N. Usunier, A. Kirillov, and S. Zagoruyko, “End-to-End Object Detection with Transformers,” in Computer Vision – ECCV 2020, Cham: Springer International Publishing, 2020, pp. 213–229. doi: </w:t>
+      </w:r>
+      <w:hyperlink r:id="rIdBib20" w:history="1">
+        <w:r>
+          <w:t xml:space="preserve">10.1007/978-3-030-58452-8_13</w:t>
+        </w:r>
+      </w:hyperlink>
+      <w:r>
+        <w:t xml:space="preserve">.</w:t>
+      </w:r>
+      <w:bookmarkEnd w:id="1107"/>
     </w:p>
     <w:p>
       <w:pPr>
@@ -25290,9 +26048,19 @@
         <w:jc w:val="left"/>
         <w:ind w:left="720" w:hanging="720"/>
       </w:pPr>
-      <w:r>
-        <w:t xml:space="preserve">[24] Google, “Benchmark CompiledModel API,” Google AI Edge. [Online]. Available: https://developers.google.com/edge/litert/next/benchmark.</w:t>
-      </w:r>
+      <w:bookmarkStart w:id="1108" w:name="bib_ref_24"/>
+      <w:r>
+        <w:t xml:space="preserve">[24] Google, “Benchmark CompiledModel API,” Google AI Edge. [Online]. Available: </w:t>
+      </w:r>
+      <w:hyperlink r:id="rIdBib21" w:history="1">
+        <w:r>
+          <w:t xml:space="preserve">https://developers.google.com/edge/litert/next/benchmark</w:t>
+        </w:r>
+      </w:hyperlink>
+      <w:r>
+        <w:t xml:space="preserve">.</w:t>
+      </w:r>
+      <w:bookmarkEnd w:id="1108"/>
     </w:p>
     <w:p>
       <w:pPr>
@@ -25301,9 +26069,19 @@
         <w:jc w:val="left"/>
         <w:ind w:left="720" w:hanging="720"/>
       </w:pPr>
-      <w:r>
-        <w:t xml:space="preserve">[25] Android Developers, “Android Debug Bridge (adb),” Android Studio. [Online]. Available: https://developer.android.com/tools/adb.</w:t>
-      </w:r>
+      <w:bookmarkStart w:id="1109" w:name="bib_ref_25"/>
+      <w:r>
+        <w:t xml:space="preserve">[25] Android Developers, “Android Debug Bridge (adb),” Android Studio. [Online]. Available: </w:t>
+      </w:r>
+      <w:hyperlink r:id="rIdBib22" w:history="1">
+        <w:r>
+          <w:t xml:space="preserve">https://developer.android.com/tools/adb</w:t>
+        </w:r>
+      </w:hyperlink>
+      <w:r>
+        <w:t xml:space="preserve">.</w:t>
+      </w:r>
+      <w:bookmarkEnd w:id="1109"/>
     </w:p>
     <w:p>
       <w:pPr>
@@ -25312,9 +26090,19 @@
         <w:jc w:val="left"/>
         <w:ind w:left="720" w:hanging="720"/>
       </w:pPr>
-      <w:r>
-        <w:t xml:space="preserve">[26] Google, “GPU acceleration delegate with Interpreter API,” Google AI Edge. [Online]. Available: https://developers.google.com/edge/litert/android/gpu.</w:t>
-      </w:r>
+      <w:bookmarkStart w:id="1110" w:name="bib_ref_26"/>
+      <w:r>
+        <w:t xml:space="preserve">[26] Google, “GPU acceleration delegate with Interpreter API,” Google AI Edge. [Online]. Available: </w:t>
+      </w:r>
+      <w:hyperlink r:id="rIdBib23" w:history="1">
+        <w:r>
+          <w:t xml:space="preserve">https://developers.google.com/edge/litert/android/gpu</w:t>
+        </w:r>
+      </w:hyperlink>
+      <w:r>
+        <w:t xml:space="preserve">.</w:t>
+      </w:r>
+      <w:bookmarkEnd w:id="1110"/>
     </w:p>
     <w:p>
       <w:pPr>
@@ -25323,9 +26111,19 @@
         <w:jc w:val="left"/>
         <w:ind w:left="720" w:hanging="720"/>
       </w:pPr>
-      <w:r>
-        <w:t xml:space="preserve">[27] Roboflow, “Roboflow: Computer vision tools for developers and enterprises.” [Online]. Available: https://roboflow.com/.</w:t>
-      </w:r>
+      <w:bookmarkStart w:id="1111" w:name="bib_ref_27"/>
+      <w:r>
+        <w:t xml:space="preserve">[27] Roboflow, “Roboflow: Computer vision tools for developers and enterprises.” [Online]. Available: </w:t>
+      </w:r>
+      <w:hyperlink r:id="rIdBib24" w:history="1">
+        <w:r>
+          <w:t xml:space="preserve">https://roboflow.com/</w:t>
+        </w:r>
+      </w:hyperlink>
+      <w:r>
+        <w:t xml:space="preserve">.</w:t>
+      </w:r>
+      <w:bookmarkEnd w:id="1111"/>
     </w:p>
     <w:p>
       <w:pPr>
@@ -25334,9 +26132,19 @@
         <w:jc w:val="left"/>
         <w:ind w:left="720" w:hanging="720"/>
       </w:pPr>
-      <w:r>
-        <w:t xml:space="preserve">[28] Khronos Group, “OpenCL – The Open Standard for Parallel Programming of Heterogeneous Systems.” [Online]. Available: https://www.khronos.org/opencl/.</w:t>
-      </w:r>
+      <w:bookmarkStart w:id="1112" w:name="bib_ref_28"/>
+      <w:r>
+        <w:t xml:space="preserve">[28] Khronos Group, “OpenCL – The Open Standard for Parallel Programming of Heterogeneous Systems.” [Online]. Available: </w:t>
+      </w:r>
+      <w:hyperlink r:id="rIdBib25" w:history="1">
+        <w:r>
+          <w:t xml:space="preserve">https://www.khronos.org/opencl/</w:t>
+        </w:r>
+      </w:hyperlink>
+      <w:r>
+        <w:t xml:space="preserve">.</w:t>
+      </w:r>
+      <w:bookmarkEnd w:id="1112"/>
     </w:p>
     <w:p>
       <w:pPr>
@@ -25345,9 +26153,19 @@
         <w:jc w:val="left"/>
         <w:ind w:left="720" w:hanging="720"/>
       </w:pPr>
-      <w:r>
-        <w:t xml:space="preserve">[29] Google, “CameraX,” Android Developers. [Online]. Available: https://developer.android.com/media/camera/camerax.</w:t>
-      </w:r>
+      <w:bookmarkStart w:id="1113" w:name="bib_ref_29"/>
+      <w:r>
+        <w:t xml:space="preserve">[29] Google, “CameraX,” Android Developers. [Online]. Available: </w:t>
+      </w:r>
+      <w:hyperlink r:id="rIdBib26" w:history="1">
+        <w:r>
+          <w:t xml:space="preserve">https://developer.android.com/media/camera/camerax</w:t>
+        </w:r>
+      </w:hyperlink>
+      <w:r>
+        <w:t xml:space="preserve">.</w:t>
+      </w:r>
+      <w:bookmarkEnd w:id="1113"/>
     </w:p>
     <w:p>
       <w:pPr>
@@ -25356,49 +26174,101 @@
         <w:jc w:val="left"/>
         <w:ind w:left="720" w:hanging="720"/>
       </w:pPr>
-      <w:r>
-        <w:t xml:space="preserve">[30] Google, “TextToSpeech,” Android Developers. [Online]. Available: https://developer.android.com/reference/android/speech/tts/TextToSpeech.</w:t>
-      </w:r>
+      <w:bookmarkStart w:id="1114" w:name="bib_ref_30"/>
+      <w:r>
+        <w:t xml:space="preserve">[30] Google, “TextToSpeech,” Android Developers. [Online]. Available: </w:t>
+      </w:r>
+      <w:hyperlink r:id="rIdBib27" w:history="1">
+        <w:r>
+          <w:t xml:space="preserve">https://developer.android.com/reference/android/speech/tts/TextToSpeech</w:t>
+        </w:r>
+      </w:hyperlink>
+      <w:r>
+        <w:t xml:space="preserve">.</w:t>
+      </w:r>
+      <w:bookmarkEnd w:id="1114"/>
     </w:p>
     <w:p>
       <w:pPr>
         <w:jc w:val="left"/>
       </w:pPr>
-      <w:r>
-        <w:t>[31] k2-fsa, “Text-to-speech,” sherpa-onnx documentation. [Online]. Available: https://k2-fsa.github.io/sherpa/onnx/tts/index.html. Consultado: 14 oct. 2026.</w:t>
-      </w:r>
+      <w:bookmarkStart w:id="1115" w:name="bib_ref_31"/>
+      <w:r>
+        <w:t xml:space="preserve">[31] k2-fsa, “Text-to-speech,” sherpa-onnx documentation. [Online]. Available: </w:t>
+      </w:r>
+      <w:hyperlink r:id="rIdBib28" w:history="1">
+        <w:r>
+          <w:t xml:space="preserve">https://k2-fsa.github.io/sherpa/onnx/tts/index.html</w:t>
+        </w:r>
+      </w:hyperlink>
+      <w:r>
+        <w:t xml:space="preserve">. Consultado: 14 oct. 2026.</w:t>
+      </w:r>
+      <w:bookmarkEnd w:id="1115"/>
     </w:p>
     <w:p>
       <w:pPr>
         <w:jc w:val="left"/>
       </w:pPr>
-      <w:r>
-        <w:t>[32] Google, “LiteRT for Android,” Google AI Edge. [Online]. Available: https://developers.google.com/edge/litert/android. Consultado: 14 oct. 2026.</w:t>
-      </w:r>
+      <w:bookmarkStart w:id="1116" w:name="bib_ref_32"/>
+      <w:r>
+        <w:t xml:space="preserve">[32] Google, “LiteRT for Android,” Google AI Edge. [Online]. Available: </w:t>
+      </w:r>
+      <w:hyperlink r:id="rIdBib29" w:history="1">
+        <w:r>
+          <w:t xml:space="preserve">https://developers.google.com/edge/litert/android</w:t>
+        </w:r>
+      </w:hyperlink>
+      <w:r>
+        <w:t xml:space="preserve">. Consultado: 14 oct. 2026.</w:t>
+      </w:r>
+      <w:bookmarkEnd w:id="1116"/>
     </w:p>
     <w:p>
       <w:pPr>
         <w:jc w:val="left"/>
       </w:pPr>
-      <w:r>
-        <w:t>[33] D. Cerda, “AssistiveVision,” código fuente, revisión 85c852ddcb543bce1bd69ad0db307f895d597881. [Online]. Available: https://github.com/diomedescerda/AssistiveVision.</w:t>
-      </w:r>
+      <w:bookmarkStart w:id="1117" w:name="bib_ref_33"/>
+      <w:r>
+        <w:t xml:space="preserve">[33] D. Cerda, “AssistiveVision,” código fuente, revisión 85c852ddcb543bce1bd69ad0db307f895d597881. [Online]. Available: </w:t>
+      </w:r>
+      <w:hyperlink r:id="rIdBib30" w:history="1">
+        <w:r>
+          <w:t xml:space="preserve">https://github.com/diomedescerda/AssistiveVision</w:t>
+        </w:r>
+      </w:hyperlink>
+      <w:r>
+        <w:t xml:space="preserve">.</w:t>
+      </w:r>
+      <w:bookmarkEnd w:id="1117"/>
     </w:p>
     <w:p>
       <w:pPr>
         <w:jc w:val="left"/>
       </w:pPr>
+      <w:bookmarkStart w:id="1118" w:name="bib_ref_34"/>
       <w:r>
         <w:t>[34] D. F. Cerda Leon, “Sistema de identificación y localización espacial de objetos basado en visión por computador para asistencia a personas con discapacidad visual,” Propuesta de pasantía en investigación, Universidad del Magdalena, documento del proyecto. Disponible en Documents/Propuesta Pasantia de Investigación - Diomedes Cerda.pdf.</w:t>
       </w:r>
+      <w:bookmarkEnd w:id="1118"/>
     </w:p>
     <w:p>
       <w:pPr>
         <w:jc w:val="left"/>
       </w:pPr>
-      <w:r>
-        <w:t>[35] Pillow contributors, “ImageStat module,” Pillow documentation. [Online]. Available: https://pillow.readthedocs.io/en/stable/reference/ImageStat.html. El análisis utiliza conversión RGB a L y media de píxeles.</w:t>
-      </w:r>
+      <w:bookmarkStart w:id="1119" w:name="bib_ref_35"/>
+      <w:r>
+        <w:t xml:space="preserve">[35] Pillow contributors, “ImageStat module,” Pillow documentation. [Online]. Available: </w:t>
+      </w:r>
+      <w:hyperlink r:id="rIdBib31" w:history="1">
+        <w:r>
+          <w:t xml:space="preserve">https://pillow.readthedocs.io/en/stable/reference/ImageStat.html</w:t>
+        </w:r>
+      </w:hyperlink>
+      <w:r>
+        <w:t xml:space="preserve">. El análisis utiliza conversión RGB a L y media de píxeles.</w:t>
+      </w:r>
+      <w:bookmarkEnd w:id="1119"/>
     </w:p>
     <w:sectPr>
       <w:headerReference w:type="even" r:id="rId41"/>

</xml_diff>

<commit_message>
Revisa atribuciones y completa bibliografía del informe final
</commit_message>
<xml_diff>
--- a/Documents/Informe_Final_Trabajo_de_Grado_AssistiveVision.docx
+++ b/Documents/Informe_Final_Trabajo_de_Grado_AssistiveVision.docx
@@ -3499,33 +3499,21 @@
       <w:r>
         <w:t xml:space="preserve">La discapacidad visual constituye una limitación significativa para la autonomía de quienes la padecen, en particular cuando se trata de desplazarse e interactuar en espacios interiores, donde la densidad de obstáculos, el mobiliario y la variabilidad de las escenas dificultan la anticipación del entorno. De acuerdo con la Organización Mundial de la Salud, al menos 2,2 mil millones de personas presentan deficiencia visual o ceguera, y de ellas al menos 1.000 millones tienen una condición que podría haberse prevenido o aún no ha sido atendida </w:t>
       </w:r>
+      <w:hyperlink w:anchor="bib_ref_1" w:history="1">
+        <w:r>
+          <w:t xml:space="preserve">[1]</w:t>
+        </w:r>
+      </w:hyperlink>
+      <w:r>
+        <w:t xml:space="preserve">. Frente a esta situación, los sistemas de asistencia basados en visión por computador se han consolidado como una alternativa tecnológica viable para apoyar la percepción del entorno, al convertir la información visual capturada por una cámara en descripciones auditivas, como exploran los prototipos descritos en </w:t>
+      </w:r>
       <w:hyperlink w:anchor="bib_ref_2" w:history="1">
         <w:r>
           <w:t xml:space="preserve">[2]</w:t>
         </w:r>
       </w:hyperlink>
       <w:r>
-        <w:t xml:space="preserve">. Frente a esta situación, los sistemas de asistencia basados en visión por computador se han consolidado como una alternativa tecnológica viable para apoyar la percepción del entorno, al convertir la información visual capturada por una cámara en descripciones auditivas útiles para el usuario.</w:t>
-      </w:r>
-    </w:p>
-    <w:p>
-      <w:pPr>
-        <w:pStyle w:val="Normal"/>
-        <w:widowControl/>
-        <w:spacing w:line="360" w:lineRule="auto" w:after="330"/>
-        <w:jc w:val="both"/>
-      </w:pPr>
-      <w:r>
-        <w:t xml:space="preserve">En los últimos años, la disponibilidad de modelos de detección de objetos optimizados para dispositivos móviles, junto con </w:t>
-      </w:r>
-      <w:r>
-        <w:rPr>
-          <w:i/>
-        </w:rPr>
-        <w:t>frameworks</w:t>
-      </w:r>
-      <w:r>
-        <w:t xml:space="preserve"> de inferencia local como TensorFlow Lite </w:t>
+        <w:t xml:space="preserve">, </w:t>
       </w:r>
       <w:hyperlink w:anchor="bib_ref_3" w:history="1">
         <w:r>
@@ -3533,39 +3521,7 @@
         </w:r>
       </w:hyperlink>
       <w:r>
-        <w:t xml:space="preserve">, ha permitido ejecutar tareas de visión por computador directamente sobre teléfonos inteligentes de gama media, sin depender de conectividad a internet ni de servidores externos. Este avance abre la posibilidad de construir ayudas técnicas de bajo costo, portátiles y funcionales para personas con discapacidad visual, especialmente en contextos donde el acceso a soluciones comerciales especializadas es limitado.</w:t>
-      </w:r>
-    </w:p>
-    <w:p>
-      <w:pPr>
-        <w:pStyle w:val="Normal"/>
-        <w:widowControl/>
-        <w:spacing w:line="360" w:lineRule="auto" w:after="330"/>
-        <w:jc w:val="both"/>
-      </w:pPr>
-      <w:r>
-        <w:t xml:space="preserve">En este contexto, el presente trabajo de grado aborda el diseño, la implementación y la evaluación de un sistema de asistencia visual ejecutado sobre un dispositivo móvil Android, capaz de identificar objetos prioritarios de un entorno interior, determinar su ubicación espacial relativa y anunciar esta información al usuario mediante descriptores de voz.</w:t>
-      </w:r>
-    </w:p>
-    <w:p>
-      <w:bookmarkStart w:id="1007" w:name="report_1007"/>
-      <w:pPr>
-        <w:pStyle w:val="Ttulo2"/>
-      </w:pPr>
-      <w:r>
-        <w:t xml:space="preserve">Antecedentes</w:t>
-      </w:r>
-      <w:bookmarkEnd w:id="1007"/>
-    </w:p>
-    <w:p>
-      <w:pPr>
-        <w:pStyle w:val="Normal"/>
-        <w:widowControl/>
-        <w:spacing w:line="360" w:lineRule="auto" w:after="330"/>
-        <w:jc w:val="both"/>
-      </w:pPr>
-      <w:r>
-        <w:t xml:space="preserve">La detección de objetos mediante redes neuronales profundas ha evolucionado desde arquitecturas de dos etapas, como Faster R-CNN </w:t>
+        <w:t xml:space="preserve"> y </w:t>
       </w:r>
       <w:hyperlink w:anchor="bib_ref_4" w:history="1">
         <w:r>
@@ -3573,7 +3529,27 @@
         </w:r>
       </w:hyperlink>
       <w:r>
-        <w:t xml:space="preserve">, hasta detectores de una etapa orientados al tiempo real, como YOLO </w:t>
+        <w:t xml:space="preserve">.</w:t>
+      </w:r>
+    </w:p>
+    <w:p>
+      <w:pPr>
+        <w:pStyle w:val="Normal"/>
+        <w:widowControl/>
+        <w:spacing w:line="360" w:lineRule="auto" w:after="330"/>
+        <w:jc w:val="both"/>
+      </w:pPr>
+      <w:r>
+        <w:t xml:space="preserve">En los últimos años, la disponibilidad de modelos de detección de objetos optimizados para dispositivos móviles, junto con </w:t>
+      </w:r>
+      <w:r>
+        <w:rPr>
+          <w:i/>
+        </w:rPr>
+        <w:t>frameworks</w:t>
+      </w:r>
+      <w:r>
+        <w:t xml:space="preserve"> de inferencia local como TensorFlow Lite </w:t>
       </w:r>
       <w:hyperlink w:anchor="bib_ref_5" w:history="1">
         <w:r>
@@ -3581,7 +3557,39 @@
         </w:r>
       </w:hyperlink>
       <w:r>
-        <w:t xml:space="preserve">, SSD </w:t>
+        <w:t xml:space="preserve">, ha permitido ejecutar tareas de visión por computador directamente sobre teléfonos inteligentes de gama media, sin depender de conectividad a internet ni de servidores externos. Este avance abre la posibilidad de construir ayudas técnicas de bajo costo, portátiles y funcionales para personas con discapacidad visual, especialmente en contextos donde el acceso a soluciones comerciales especializadas es limitado.</w:t>
+      </w:r>
+    </w:p>
+    <w:p>
+      <w:pPr>
+        <w:pStyle w:val="Normal"/>
+        <w:widowControl/>
+        <w:spacing w:line="360" w:lineRule="auto" w:after="330"/>
+        <w:jc w:val="both"/>
+      </w:pPr>
+      <w:r>
+        <w:t xml:space="preserve">En este contexto, el presente trabajo de grado aborda el diseño, la implementación y la evaluación de un sistema de asistencia visual ejecutado sobre un dispositivo móvil Android, capaz de identificar objetos prioritarios de un entorno interior, determinar su ubicación espacial relativa y anunciar esta información al usuario mediante descriptores de voz.</w:t>
+      </w:r>
+    </w:p>
+    <w:p>
+      <w:bookmarkStart w:id="1007" w:name="report_1007"/>
+      <w:pPr>
+        <w:pStyle w:val="Ttulo2"/>
+      </w:pPr>
+      <w:r>
+        <w:t xml:space="preserve">Antecedentes</w:t>
+      </w:r>
+      <w:bookmarkEnd w:id="1007"/>
+    </w:p>
+    <w:p>
+      <w:pPr>
+        <w:pStyle w:val="Normal"/>
+        <w:widowControl/>
+        <w:spacing w:line="360" w:lineRule="auto" w:after="330"/>
+        <w:jc w:val="both"/>
+      </w:pPr>
+      <w:r>
+        <w:t xml:space="preserve">La detección de objetos mediante redes neuronales profundas ha evolucionado desde arquitecturas de dos etapas, como Faster R-CNN </w:t>
       </w:r>
       <w:hyperlink w:anchor="bib_ref_6" w:history="1">
         <w:r>
@@ -3589,7 +3597,7 @@
         </w:r>
       </w:hyperlink>
       <w:r>
-        <w:t xml:space="preserve"> y EfficientDet </w:t>
+        <w:t xml:space="preserve">, hasta detectores de una etapa orientados al tiempo real, como YOLO </w:t>
       </w:r>
       <w:hyperlink w:anchor="bib_ref_7" w:history="1">
         <w:r>
@@ -3597,7 +3605,7 @@
         </w:r>
       </w:hyperlink>
       <w:r>
-        <w:t xml:space="preserve">, que ofrecen diferentes compromisos entre exactitud y costo computacional. En el ámbito de las tecnologías de asistencia, trabajos recientes han demostrado la viabilidad de ejecutar detectores de objetos sobre Android con fines de apoyo a personas con discapacidad visual; es el caso del sistema propuesto por More et al. </w:t>
+        <w:t xml:space="preserve">, SSD </w:t>
       </w:r>
       <w:hyperlink w:anchor="bib_ref_8" w:history="1">
         <w:r>
@@ -3605,197 +3613,7 @@
         </w:r>
       </w:hyperlink>
       <w:r>
-        <w:t xml:space="preserve">, que integra un modelo YOLOv8 convertido a TensorFlow Lite con retroalimentación auditiva. Estos antecedentes evidencian tanto la pertinencia del problema como la necesidad de comparar experimentalmente los modelos bajo condiciones de despliegue concretas.</w:t>
-      </w:r>
-    </w:p>
-    <w:p>
-      <w:bookmarkStart w:id="1008" w:name="report_1008"/>
-      <w:pPr>
-        <w:pStyle w:val="Ttulo2"/>
-      </w:pPr>
-      <w:r>
-        <w:t xml:space="preserve">Objetivos</w:t>
-      </w:r>
-      <w:bookmarkEnd w:id="1008"/>
-    </w:p>
-    <w:p>
-      <w:pPr>
-        <w:pStyle w:val="Ttulo3"/>
-      </w:pPr>
-      <w:r>
-        <w:t xml:space="preserve">Objetivo general</w:t>
-      </w:r>
-    </w:p>
-    <w:p>
-      <w:pPr>
-        <w:pStyle w:val="Normal"/>
-        <w:widowControl/>
-        <w:spacing w:line="360" w:lineRule="auto" w:after="330"/>
-        <w:jc w:val="both"/>
-      </w:pPr>
-      <w:r>
-        <w:t xml:space="preserve">Desarrollar un sistema de asistencia implementado en un dispositivo móvil, basado en técnicas de visión por computador, para la identificación y localización espacial de objetos en entornos interiores, orientado al apoyo de la percepción del entorno para personas con discapacidad visual.</w:t>
-      </w:r>
-    </w:p>
-    <w:p>
-      <w:pPr>
-        <w:pStyle w:val="Ttulo3"/>
-      </w:pPr>
-      <w:r>
-        <w:t xml:space="preserve">Objetivos específicos</w:t>
-      </w:r>
-    </w:p>
-    <w:p>
-      <w:pPr>
-        <w:pStyle w:val="Normal"/>
-        <w:widowControl/>
-        <w:spacing w:line="360" w:lineRule="auto" w:after="330"/>
-        <w:jc w:val="both"/>
-      </w:pPr>
-      <w:r>
-        <w:t xml:space="preserve">1. Seleccionar un modelo de detección de objetos optimizado para su implementación en dispositivos móviles con plataforma Android.</w:t>
-      </w:r>
-    </w:p>
-    <w:p>
-      <w:pPr>
-        <w:pStyle w:val="Normal"/>
-        <w:widowControl/>
-        <w:spacing w:line="360" w:lineRule="auto" w:after="330"/>
-        <w:jc w:val="both"/>
-      </w:pPr>
-      <w:r>
-        <w:t xml:space="preserve">2. Desarrollar un prototipo funcional en plataforma Android que integre la cámara del dispositivo y un modelo de detección de objetos para identificar elementos del entorno y determinar su ubicación relativa, así como descriptores de audio.</w:t>
-      </w:r>
-    </w:p>
-    <w:p>
-      <w:pPr>
-        <w:pStyle w:val="Normal"/>
-        <w:widowControl/>
-        <w:spacing w:line="360" w:lineRule="auto" w:after="330"/>
-        <w:jc w:val="both"/>
-      </w:pPr>
-      <w:r>
-        <w:t xml:space="preserve">3. Evaluar el desempeño del prototipo en entornos interiores controlados, analizando métricas como la exactitud de detección, la latencia de procesamiento y la claridad de la retroalimentación auditiva.</w:t>
-      </w:r>
-    </w:p>
-    <w:p>
-      <w:bookmarkStart w:id="1009" w:name="report_1009"/>
-      <w:pPr>
-        <w:pStyle w:val="Ttulo2"/>
-      </w:pPr>
-      <w:r>
-        <w:t xml:space="preserve">Alcance</w:t>
-      </w:r>
-      <w:bookmarkEnd w:id="1009"/>
-    </w:p>
-    <w:p>
-      <w:pPr>
-        <w:pStyle w:val="Normal"/>
-        <w:widowControl/>
-        <w:spacing w:line="360" w:lineRule="auto" w:after="330"/>
-        <w:jc w:val="both"/>
-      </w:pPr>
-      <w:r>
-        <w:t xml:space="preserve">El sistema se circunscribe a entornos interiores y a un conjunto de diez clases de objetos prioritarios presentes de manera frecuente en espacios domésticos e institucionales: persona, silla, sofá, cama, mesa, inodoro, televisor, computador portátil, lavamanos y refrigerador. La retroalimentación al usuario se realiza exclusivamente por vía auditiva, en español e inglés, mediante la síntesis de voz disponible en el propio dispositivo. El prototipo opera en un modo manual, en el que el usuario solicita la descripción de la escena en el momento que lo requiere. El desarrollo no contempla el entrenamiento de modelos desde cero, sino la selección, evaluación e integración de modelos preentrenados de acceso libre.</w:t>
-      </w:r>
-    </w:p>
-    <w:p>
-      <w:bookmarkStart w:id="1010" w:name="report_1010"/>
-      <w:pPr>
-        <w:pStyle w:val="Ttulo2"/>
-      </w:pPr>
-      <w:r>
-        <w:t xml:space="preserve">Limitaciones</w:t>
-      </w:r>
-      <w:bookmarkEnd w:id="1010"/>
-    </w:p>
-    <w:p>
-      <w:pPr>
-        <w:pStyle w:val="Normal"/>
-        <w:widowControl/>
-        <w:spacing w:line="360" w:lineRule="auto" w:after="330"/>
-        <w:jc w:val="both"/>
-      </w:pPr>
-      <w:r>
-        <w:t>El desempeño depende del dispositivo, el encuadre, la iluminación y las oclusiones. La localización describe regiones bidimensionales del campo visual y no estima distancias ni garantiza movilidad segura. El capítulo 4 analiza fotografías reproducidas en Android y distancias aproximadas, por lo que sus resultados no equivalen a una evaluación de navegación, comprensión del habla o desempeño con usuarios finales.</w:t>
-      </w:r>
-    </w:p>
-    <w:p>
-      <w:bookmarkStart w:id="1011" w:name="report_1011"/>
-      <w:pPr>
-        <w:pStyle w:val="Ttulo2"/>
-      </w:pPr>
-      <w:r>
-        <w:t xml:space="preserve">Metodología</w:t>
-      </w:r>
-      <w:bookmarkEnd w:id="1011"/>
-    </w:p>
-    <w:p>
-      <w:pPr>
-        <w:pStyle w:val="Normal"/>
-        <w:widowControl/>
-        <w:spacing w:line="360" w:lineRule="auto" w:after="330"/>
-        <w:jc w:val="both"/>
-      </w:pPr>
-      <w:r>
-        <w:t xml:space="preserve">La metodología conserva las tres fases de la propuesta de pasantía </w:t>
-      </w:r>
-      <w:hyperlink w:anchor="bib_ref_34" w:history="1">
-        <w:r>
-          <w:t xml:space="preserve">[34]</w:t>
-        </w:r>
-      </w:hyperlink>
-      <w:r>
-        <w:t xml:space="preserve">. La fase 1 comprende revisión de literatura, análisis del problema, requerimientos, selección del modelo, delimitación de objetos y diseño de descriptores. La comparación inicial de seis configuraciones sobre 80 imágenes y 257 anotaciones pertenece a esta fase y se presenta en el capítulo 2. La fase 2 corresponde al diseño integrado y al desarrollo del prototipo Android, descritos en el capítulo 3. La fase 3 evalúa el posicionamiento y el desempeño con 198 fotografías organizadas en 33 grupos; sus resultados se presentan en el capítulo 4. El </w:t>
-      </w:r>
-      <w:r>
-        <w:rPr>
-          <w:i/>
-        </w:rPr>
-        <w:t>benchmark</w:t>
-      </w:r>
-      <w:r>
-        <w:t xml:space="preserve"> inicial en Redmi Note 13 y la reproducción posterior en emulador Pixel 8 tienen alcances distintos y se analizan por separado.</w:t>
-      </w:r>
-    </w:p>
-    <w:p>
-      <w:pPr>
-        <w:widowControl/>
-        <w:spacing w:line="360" w:lineRule="auto" w:after="330"/>
-        <w:jc w:val="both"/>
-      </w:pPr>
-      <w:r>
-        <w:t>La evaluación de la fase 3 cubre detección y procesamiento de imágenes; la iluminación se explora mediante brillo digital, sin mediciones de iluminancia, y la oclusión se explora con etiquetas suplementarias asistidas por IA, con revisión parcial del autor. La claridad auditiva, el tiempo hasta escuchar el mensaje y el efecto sobre la autonomía requieren evaluación adicional. El análisis geométrico de distancia es complementario y no sustituye estas actividades.</w:t>
-      </w:r>
-    </w:p>
-    <w:p>
-      <w:bookmarkStart w:id="1012" w:name="report_1012"/>
-      <w:pPr>
-        <w:pStyle w:val="Ttulo2"/>
-      </w:pPr>
-      <w:r>
-        <w:t xml:space="preserve">Significado del trabajo</w:t>
-      </w:r>
-      <w:bookmarkEnd w:id="1012"/>
-    </w:p>
-    <w:p>
-      <w:pPr>
-        <w:pStyle w:val="Normal"/>
-        <w:widowControl/>
-        <w:spacing w:line="360" w:lineRule="auto" w:after="330"/>
-        <w:jc w:val="both"/>
-      </w:pPr>
-      <w:r>
-        <w:t xml:space="preserve">El resultado del proyecto es un prototipo funcional de bajo costo que demuestra la viabilidad de ejecutar un </w:t>
-      </w:r>
-      <w:r>
-        <w:rPr>
-          <w:i/>
-        </w:rPr>
-        <w:t>pipeline</w:t>
-      </w:r>
-      <w:r>
-        <w:t xml:space="preserve"> completo de detección, localización espacial y descripción auditiva de escenas interiores sobre un teléfono inteligente de gama media, sentando las bases para una ayuda técnica de apoyo a la percepción del entorno para personas con discapacidad visual. En el contexto institucional, este propósito se relaciona con los compromisos de la Universidad del Magdalena con la innovación tecnológica, la investigación y la inclusión, expresados en el Plan de Desarrollo UNIMAGDALENA Comprometida 2020-2030 </w:t>
+        <w:t xml:space="preserve"> y EfficientDet </w:t>
       </w:r>
       <w:hyperlink w:anchor="bib_ref_9" w:history="1">
         <w:r>
@@ -3803,11 +3621,217 @@
         </w:r>
       </w:hyperlink>
       <w:r>
-        <w:t xml:space="preserve"> y en el Plan de Gobierno Rectoral 2024-2028 </w:t>
+        <w:t xml:space="preserve">, que ofrecen diferentes compromisos entre exactitud y costo computacional. En el ámbito de las tecnologías de asistencia, trabajos recientes han demostrado la viabilidad de ejecutar detectores de objetos sobre Android con fines de apoyo a personas con discapacidad visual; es el caso del sistema propuesto por More et al. </w:t>
+      </w:r>
+      <w:hyperlink w:anchor="bib_ref_2" w:history="1">
+        <w:r>
+          <w:t xml:space="preserve">[2]</w:t>
+        </w:r>
+      </w:hyperlink>
+      <w:r>
+        <w:t xml:space="preserve">, que integra un modelo YOLOv8 convertido a TensorFlow Lite con retroalimentación auditiva. Estos antecedentes evidencian tanto la pertinencia del problema como la necesidad de comparar experimentalmente los modelos bajo condiciones de despliegue concretas.</w:t>
+      </w:r>
+    </w:p>
+    <w:p>
+      <w:bookmarkStart w:id="1008" w:name="report_1008"/>
+      <w:pPr>
+        <w:pStyle w:val="Ttulo2"/>
+      </w:pPr>
+      <w:r>
+        <w:t xml:space="preserve">Objetivos</w:t>
+      </w:r>
+      <w:bookmarkEnd w:id="1008"/>
+    </w:p>
+    <w:p>
+      <w:pPr>
+        <w:pStyle w:val="Ttulo3"/>
+      </w:pPr>
+      <w:r>
+        <w:t xml:space="preserve">Objetivo general</w:t>
+      </w:r>
+    </w:p>
+    <w:p>
+      <w:pPr>
+        <w:pStyle w:val="Normal"/>
+        <w:widowControl/>
+        <w:spacing w:line="360" w:lineRule="auto" w:after="330"/>
+        <w:jc w:val="both"/>
+      </w:pPr>
+      <w:r>
+        <w:t xml:space="preserve">Desarrollar un sistema de asistencia implementado en un dispositivo móvil, basado en técnicas de visión por computador, para la identificación y localización espacial de objetos en entornos interiores, orientado al apoyo de la percepción del entorno para personas con discapacidad visual.</w:t>
+      </w:r>
+    </w:p>
+    <w:p>
+      <w:pPr>
+        <w:pStyle w:val="Ttulo3"/>
+      </w:pPr>
+      <w:r>
+        <w:t xml:space="preserve">Objetivos específicos</w:t>
+      </w:r>
+    </w:p>
+    <w:p>
+      <w:pPr>
+        <w:pStyle w:val="Normal"/>
+        <w:widowControl/>
+        <w:spacing w:line="360" w:lineRule="auto" w:after="330"/>
+        <w:jc w:val="both"/>
+      </w:pPr>
+      <w:r>
+        <w:t xml:space="preserve">1. Seleccionar un modelo de detección de objetos optimizado para su implementación en dispositivos móviles con plataforma Android.</w:t>
+      </w:r>
+    </w:p>
+    <w:p>
+      <w:pPr>
+        <w:pStyle w:val="Normal"/>
+        <w:widowControl/>
+        <w:spacing w:line="360" w:lineRule="auto" w:after="330"/>
+        <w:jc w:val="both"/>
+      </w:pPr>
+      <w:r>
+        <w:t xml:space="preserve">2. Desarrollar un prototipo funcional en plataforma Android que integre la cámara del dispositivo y un modelo de detección de objetos para identificar elementos del entorno y determinar su ubicación relativa, así como descriptores de audio.</w:t>
+      </w:r>
+    </w:p>
+    <w:p>
+      <w:pPr>
+        <w:pStyle w:val="Normal"/>
+        <w:widowControl/>
+        <w:spacing w:line="360" w:lineRule="auto" w:after="330"/>
+        <w:jc w:val="both"/>
+      </w:pPr>
+      <w:r>
+        <w:t xml:space="preserve">3. Evaluar el desempeño del prototipo en entornos interiores controlados, analizando métricas como la exactitud de detección, la latencia de procesamiento y la claridad de la retroalimentación auditiva.</w:t>
+      </w:r>
+    </w:p>
+    <w:p>
+      <w:bookmarkStart w:id="1009" w:name="report_1009"/>
+      <w:pPr>
+        <w:pStyle w:val="Ttulo2"/>
+      </w:pPr>
+      <w:r>
+        <w:t xml:space="preserve">Alcance</w:t>
+      </w:r>
+      <w:bookmarkEnd w:id="1009"/>
+    </w:p>
+    <w:p>
+      <w:pPr>
+        <w:pStyle w:val="Normal"/>
+        <w:widowControl/>
+        <w:spacing w:line="360" w:lineRule="auto" w:after="330"/>
+        <w:jc w:val="both"/>
+      </w:pPr>
+      <w:r>
+        <w:t xml:space="preserve">El sistema se circunscribe a entornos interiores y a un conjunto de diez clases de objetos prioritarios presentes de manera frecuente en espacios domésticos e institucionales: persona, silla, sofá, cama, mesa, inodoro, televisor, computador portátil, lavamanos y refrigerador. La retroalimentación al usuario se realiza exclusivamente por vía auditiva, en español e inglés, mediante la síntesis de voz disponible en el propio dispositivo. El prototipo opera en un modo manual, en el que el usuario solicita la descripción de la escena en el momento que lo requiere. El desarrollo no contempla el entrenamiento de modelos desde cero, sino la selección, evaluación e integración de modelos preentrenados de acceso libre.</w:t>
+      </w:r>
+    </w:p>
+    <w:p>
+      <w:bookmarkStart w:id="1010" w:name="report_1010"/>
+      <w:pPr>
+        <w:pStyle w:val="Ttulo2"/>
+      </w:pPr>
+      <w:r>
+        <w:t xml:space="preserve">Limitaciones</w:t>
+      </w:r>
+      <w:bookmarkEnd w:id="1010"/>
+    </w:p>
+    <w:p>
+      <w:pPr>
+        <w:pStyle w:val="Normal"/>
+        <w:widowControl/>
+        <w:spacing w:line="360" w:lineRule="auto" w:after="330"/>
+        <w:jc w:val="both"/>
+      </w:pPr>
+      <w:r>
+        <w:t>El desempeño depende del dispositivo, el encuadre, la iluminación y las oclusiones. La localización describe regiones bidimensionales del campo visual y no estima distancias ni garantiza movilidad segura. El capítulo 4 analiza fotografías reproducidas en Android y distancias aproximadas, por lo que sus resultados no equivalen a una evaluación de navegación, comprensión del habla o desempeño con usuarios finales.</w:t>
+      </w:r>
+    </w:p>
+    <w:p>
+      <w:bookmarkStart w:id="1011" w:name="report_1011"/>
+      <w:pPr>
+        <w:pStyle w:val="Ttulo2"/>
+      </w:pPr>
+      <w:r>
+        <w:t xml:space="preserve">Metodología</w:t>
+      </w:r>
+      <w:bookmarkEnd w:id="1011"/>
+    </w:p>
+    <w:p>
+      <w:pPr>
+        <w:pStyle w:val="Normal"/>
+        <w:widowControl/>
+        <w:spacing w:line="360" w:lineRule="auto" w:after="330"/>
+        <w:jc w:val="both"/>
+      </w:pPr>
+      <w:r>
+        <w:t xml:space="preserve">La metodología conserva las tres fases de la propuesta de pasantía </w:t>
       </w:r>
       <w:hyperlink w:anchor="bib_ref_10" w:history="1">
         <w:r>
           <w:t xml:space="preserve">[10]</w:t>
+        </w:r>
+      </w:hyperlink>
+      <w:r>
+        <w:t xml:space="preserve">. La fase 1 comprende revisión de literatura, análisis del problema, requerimientos, selección del modelo, delimitación de objetos y diseño de descriptores. La comparación inicial de seis configuraciones sobre 80 imágenes y 257 anotaciones pertenece a esta fase y se presenta en el capítulo 2. La fase 2 corresponde al diseño integrado y al desarrollo del prototipo Android, descritos en el capítulo 3. La fase 3 evalúa el posicionamiento y el desempeño con 198 fotografías organizadas en 33 grupos; sus resultados se presentan en el capítulo 4. El </w:t>
+      </w:r>
+      <w:r>
+        <w:rPr>
+          <w:i/>
+        </w:rPr>
+        <w:t>benchmark</w:t>
+      </w:r>
+      <w:r>
+        <w:t xml:space="preserve"> inicial en Redmi Note 13 y la reproducción posterior en emulador Pixel 8 tienen alcances distintos y se analizan por separado.</w:t>
+      </w:r>
+    </w:p>
+    <w:p>
+      <w:pPr>
+        <w:widowControl/>
+        <w:spacing w:line="360" w:lineRule="auto" w:after="330"/>
+        <w:jc w:val="both"/>
+      </w:pPr>
+      <w:r>
+        <w:t>La evaluación de la fase 3 cubre detección y procesamiento de imágenes; la iluminación se explora mediante brillo digital, sin mediciones de iluminancia, y la oclusión se explora con etiquetas suplementarias asistidas por IA, con revisión parcial del autor. La claridad auditiva, el tiempo hasta escuchar el mensaje y el efecto sobre la autonomía requieren evaluación adicional. El análisis geométrico de distancia es complementario y no sustituye estas actividades.</w:t>
+      </w:r>
+    </w:p>
+    <w:p>
+      <w:bookmarkStart w:id="1012" w:name="report_1012"/>
+      <w:pPr>
+        <w:pStyle w:val="Ttulo2"/>
+      </w:pPr>
+      <w:r>
+        <w:t xml:space="preserve">Significado del trabajo</w:t>
+      </w:r>
+      <w:bookmarkEnd w:id="1012"/>
+    </w:p>
+    <w:p>
+      <w:pPr>
+        <w:pStyle w:val="Normal"/>
+        <w:widowControl/>
+        <w:spacing w:line="360" w:lineRule="auto" w:after="330"/>
+        <w:jc w:val="both"/>
+      </w:pPr>
+      <w:r>
+        <w:t xml:space="preserve">El resultado del proyecto es un prototipo funcional de bajo costo que demuestra la viabilidad de ejecutar un </w:t>
+      </w:r>
+      <w:r>
+        <w:rPr>
+          <w:i/>
+        </w:rPr>
+        <w:t>pipeline</w:t>
+      </w:r>
+      <w:r>
+        <w:t xml:space="preserve"> completo de detección, localización espacial y descripción auditiva de escenas interiores sobre un teléfono inteligente de gama media, sentando las bases para una ayuda técnica de apoyo a la percepción del entorno para personas con discapacidad visual. En el contexto institucional, este propósito se relaciona con los compromisos de la Universidad del Magdalena con la innovación tecnológica, la investigación y la inclusión, expresados en el Plan de Desarrollo UNIMAGDALENA Comprometida 2020-2030 </w:t>
+      </w:r>
+      <w:hyperlink w:anchor="bib_ref_11" w:history="1">
+        <w:r>
+          <w:t xml:space="preserve">[11]</w:t>
+        </w:r>
+      </w:hyperlink>
+      <w:r>
+        <w:t xml:space="preserve"> y en el Plan de Gobierno Rectoral 2024-2028 </w:t>
+      </w:r>
+      <w:hyperlink w:anchor="bib_ref_12" w:history="1">
+        <w:r>
+          <w:t xml:space="preserve">[12]</w:t>
         </w:r>
       </w:hyperlink>
       <w:r>
@@ -3896,7 +3920,31 @@
         <w:jc w:val="both"/>
       </w:pPr>
       <w:r>
-        <w:t xml:space="preserve">Los trabajos revisados muestran que una solución de asistencia visual debe resolver simultáneamente tres problemas: detectar objetos relevantes, comunicar su presencia de manera comprensible y operar con recursos limitados. La literatura también evidencia que la estimación de distancia y la selección de la información que se anuncia son retos distintos de la clasificación de objetos.</w:t>
+        <w:t xml:space="preserve">Los trabajos revisados muestran que una solución de asistencia visual debe resolver simultáneamente tres problemas: detectar objetos relevantes, comunicar su presencia de manera comprensible y operar con recursos limitados. La literatura también evidencia que la estimación de distancia y la selección de la información que se anuncia son retos distintos de la clasificación de objetos </w:t>
+      </w:r>
+      <w:hyperlink w:anchor="bib_ref_2" w:history="1">
+        <w:r>
+          <w:t xml:space="preserve">[2]</w:t>
+        </w:r>
+      </w:hyperlink>
+      <w:r>
+        <w:t xml:space="preserve">, </w:t>
+      </w:r>
+      <w:hyperlink w:anchor="bib_ref_3" w:history="1">
+        <w:r>
+          <w:t xml:space="preserve">[3]</w:t>
+        </w:r>
+      </w:hyperlink>
+      <w:r>
+        <w:t xml:space="preserve">, </w:t>
+      </w:r>
+      <w:hyperlink w:anchor="bib_ref_4" w:history="1">
+        <w:r>
+          <w:t xml:space="preserve">[4]</w:t>
+        </w:r>
+      </w:hyperlink>
+      <w:r>
+        <w:t xml:space="preserve">.</w:t>
       </w:r>
     </w:p>
     <w:p>
@@ -3909,9 +3957,9 @@
       <w:r>
         <w:t xml:space="preserve">Meenakshi et al. desarrollaron una aplicación móvil para Android orientada a apoyar la movilidad de personas con discapacidad visual mediante YOLOv3 </w:t>
       </w:r>
-      <w:hyperlink w:anchor="bib_ref_11" w:history="1">
+      <w:hyperlink w:anchor="bib_ref_3" w:history="1">
         <w:r>
-          <w:t xml:space="preserve">[11]</w:t>
+          <w:t xml:space="preserve">[3]</w:t>
         </w:r>
       </w:hyperlink>
       <w:r>
@@ -3928,13 +3976,32 @@
       <w:r>
         <w:t xml:space="preserve">Guravaiah et al. presentaron Third Eye, un sistema que utiliza YOLOv5 para reconocer objetos y convertir las etiquetas detectadas en voz mediante las bibliotecas pyttsx3 y gTTS </w:t>
       </w:r>
-      <w:hyperlink w:anchor="bib_ref_12" w:history="1">
+      <w:hyperlink w:anchor="bib_ref_4" w:history="1">
         <w:r>
-          <w:t xml:space="preserve">[12]</w:t>
+          <w:t xml:space="preserve">[4]</w:t>
         </w:r>
       </w:hyperlink>
       <w:r>
         <w:t xml:space="preserve">. El conjunto combina MS COCO con quince clases adicionales de interés para el entorno cotidiano, como puertas, ventanas, casilleros y señales, para un total de noventa y cinco clases </w:t>
+      </w:r>
+      <w:hyperlink w:anchor="bib_ref_4" w:history="1">
+        <w:r>
+          <w:t xml:space="preserve">[4]</w:t>
+        </w:r>
+      </w:hyperlink>
+      <w:r>
+        <w:t xml:space="preserve">. El aporte principal es la integración explícita entre detección y síntesis de voz; no obstante, la implementación se plantea en Python y no resuelve de manera métrica la profundidad ni la localización espacial detallada.</w:t>
+      </w:r>
+    </w:p>
+    <w:p>
+      <w:pPr>
+        <w:pStyle w:val="Normal"/>
+        <w:widowControl/>
+        <w:spacing w:line="360" w:lineRule="auto" w:after="330"/>
+        <w:jc w:val="both"/>
+      </w:pPr>
+      <w:r>
+        <w:t xml:space="preserve">En un preprint, Pawar describe una aplicación Android basada en TensorFlow Object Detection API y SSD MobileNet, ajustada mediante transferencia de aprendizaje para reconocer ochenta categorías </w:t>
       </w:r>
       <w:hyperlink w:anchor="bib_ref_13" w:history="1">
         <w:r>
@@ -3942,7 +4009,16 @@
         </w:r>
       </w:hyperlink>
       <w:r>
-        <w:t xml:space="preserve">. El aporte principal es la integración explícita entre detección y síntesis de voz; no obstante, la implementación se plantea en Python y no resuelve de manera métrica la profundidad ni la localización espacial detallada.</w:t>
+        <w:t xml:space="preserve">. El sistema utiliza más de mil imágenes anotadas, aumento de datos y retroalimentación mediante texto a voz. El artículo reporta una exactitud aproximada del noventa por ciento y destaca la operación sin conexión como una ventaja de accesibilidad. Para el presente trabajo, este antecedente propone el uso de SSD MobileNet en aplicaciones móviles, pero también resalta la necesidad de separar la exactitud reportada en un conjunto propio de la medición reproducible de mAP, precisión, </w:t>
+      </w:r>
+      <w:r>
+        <w:rPr>
+          <w:i/>
+        </w:rPr>
+        <w:t>recall</w:t>
+      </w:r>
+      <w:r>
+        <w:t>, latencia y FPS.</w:t>
       </w:r>
     </w:p>
     <w:p>
@@ -3953,7 +4029,7 @@
         <w:jc w:val="both"/>
       </w:pPr>
       <w:r>
-        <w:t xml:space="preserve">Pawar estudió una aplicación Android basada en TensorFlow Object Detection API y SSD MobileNet, ajustada mediante transferencia de aprendizaje para reconocer ochenta categorías </w:t>
+        <w:t xml:space="preserve">Figura, Kuźmiczuk y Badurowicz compararon Faster R-CNN ResNet-101 v1, YOLOv8s, SSD MobileNetV2 y EfficientDet-Lite2 en un entorno simulado de gafas de realidad aumentada </w:t>
       </w:r>
       <w:hyperlink w:anchor="bib_ref_14" w:history="1">
         <w:r>
@@ -3961,16 +4037,7 @@
         </w:r>
       </w:hyperlink>
       <w:r>
-        <w:t xml:space="preserve">. El sistema utiliza más de mil imágenes anotadas, aumento de datos y retroalimentación mediante texto a voz. El artículo reporta una exactitud aproximada del noventa por ciento y destaca la operación sin conexión como una ventaja de accesibilidad. Para el presente trabajo, este antecedente confirma la viabilidad de SSD MobileNet en aplicaciones móviles, pero también resalta la necesidad de separar la exactitud reportada en un conjunto propio de la medición reproducible de mAP, precisión, </w:t>
-      </w:r>
-      <w:r>
-        <w:rPr>
-          <w:i/>
-        </w:rPr>
-        <w:t>recall</w:t>
-      </w:r>
-      <w:r>
-        <w:t>, latencia y FPS.</w:t>
+        <w:t xml:space="preserve">. Evaluaron velocidad, precisión, consumo de recursos y eficiencia energética. Sus resultados muestran que los detectores de una etapa son más apropiados para ejecución directa en el dispositivo; YOLOv8s obtuvo el mejor compromiso global entre las métricas consideradas, mientras EfficientDet-Lite2 y SSD MobileNetV2 presentaron ventajas de rapidez. Este estudio es especialmente cercano al problema de selección abordado en el capítulo 2 porque compara dos de los candidatos considerados en este trabajo.</w:t>
       </w:r>
     </w:p>
     <w:p>
@@ -3981,7 +4048,204 @@
         <w:jc w:val="both"/>
       </w:pPr>
       <w:r>
-        <w:t xml:space="preserve">Figura, Kuźmiczuk y Badurowicz compararon Faster R-CNN ResNet-101 v1, YOLOv8s, SSD MobileNetV2 y EfficientDet-Lite2 en un entorno simulado de gafas de realidad aumentada </w:t>
+        <w:t xml:space="preserve">More et al. propusieron una aplicación Android para personas con discapacidad visual que convierte YOLOv8 a TensorFlow Lite y añade retroalimentación auditiva </w:t>
+      </w:r>
+      <w:hyperlink w:anchor="bib_ref_2" w:history="1">
+        <w:r>
+          <w:t xml:space="preserve">[2]</w:t>
+        </w:r>
+      </w:hyperlink>
+      <w:r>
+        <w:t xml:space="preserve">. En sus pruebas, el modelo YOLOv8n a 640×640 alcanzó un mAP50 de 79,9 % y un mAP50-95 de 57,1 %, con un tiempo medio de inferencia de 350 ms; el modelo mediano obtuvo valores superiores de exactitud, pero con un costo temporal mayor. El resultado ilustra el compromiso entre tamaño del modelo, resolución, exactitud y latencia que debe considerarse antes de desplegar un detector en un teléfono.</w:t>
+      </w:r>
+    </w:p>
+    <w:p>
+      <w:pPr>
+        <w:pStyle w:val="Normal"/>
+        <w:widowControl/>
+        <w:spacing w:line="360" w:lineRule="auto" w:after="330"/>
+        <w:jc w:val="both"/>
+      </w:pPr>
+      <w:r>
+        <w:t>Estos antecedentes justifican una arquitectura que ejecute la inferencia localmente, limite la información anunciada y traduzca la caja detectada a una zona espacial comprensible. AssistiveVision adopta un modo manual bajo demanda y una localización bidimensional por zonas. El capítulo 4 explora la relación entre detección y distancia estimada; la validación con distancias medidas permanece pendiente.</w:t>
+      </w:r>
+    </w:p>
+    <w:p>
+      <w:bookmarkStart w:id="1016" w:name="report_1016"/>
+      <w:pPr>
+        <w:pStyle w:val="Ttulo2"/>
+      </w:pPr>
+      <w:r>
+        <w:t xml:space="preserve">1.2 Arquitecturas de detección: </w:t>
+      </w:r>
+      <w:r>
+        <w:rPr>
+          <w:i/>
+        </w:rPr>
+        <w:t>one-stage</w:t>
+      </w:r>
+      <w:r>
+        <w:t xml:space="preserve"> y </w:t>
+      </w:r>
+      <w:r>
+        <w:rPr>
+          <w:i/>
+        </w:rPr>
+        <w:t>two-stage</w:t>
+      </w:r>
+      <w:bookmarkEnd w:id="1016"/>
+    </w:p>
+    <w:p>
+      <w:pPr>
+        <w:pStyle w:val="Normal"/>
+        <w:widowControl/>
+        <w:spacing w:line="360" w:lineRule="auto" w:after="330"/>
+        <w:jc w:val="both"/>
+      </w:pPr>
+      <w:r>
+        <w:t xml:space="preserve">Entre los detectores convolucionales revisados se distinguen enfoques de dos etapas, como Faster R-CNN </w:t>
+      </w:r>
+      <w:hyperlink w:anchor="bib_ref_6" w:history="1">
+        <w:r>
+          <w:t xml:space="preserve">[6]</w:t>
+        </w:r>
+      </w:hyperlink>
+      <w:r>
+        <w:t xml:space="preserve">, y de una etapa, como YOLO </w:t>
+      </w:r>
+      <w:hyperlink w:anchor="bib_ref_7" w:history="1">
+        <w:r>
+          <w:t xml:space="preserve">[7]</w:t>
+        </w:r>
+      </w:hyperlink>
+      <w:r>
+        <w:t xml:space="preserve"> y SSD </w:t>
+      </w:r>
+      <w:hyperlink w:anchor="bib_ref_8" w:history="1">
+        <w:r>
+          <w:t xml:space="preserve">[8]</w:t>
+        </w:r>
+      </w:hyperlink>
+      <w:r>
+        <w:t xml:space="preserve">.</w:t>
+      </w:r>
+    </w:p>
+    <w:p>
+      <w:pPr>
+        <w:pStyle w:val="Normal"/>
+        <w:widowControl/>
+        <w:spacing w:line="360" w:lineRule="auto" w:after="330"/>
+        <w:jc w:val="both"/>
+      </w:pPr>
+      <w:r>
+        <w:t xml:space="preserve">Faster R-CNN divide el proceso en dos pasos. En la primera etapa, una Red de Propuesta de Regiones (RPN) escanea la imagen y genera regiones candidatas donde podrían existir objetos. En la segunda etapa, se extraen características de cada región candidata mediante redes convolucionales, asignando una etiqueta de clase y ajustando las coordenadas del </w:t>
+      </w:r>
+      <w:r>
+        <w:rPr>
+          <w:i/>
+        </w:rPr>
+        <w:t>bounding box</w:t>
+      </w:r>
+      <w:r>
+        <w:t xml:space="preserve"> </w:t>
+      </w:r>
+      <w:hyperlink w:anchor="bib_ref_6" w:history="1">
+        <w:r>
+          <w:t xml:space="preserve">[6]</w:t>
+        </w:r>
+      </w:hyperlink>
+      <w:r>
+        <w:t xml:space="preserve">. Esta descripción corresponde al detector de propuestas de regiones utilizado como antecedente.</w:t>
+      </w:r>
+    </w:p>
+    <w:p>
+      <w:pPr>
+        <w:pStyle w:val="Normal"/>
+        <w:widowControl/>
+        <w:spacing w:line="360" w:lineRule="auto" w:after="330"/>
+        <w:jc w:val="both"/>
+      </w:pPr>
+      <w:r>
+        <w:t xml:space="preserve">Los detectores de una etapa procesan la imagen completa en una sola pasada por la red neuronal, prediciendo clases y </w:t>
+      </w:r>
+      <w:r>
+        <w:rPr>
+          <w:i/>
+        </w:rPr>
+        <w:t>bounding boxes</w:t>
+      </w:r>
+      <w:r>
+        <w:t xml:space="preserve"> simultáneamente como un problema de regresión directa </w:t>
+      </w:r>
+      <w:hyperlink w:anchor="bib_ref_7" w:history="1">
+        <w:r>
+          <w:t xml:space="preserve">[7]</w:t>
+        </w:r>
+      </w:hyperlink>
+      <w:r>
+        <w:t xml:space="preserve">, </w:t>
+      </w:r>
+      <w:hyperlink w:anchor="bib_ref_8" w:history="1">
+        <w:r>
+          <w:t xml:space="preserve">[8]</w:t>
+        </w:r>
+      </w:hyperlink>
+      <w:r>
+        <w:t xml:space="preserve">. Una red convolucional extrae mapas de características espaciales y semánticas, sobre los cuales el modelo predice coordenadas y probabilidades de clase. YOLO prioriza la velocidad </w:t>
+      </w:r>
+      <w:hyperlink w:anchor="bib_ref_7" w:history="1">
+        <w:r>
+          <w:t xml:space="preserve">[7]</w:t>
+        </w:r>
+      </w:hyperlink>
+      <w:r>
+        <w:t xml:space="preserve">, SSD utiliza mapas multiescala y cajas predefinidas </w:t>
+      </w:r>
+      <w:hyperlink w:anchor="bib_ref_8" w:history="1">
+        <w:r>
+          <w:t xml:space="preserve">[8]</w:t>
+        </w:r>
+      </w:hyperlink>
+      <w:r>
+        <w:t xml:space="preserve">, y EfficientDet incorpora una fusión bidireccional de características y un escalamiento compuesto </w:t>
+      </w:r>
+      <w:hyperlink w:anchor="bib_ref_9" w:history="1">
+        <w:r>
+          <w:t xml:space="preserve">[9]</w:t>
+        </w:r>
+      </w:hyperlink>
+      <w:r>
+        <w:t xml:space="preserve">.</w:t>
+      </w:r>
+    </w:p>
+    <w:p>
+      <w:bookmarkStart w:id="1017" w:name="report_1017"/>
+      <w:pPr>
+        <w:pStyle w:val="Ttulo2"/>
+      </w:pPr>
+      <w:r>
+        <w:t xml:space="preserve">1.3 Modelos ligeros y eficiencia para dispositivos móviles</w:t>
+      </w:r>
+      <w:bookmarkEnd w:id="1017"/>
+    </w:p>
+    <w:p>
+      <w:pPr>
+        <w:pStyle w:val="Normal"/>
+        <w:widowControl/>
+        <w:spacing w:line="360" w:lineRule="auto" w:after="330"/>
+        <w:jc w:val="both"/>
+      </w:pPr>
+      <w:r>
+        <w:t xml:space="preserve">El despliegue en un teléfono introduce restricciones de memoria, energía, almacenamiento y tiempo de respuesta. Por esta razón, la eficiencia no depende únicamente del detector elegido: también intervienen el </w:t>
+      </w:r>
+      <w:r>
+        <w:rPr>
+          <w:i/>
+        </w:rPr>
+        <w:t>backbone</w:t>
+      </w:r>
+      <w:r>
+        <w:t xml:space="preserve">, la resolución de entrada, la representación numérica y las técnicas de compresión </w:t>
       </w:r>
       <w:hyperlink w:anchor="bib_ref_15" w:history="1">
         <w:r>
@@ -3989,7 +4253,15 @@
         </w:r>
       </w:hyperlink>
       <w:r>
-        <w:t xml:space="preserve">. Evaluaron velocidad, precisión, consumo de recursos y eficiencia energética. Sus resultados muestran que los detectores de una etapa son más apropiados para ejecución directa en el dispositivo; YOLOv8s obtuvo la mejor combinación de precisión y velocidad entre los modelos analizados, mientras EfficientDet-Lite2 y SSD MobileNetV2 presentaron ventajas de rapidez. Este estudio es especialmente cercano al problema de selección abordado en el capítulo 2 porque compara dos de los candidatos considerados en este trabajo.</w:t>
+        <w:t xml:space="preserve">, </w:t>
+      </w:r>
+      <w:hyperlink w:anchor="bib_ref_16" w:history="1">
+        <w:r>
+          <w:t xml:space="preserve">[16]</w:t>
+        </w:r>
+      </w:hyperlink>
+      <w:r>
+        <w:t xml:space="preserve">.</w:t>
       </w:r>
     </w:p>
     <w:p>
@@ -4000,7 +4272,152 @@
         <w:jc w:val="both"/>
       </w:pPr>
       <w:r>
-        <w:t xml:space="preserve">More et al. propusieron una aplicación Android para personas con discapacidad visual que convierte YOLOv8 a TensorFlow Lite y añade retroalimentación auditiva </w:t>
+        <w:t xml:space="preserve">Howard et al. propusieron MobileNets como una familia de redes para visión móvil basada en convoluciones separables en profundidad </w:t>
+      </w:r>
+      <w:hyperlink w:anchor="bib_ref_15" w:history="1">
+        <w:r>
+          <w:t xml:space="preserve">[15]</w:t>
+        </w:r>
+      </w:hyperlink>
+      <w:r>
+        <w:t xml:space="preserve">. La factorización reduce de manera importante las operaciones y los parámetros frente a una convolución convencional. Además, los multiplicadores de ancho y resolución permiten ajustar el costo computacional a las capacidades del dispositivo, lo que explica la amplia adopción de MobileNet como </w:t>
+      </w:r>
+      <w:r>
+        <w:rPr>
+          <w:i/>
+        </w:rPr>
+        <w:t>backbone</w:t>
+      </w:r>
+      <w:r>
+        <w:t xml:space="preserve"> de detectores SSD móviles.</w:t>
+      </w:r>
+    </w:p>
+    <w:p>
+      <w:pPr>
+        <w:pStyle w:val="Normal"/>
+        <w:widowControl/>
+        <w:spacing w:line="360" w:lineRule="auto" w:after="330"/>
+        <w:jc w:val="both"/>
+      </w:pPr>
+      <w:r>
+        <w:t xml:space="preserve">MobileNetV2, presentada por Sandler et al., introduce residuos invertidos y cuellos de botella lineales para mejorar la relación entre expresividad y costo </w:t>
+      </w:r>
+      <w:hyperlink w:anchor="bib_ref_16" w:history="1">
+        <w:r>
+          <w:t xml:space="preserve">[16]</w:t>
+        </w:r>
+      </w:hyperlink>
+      <w:r>
+        <w:t xml:space="preserve">. Al combinarse con SSDLite, la arquitectura reporta una reducción sustancial de operaciones y parámetros frente a YOLOv2, manteniendo un desempeño competitivo en detección sobre COCO. Este antecedente explica por qué las variantes SSD MobileNet son candidatos naturales para aplicaciones Android.</w:t>
+      </w:r>
+    </w:p>
+    <w:p>
+      <w:pPr>
+        <w:pStyle w:val="Normal"/>
+        <w:widowControl/>
+        <w:spacing w:line="360" w:lineRule="auto" w:after="330"/>
+        <w:jc w:val="both"/>
+      </w:pPr>
+      <w:r>
+        <w:t xml:space="preserve">Dai aborda la conversión de modelos Float32 a uint8 con TensorFlow Lite para reducir almacenamiento y coste de inferencia en dispositivos de borde </w:t>
+      </w:r>
+      <w:hyperlink w:anchor="bib_ref_17" w:history="1">
+        <w:r>
+          <w:t xml:space="preserve">[17]</w:t>
+        </w:r>
+      </w:hyperlink>
+      <w:r>
+        <w:t xml:space="preserve">. El artículo también reproduce una comparación entre SSD y Faster R-CNN; sus cifras no se utilizan aquí como mediciones del prototipo ni como evidencia aislada del efecto de la cuantización. Este antecedente motiva evaluar velocidad y exactitud en el dispositivo y con el protocolo propios.</w:t>
+      </w:r>
+    </w:p>
+    <w:p>
+      <w:pPr>
+        <w:pStyle w:val="Normal"/>
+        <w:widowControl/>
+        <w:spacing w:line="360" w:lineRule="auto" w:after="330"/>
+        <w:jc w:val="both"/>
+      </w:pPr>
+      <w:r>
+        <w:t xml:space="preserve">Magdy et al. analizaron la compresión de Faster R-CNN mediante entrenamiento con precisión mixta FP16, poda no estructurada y cuantización dinámica </w:t>
+      </w:r>
+      <w:hyperlink w:anchor="bib_ref_18" w:history="1">
+        <w:r>
+          <w:t xml:space="preserve">[18]</w:t>
+        </w:r>
+      </w:hyperlink>
+      <w:r>
+        <w:t xml:space="preserve">. En conjuntos de imágenes de teledetección, la estrategia redujo en promedio el tamaño del modelo un 25,6 % y el número de parámetros un 56,6 %, manteniendo el mAP. Aunque el dominio es diferente, el resultado muestra que un detector de dos etapas puede optimizarse; aun así, la complejidad de ese proceso debe contrastarse con la disponibilidad de modelos ligeros preentrenados para el caso de uso móvil.</w:t>
+      </w:r>
+    </w:p>
+    <w:p>
+      <w:pPr>
+        <w:pStyle w:val="Normal"/>
+        <w:widowControl/>
+        <w:spacing w:line="360" w:lineRule="auto" w:after="330"/>
+        <w:jc w:val="both"/>
+      </w:pPr>
+      <w:r>
+        <w:t xml:space="preserve">Estos trabajos sustentan la elección de métricas conjuntas de exactitud y costo computacional. En una aplicación de asistencia, un modelo rápido pero con muchos falsos positivos puede producir anuncios incorrectos, mientras un modelo exacto pero lento no entrega información oportuna. Como criterio de diseño, y sin medir aquí confianza del usuario, la selección experimental del capítulo 2 no se basa en una única métrica.</w:t>
+      </w:r>
+    </w:p>
+    <w:p>
+      <w:bookmarkStart w:id="1018" w:name="report_1018"/>
+      <w:pPr>
+        <w:pStyle w:val="Ttulo2"/>
+      </w:pPr>
+      <w:r>
+        <w:t xml:space="preserve">1.4 Modelos candidatos</w:t>
+      </w:r>
+      <w:bookmarkEnd w:id="1018"/>
+    </w:p>
+    <w:p>
+      <w:pPr>
+        <w:pStyle w:val="Normal"/>
+        <w:widowControl/>
+        <w:spacing w:line="360" w:lineRule="auto" w:after="330"/>
+        <w:jc w:val="both"/>
+      </w:pPr>
+      <w:r>
+        <w:t xml:space="preserve">A partir de la revisión se definieron cuatro arquitecturas candidatas para la comparación experimental: Faster R-CNN, YOLO, SSD MobileNet y EfficientDet. La selección considera que deben detectar varias clases en una imagen, disponer de implementaciones o pesos reutilizables y permitir una ejecución razonable en dispositivos móviles.</w:t>
+      </w:r>
+    </w:p>
+    <w:p>
+      <w:pPr>
+        <w:pStyle w:val="Normal"/>
+        <w:widowControl/>
+        <w:spacing w:line="360" w:lineRule="auto" w:after="330"/>
+        <w:jc w:val="both"/>
+      </w:pPr>
+      <w:r>
+        <w:t xml:space="preserve">Faster R-CNN representa la alternativa de dos etapas y ofrece alta precisión mediante una Red de Propuesta de Regiones, pero su costo de inferencia y memoria puede limitar el tiempo real en un teléfono. Las estrategias de compresión descritas por Magdy et al. muestran posibilidades de optimización </w:t>
+      </w:r>
+      <w:hyperlink w:anchor="bib_ref_18" w:history="1">
+        <w:r>
+          <w:t xml:space="preserve">[18]</w:t>
+        </w:r>
+      </w:hyperlink>
+      <w:r>
+        <w:t xml:space="preserve">, aunque el prototipo de este trabajo no entrena ni comprime este modelo.</w:t>
+      </w:r>
+    </w:p>
+    <w:p>
+      <w:pPr>
+        <w:pStyle w:val="Normal"/>
+        <w:widowControl/>
+        <w:spacing w:line="360" w:lineRule="auto" w:after="330"/>
+        <w:jc w:val="both"/>
+      </w:pPr>
+      <w:r>
+        <w:t xml:space="preserve">SSD MobileNet combina detección de una etapa con un </w:t>
+      </w:r>
+      <w:r>
+        <w:rPr>
+          <w:i/>
+        </w:rPr>
+        <w:t>backbone</w:t>
+      </w:r>
+      <w:r>
+        <w:t xml:space="preserve"> ligero. SSD predice objetos en mapas de características de diferentes escalas y MobileNet reduce el costo de las convoluciones </w:t>
       </w:r>
       <w:hyperlink w:anchor="bib_ref_8" w:history="1">
         <w:r>
@@ -4008,7 +4425,23 @@
         </w:r>
       </w:hyperlink>
       <w:r>
-        <w:t xml:space="preserve">. En sus pruebas, el modelo YOLOv8n a 640×640 alcanzó un mAP50 de 79,9 % y un mAP50-95 de 57,1 %, con un tiempo medio de inferencia de 350 ms; el modelo mediano obtuvo valores superiores de exactitud, pero con un costo temporal mayor. El resultado ilustra el compromiso entre tamaño del modelo, resolución, exactitud y latencia que debe considerarse antes de desplegar un detector en un teléfono.</w:t>
+        <w:t xml:space="preserve">, </w:t>
+      </w:r>
+      <w:hyperlink w:anchor="bib_ref_15" w:history="1">
+        <w:r>
+          <w:t xml:space="preserve">[15]</w:t>
+        </w:r>
+      </w:hyperlink>
+      <w:r>
+        <w:t xml:space="preserve">, </w:t>
+      </w:r>
+      <w:hyperlink w:anchor="bib_ref_16" w:history="1">
+        <w:r>
+          <w:t xml:space="preserve">[16]</w:t>
+        </w:r>
+      </w:hyperlink>
+      <w:r>
+        <w:t xml:space="preserve">. Esta combinación favorece la velocidad, pero su precisión de localización debe verificarse para las clases y escenas interiores del conjunto propio.</w:t>
       </w:r>
     </w:p>
     <w:p>
@@ -4019,33 +4452,30 @@
         <w:jc w:val="both"/>
       </w:pPr>
       <w:r>
-        <w:t>Estos antecedentes justifican una arquitectura que ejecute la inferencia localmente, limite la información anunciada y traduzca la caja detectada a una zona espacial comprensible. AssistiveVision adopta un modo manual bajo demanda y una localización bidimensional por zonas. El capítulo 4 explora la relación entre detección y distancia estimada; la validación con distancias medidas permanece pendiente.</w:t>
-      </w:r>
-    </w:p>
-    <w:p>
-      <w:bookmarkStart w:id="1016" w:name="report_1016"/>
-      <w:pPr>
-        <w:pStyle w:val="Ttulo2"/>
-      </w:pPr>
-      <w:r>
-        <w:t xml:space="preserve">1.2 Arquitecturas de detección: </w:t>
-      </w:r>
+        <w:t xml:space="preserve">EfficientDet es una familia de detectores de una etapa basada en EfficientNet, BiFPN y escalamiento compuesto </w:t>
+      </w:r>
+      <w:hyperlink w:anchor="bib_ref_9" w:history="1">
+        <w:r>
+          <w:t xml:space="preserve">[9]</w:t>
+        </w:r>
+      </w:hyperlink>
+      <w:r>
+        <w:t xml:space="preserve">. La documentación de EfficientDet-Lite describe variantes para dispositivos móviles </w:t>
+      </w:r>
+      <w:hyperlink w:anchor="bib_ref_19" w:history="1">
+        <w:r>
+          <w:t xml:space="preserve">[19]</w:t>
+        </w:r>
+      </w:hyperlink>
       <w:r>
         <w:rPr>
           <w:i/>
         </w:rPr>
-        <w:t>one-stage</w:t>
-      </w:r>
-      <w:r>
-        <w:t xml:space="preserve"> y </w:t>
-      </w:r>
-      <w:r>
-        <w:rPr>
-          <w:i/>
-        </w:rPr>
-        <w:t>two-stage</w:t>
-      </w:r>
-      <w:bookmarkEnd w:id="1016"/>
+        <w:t xml:space="preserve"/>
+      </w:r>
+      <w:r>
+        <w:t>; por ello, EfficientDet-Lite2 se considera una opción intermedia entre precisión, tamaño y velocidad.</w:t>
+      </w:r>
     </w:p>
     <w:p>
       <w:pPr>
@@ -4055,15 +4485,31 @@
         <w:jc w:val="both"/>
       </w:pPr>
       <w:r>
-        <w:t xml:space="preserve">Los modelos de detección de objetos basados en redes neuronales profundas se clasifican en dos grandes categorías según su arquitectura </w:t>
-      </w:r>
-      <w:hyperlink w:anchor="bib_ref_1" w:history="1">
+        <w:t xml:space="preserve">YOLO realiza la detección en una sola pasada y dispone de variantes con diferentes tamaños, desde modelos pequeños hasta modelos de mayor capacidad </w:t>
+      </w:r>
+      <w:hyperlink w:anchor="bib_ref_7" w:history="1">
         <w:r>
-          <w:t xml:space="preserve">[1]</w:t>
+          <w:t xml:space="preserve">[7]</w:t>
         </w:r>
       </w:hyperlink>
       <w:r>
-        <w:t xml:space="preserve">.</w:t>
+        <w:t xml:space="preserve">. Las variantes YOLOv8 y YOLO11 evaluadas se documentan por separado en Ultralytics </w:t>
+      </w:r>
+      <w:hyperlink w:anchor="bib_ref_20" w:history="1">
+        <w:r>
+          <w:t xml:space="preserve">[20]</w:t>
+        </w:r>
+      </w:hyperlink>
+      <w:r>
+        <w:t xml:space="preserve">, </w:t>
+      </w:r>
+      <w:hyperlink w:anchor="bib_ref_21" w:history="1">
+        <w:r>
+          <w:t xml:space="preserve">[21]</w:t>
+        </w:r>
+      </w:hyperlink>
+      <w:r>
+        <w:t xml:space="preserve">; mientras que el tamaño de la variante y la resolución de entrada determinan el costo real de ejecución en Android.</w:t>
       </w:r>
     </w:p>
     <w:p>
@@ -4074,24 +4520,23 @@
         <w:jc w:val="both"/>
       </w:pPr>
       <w:r>
-        <w:t xml:space="preserve">Los detectores de dos etapas dividen el proceso en dos pasos. En la primera etapa, una Red de Propuesta de Regiones (RPN) escanea la imagen y genera regiones candidatas donde podrían existir objetos. En la segunda etapa, se extraen características de cada región candidata mediante redes convolucionales, asignando una etiqueta de clase y ajustando las coordenadas del </w:t>
-      </w:r>
-      <w:r>
-        <w:rPr>
-          <w:i/>
-        </w:rPr>
-        <w:t>bounding box</w:t>
-      </w:r>
-      <w:r>
-        <w:t xml:space="preserve"> </w:t>
-      </w:r>
-      <w:hyperlink w:anchor="bib_ref_4" w:history="1">
+        <w:t xml:space="preserve">Las clases prioritarias del prototipo se relacionan con categorías disponibles en MS COCO, conjunto que contiene anotaciones para detección y segmentación en escenas cotidianas </w:t>
+      </w:r>
+      <w:hyperlink w:anchor="bib_ref_22" w:history="1">
         <w:r>
-          <w:t xml:space="preserve">[4]</w:t>
+          <w:t xml:space="preserve">[22]</w:t>
         </w:r>
       </w:hyperlink>
       <w:r>
-        <w:t xml:space="preserve">. Ejemplos de esta arquitectura incluyen la familia R-CNN, específicamente Faster R-CNN y Mask R-CNN.</w:t>
+        <w:t xml:space="preserve">. También se revisó Open Images como fuente de categorías y anotaciones de gran escala </w:t>
+      </w:r>
+      <w:hyperlink w:anchor="bib_ref_23" w:history="1">
+        <w:r>
+          <w:t xml:space="preserve">[23]</w:t>
+        </w:r>
+      </w:hyperlink>
+      <w:r>
+        <w:t xml:space="preserve">. En la implementación final se mantuvo MS COCO porque EfficientDet-Lite2 ya dispone de pesos compatibles con sus categorías y no fue necesario entrenar un modelo propio.</w:t>
       </w:r>
     </w:p>
     <w:p>
@@ -4102,16 +4547,7 @@
         <w:jc w:val="both"/>
       </w:pPr>
       <w:r>
-        <w:t xml:space="preserve">Los detectores de una etapa procesan la imagen completa en una sola pasada por la red neuronal, prediciendo clases y </w:t>
-      </w:r>
-      <w:r>
-        <w:rPr>
-          <w:i/>
-        </w:rPr>
-        <w:t>bounding boxes</w:t>
-      </w:r>
-      <w:r>
-        <w:t xml:space="preserve"> simultáneamente como un problema de regresión directa </w:t>
+        <w:t xml:space="preserve">La portabilidad de los modelos también depende del formato de inferencia. TensorFlow Lite permite ejecutar archivos .tflite en el dispositivo </w:t>
       </w:r>
       <w:hyperlink w:anchor="bib_ref_5" w:history="1">
         <w:r>
@@ -4119,50 +4555,34 @@
         </w:r>
       </w:hyperlink>
       <w:r>
-        <w:t xml:space="preserve">, </w:t>
-      </w:r>
-      <w:hyperlink w:anchor="bib_ref_6" w:history="1">
+        <w:t xml:space="preserve">, mientras ONNX Runtime y ExecuTorch representan alternativas para otros ecosistemas de despliegue </w:t>
+      </w:r>
+      <w:hyperlink w:anchor="bib_ref_24" w:history="1">
         <w:r>
-          <w:t xml:space="preserve">[6]</w:t>
+          <w:t xml:space="preserve">[24]</w:t>
         </w:r>
       </w:hyperlink>
       <w:r>
-        <w:t xml:space="preserve">. Una red convolucional extrae mapas de características espaciales y semánticas, sobre los cuales el modelo predice coordenadas y probabilidades de clase. YOLO prioriza la velocidad </w:t>
-      </w:r>
-      <w:hyperlink w:anchor="bib_ref_5" w:history="1">
+        <w:t xml:space="preserve">, </w:t>
+      </w:r>
+      <w:hyperlink w:anchor="bib_ref_25" w:history="1">
         <w:r>
-          <w:t xml:space="preserve">[5]</w:t>
+          <w:t xml:space="preserve">[25]</w:t>
         </w:r>
       </w:hyperlink>
       <w:r>
-        <w:t xml:space="preserve">, SSD utiliza mapas multiescala y cajas predefinidas </w:t>
-      </w:r>
-      <w:hyperlink w:anchor="bib_ref_6" w:history="1">
-        <w:r>
-          <w:t xml:space="preserve">[6]</w:t>
-        </w:r>
-      </w:hyperlink>
-      <w:r>
-        <w:t xml:space="preserve">, y EfficientDet incorpora una fusión bidireccional de características y un escalamiento compuesto </w:t>
-      </w:r>
-      <w:hyperlink w:anchor="bib_ref_7" w:history="1">
-        <w:r>
-          <w:t xml:space="preserve">[7]</w:t>
-        </w:r>
-      </w:hyperlink>
-      <w:r>
-        <w:t xml:space="preserve">.</w:t>
-      </w:r>
-    </w:p>
-    <w:p>
-      <w:bookmarkStart w:id="1017" w:name="report_1017"/>
+        <w:t xml:space="preserve">. AssistiveVision utiliza TensorFlow Lite por su integración directa con el modelo EfficientDet-Lite2 seleccionado.</w:t>
+      </w:r>
+    </w:p>
+    <w:p>
+      <w:bookmarkStart w:id="1019" w:name="report_1019"/>
       <w:pPr>
         <w:pStyle w:val="Ttulo2"/>
       </w:pPr>
       <w:r>
-        <w:t xml:space="preserve">1.3 Modelos ligeros y eficiencia para dispositivos móviles</w:t>
-      </w:r>
-      <w:bookmarkEnd w:id="1017"/>
+        <w:t xml:space="preserve">1.5 Nuevos paradigmas: DETR</w:t>
+      </w:r>
+      <w:bookmarkEnd w:id="1019"/>
     </w:p>
     <w:p>
       <w:pPr>
@@ -4172,334 +4592,15 @@
         <w:jc w:val="both"/>
       </w:pPr>
       <w:r>
-        <w:t xml:space="preserve">El despliegue en un teléfono introduce restricciones de memoria, energía, almacenamiento y tiempo de respuesta. Por esta razón, la eficiencia no depende únicamente del detector elegido: también intervienen el </w:t>
-      </w:r>
-      <w:r>
-        <w:rPr>
-          <w:i/>
-        </w:rPr>
-        <w:t>backbone</w:t>
-      </w:r>
-      <w:r>
-        <w:t>, la resolución de entrada, la representación numérica y las técnicas de compresión.</w:t>
-      </w:r>
-    </w:p>
-    <w:p>
-      <w:pPr>
-        <w:pStyle w:val="Normal"/>
-        <w:widowControl/>
-        <w:spacing w:line="360" w:lineRule="auto" w:after="330"/>
-        <w:jc w:val="both"/>
-      </w:pPr>
-      <w:r>
-        <w:t xml:space="preserve">Howard et al. propusieron MobileNets como una familia de redes para visión móvil basada en convoluciones separables en profundidad </w:t>
-      </w:r>
-      <w:hyperlink w:anchor="bib_ref_16" w:history="1">
+        <w:t xml:space="preserve">DETR (DEtection TRansformer) introduce un paradigma basado en transformers para realizar detección de objetos de extremo a extremo </w:t>
+      </w:r>
+      <w:hyperlink w:anchor="bib_ref_26" w:history="1">
         <w:r>
-          <w:t xml:space="preserve">[16]</w:t>
+          <w:t xml:space="preserve">[26]</w:t>
         </w:r>
       </w:hyperlink>
       <w:r>
-        <w:t xml:space="preserve">. La factorización reduce de manera importante las operaciones y los parámetros frente a una convolución convencional. Además, los multiplicadores de ancho y resolución permiten ajustar el costo computacional a las capacidades del dispositivo, lo que explica la amplia adopción de MobileNet como </w:t>
-      </w:r>
-      <w:r>
-        <w:rPr>
-          <w:i/>
-        </w:rPr>
-        <w:t>backbone</w:t>
-      </w:r>
-      <w:r>
-        <w:t xml:space="preserve"> de detectores SSD móviles.</w:t>
-      </w:r>
-    </w:p>
-    <w:p>
-      <w:pPr>
-        <w:pStyle w:val="Normal"/>
-        <w:widowControl/>
-        <w:spacing w:line="360" w:lineRule="auto" w:after="330"/>
-        <w:jc w:val="both"/>
-      </w:pPr>
-      <w:r>
-        <w:t xml:space="preserve">MobileNetV2, presentada por Sandler et al., introduce residuos invertidos y cuellos de botella lineales para mejorar la relación entre expresividad y costo </w:t>
-      </w:r>
-      <w:hyperlink w:anchor="bib_ref_17" w:history="1">
-        <w:r>
-          <w:t xml:space="preserve">[17]</w:t>
-        </w:r>
-      </w:hyperlink>
-      <w:r>
-        <w:t xml:space="preserve">. Al combinarse con SSDLite, la arquitectura reporta una reducción sustancial de operaciones y parámetros frente a YOLOv2, manteniendo un desempeño competitivo en detección sobre COCO. Este antecedente explica por qué las variantes SSD MobileNet son candidatos naturales para aplicaciones Android.</w:t>
-      </w:r>
-    </w:p>
-    <w:p>
-      <w:pPr>
-        <w:pStyle w:val="Normal"/>
-        <w:widowControl/>
-        <w:spacing w:line="360" w:lineRule="auto" w:after="330"/>
-        <w:jc w:val="both"/>
-      </w:pPr>
-      <w:r>
-        <w:t xml:space="preserve">Dai estudió la ejecución de detectores en dispositivos de borde mediante TensorFlow Lite y la conversión de modelos Float32 a uint8 </w:t>
-      </w:r>
-      <w:hyperlink w:anchor="bib_ref_18" w:history="1">
-        <w:r>
-          <w:t xml:space="preserve">[18]</w:t>
-        </w:r>
-      </w:hyperlink>
-      <w:r>
-        <w:t xml:space="preserve">. En sus experimentos sobre MS COCO, SSD300 alcanzó 58 FPS con un mAP de 72,1 %, mientras SSD500 alcanzó 23 FPS con un mAP de 75,1 %; Faster R-CNN obtuvo 7 FPS con un mAP de 73,2 %. Aunque las condiciones de hardware y el protocolo no son idénticos a los de este trabajo, la comparación evidencia el efecto de la cuantización y del tamaño de entrada sobre la velocidad.</w:t>
-      </w:r>
-    </w:p>
-    <w:p>
-      <w:pPr>
-        <w:pStyle w:val="Normal"/>
-        <w:widowControl/>
-        <w:spacing w:line="360" w:lineRule="auto" w:after="330"/>
-        <w:jc w:val="both"/>
-      </w:pPr>
-      <w:r>
-        <w:t xml:space="preserve">Magdy et al. analizaron la compresión de Faster R-CNN mediante entrenamiento con precisión mixta FP16, poda no estructurada y cuantización dinámica </w:t>
-      </w:r>
-      <w:hyperlink w:anchor="bib_ref_19" w:history="1">
-        <w:r>
-          <w:t xml:space="preserve">[19]</w:t>
-        </w:r>
-      </w:hyperlink>
-      <w:r>
-        <w:t xml:space="preserve">. En conjuntos de imágenes de teledetección, la estrategia redujo en promedio el tamaño del modelo un 25,6 % y el número de parámetros un 56,6 %, manteniendo el mAP. Aunque el dominio es diferente, el resultado muestra que un detector de dos etapas puede optimizarse; aun así, la complejidad de ese proceso debe contrastarse con la disponibilidad de modelos ligeros preentrenados para el caso de uso móvil.</w:t>
-      </w:r>
-    </w:p>
-    <w:p>
-      <w:pPr>
-        <w:pStyle w:val="Normal"/>
-        <w:widowControl/>
-        <w:spacing w:line="360" w:lineRule="auto" w:after="330"/>
-        <w:jc w:val="both"/>
-      </w:pPr>
-      <w:r>
-        <w:t xml:space="preserve">Estos trabajos sustentan la elección de métricas conjuntas de exactitud y costo computacional. En una aplicación de asistencia, un modelo rápido pero con muchos falsos positivos puede producir mensajes que reduzcan la confianza, mientras un modelo exacto pero lento no entrega información oportuna. Por ello, la selección experimental del capítulo 2 no se basa en una única métrica.</w:t>
-      </w:r>
-    </w:p>
-    <w:p>
-      <w:bookmarkStart w:id="1018" w:name="report_1018"/>
-      <w:pPr>
-        <w:pStyle w:val="Ttulo2"/>
-      </w:pPr>
-      <w:r>
-        <w:t xml:space="preserve">1.4 Modelos candidatos</w:t>
-      </w:r>
-      <w:bookmarkEnd w:id="1018"/>
-    </w:p>
-    <w:p>
-      <w:pPr>
-        <w:pStyle w:val="Normal"/>
-        <w:widowControl/>
-        <w:spacing w:line="360" w:lineRule="auto" w:after="330"/>
-        <w:jc w:val="both"/>
-      </w:pPr>
-      <w:r>
-        <w:t xml:space="preserve">A partir de la revisión se definieron cuatro arquitecturas candidatas para la comparación experimental: Faster R-CNN, YOLO, SSD MobileNet y EfficientDet. La selección considera que deben detectar varias clases en una imagen, disponer de implementaciones o pesos reutilizables y permitir una ejecución razonable en dispositivos móviles.</w:t>
-      </w:r>
-    </w:p>
-    <w:p>
-      <w:pPr>
-        <w:pStyle w:val="Normal"/>
-        <w:widowControl/>
-        <w:spacing w:line="360" w:lineRule="auto" w:after="330"/>
-        <w:jc w:val="both"/>
-      </w:pPr>
-      <w:r>
-        <w:t xml:space="preserve">Faster R-CNN representa la alternativa de dos etapas y ofrece alta precisión mediante una Red de Propuesta de Regiones, pero su costo de inferencia y memoria puede limitar el tiempo real en un teléfono. Las estrategias de compresión descritas por Magdy et al. muestran posibilidades de optimización </w:t>
-      </w:r>
-      <w:hyperlink w:anchor="bib_ref_19" w:history="1">
-        <w:r>
-          <w:t xml:space="preserve">[19]</w:t>
-        </w:r>
-      </w:hyperlink>
-      <w:r>
-        <w:t xml:space="preserve">, aunque el prototipo de este trabajo no entrena ni comprime este modelo.</w:t>
-      </w:r>
-    </w:p>
-    <w:p>
-      <w:pPr>
-        <w:pStyle w:val="Normal"/>
-        <w:widowControl/>
-        <w:spacing w:line="360" w:lineRule="auto" w:after="330"/>
-        <w:jc w:val="both"/>
-      </w:pPr>
-      <w:r>
-        <w:t xml:space="preserve">SSD MobileNet combina detección de una etapa con un </w:t>
-      </w:r>
-      <w:r>
-        <w:rPr>
-          <w:i/>
-        </w:rPr>
-        <w:t>backbone</w:t>
-      </w:r>
-      <w:r>
-        <w:t xml:space="preserve"> ligero. SSD predice objetos en mapas de características de diferentes escalas y MobileNet reduce el costo de las convoluciones </w:t>
-      </w:r>
-      <w:hyperlink w:anchor="bib_ref_6" w:history="1">
-        <w:r>
-          <w:t xml:space="preserve">[6]</w:t>
-        </w:r>
-      </w:hyperlink>
-      <w:r>
-        <w:t xml:space="preserve">, </w:t>
-      </w:r>
-      <w:hyperlink w:anchor="bib_ref_16" w:history="1">
-        <w:r>
-          <w:t xml:space="preserve">[16]</w:t>
-        </w:r>
-      </w:hyperlink>
-      <w:r>
-        <w:t xml:space="preserve">, </w:t>
-      </w:r>
-      <w:hyperlink w:anchor="bib_ref_17" w:history="1">
-        <w:r>
-          <w:t xml:space="preserve">[17]</w:t>
-        </w:r>
-      </w:hyperlink>
-      <w:r>
-        <w:t xml:space="preserve">. Esta combinación favorece la velocidad, pero su precisión de localización debe verificarse para las clases y escenas interiores del conjunto propio.</w:t>
-      </w:r>
-    </w:p>
-    <w:p>
-      <w:pPr>
-        <w:pStyle w:val="Normal"/>
-        <w:widowControl/>
-        <w:spacing w:line="360" w:lineRule="auto" w:after="330"/>
-        <w:jc w:val="both"/>
-      </w:pPr>
-      <w:r>
-        <w:t xml:space="preserve">EfficientDet es una familia de detectores de una etapa basada en EfficientNet, BiFPN y escalamiento compuesto </w:t>
-      </w:r>
-      <w:hyperlink w:anchor="bib_ref_7" w:history="1">
-        <w:r>
-          <w:t xml:space="preserve">[7]</w:t>
-        </w:r>
-      </w:hyperlink>
-      <w:r>
-        <w:t xml:space="preserve">. Sus variantes Lite fueron diseñadas para dispositivos móviles y </w:t>
-      </w:r>
-      <w:r>
-        <w:rPr>
-          <w:i/>
-        </w:rPr>
-        <w:t>edge</w:t>
-      </w:r>
-      <w:r>
-        <w:t>; por ello, EfficientDet-Lite2 se considera una opción intermedia entre precisión, tamaño y velocidad.</w:t>
-      </w:r>
-    </w:p>
-    <w:p>
-      <w:pPr>
-        <w:pStyle w:val="Normal"/>
-        <w:widowControl/>
-        <w:spacing w:line="360" w:lineRule="auto" w:after="330"/>
-        <w:jc w:val="both"/>
-      </w:pPr>
-      <w:r>
-        <w:t xml:space="preserve">YOLO realiza la detección en una sola pasada y dispone de variantes con diferentes tamaños, desde modelos pequeños hasta modelos de mayor capacidad </w:t>
-      </w:r>
-      <w:hyperlink w:anchor="bib_ref_5" w:history="1">
-        <w:r>
-          <w:t xml:space="preserve">[5]</w:t>
-        </w:r>
-      </w:hyperlink>
-      <w:r>
-        <w:t xml:space="preserve">. Su ventaja principal es la velocidad, mientras que el tamaño de la variante y la resolución de entrada determinan el costo real de ejecución en Android.</w:t>
-      </w:r>
-    </w:p>
-    <w:p>
-      <w:pPr>
-        <w:pStyle w:val="Normal"/>
-        <w:widowControl/>
-        <w:spacing w:line="360" w:lineRule="auto" w:after="330"/>
-        <w:jc w:val="both"/>
-      </w:pPr>
-      <w:r>
-        <w:t xml:space="preserve">Las clases prioritarias del prototipo se relacionan con categorías disponibles en MS COCO, conjunto que contiene anotaciones para detección y segmentación en escenas cotidianas </w:t>
-      </w:r>
-      <w:hyperlink w:anchor="bib_ref_13" w:history="1">
-        <w:r>
-          <w:t xml:space="preserve">[13]</w:t>
-        </w:r>
-      </w:hyperlink>
-      <w:r>
-        <w:t xml:space="preserve">. También se revisó Open Images como fuente de categorías y anotaciones de gran escala </w:t>
-      </w:r>
-      <w:hyperlink w:anchor="bib_ref_20" w:history="1">
-        <w:r>
-          <w:t xml:space="preserve">[20]</w:t>
-        </w:r>
-      </w:hyperlink>
-      <w:r>
-        <w:t xml:space="preserve">. En la implementación final se mantuvo MS COCO porque EfficientDet-Lite2 ya dispone de pesos compatibles con sus categorías y no fue necesario entrenar un modelo propio.</w:t>
-      </w:r>
-    </w:p>
-    <w:p>
-      <w:pPr>
-        <w:pStyle w:val="Normal"/>
-        <w:widowControl/>
-        <w:spacing w:line="360" w:lineRule="auto" w:after="330"/>
-        <w:jc w:val="both"/>
-      </w:pPr>
-      <w:r>
-        <w:t xml:space="preserve">La portabilidad de los modelos también depende del formato de inferencia. TensorFlow Lite permite ejecutar archivos .tflite en el dispositivo </w:t>
-      </w:r>
-      <w:hyperlink w:anchor="bib_ref_3" w:history="1">
-        <w:r>
-          <w:t xml:space="preserve">[3]</w:t>
-        </w:r>
-      </w:hyperlink>
-      <w:r>
-        <w:t xml:space="preserve">, mientras ONNX Runtime y ExecuTorch representan alternativas para otros ecosistemas de despliegue </w:t>
-      </w:r>
-      <w:hyperlink w:anchor="bib_ref_21" w:history="1">
-        <w:r>
-          <w:t xml:space="preserve">[21]</w:t>
-        </w:r>
-      </w:hyperlink>
-      <w:r>
-        <w:t xml:space="preserve">, </w:t>
-      </w:r>
-      <w:hyperlink w:anchor="bib_ref_22" w:history="1">
-        <w:r>
-          <w:t xml:space="preserve">[22]</w:t>
-        </w:r>
-      </w:hyperlink>
-      <w:r>
-        <w:t xml:space="preserve">. AssistiveVision utiliza TensorFlow Lite por su integración directa con el modelo EfficientDet-Lite2 seleccionado.</w:t>
-      </w:r>
-    </w:p>
-    <w:p>
-      <w:bookmarkStart w:id="1019" w:name="report_1019"/>
-      <w:pPr>
-        <w:pStyle w:val="Ttulo2"/>
-      </w:pPr>
-      <w:r>
-        <w:t xml:space="preserve">1.5 Nuevos paradigmas: DETR</w:t>
-      </w:r>
-      <w:bookmarkEnd w:id="1019"/>
-    </w:p>
-    <w:p>
-      <w:pPr>
-        <w:pStyle w:val="Normal"/>
-        <w:widowControl/>
-        <w:spacing w:line="360" w:lineRule="auto" w:after="330"/>
-        <w:jc w:val="both"/>
-      </w:pPr>
-      <w:r>
-        <w:t xml:space="preserve">DETR (DEtection TRansformer) introduce un paradigma basado en transformers para realizar detección de objetos de extremo a extremo </w:t>
-      </w:r>
-      <w:hyperlink w:anchor="bib_ref_23" w:history="1">
-        <w:r>
-          <w:t xml:space="preserve">[23]</w:t>
-        </w:r>
-      </w:hyperlink>
-      <w:r>
-        <w:t xml:space="preserve">. El modelo procesa la imagen completa y utiliza object queries para producir predicciones directas, sin seguir explícitamente el esquema clásico de una o dos etapas. Su formulación reduce componentes como las cajas predefinidas y la supresión no máxima, pero su costo computacional y la exigencia de datos y hardware limitan su conveniencia para el teléfono de gama media utilizado en este proyecto.</w:t>
+        <w:t xml:space="preserve">. El modelo procesa la imagen completa y utiliza object queries para producir predicciones directas, sin seguir explícitamente el esquema clásico de una o dos etapas. Su formulación reduce componentes como las cajas predefinidas y la supresión no máxima, en este proyecto se mantuvo como antecedente y no se midió su desempeño en el teléfono objetivo.</w:t>
       </w:r>
     </w:p>
     <w:p>
@@ -4645,9 +4746,17 @@
       <w:r>
         <w:t xml:space="preserve"> y promedia las categorías evaluables. Un error de clase produce una predicción falsa y deja sin recuperar la anotación de la clase correcta </w:t>
       </w:r>
-      <w:hyperlink w:anchor="bib_ref_13" w:history="1">
+      <w:hyperlink w:anchor="bib_ref_22" w:history="1">
         <w:r>
-          <w:t xml:space="preserve">[13]</w:t>
+          <w:t xml:space="preserve">[22]</w:t>
+        </w:r>
+      </w:hyperlink>
+      <w:r>
+        <w:t xml:space="preserve">, </w:t>
+      </w:r>
+      <w:hyperlink w:anchor="bib_ref_27" w:history="1">
+        <w:r>
+          <w:t xml:space="preserve">[27]</w:t>
         </w:r>
       </w:hyperlink>
       <w:r>
@@ -4671,11 +4780,19 @@
         <w:t>bounding boxes</w:t>
       </w:r>
       <w:r>
-        <w:t xml:space="preserve"> no se ajustan con precisión al objeto detectado. Al igual que mAP50, la evaluación se realiza por clase, por lo que un error de clasificación penaliza ambas métricas por igual. Para el sistema propuesto, mAP50-95 indica la precisión geométrica de las detecciones </w:t>
-      </w:r>
-      <w:hyperlink w:anchor="bib_ref_13" w:history="1">
+        <w:t xml:space="preserve"> no se ajustan con precisión al objeto detectado. Al igual que mAP50, la evaluación se realiza por clase, por lo que un error de clasificación afecta ambas métricas. Para el sistema propuesto, mAP50-95 incorpora exigencias de clasificación y ajuste geométrico de las detecciones </w:t>
+      </w:r>
+      <w:hyperlink w:anchor="bib_ref_22" w:history="1">
         <w:r>
-          <w:t xml:space="preserve">[13]</w:t>
+          <w:t xml:space="preserve">[22]</w:t>
+        </w:r>
+      </w:hyperlink>
+      <w:r>
+        <w:t xml:space="preserve">, </w:t>
+      </w:r>
+      <w:hyperlink w:anchor="bib_ref_27" w:history="1">
+        <w:r>
+          <w:t xml:space="preserve">[27]</w:t>
         </w:r>
       </w:hyperlink>
       <w:r>
@@ -4690,13 +4807,19 @@
         <w:jc w:val="both"/>
       </w:pPr>
       <w:r>
-        <w:t xml:space="preserve">Precisión (Precision). La precisión indica, de todas las detecciones realizadas por el modelo, qué porcentaje fue correcto, midiendo la tasa de falsos positivos: Precision = TP / (TP + FP), donde TP corresponde a verdaderos positivos y FP a falsos positivos. Para el sistema propuesto, si el modelo anuncia la presencia de una silla cuando no hay ninguna silla en la escena, el usuario recibe una indicación errónea y pierde confianza en el sistema, por lo que una precisión alta resulta fundamental </w:t>
-      </w:r>
-      <w:hyperlink w:anchor="bib_ref_1" w:history="1">
+        <w:t xml:space="preserve">La precisión es la proporción de predicciones positivas que resultan correctas: P = TP/(TP + FP) </w:t>
+      </w:r>
+      <w:hyperlink w:anchor="bib_ref_28" w:history="1">
         <w:r>
-          <w:t xml:space="preserve">[1]</w:t>
+          <w:t xml:space="preserve">[28]</w:t>
         </w:r>
       </w:hyperlink>
+      <w:r>
+        <w:t xml:space="preserve">. No equivale a la tasa de falsos positivos. En este experimento se calcula después del emparejamiento de clase y caja; una predicción sin correspondencia se contabiliza como FP. Una precisión alta reduce la proporción de anuncios incorrectos entre las selecciones, pero su efecto sobre confianza o utilidad requiere evaluación </w:t>
+      </w:r>
+      <w:r>
+        <w:t xml:space="preserve">con usuarios</w:t>
+      </w:r>
       <w:r>
         <w:t xml:space="preserve">.</w:t>
       </w:r>
@@ -4715,7 +4838,15 @@
         <w:t>Recall</w:t>
       </w:r>
       <w:r>
-        <w:t xml:space="preserve">, o exhaustividad, es la proporción de instancias anotadas visibles que el detector recupera: TP/(TP+FN). Los falsos negativos describen objetos presentes en la imagen y no detectados; un objeto fuera del encuadre no entra en el denominador. Por ello, este trabajo acompaña </w:t>
+        <w:t xml:space="preserve">, o exhaustividad, es la proporción de instancias anotadas visibles que el detector recupera: TP/(TP+FN) </w:t>
+      </w:r>
+      <w:hyperlink w:anchor="bib_ref_28" w:history="1">
+        <w:r>
+          <w:t xml:space="preserve">[28]</w:t>
+        </w:r>
+      </w:hyperlink>
+      <w:r>
+        <w:t xml:space="preserve">. Los falsos negativos describen objetos presentes en la imagen y no detectados; un objeto fuera del encuadre no entra en el denominador. Por ello, este trabajo acompaña </w:t>
       </w:r>
       <w:r>
         <w:rPr>
@@ -4764,9 +4895,9 @@
       <w:r>
         <w:t xml:space="preserve">). A diferencia de la media aritmética, penaliza el desequilibrio entre ambas métricas, por lo que resulta útil como métrica única de exactitud global cuando se requiere un compromiso entre falsos positivos y falsos negativos </w:t>
       </w:r>
-      <w:hyperlink w:anchor="bib_ref_1" w:history="1">
+      <w:hyperlink w:anchor="bib_ref_28" w:history="1">
         <w:r>
-          <w:t xml:space="preserve">[1]</w:t>
+          <w:t xml:space="preserve">[28]</w:t>
         </w:r>
       </w:hyperlink>
       <w:r>
@@ -4781,7 +4912,15 @@
         <w:jc w:val="both"/>
       </w:pPr>
       <w:r>
-        <w:t xml:space="preserve">FPS y latencia de inferencia. Los fotogramas por segundo (FPS) expresan cuántas imágenes procesa el modelo en un segundo, determinando la frecuencia con la que el sistema puede actualizar su percepción del entorno. La latencia de inferencia corresponde al tiempo en milisegundos requerido para procesar una imagen completa, desde que entra al modelo hasta que se obtienen las detecciones. Ambas métricas están inversamente relacionadas: a mayor latencia, menor FPS.</w:t>
+        <w:t xml:space="preserve">FPS y latencia de inferencia. Los fotogramas por segundo (FPS) expresan cuántas imágenes procesa el modelo en un segundo, determinando la frecuencia con la que el sistema puede actualizar su percepción del entorno. La latencia de inferencia corresponde al tiempo en milisegundos requerido para procesar una imagen completa, desde que entra al modelo hasta que se obtienen las detecciones. Para inferencias secuenciales aisladas, los FPS se calculan como 1000 dividido por la latencia en milisegundos; esta conversión no incluye captura, interfaz ni voz </w:t>
+      </w:r>
+      <w:hyperlink w:anchor="bib_ref_29" w:history="1">
+        <w:r>
+          <w:t xml:space="preserve">[29]</w:t>
+        </w:r>
+      </w:hyperlink>
+      <w:r>
+        <w:t xml:space="preserve">.</w:t>
       </w:r>
     </w:p>
     <w:p>
@@ -4792,22 +4931,28 @@
         <w:jc w:val="both"/>
       </w:pPr>
       <w:r>
-        <w:t xml:space="preserve">Consumo de memoria RAM. El consumo de memoria RAM corresponde a la memoria ocupada por el modelo y sus tensores intermedios durante la inicialización y la inferencia. Esta métrica determina la compatibilidad del sistema con dispositivos de gama baja, donde la memoria disponible es limitada y el sistema operativo puede terminar aplicaciones que excedan los recursos disponibles. Se reporta en megabytes (MB) mediante el perfilador de memoria de la </w:t>
-      </w:r>
-      <w:r>
-        <w:rPr>
-          <w:i/>
-        </w:rPr>
-        <w:t>Benchmark</w:t>
-      </w:r>
-      <w:r>
-        <w:t xml:space="preserve"> Tool </w:t>
-      </w:r>
-      <w:hyperlink w:anchor="bib_ref_24" w:history="1">
+        <w:t xml:space="preserve">La memoria se reporta como la huella aproximada medida por la Benchmark Tool durante la inicialización y ejecución, en megabytes (MB) </w:t>
+      </w:r>
+      <w:hyperlink w:anchor="bib_ref_29" w:history="1">
         <w:r>
-          <w:t xml:space="preserve">[24]</w:t>
+          <w:t xml:space="preserve">[29]</w:t>
         </w:r>
       </w:hyperlink>
+      <w:r>
+        <w:t xml:space="preserve">. Incluye efectos del proceso de medición y no representa exclusivamente el tamaño del modelo o de sus tensores. Se utiliza para comparar las </w:t>
+      </w:r>
+      <w:r>
+        <w:rPr>
+          <w:i w:val="0"/>
+        </w:rPr>
+        <w:t xml:space="preserve">configuraciones bajo el mismo procedimient</w:t>
+      </w:r>
+      <w:r>
+        <w:t xml:space="preserve">o</w:t>
+      </w:r>
+      <w:r>
+        <w:t xml:space="preserve"/>
+      </w:r>
       <w:r>
         <w:t xml:space="preserve">.</w:t>
       </w:r>
@@ -4822,9 +4967,9 @@
       <w:r>
         <w:t xml:space="preserve">Tiempo de inicialización. El tiempo de inicialización corresponde al intervalo requerido para cargar el modelo en memoria, crear el intérprete y preparar los delegados de hardware antes de la primera inferencia. Esta métrica afecta directamente el tiempo que transcurre desde que el usuario abre la aplicación hasta que el sistema de detección está listo para operar </w:t>
       </w:r>
-      <w:hyperlink w:anchor="bib_ref_24" w:history="1">
+      <w:hyperlink w:anchor="bib_ref_29" w:history="1">
         <w:r>
-          <w:t xml:space="preserve">[24]</w:t>
+          <w:t xml:space="preserve">[29]</w:t>
         </w:r>
       </w:hyperlink>
       <w:r>
@@ -4848,250 +4993,6 @@
       </w:pPr>
       <w:r>
         <w:t xml:space="preserve">La reducción de precisión numérica, por ejemplo de pesos Float32 a Float16, puede disminuir el tamaño del archivo. Su efecto sobre la latencia y la exactitud depende del modelo, del backend y del hardware; requiere medición. La cuantización entera, como INT8, introduce además escalas y desplazamientos que deben respetarse durante la inferencia. El formato de los pesos y el tipo del tensor de entrada son propiedades distintas </w:t>
-      </w:r>
-      <w:hyperlink w:anchor="bib_ref_3" w:history="1">
-        <w:r>
-          <w:t xml:space="preserve">[3]</w:t>
-        </w:r>
-      </w:hyperlink>
-      <w:r>
-        <w:t xml:space="preserve">.</w:t>
-      </w:r>
-    </w:p>
-    <w:p>
-      <w:pPr>
-        <w:pStyle w:val="Ttulo3"/>
-      </w:pPr>
-      <w:r>
-        <w:t xml:space="preserve">2.2.3 TensorFlow Lite y GPU Delegate</w:t>
-      </w:r>
-    </w:p>
-    <w:p>
-      <w:pPr>
-        <w:pStyle w:val="Normal"/>
-        <w:widowControl/>
-        <w:spacing w:line="360" w:lineRule="auto" w:after="330"/>
-        <w:jc w:val="both"/>
-      </w:pPr>
-      <w:r>
-        <w:t xml:space="preserve">TensorFlow Lite (TFLite) es el </w:t>
-      </w:r>
-      <w:r>
-        <w:rPr>
-          <w:i/>
-        </w:rPr>
-        <w:t>framework</w:t>
-      </w:r>
-      <w:r>
-        <w:t xml:space="preserve"> de inferencia de Google optimizado para dispositivos móviles y embebidos. Ejecuta modelos en formato .tflite directamente en el dispositivo, sin requerir conexión a internet ni servidores externos </w:t>
-      </w:r>
-      <w:hyperlink w:anchor="bib_ref_3" w:history="1">
-        <w:r>
-          <w:t xml:space="preserve">[3]</w:t>
-        </w:r>
-      </w:hyperlink>
-      <w:r>
-        <w:t xml:space="preserve">.</w:t>
-      </w:r>
-    </w:p>
-    <w:p>
-      <w:pPr>
-        <w:pStyle w:val="Normal"/>
-        <w:widowControl/>
-        <w:spacing w:line="360" w:lineRule="auto" w:after="330"/>
-        <w:jc w:val="both"/>
-      </w:pPr>
-      <w:r>
-        <w:t xml:space="preserve">En escritorio se calculó AP mediante pycocotools y precisión, </w:t>
-      </w:r>
-      <w:r>
-        <w:rPr>
-          <w:i/>
-        </w:rPr>
-        <w:t>recall</w:t>
-      </w:r>
-      <w:r>
-        <w:t xml:space="preserve"> y F1 mediante emparejamiento por clase e IoU. El protocolo COCO y el cálculo de métricas a un umbral fijo se documentan por separado para distinguir la evaluación de la curva de puntuaciones de la operación del prototipo </w:t>
-      </w:r>
-      <w:hyperlink w:anchor="bib_ref_13" w:history="1">
-        <w:r>
-          <w:t xml:space="preserve">[13]</w:t>
-        </w:r>
-      </w:hyperlink>
-      <w:r>
-        <w:t xml:space="preserve">.</w:t>
-      </w:r>
-    </w:p>
-    <w:p>
-      <w:pPr>
-        <w:pStyle w:val="Normal"/>
-        <w:widowControl/>
-        <w:spacing w:line="360" w:lineRule="auto" w:after="330"/>
-        <w:jc w:val="both"/>
-      </w:pPr>
-      <w:r>
-        <w:t xml:space="preserve">Las pruebas en Android se realizaron con la LiteRT </w:t>
-      </w:r>
-      <w:r>
-        <w:rPr>
-          <w:i/>
-        </w:rPr>
-        <w:t>Benchmark</w:t>
-      </w:r>
-      <w:r>
-        <w:t xml:space="preserve"> Tool, específicamente el binario compilado android_aarch64_benchmark_model, ejecutado vía ADB. Este binario en C++ permite medir el tiempo de inferencia directamente sobre el dispositivo con soporte para aceleración por GPU, sin incluir captura de cámara ni postprocesado de resultados, garantizando mediciones aisladas y reproducibles. Se ejecutaron 50 iteraciones por modelo con 4 hilos de procesamiento </w:t>
-      </w:r>
-      <w:hyperlink w:anchor="bib_ref_24" w:history="1">
-        <w:r>
-          <w:t xml:space="preserve">[24]</w:t>
-        </w:r>
-      </w:hyperlink>
-      <w:r>
-        <w:t xml:space="preserve">.</w:t>
-      </w:r>
-    </w:p>
-    <w:p>
-      <w:pPr>
-        <w:pStyle w:val="Normal"/>
-        <w:widowControl/>
-        <w:spacing w:line="360" w:lineRule="auto" w:after="330"/>
-        <w:jc w:val="both"/>
-      </w:pPr>
-      <w:r>
-        <w:t xml:space="preserve">La ejecución remota del </w:t>
-      </w:r>
-      <w:r>
-        <w:rPr>
-          <w:i/>
-        </w:rPr>
-        <w:t>benchmark</w:t>
-      </w:r>
-      <w:r>
-        <w:t xml:space="preserve"> sobre el dispositivo se realizó mediante Android Debug Bridge (ADB), la herramienta oficial de línea de comandos de la plataforma Android que permite transferir los modelos y el binario al dispositivo, lanzar las mediciones y recopilar los resultados desde el equipo de desarrollo, garantizando un procedimiento reproducible sin intervención manual sobre el teléfono </w:t>
-      </w:r>
-      <w:hyperlink w:anchor="bib_ref_25" w:history="1">
-        <w:r>
-          <w:t xml:space="preserve">[25]</w:t>
-        </w:r>
-      </w:hyperlink>
-      <w:r>
-        <w:t xml:space="preserve">.</w:t>
-      </w:r>
-    </w:p>
-    <w:p>
-      <w:pPr>
-        <w:pStyle w:val="Normal"/>
-        <w:widowControl/>
-        <w:spacing w:line="360" w:lineRule="auto" w:after="330"/>
-        <w:jc w:val="both"/>
-      </w:pPr>
-      <w:r>
-        <w:t xml:space="preserve">El GPU Delegate es una extensión de TFLite que redirige los cálculos de la CPU a la GPU del dispositivo mediante la API OpenCL. El objetivo es aprovechar el paralelismo masivo de la GPU para acelerar la inferencia. Sin embargo, no todas las operaciones son compatibles con el GPU Delegate: operaciones personalizadas como TFLite_Detection_PostProcess (presente en SSD y EfficientDet) deben ejecutarse en CPU, creando un cuello de botella por la transferencia de datos entre ambos procesadores </w:t>
-      </w:r>
-      <w:hyperlink w:anchor="bib_ref_26" w:history="1">
-        <w:r>
-          <w:t xml:space="preserve">[26]</w:t>
-        </w:r>
-      </w:hyperlink>
-      <w:r>
-        <w:t xml:space="preserve">.</w:t>
-      </w:r>
-    </w:p>
-    <w:p>
-      <w:bookmarkStart w:id="1023" w:name="report_1023"/>
-      <w:pPr>
-        <w:pStyle w:val="Ttulo2"/>
-      </w:pPr>
-      <w:r>
-        <w:t xml:space="preserve">2.3 Entorno experimental</w:t>
-      </w:r>
-      <w:bookmarkEnd w:id="1023"/>
-    </w:p>
-    <w:p>
-      <w:pPr>
-        <w:pStyle w:val="Ttulo3"/>
-      </w:pPr>
-      <w:r>
-        <w:t xml:space="preserve">2.3.1 Equipo de escritorio</w:t>
-      </w:r>
-    </w:p>
-    <w:p>
-      <w:pPr>
-        <w:pStyle w:val="Normal"/>
-        <w:widowControl/>
-        <w:spacing w:line="360" w:lineRule="auto" w:after="330"/>
-        <w:jc w:val="both"/>
-      </w:pPr>
-      <w:r>
-        <w:t xml:space="preserve">La primera fase se ejecutó en un equipo con sistema operativo Arch Linux x86_64, procesador Intel Core i5-12450H de 8 núcleos y 12 hilos, gráficos integrados Intel UHD Graphics y 8 GB de memoria RAM. La inferencia se realizó mediante TensorFlow Lite sobre CPU, con el fin de obtener métricas de exactitud en entorno controlado.</w:t>
-      </w:r>
-    </w:p>
-    <w:p>
-      <w:pPr>
-        <w:pStyle w:val="Ttulo3"/>
-      </w:pPr>
-      <w:r>
-        <w:t xml:space="preserve">2.3.2 Dispositivo móvil Android</w:t>
-      </w:r>
-    </w:p>
-    <w:p>
-      <w:pPr>
-        <w:pStyle w:val="Normal"/>
-        <w:widowControl/>
-        <w:spacing w:line="360" w:lineRule="auto" w:after="330"/>
-        <w:jc w:val="both"/>
-      </w:pPr>
-      <w:r>
-        <w:t xml:space="preserve">Las pruebas de despliegue se realizaron sobre un dispositivo Xiaomi Redmi Note 13 4G (modelo 23129RA5FL), representativo de la gama media en el mercado colombiano. El dispositivo cuenta con procesador Qualcomm Snapdragon 685 Octa-core a 2.8 GHz, GPU Adreno 610, 8 GB de RAM LPDDR4X y opera bajo Android 15.</w:t>
-      </w:r>
-    </w:p>
-    <w:p>
-      <w:pPr>
-        <w:pStyle w:val="Normal"/>
-        <w:widowControl/>
-        <w:spacing w:line="360" w:lineRule="auto" w:after="330"/>
-        <w:jc w:val="both"/>
-      </w:pPr>
-      <w:r>
-        <w:t xml:space="preserve">Se evaluaron dos backends de ejecución: CPU con 4 hilos de procesamiento, y GPU Delegate mediante TFLite GPU Delegate con soporte OpenCL. Se realizaron 50 ejecuciones por modelo para obtener mediciones estables de latencia y rendimiento temporal.</w:t>
-      </w:r>
-    </w:p>
-    <w:p>
-      <w:bookmarkStart w:id="1024" w:name="report_1024"/>
-      <w:pPr>
-        <w:pStyle w:val="Ttulo2"/>
-      </w:pPr>
-      <w:r>
-        <w:t xml:space="preserve">2.4 Metodología de evaluación</w:t>
-      </w:r>
-      <w:bookmarkEnd w:id="1024"/>
-    </w:p>
-    <w:p>
-      <w:pPr>
-        <w:pStyle w:val="Ttulo3"/>
-      </w:pPr>
-      <w:r>
-        <w:t xml:space="preserve">2.4.1 Modelos evaluados</w:t>
-      </w:r>
-    </w:p>
-    <w:p>
-      <w:pPr>
-        <w:pStyle w:val="Normal"/>
-        <w:widowControl/>
-        <w:spacing w:line="360" w:lineRule="auto" w:after="330"/>
-        <w:jc w:val="both"/>
-      </w:pPr>
-      <w:r>
-        <w:t xml:space="preserve">Se evaluaron seis configuraciones de modelos, todas en formato TensorFlow Lite y con pesos preentrenados sobre el </w:t>
-      </w:r>
-      <w:r>
-        <w:rPr>
-          <w:i/>
-        </w:rPr>
-        <w:t>dataset</w:t>
-      </w:r>
-      <w:r>
-        <w:t xml:space="preserve"> MS COCO: YOLOv8s en variantes Float32 y Float16 </w:t>
       </w:r>
       <w:hyperlink w:anchor="bib_ref_5" w:history="1">
         <w:r>
@@ -5099,7 +5000,35 @@
         </w:r>
       </w:hyperlink>
       <w:r>
-        <w:t xml:space="preserve">, YOLO11n en variantes Float32 y Float16 </w:t>
+        <w:t xml:space="preserve">.</w:t>
+      </w:r>
+    </w:p>
+    <w:p>
+      <w:pPr>
+        <w:pStyle w:val="Ttulo3"/>
+      </w:pPr>
+      <w:r>
+        <w:t xml:space="preserve">2.2.3 TensorFlow Lite y GPU Delegate</w:t>
+      </w:r>
+    </w:p>
+    <w:p>
+      <w:pPr>
+        <w:pStyle w:val="Normal"/>
+        <w:widowControl/>
+        <w:spacing w:line="360" w:lineRule="auto" w:after="330"/>
+        <w:jc w:val="both"/>
+      </w:pPr>
+      <w:r>
+        <w:t xml:space="preserve">TensorFlow Lite (TFLite) es el </w:t>
+      </w:r>
+      <w:r>
+        <w:rPr>
+          <w:i/>
+        </w:rPr>
+        <w:t>framework</w:t>
+      </w:r>
+      <w:r>
+        <w:t xml:space="preserve"> de inferencia de Google optimizado para dispositivos móviles y embebidos. Ejecuta modelos en formato .tflite directamente en el dispositivo, sin requerir conexión a internet ni servidores externos </w:t>
       </w:r>
       <w:hyperlink w:anchor="bib_ref_5" w:history="1">
         <w:r>
@@ -5107,19 +5036,270 @@
         </w:r>
       </w:hyperlink>
       <w:r>
-        <w:t xml:space="preserve">, SSD MobileNetV1 </w:t>
-      </w:r>
-      <w:hyperlink w:anchor="bib_ref_6" w:history="1">
+        <w:t xml:space="preserve">.</w:t>
+      </w:r>
+    </w:p>
+    <w:p>
+      <w:pPr>
+        <w:pStyle w:val="Normal"/>
+        <w:widowControl/>
+        <w:spacing w:line="360" w:lineRule="auto" w:after="330"/>
+        <w:jc w:val="both"/>
+      </w:pPr>
+      <w:r>
+        <w:t xml:space="preserve">En escritorio se calculó AP mediante pycocotools y precisión, </w:t>
+      </w:r>
+      <w:r>
+        <w:rPr>
+          <w:i/>
+        </w:rPr>
+        <w:t>recall</w:t>
+      </w:r>
+      <w:r>
+        <w:t xml:space="preserve"> y F1 mediante emparejamiento por clase e IoU. El protocolo COCO y el cálculo de métricas a un umbral fijo se documentan por separado para distinguir la evaluación de la curva de puntuaciones de la operación del prototipo </w:t>
+      </w:r>
+      <w:hyperlink w:anchor="bib_ref_22" w:history="1">
         <w:r>
-          <w:t xml:space="preserve">[6]</w:t>
+          <w:t xml:space="preserve">[22]</w:t>
         </w:r>
       </w:hyperlink>
       <w:r>
+        <w:t xml:space="preserve">.</w:t>
+      </w:r>
+    </w:p>
+    <w:p>
+      <w:pPr>
+        <w:pStyle w:val="Normal"/>
+        <w:widowControl/>
+        <w:spacing w:line="360" w:lineRule="auto" w:after="330"/>
+        <w:jc w:val="both"/>
+      </w:pPr>
+      <w:r>
+        <w:t xml:space="preserve">Las pruebas en Android se realizaron con la LiteRT </w:t>
+      </w:r>
+      <w:r>
+        <w:rPr>
+          <w:i/>
+        </w:rPr>
+        <w:t>Benchmark</w:t>
+      </w:r>
+      <w:r>
+        <w:t xml:space="preserve"> Tool, específicamente el binario compilado android_aarch64_benchmark_model, ejecutado vía ADB. Este binario en C++ permite medir el tiempo de inferencia directamente sobre el dispositivo con soporte para aceleración por GPU, sin incluir captura de cámara ni postprocesado de resultados, con un alcance limitado a la ejecución del modelo. Se ejecutaron 50 iteraciones por modelo con 4 hilos de procesamiento </w:t>
+      </w:r>
+      <w:hyperlink w:anchor="bib_ref_29" w:history="1">
+        <w:r>
+          <w:t xml:space="preserve">[29]</w:t>
+        </w:r>
+      </w:hyperlink>
+      <w:r>
+        <w:t xml:space="preserve">.</w:t>
+      </w:r>
+    </w:p>
+    <w:p>
+      <w:pPr>
+        <w:pStyle w:val="Normal"/>
+        <w:widowControl/>
+        <w:spacing w:line="360" w:lineRule="auto" w:after="330"/>
+        <w:jc w:val="both"/>
+      </w:pPr>
+      <w:r>
+        <w:t xml:space="preserve">La ejecución remota del </w:t>
+      </w:r>
+      <w:r>
+        <w:rPr>
+          <w:i/>
+        </w:rPr>
+        <w:t>benchmark</w:t>
+      </w:r>
+      <w:r>
+        <w:t xml:space="preserve"> sobre el dispositivo se realizó mediante Android Debug Bridge (ADB), la herramienta oficial de línea de comandos de la plataforma Android que permite transferir los modelos y el binario al dispositivo, lanzar las mediciones y recopilar los resultados desde el equipo de desarrollo, mediante comandos automatizados </w:t>
+      </w:r>
+      <w:hyperlink w:anchor="bib_ref_30" w:history="1">
+        <w:r>
+          <w:t xml:space="preserve">[30]</w:t>
+        </w:r>
+      </w:hyperlink>
+      <w:r>
+        <w:t xml:space="preserve">.</w:t>
+      </w:r>
+    </w:p>
+    <w:p>
+      <w:pPr>
+        <w:pStyle w:val="Normal"/>
+        <w:widowControl/>
+        <w:spacing w:line="360" w:lineRule="auto" w:after="330"/>
+        <w:jc w:val="both"/>
+      </w:pPr>
+      <w:r>
+        <w:t xml:space="preserve">El GPU Delegate permite delegar operaciones compatibles de TFLite a la GPU, con backends como OpenCL </w:t>
+      </w:r>
+      <w:hyperlink w:anchor="bib_ref_31" w:history="1">
+        <w:r>
+          <w:t xml:space="preserve">[31]</w:t>
+        </w:r>
+      </w:hyperlink>
+      <w:r>
+        <w:t xml:space="preserve">, </w:t>
+      </w:r>
+      <w:hyperlink w:anchor="bib_ref_32" w:history="1">
+        <w:r>
+          <w:t xml:space="preserve">[32]</w:t>
+        </w:r>
+      </w:hyperlink>
+      <w:r>
+        <w:t xml:space="preserve">. Las operaciones no admitidas pueden permanecer en CPU y la división del grafo puede introducir transferencias y sincronización. La documentación advierte de ese coste </w:t>
+      </w:r>
+      <w:hyperlink w:anchor="bib_ref_31" w:history="1">
+        <w:r>
+          <w:t xml:space="preserve">[31]</w:t>
+        </w:r>
+      </w:hyperlink>
+      <w:r>
+        <w:t xml:space="preserve">; estas posibilidades no identifican por sí solas la causa del rendimiento observado en el dispositivo</w:t>
+      </w:r>
+      <w:r>
+        <w:t xml:space="preserve">.</w:t>
+      </w:r>
+    </w:p>
+    <w:p>
+      <w:bookmarkStart w:id="1023" w:name="report_1023"/>
+      <w:pPr>
+        <w:pStyle w:val="Ttulo2"/>
+      </w:pPr>
+      <w:r>
+        <w:t xml:space="preserve">2.3 Entorno experimental</w:t>
+      </w:r>
+      <w:bookmarkEnd w:id="1023"/>
+    </w:p>
+    <w:p>
+      <w:pPr>
+        <w:pStyle w:val="Ttulo3"/>
+      </w:pPr>
+      <w:r>
+        <w:t xml:space="preserve">2.3.1 Equipo de escritorio</w:t>
+      </w:r>
+    </w:p>
+    <w:p>
+      <w:pPr>
+        <w:pStyle w:val="Normal"/>
+        <w:widowControl/>
+        <w:spacing w:line="360" w:lineRule="auto" w:after="330"/>
+        <w:jc w:val="both"/>
+      </w:pPr>
+      <w:r>
+        <w:t xml:space="preserve">La primera fase se ejecutó en un equipo con sistema operativo Arch Linux x86_64, procesador Intel Core i5-12450H de 8 núcleos y 12 hilos, gráficos integrados Intel UHD Graphics y 8 GB de memoria RAM. La inferencia se realizó mediante TensorFlow Lite sobre CPU, con el fin de obtener métricas de exactitud en entorno controlado.</w:t>
+      </w:r>
+    </w:p>
+    <w:p>
+      <w:pPr>
+        <w:pStyle w:val="Ttulo3"/>
+      </w:pPr>
+      <w:r>
+        <w:t xml:space="preserve">2.3.2 Dispositivo móvil Android</w:t>
+      </w:r>
+    </w:p>
+    <w:p>
+      <w:pPr>
+        <w:pStyle w:val="Normal"/>
+        <w:widowControl/>
+        <w:spacing w:line="360" w:lineRule="auto" w:after="330"/>
+        <w:jc w:val="both"/>
+      </w:pPr>
+      <w:r>
+        <w:t xml:space="preserve">Las pruebas de despliegue se realizaron sobre un dispositivo Xiaomi Redmi Note 13 4G (modelo 23129RA5FL), representativo de la gama media en el mercado colombiano. El dispositivo cuenta con procesador Qualcomm Snapdragon 685 Octa-core a 2.8 GHz, GPU Adreno 610, 8 GB de RAM LPDDR4X y opera bajo Android 15.</w:t>
+      </w:r>
+    </w:p>
+    <w:p>
+      <w:pPr>
+        <w:pStyle w:val="Normal"/>
+        <w:widowControl/>
+        <w:spacing w:line="360" w:lineRule="auto" w:after="330"/>
+        <w:jc w:val="both"/>
+      </w:pPr>
+      <w:r>
+        <w:t xml:space="preserve">Se evaluaron dos backends de ejecución: CPU con 4 hilos de procesamiento, y GPU Delegate mediante TFLite GPU Delegate con soporte OpenCL. Se realizaron 50 ejecuciones por modelo para obtener mediciones estables de latencia y rendimiento temporal.</w:t>
+      </w:r>
+    </w:p>
+    <w:p>
+      <w:bookmarkStart w:id="1024" w:name="report_1024"/>
+      <w:pPr>
+        <w:pStyle w:val="Ttulo2"/>
+      </w:pPr>
+      <w:r>
+        <w:t xml:space="preserve">2.4 Metodología de evaluación</w:t>
+      </w:r>
+      <w:bookmarkEnd w:id="1024"/>
+    </w:p>
+    <w:p>
+      <w:pPr>
+        <w:pStyle w:val="Ttulo3"/>
+      </w:pPr>
+      <w:r>
+        <w:t xml:space="preserve">2.4.1 Modelos evaluados</w:t>
+      </w:r>
+    </w:p>
+    <w:p>
+      <w:pPr>
+        <w:pStyle w:val="Normal"/>
+        <w:widowControl/>
+        <w:spacing w:line="360" w:lineRule="auto" w:after="330"/>
+        <w:jc w:val="both"/>
+      </w:pPr>
+      <w:r>
+        <w:t xml:space="preserve">Se evaluaron seis configuraciones de modelos, todas en formato TensorFlow Lite y con pesos preentrenados sobre el </w:t>
+      </w:r>
+      <w:r>
+        <w:rPr>
+          <w:i/>
+        </w:rPr>
+        <w:t>dataset</w:t>
+      </w:r>
+      <w:r>
+        <w:t xml:space="preserve"> MS COCO: YOLOv8s en variantes Float32 y Float16 </w:t>
+      </w:r>
+      <w:hyperlink w:anchor="bib_ref_20" w:history="1">
+        <w:r>
+          <w:t xml:space="preserve">[20]</w:t>
+        </w:r>
+      </w:hyperlink>
+      <w:r>
+        <w:t xml:space="preserve">, YOLO11n en variantes Float32 y Float16 </w:t>
+      </w:r>
+      <w:hyperlink w:anchor="bib_ref_21" w:history="1">
+        <w:r>
+          <w:t xml:space="preserve">[21]</w:t>
+        </w:r>
+      </w:hyperlink>
+      <w:r>
+        <w:t xml:space="preserve">, SSD MobileNetV1 </w:t>
+      </w:r>
+      <w:hyperlink w:anchor="bib_ref_8" w:history="1">
+        <w:r>
+          <w:t xml:space="preserve">[8]</w:t>
+        </w:r>
+      </w:hyperlink>
+      <w:r>
+        <w:t xml:space="preserve">, </w:t>
+      </w:r>
+      <w:hyperlink w:anchor="bib_ref_15" w:history="1">
+        <w:r>
+          <w:t xml:space="preserve">[15]</w:t>
+        </w:r>
+      </w:hyperlink>
+      <w:r>
         <w:t xml:space="preserve"> y EfficientDet-Lite2 </w:t>
       </w:r>
-      <w:hyperlink w:anchor="bib_ref_7" w:history="1">
+      <w:hyperlink w:anchor="bib_ref_9" w:history="1">
         <w:r>
-          <w:t xml:space="preserve">[7]</w:t>
+          <w:t xml:space="preserve">[9]</w:t>
+        </w:r>
+      </w:hyperlink>
+      <w:r>
+        <w:t xml:space="preserve">, </w:t>
+      </w:r>
+      <w:hyperlink w:anchor="bib_ref_19" w:history="1">
+        <w:r>
+          <w:t xml:space="preserve">[19]</w:t>
         </w:r>
       </w:hyperlink>
       <w:r>
@@ -5151,19 +5331,19 @@
         <w:jc w:val="both"/>
       </w:pPr>
       <w:r>
-        <w:t xml:space="preserve">La evaluación de precisión se realizó sobre un conjunto de imágenes propias capturadas en entornos interiores reales, complementadas con imágenes de dominio público. Las imágenes fueron anotadas manualmente mediante la plataforma Roboflow </w:t>
-      </w:r>
-      <w:hyperlink w:anchor="bib_ref_27" w:history="1">
+        <w:t xml:space="preserve">La evaluación de precisión se realizó sobre un conjunto de imágenes propias capturadas en entornos interiores reales, complementadas con imágenes obtenidas de fuentes externas. Las imágenes fueron anotadas manualmente mediante la plataforma Roboflow </w:t>
+      </w:r>
+      <w:hyperlink w:anchor="bib_ref_33" w:history="1">
         <w:r>
-          <w:t xml:space="preserve">[27]</w:t>
+          <w:t xml:space="preserve">[33]</w:t>
         </w:r>
       </w:hyperlink>
       <w:r>
         <w:t xml:space="preserve">, generando un total de 80 imágenes con 257 anotaciones en formato COCO JSON </w:t>
       </w:r>
-      <w:hyperlink w:anchor="bib_ref_13" w:history="1">
+      <w:hyperlink w:anchor="bib_ref_22" w:history="1">
         <w:r>
-          <w:t xml:space="preserve">[13]</w:t>
+          <w:t xml:space="preserve">[22]</w:t>
         </w:r>
       </w:hyperlink>
       <w:r>
@@ -5180,9 +5360,9 @@
       <w:r>
         <w:t xml:space="preserve">Las categorías evaluadas fueron: persona (38 anotaciones), silla (81 anotaciones), sofá (20 anotaciones), cama (16 anotaciones), mesa (29 anotaciones), inodoro (13 anotaciones), televisor (20 anotaciones), computador portátil (13 anotaciones), lavamanos (16 anotaciones) y refrigerador (11 anotaciones), correspondientes a los identificadores COCO </w:t>
       </w:r>
-      <w:hyperlink w:anchor="bib_ref_13" w:history="1">
+      <w:hyperlink w:anchor="bib_ref_22" w:history="1">
         <w:r>
-          <w:t xml:space="preserve">[13]</w:t>
+          <w:t xml:space="preserve">[22]</w:t>
         </w:r>
       </w:hyperlink>
       <w:r>
@@ -5199,9 +5379,17 @@
       <w:r>
         <w:t xml:space="preserve">Las métricas de precisión fueron calculadas mediante la librería pycocotools, que implementa el protocolo oficial de evaluación COCO </w:t>
       </w:r>
-      <w:hyperlink w:anchor="bib_ref_13" w:history="1">
+      <w:hyperlink w:anchor="bib_ref_22" w:history="1">
         <w:r>
-          <w:t xml:space="preserve">[13]</w:t>
+          <w:t xml:space="preserve">[22]</w:t>
+        </w:r>
+      </w:hyperlink>
+      <w:r>
+        <w:t xml:space="preserve">, </w:t>
+      </w:r>
+      <w:hyperlink w:anchor="bib_ref_27" w:history="1">
+        <w:r>
+          <w:t xml:space="preserve">[27]</w:t>
         </w:r>
       </w:hyperlink>
       <w:r>
@@ -11037,7 +11225,7 @@
         <w:t>benchmark</w:t>
       </w:r>
       <w:r>
-        <w:t xml:space="preserve"> tool revela dos causas concretas del bajo rendimiento con GPU Delegate. La primera es el tiempo de inicialización: todos los modelos requieren entre 3,002 ms y 4,351 ms para inicializar la sesión con GPU Delegate, frente a tiempos significativamente menores en CPU. Aunque este </w:t>
+        <w:t xml:space="preserve"> tool muestra diferencias de inicialización y memoria entre CPU y GPU. La primera es el tiempo de inicialización: todos los modelos requieren entre 3002 ms y 4351 ms para inicializar la sesión con GPU Delegate, frente a tiempos significativamente menores en CPU. Aunque este </w:t>
       </w:r>
       <w:r>
         <w:rPr>
@@ -11046,30 +11234,34 @@
         <w:t>overhead</w:t>
       </w:r>
       <w:r>
-        <w:t xml:space="preserve"> no afecta la latencia de inferencia por frame una vez inicializado, refleja el costo de compilar y cargar los </w:t>
+        <w:t xml:space="preserve"> no afecta la latencia de inferencia por frame una vez inicializado, es compatible con los costes de preparación del delegado descritos en la documentación </w:t>
+      </w:r>
+      <w:hyperlink w:anchor="bib_ref_31" w:history="1">
+        <w:r>
+          <w:t xml:space="preserve">[31]</w:t>
+        </w:r>
+      </w:hyperlink>
+      <w:r>
+        <w:t xml:space="preserve">; no se midieron por separado compilación, transf</w:t>
       </w:r>
       <w:r>
         <w:rPr>
           <w:i/>
         </w:rPr>
-        <w:t>kernels</w:t>
-      </w:r>
-      <w:r>
-        <w:t xml:space="preserve"> OpenCL </w:t>
-      </w:r>
-      <w:hyperlink w:anchor="bib_ref_28" w:history="1">
-        <w:r>
-          <w:t xml:space="preserve">[28]</w:t>
-        </w:r>
-      </w:hyperlink>
-      <w:r>
-        <w:t xml:space="preserve"> en la GPU Adreno 610 </w:t>
-      </w:r>
-      <w:hyperlink w:anchor="bib_ref_26" w:history="1">
-        <w:r>
-          <w:t xml:space="preserve">[26]</w:t>
-        </w:r>
-      </w:hyperlink>
+        <w:t xml:space="preserve">e</w:t>
+      </w:r>
+      <w:r>
+        <w:t xml:space="preserve"/>
+      </w:r>
+      <w:r>
+        <w:t xml:space="preserve"/>
+      </w:r>
+      <w:r>
+        <w:t xml:space="preserve">rencias o sincronización</w:t>
+      </w:r>
+      <w:r>
+        <w:t xml:space="preserve"/>
+      </w:r>
       <w:r>
         <w:t xml:space="preserve">.</w:t>
       </w:r>
@@ -11082,7 +11274,7 @@
         <w:jc w:val="both"/>
       </w:pPr>
       <w:r>
-        <w:t xml:space="preserve">El consumo de memoria RAM refuerza esta conclusión: las variantes con GPU Delegate requirieron entre 12 MB y 81 MB adicionales respecto a CPU para el mismo modelo (por ejemplo, YOLOv8s Float32 pasó de 164.1 MB en CPU a 188.3 MB en GPU), debido a la duplicación de búferes entre ambos procesadores. En conjunto, SSD MobileNetV1 presentó el menor consumo absoluto (18.5 MB), seguido de EfficientDet-Lite2 (65.8 MB) y YOLO11n (aproximadamente 80 MB), mientras que YOLOv8s superó los 150 MB en todas sus variantes. Asimismo, el tiempo de inicialización con GPU Delegate osciló entre 3,002 ms y 4,351 ms, frente a un rango de 58 a 393 ms en CPU, lo que implica un retraso perceptible de varios segundos desde la apertura de la aplicación hasta que el sistema estaría operativo.</w:t>
+        <w:t xml:space="preserve">El consumo de memoria RAM refuerza esta conclusión: las variantes con GPU Delegate requirieron entre 12 MB y 81 MB adicionales respecto a CPU para el mismo modelo (por ejemplo, YOLOv8s Float32 pasó de 164.1 MB en CPU a 188.3 MB en GPU), sin que esta medición permita identificar qué asignaciones explican la diferencia. En conjunto, SSD MobileNetV1 presentó el menor consumo absoluto (18.5 MB), seguido de EfficientDet-Lite2 (65.8 MB) y YOLO11n (aproximadamente 80 MB), mientras que YOLOv8s superó los 150 MB en todas sus variantes. Asimismo, el tiempo de inicialización con GPU Delegate osciló entre 3002 ms y 4351 ms, frente a un rango de 58 a 393 ms en CPU, lo que implica un retraso perceptible de varios segundos desde la apertura de la aplicación hasta que el sistema estaría operativo.</w:t>
       </w:r>
     </w:p>
     <w:p>
@@ -11917,7 +12109,15 @@
         <w:t>letterbox</w:t>
       </w:r>
       <w:r>
-        <w:t xml:space="preserve"> devuelve las cajas al fotograma original antes de asignar las zonas. Los módulos de inferencia y audio se inicializan una vez y se liberan al finalizar su ciclo de vida.</w:t>
+        <w:t xml:space="preserve"> devuelve las cajas al fotograma original antes de asignar las zonas. Los módulos de inferencia y audio se inicializan una vez y se liberan al finalizar su ciclo de vida. La implementación de estos módulos se conserva en la revisión del código fuente citada en </w:t>
+      </w:r>
+      <w:hyperlink w:anchor="bib_ref_34" w:history="1">
+        <w:r>
+          <w:t xml:space="preserve">[34]</w:t>
+        </w:r>
+      </w:hyperlink>
+      <w:r>
+        <w:t xml:space="preserve">.</w:t>
       </w:r>
     </w:p>
     <w:p>
@@ -12032,9 +12232,9 @@
       <w:r>
         <w:t xml:space="preserve">CameraX 1.6.1 gestiona la cámara y su ciclo de vida </w:t>
       </w:r>
-      <w:hyperlink w:anchor="bib_ref_29" w:history="1">
+      <w:hyperlink w:anchor="bib_ref_35" w:history="1">
         <w:r>
-          <w:t xml:space="preserve">[29]</w:t>
+          <w:t xml:space="preserve">[35]</w:t>
         </w:r>
       </w:hyperlink>
       <w:r>
@@ -12079,7 +12279,15 @@
         <w:t>letterbox</w:t>
       </w:r>
       <w:r>
-        <w:t>, es decir, se escala manteniendo la relación de aspecto y se completa con un relleno gris (114, 114, 114) hasta alcanzar 448×448 píxeles, evitando la distorsión geométrica de la escena. No se aplica normalización a valores flotantes, de acuerdo con la especificación de entrada del modelo.</w:t>
+        <w:t xml:space="preserve">, es decir, se escala manteniendo la relación de aspecto y se completa con un relleno gris (114, 114, 114) hasta alcanzar 448×448 píxeles, evitando la distorsión geométrica de la escena. No se aplica normalización a valores flotantes, de acuerdo con la especificación de entrada del modelo </w:t>
+      </w:r>
+      <w:hyperlink w:anchor="bib_ref_34" w:history="1">
+        <w:r>
+          <w:t xml:space="preserve">[34]</w:t>
+        </w:r>
+      </w:hyperlink>
+      <w:r>
+        <w:t xml:space="preserve">.</w:t>
       </w:r>
     </w:p>
     <w:p>
@@ -12102,9 +12310,9 @@
       <w:r>
         <w:t xml:space="preserve">DetectionModule utiliza la API Interpreter del paquete LiteRT 1.4.2 y el archivo efficientdet-lite2-detection-metadata.tflite, cargado mediante un MappedByteBuffer </w:t>
       </w:r>
-      <w:hyperlink w:anchor="bib_ref_32" w:history="1">
+      <w:hyperlink w:anchor="bib_ref_36" w:history="1">
         <w:r>
-          <w:t xml:space="preserve">[32]</w:t>
+          <w:t xml:space="preserve">[36]</w:t>
         </w:r>
       </w:hyperlink>
       <w:r>
@@ -13149,7 +13357,7 @@
         <w:jc w:val="both"/>
       </w:pPr>
       <w:r>
-        <w:t>LocalizationModule asigna la zona según el centro de la caja en coordenadas del fotograma original. Los límites horizontales son 0,35 y 0,65 del ancho; el límite vertical es la mitad de la altura. Estas divisiones producen seis zonas y no constituyen tercios exactos ni posiciones métricas en el espacio. La Tabla 3.2 y la Figura 3.2 muestran esta partición.</w:t>
+        <w:t xml:space="preserve">LocalizationModule asigna seis zonas según el centro de la caja: cortes en 0,35 y 0,65 del ancho y a media altura. Son regiones de imagen, no distancias ni tercios exactos (Tabla 3.2 y Figura 3.2).</w:t>
       </w:r>
     </w:p>
     <w:p>
@@ -13719,7 +13927,7 @@
           </w:tcPr>
           <w:p>
             <w:pPr>
-              <w:keepNext w:val="0"/>
+              <w:keepNext w:val="1"/>
               <w:spacing w:line="240" w:lineRule="auto" w:after="60"/>
             </w:pPr>
             <w:r>
@@ -13746,7 +13954,7 @@
           </w:tcPr>
           <w:p>
             <w:pPr>
-              <w:keepNext w:val="0"/>
+              <w:keepNext w:val="1"/>
               <w:spacing w:line="240" w:lineRule="auto" w:after="60"/>
             </w:pPr>
             <w:r>
@@ -13773,7 +13981,7 @@
           </w:tcPr>
           <w:p>
             <w:pPr>
-              <w:keepNext w:val="0"/>
+              <w:keepNext w:val="1"/>
               <w:spacing w:line="240" w:lineRule="auto" w:after="60"/>
             </w:pPr>
             <w:r>
@@ -13909,17 +14117,17 @@
       <w:r>
         <w:t xml:space="preserve">La prioridad de las diez clases de la Tabla 3.1 responde a una delimitación técnica para explorar mobiliario, equipamiento doméstico y presencia de personas, junto con la disponibilidad de etiquetas COCO </w:t>
       </w:r>
-      <w:hyperlink w:anchor="bib_ref_13" w:history="1">
+      <w:hyperlink w:anchor="bib_ref_22" w:history="1">
         <w:r>
-          <w:t xml:space="preserve">[13]</w:t>
+          <w:t xml:space="preserve">[22]</w:t>
         </w:r>
       </w:hyperlink>
       <w:r>
         <w:t xml:space="preserve">. No procede de un estudio de necesidades con usuarios ni establece una jerarquía clínica o de riesgo. La propuesta menciona puertas, sillas y escritorios como ejemplos </w:t>
       </w:r>
-      <w:hyperlink w:anchor="bib_ref_34" w:history="1">
+      <w:hyperlink w:anchor="bib_ref_10" w:history="1">
         <w:r>
-          <w:t xml:space="preserve">[34]</w:t>
+          <w:t xml:space="preserve">[10]</w:t>
         </w:r>
       </w:hyperlink>
       <w:r>
@@ -13934,9 +14142,9 @@
       <w:r>
         <w:t xml:space="preserve"> corresponde a mesa de comedor y no permite afirmar detección general de escritorios. Open Images se consideró como alternativa de vocabulario </w:t>
       </w:r>
-      <w:hyperlink w:anchor="bib_ref_20" w:history="1">
+      <w:hyperlink w:anchor="bib_ref_23" w:history="1">
         <w:r>
-          <w:t xml:space="preserve">[20]</w:t>
+          <w:t xml:space="preserve">[23]</w:t>
         </w:r>
       </w:hyperlink>
       <w:r>
@@ -13963,9 +14171,25 @@
       <w:r>
         <w:t xml:space="preserve">AudioModule utiliza sherpa-onnx v1.13.6 para sintetizar voz local a partir de modelos VITS/Piper empaquetados con la aplicación </w:t>
       </w:r>
-      <w:hyperlink w:anchor="bib_ref_31" w:history="1">
+      <w:hyperlink w:anchor="bib_ref_37" w:history="1">
         <w:r>
-          <w:t xml:space="preserve">[31]</w:t>
+          <w:t xml:space="preserve">[37]</w:t>
+        </w:r>
+      </w:hyperlink>
+      <w:r>
+        <w:t xml:space="preserve">, </w:t>
+      </w:r>
+      <w:hyperlink w:anchor="bib_ref_38" w:history="1">
+        <w:r>
+          <w:t xml:space="preserve">[38]</w:t>
+        </w:r>
+      </w:hyperlink>
+      <w:r>
+        <w:t xml:space="preserve">, </w:t>
+      </w:r>
+      <w:hyperlink w:anchor="bib_ref_39" w:history="1">
+        <w:r>
+          <w:t xml:space="preserve">[39]</w:t>
         </w:r>
       </w:hyperlink>
       <w:r>
@@ -13980,7 +14204,15 @@
         <w:jc w:val="both"/>
       </w:pPr>
       <w:r>
-        <w:t>SpeechFormatter construye una oración con artículos y conectores localizados. Por ejemplo: «Hay una persona donde estás apuntando y una silla abajo a la izquierda de donde estás apuntando». Las voces y la velocidad se seleccionan según las preferencias. La reproducción se realiza mediante AudioTrack; la terminación y los errores se comunican al flujo de captura para liberar el fotograma congelado. El experimento de detección no mide inteligibilidad, naturalidad ni tiempo total de síntesis.</w:t>
+        <w:t xml:space="preserve">SpeechFormatter construye una oración con artículos y conectores localizados. Por ejemplo: «Hay una persona donde estás apuntando y una silla abajo a la izquierda de donde estás apuntando». Las voces y la velocidad se seleccionan según las preferencias. La reproducción se realiza mediante AudioTrack </w:t>
+      </w:r>
+      <w:hyperlink w:anchor="bib_ref_40" w:history="1">
+        <w:r>
+          <w:t xml:space="preserve">[40]</w:t>
+        </w:r>
+      </w:hyperlink>
+      <w:r>
+        <w:t xml:space="preserve">; la terminación y los errores se comunican al flujo de captura para liberar el fotograma congelado. El experimento de detección no mide inteligibilidad, naturalidad ni tiempo total de síntesis.</w:t>
       </w:r>
     </w:p>
     <w:p>
@@ -14043,7 +14275,15 @@
         <w:jc w:val="both"/>
       </w:pPr>
       <w:r>
-        <w:t xml:space="preserve">La aplicación incluye una pantalla de configuración que permite ajustar el comportamiento del sistema sin necesidad de reiniciarla, almacenando las preferencias con Jetpack DataStore. La Tabla 3.3 resume los parámetros disponibles.</w:t>
+        <w:t xml:space="preserve">La aplicación incluye una pantalla de configuración que permite ajustar el comportamiento del sistema sin necesidad de reiniciarla, almacenando las preferencias con Jetpack DataStore </w:t>
+      </w:r>
+      <w:hyperlink w:anchor="bib_ref_41" w:history="1">
+        <w:r>
+          <w:t xml:space="preserve">[41]</w:t>
+        </w:r>
+      </w:hyperlink>
+      <w:r>
+        <w:t xml:space="preserve">. La Tabla 3.3 resume los parámetros disponibles.</w:t>
       </w:r>
     </w:p>
     <w:p>
@@ -15469,7 +15709,15 @@
         <w:jc w:val="both"/>
       </w:pPr>
       <w:r>
-        <w:t xml:space="preserve">Sobre los mismos datos de predicción se aplican dos comparaciones complementarias: una prueba t de Student pareada por escena (33 pares, gl = 32) sobre el número de objetos detectados correctamente por escena, y un </w:t>
+        <w:t xml:space="preserve">Sobre los mismos datos de predicción se aplican dos comparaciones complementarias: una prueba t de Student pareada por escena (33 pares, gl = 32) </w:t>
+      </w:r>
+      <w:hyperlink w:anchor="bib_ref_42" w:history="1">
+        <w:r>
+          <w:t xml:space="preserve">[42]</w:t>
+        </w:r>
+      </w:hyperlink>
+      <w:r>
+        <w:t xml:space="preserve"> sobre el número de objetos detectados correctamente por escena, y un </w:t>
       </w:r>
       <w:r>
         <w:rPr>
@@ -15487,7 +15735,23 @@
         <w:t>recall</w:t>
       </w:r>
       <w:r>
-        <w:t xml:space="preserve"> por banda, remuestreando grupos completos para preservar el emparejamiento. Todas las comparaciones son exploratorias, sin corrección por comparaciones múltiples; los supuestos y sus limitaciones se enumeran en la sección 4.6.</w:t>
+        <w:t xml:space="preserve"> por banda, remuestreando grupos completos para preservar el emparejamiento </w:t>
+      </w:r>
+      <w:hyperlink w:anchor="bib_ref_43" w:history="1">
+        <w:r>
+          <w:t xml:space="preserve">[43]</w:t>
+        </w:r>
+      </w:hyperlink>
+      <w:r>
+        <w:t xml:space="preserve">, </w:t>
+      </w:r>
+      <w:hyperlink w:anchor="bib_ref_44" w:history="1">
+        <w:r>
+          <w:t xml:space="preserve">[44]</w:t>
+        </w:r>
+      </w:hyperlink>
+      <w:r>
+        <w:t xml:space="preserve">. Todas las comparaciones son exploratorias, sin corrección por comparaciones múltiples; los supuestos y sus limitaciones se enumeran en la sección 4.6.</w:t>
       </w:r>
     </w:p>
     <w:p>
@@ -16676,7 +16940,15 @@
         <w:jc w:val="both"/>
       </w:pPr>
       <w:r>
-        <w:t>La prueba t pareada por escena (lentes agrupadas) contrasta las posiciones dentro de cada grupo de captura; con gl = 32 el valor crítico a dos colas es t = 2,04 (α = 0,05).</w:t>
+        <w:t xml:space="preserve">La prueba t pareada por escena (lentes agrupadas) contrasta las posiciones dentro de cada grupo de captura; con gl = 32 el valor crítico a dos colas es t = 2,04 (α = 0,05) </w:t>
+      </w:r>
+      <w:hyperlink w:anchor="bib_ref_42" w:history="1">
+        <w:r>
+          <w:t xml:space="preserve">[42]</w:t>
+        </w:r>
+      </w:hyperlink>
+      <w:r>
+        <w:t xml:space="preserve">.</w:t>
       </w:r>
     </w:p>
     <w:p>
@@ -19671,7 +19943,23 @@
         <w:jc w:val="both"/>
       </w:pPr>
       <w:r>
-        <w:t>Para caracterizar el rango de profundidad útil del sistema se estima la distancia entre el objeto y la cámara para cada instancia anotada de las mismas 198 fotografías, sin capturas adicionales. El modelo estenopeico de la cámara entrega d ≈ f_px · H_cls / h_px, donde f_px es la distancia focal en píxeles —calculada del campo FocalLengthIn35mmFilm del EXIF (equivalente a 25 mm para el lente 1x y a 14 mm para el 0,5x; se registraron seis discrepancias de grupo de lente y una variación menor de 25 a 26 mm y se adoptó el valor del EXIF)—, h_px es la altura de la caja anotada en píxeles y H_cls es una altura de referencia fija por clase (persona 1,70 m; nevera 1,75 m; silla 0,90 m; sofá 0,85 m; inodoro 0,78 m; mesa de comedor 0,76 m; lavamanos 0,80 m; televisor 0,60 m; cama 0,60 m; computador portátil 0,25 m). Las distancias resultantes son aproximaciones, no mediciones, por lo que el análisis se reporta exclusivamente en bandas.</w:t>
+        <w:t xml:space="preserve">Para caracterizar el rango de profundidad útil del sistema se estima la distancia entre el objeto y la cámara para cada instancia anotada de las mismas 198 fotografías, sin capturas adicionales. El modelo estenopeico de la cámara entrega d ≈ f_px · H_cls / h_px </w:t>
+      </w:r>
+      <w:hyperlink w:anchor="bib_ref_45" w:history="1">
+        <w:r>
+          <w:t xml:space="preserve">[45]</w:t>
+        </w:r>
+      </w:hyperlink>
+      <w:r>
+        <w:t xml:space="preserve">, donde f_px es la distancia focal en píxeles —calculada del campo FocalLengthIn35mmFilm del EXIF </w:t>
+      </w:r>
+      <w:hyperlink w:anchor="bib_ref_46" w:history="1">
+        <w:r>
+          <w:t xml:space="preserve">[46]</w:t>
+        </w:r>
+      </w:hyperlink>
+      <w:r>
+        <w:t xml:space="preserve"> (equivalente a 25 mm para el lente 1x y a 14 mm para el 0,5x; se registraron seis discrepancias de grupo de lente y una variación menor de 25 a 26 mm y se adoptó el valor del EXIF)—, h_px es la altura de la caja anotada en píxeles y H_cls es una altura de referencia fija por clase, adoptada como supuesto de este análisis (persona 1,70 m; nevera 1,75 m; silla 0,90 m; sofá 0,85 m; inodoro 0,78 m; mesa de comedor 0,76 m; lavamanos 0,80 m; televisor 0,60 m; cama 0,60 m; computador portátil 0,25 m). Las distancias resultantes son aproximaciones, no mediciones, por lo que el análisis se reporta exclusivamente en bandas.</w:t>
       </w:r>
     </w:p>
     <w:p>
@@ -23092,7 +23380,15 @@
         <w:t>benchmark</w:t>
       </w:r>
       <w:r>
-        <w:t xml:space="preserve"> conservó candidatos desde confianza 0,001 para la evaluación; los tiempos no proceden de una nueva ejecución con corte 0,30. La prueba de instrumentación realizó tres ejecuciones de calentamiento y recorrió las fotografías en un orden aleatorio fijo. La Tabla 4.8 presenta mediana, cuartiles y percentil 95; los cuantiles se obtienen por interpolación lineal en la posición (n − 1)p.</w:t>
+        <w:t xml:space="preserve"> conservó candidatos desde confianza 0,001 para la evaluación; los tiempos no proceden de una nueva ejecución con corte 0,30. La prueba de instrumentación realizó tres ejecuciones de calentamiento y recorrió las fotografías en un orden aleatorio fijo. La Tabla 4.8 presenta mediana, cuartiles y percentil 95; los cuantiles se obtienen por interpolación lineal en la posición (n − 1)p </w:t>
+      </w:r>
+      <w:hyperlink w:anchor="bib_ref_47" w:history="1">
+        <w:r>
+          <w:t xml:space="preserve">[47]</w:t>
+        </w:r>
+      </w:hyperlink>
+      <w:r>
+        <w:t xml:space="preserve">.</w:t>
       </w:r>
     </w:p>
     <w:p>
@@ -23601,17 +23897,17 @@
       <w:r>
         <w:t xml:space="preserve">La propuesta incluye iluminación y oclusión como condiciones de evaluación </w:t>
       </w:r>
-      <w:hyperlink w:anchor="bib_ref_34" w:history="1">
+      <w:hyperlink w:anchor="bib_ref_10" w:history="1">
         <w:r>
-          <w:t xml:space="preserve">[34]</w:t>
+          <w:t xml:space="preserve">[10]</w:t>
         </w:r>
       </w:hyperlink>
       <w:r>
         <w:t xml:space="preserve">. Las fotografías no tienen registros de lux; la oclusión se analiza posteriormente con etiquetas suplementarias asistidas por IA. Como análisis posterior disponible, se calculó el brillo digital medio de cada JPEG a resolución original mediante la conversión RGB a escala de grises de ocho bits de Pillow </w:t>
       </w:r>
-      <w:hyperlink w:anchor="bib_ref_35" w:history="1">
+      <w:hyperlink w:anchor="bib_ref_48" w:history="1">
         <w:r>
-          <w:t xml:space="preserve">[35]</w:t>
+          <w:t xml:space="preserve">[48]</w:t>
         </w:r>
       </w:hyperlink>
       <w:r>
@@ -24239,7 +24535,7 @@
         <w:jc w:val="both"/>
       </w:pPr>
       <w:r>
-        <w:t>Se inspeccionaron las 198 fotografías y se asignó una etiqueta suplementaria a cada una de las 889 instancias COCO, sin modificar sus cajas ni volver a ejecutar el detector. Dos lotes disjuntos fueron revisados visualmente con GPT-6 Astra y razonamiento High, sin mostrar predicciones durante el etiquetado. El protocolo distingue ausencia de obstrucción externa, oclusión parcial y fuerte; los casos ambiguos se conservan como inciertos. El truncamiento por borde se registra aparte, y el tamaño pequeño o la perspectiva no se consideran por sí solos oclusión. La severidad es cualitativa y no corresponde a porcentajes medidos de superficie oculta.</w:t>
+        <w:t xml:space="preserve">Se inspeccionaron las 198 fotografías y se asignó una etiqueta suplementaria a cada una de las 889 instancias COCO, sin modificar sus cajas ni volver a ejecutar el detector. Dos lotes disjuntos fueron revisados visualmente con GPT-6 Astra y razonamiento High, sin mostrar predicciones durante el etiquetado. Como definición operativa propia para este análisis, el protocolo distingue ausencia de obstrucción externa, oclusión parcial y fuerte; los casos ambiguos se conservan como inciertos. El truncamiento por borde se registra aparte, y el tamaño pequeño o la perspectiva no se consideran por sí solos oclusión. La severidad es cualitativa y no corresponde a porcentajes medidos de superficie oculta.</w:t>
       </w:r>
     </w:p>
     <w:p>
@@ -25398,7 +25694,31 @@
         <w:t>benchmark</w:t>
       </w:r>
       <w:r>
-        <w:t>/results/android.json (predicciones) y los scripts de métricas, escenas, estadística y profundidad. Los borradores no son etiquetas finales. verify_package.py comprueba el archivo base; Documents/Review registra esta revisión.</w:t>
+        <w:t xml:space="preserve">/results/android.json (predicciones) y los scripts de métricas, escenas, estadística y profundidad. Los borradores no son etiquetas finales. verify_package.py comprueba el archivo base; Documents/Review registra esta revisión. Los cálculos emplean NumPy </w:t>
+      </w:r>
+      <w:hyperlink w:anchor="bib_ref_47" w:history="1">
+        <w:r>
+          <w:t xml:space="preserve">[47]</w:t>
+        </w:r>
+      </w:hyperlink>
+      <w:r>
+        <w:t xml:space="preserve">, la evaluación COCO utiliza pycocotools </w:t>
+      </w:r>
+      <w:hyperlink w:anchor="bib_ref_27" w:history="1">
+        <w:r>
+          <w:t xml:space="preserve">[27]</w:t>
+        </w:r>
+      </w:hyperlink>
+      <w:r>
+        <w:t xml:space="preserve"> y los gráficos se generan con Matplotlib </w:t>
+      </w:r>
+      <w:hyperlink w:anchor="bib_ref_49" w:history="1">
+        <w:r>
+          <w:t xml:space="preserve">[49]</w:t>
+        </w:r>
+      </w:hyperlink>
+      <w:r>
+        <w:t xml:space="preserve">.</w:t>
       </w:r>
     </w:p>
     <w:p>
@@ -25529,7 +25849,15 @@
         <w:jc w:val="both"/>
       </w:pPr>
       <w:r>
-        <w:t>Manual técnico. El proyecto Android se conserva en diomedescerda/AssistiveVision. La revisión evaluada es 85c852ddcb543bce1bd69ad0db307f895d597881; declara compileSdk 37 con minor API 1, minSdk 26, AGP 9.3.1 y Gradle 9.5.0. La compilación verificada empleó el JBR de Android Studio; el objetivo Java 11 del código no debe confundirse con el JDK necesario para ejecutar Gradle. El comando ./gradlew assembleDebug genera el APK. Build/Testing/README.md documenta la reproducción, los hashes y los límites de cada ejecución.</w:t>
+        <w:t xml:space="preserve">Manual técnico. El proyecto Android se conserva en diomedescerda/AssistiveVision. La revisión evaluada es 85c852ddcb543bce1bd69ad0db307f895d597881; declara compileSdk 37 con minor API 1, minSdk 26, AGP 9.3.1 y Gradle 9.5.0. La compilación verificada empleó el JBR de Android Studio; el objetivo Java 11 del código no debe confundirse con el JDK necesario para ejecutar Gradle. El comando ./gradlew assembleDebug genera el APK. Build/Testing/LEEME.md documenta la reproducción, los hashes y los límites de cada ejecución. La configuración y los módulos corresponden a la revisión de la app indicada en </w:t>
+      </w:r>
+      <w:hyperlink w:anchor="bib_ref_34" w:history="1">
+        <w:r>
+          <w:t xml:space="preserve">[34]</w:t>
+        </w:r>
+      </w:hyperlink>
+      <w:r>
+        <w:t xml:space="preserve">.</w:t>
       </w:r>
     </w:p>
     <w:p>
@@ -25588,10 +25916,959 @@
         <w:spacing w:line="360" w:lineRule="auto"/>
         <w:jc w:val="left"/>
         <w:ind w:left="720" w:hanging="720"/>
+        <w:keepLines w:val="1"/>
       </w:pPr>
       <w:bookmarkStart w:id="1085" w:name="bib_ref_1"/>
       <w:r>
-        <w:t xml:space="preserve">[1] R. Szeliski, “Computer Vision: Algorithms and Applications,” Springer-Verlag, Heidelberg, Berlin, 2010. [Online]. Available: </w:t>
+        <w:t xml:space="preserve">[1] World Health Organization, World report on vision. Geneva, Switzerland: World Health Organization, 2019. [Online]. Available: </w:t>
+      </w:r>
+      <w:hyperlink r:id="rIdBib32" w:history="1">
+        <w:r>
+          <w:t xml:space="preserve">https://www.who.int/publications/i/item/9789241516570</w:t>
+        </w:r>
+      </w:hyperlink>
+      <w:r>
+        <w:t xml:space="preserve">.</w:t>
+      </w:r>
+      <w:bookmarkEnd w:id="1085"/>
+    </w:p>
+    <w:p>
+      <w:pPr>
+        <w:pStyle w:val="Normal"/>
+        <w:spacing w:line="360" w:lineRule="auto"/>
+        <w:jc w:val="left"/>
+        <w:ind w:left="720" w:hanging="720"/>
+        <w:keepLines w:val="1"/>
+      </w:pPr>
+      <w:bookmarkStart w:id="1086" w:name="bib_ref_2"/>
+      <w:r>
+        <w:t xml:space="preserve">[2] S. S. More, N. Patil, V. B. Lobo, N. Shet, D. Goswami, and P. Rane, “Empowering the Visually Impaired: YOLOv8-based Object Detection in Android Applications,” Procedia Computer Science, vol. 252, pp. 457–469, 2025. doi: </w:t>
+      </w:r>
+      <w:hyperlink r:id="rIdBib33" w:history="1">
+        <w:r>
+          <w:t xml:space="preserve">10.1016/j.procs.2025.01.005</w:t>
+        </w:r>
+      </w:hyperlink>
+      <w:r>
+        <w:t xml:space="preserve">.</w:t>
+      </w:r>
+      <w:bookmarkEnd w:id="1086"/>
+    </w:p>
+    <w:p>
+      <w:pPr>
+        <w:pStyle w:val="Normal"/>
+        <w:spacing w:line="360" w:lineRule="auto"/>
+        <w:jc w:val="left"/>
+        <w:ind w:left="720" w:hanging="720"/>
+        <w:keepLines w:val="1"/>
+      </w:pPr>
+      <w:bookmarkStart w:id="1087" w:name="bib_ref_3"/>
+      <w:r>
+        <w:t xml:space="preserve">[3] R. Meenakshi, R. Ponnusamy, S. Alghamdi, O. I. Khalaf, and Y. Alotaibi, “Development of Mobile App to Support the Mobility of Visually Impaired People,” Computers, Materials &amp; Continua, vol. 73, no. 2, pp. 3473–3495, 2022. doi: </w:t>
+      </w:r>
+      <w:hyperlink r:id="rIdBib10" w:history="1">
+        <w:r>
+          <w:t xml:space="preserve">10.32604/cmc.2022.028540</w:t>
+        </w:r>
+      </w:hyperlink>
+      <w:r>
+        <w:t xml:space="preserve">.</w:t>
+      </w:r>
+      <w:bookmarkEnd w:id="1087"/>
+    </w:p>
+    <w:p>
+      <w:pPr>
+        <w:pStyle w:val="Normal"/>
+        <w:spacing w:line="360" w:lineRule="auto"/>
+        <w:jc w:val="left"/>
+        <w:ind w:left="720" w:hanging="720"/>
+        <w:keepLines w:val="1"/>
+      </w:pPr>
+      <w:bookmarkStart w:id="1088" w:name="bib_ref_4"/>
+      <w:r>
+        <w:t xml:space="preserve">[4] K. Guravaiah, Y. S. Bhavadeesh, P. Shwejan, A. H. Vardhan, and S. Lavanya, “Third Eye: Object Recognition and Speech Generation for Visually Impaired,” Procedia Computer Science, vol. 218, pp. 1144–1155, 2023. doi: </w:t>
+      </w:r>
+      <w:hyperlink r:id="rIdBib11" w:history="1">
+        <w:r>
+          <w:t xml:space="preserve">10.1016/j.procs.2023.01.093</w:t>
+        </w:r>
+      </w:hyperlink>
+      <w:r>
+        <w:t xml:space="preserve">.</w:t>
+      </w:r>
+      <w:bookmarkEnd w:id="1088"/>
+    </w:p>
+    <w:p>
+      <w:pPr>
+        <w:pStyle w:val="Normal"/>
+        <w:spacing w:line="360" w:lineRule="auto"/>
+        <w:jc w:val="left"/>
+        <w:ind w:left="720" w:hanging="720"/>
+        <w:keepLines w:val="1"/>
+      </w:pPr>
+      <w:bookmarkStart w:id="1089" w:name="bib_ref_5"/>
+      <w:r>
+        <w:t xml:space="preserve">[5] TensorFlow, “TensorFlow Lite,” TensorFlow. [Online]. Available: </w:t>
+      </w:r>
+      <w:hyperlink r:id="rIdBib3" w:history="1">
+        <w:r>
+          <w:t xml:space="preserve">https://www.tensorflow.org/lite/guide</w:t>
+        </w:r>
+      </w:hyperlink>
+      <w:r>
+        <w:t xml:space="preserve">.</w:t>
+      </w:r>
+      <w:bookmarkEnd w:id="1089"/>
+    </w:p>
+    <w:p>
+      <w:pPr>
+        <w:pStyle w:val="Normal"/>
+        <w:spacing w:line="360" w:lineRule="auto"/>
+        <w:jc w:val="left"/>
+        <w:ind w:left="720" w:hanging="720"/>
+        <w:keepLines w:val="1"/>
+      </w:pPr>
+      <w:bookmarkStart w:id="1090" w:name="bib_ref_6"/>
+      <w:r>
+        <w:t xml:space="preserve">[6] S. Ren, K. He, R. Girshick, and J. Sun, “Faster R-CNN: Towards Real-Time Object Detection with Region Proposal Networks,” </w:t>
+      </w:r>
+      <w:hyperlink r:id="rIdBib4" w:history="1">
+        <w:r>
+          <w:t xml:space="preserve">arXiv:1506.01497</w:t>
+        </w:r>
+      </w:hyperlink>
+      <w:r>
+        <w:t xml:space="preserve">, 2015. doi: </w:t>
+      </w:r>
+      <w:hyperlink r:id="rIdBib5" w:history="1">
+        <w:r>
+          <w:t xml:space="preserve">10.48550/arXiv.1506.01497</w:t>
+        </w:r>
+      </w:hyperlink>
+      <w:r>
+        <w:t xml:space="preserve">.</w:t>
+      </w:r>
+      <w:bookmarkEnd w:id="1090"/>
+    </w:p>
+    <w:p>
+      <w:pPr>
+        <w:pStyle w:val="Normal"/>
+        <w:spacing w:line="360" w:lineRule="auto"/>
+        <w:jc w:val="left"/>
+        <w:ind w:left="720" w:hanging="720"/>
+        <w:keepLines w:val="1"/>
+      </w:pPr>
+      <w:bookmarkStart w:id="1091" w:name="bib_ref_7"/>
+      <w:r>
+        <w:t xml:space="preserve">[7] J. Redmon, S. Divvala, R. Girshick, and A. Farhadi, “You Only Look Once: Unified, Real-Time Object Detection,” in 2016 IEEE Conference on Computer Vision and Pattern Recognition (CVPR), Jun. 2016, pp. 779–788. doi: </w:t>
+      </w:r>
+      <w:hyperlink r:id="rIdBib6" w:history="1">
+        <w:r>
+          <w:t xml:space="preserve">10.1109/CVPR.2016.91</w:t>
+        </w:r>
+      </w:hyperlink>
+      <w:r>
+        <w:t xml:space="preserve">.</w:t>
+      </w:r>
+      <w:bookmarkEnd w:id="1091"/>
+    </w:p>
+    <w:p>
+      <w:pPr>
+        <w:pStyle w:val="Normal"/>
+        <w:spacing w:line="360" w:lineRule="auto"/>
+        <w:jc w:val="left"/>
+        <w:ind w:left="720" w:hanging="720"/>
+        <w:keepLines w:val="1"/>
+      </w:pPr>
+      <w:bookmarkStart w:id="1092" w:name="bib_ref_8"/>
+      <w:r>
+        <w:t xml:space="preserve">[8] W. Liu et al., “SSD: Single Shot MultiBox Detector,” in Computer Vision – ECCV 2016, Cham: Springer International Publishing, 2016, pp. 21–37. doi: </w:t>
+      </w:r>
+      <w:hyperlink r:id="rIdBib7" w:history="1">
+        <w:r>
+          <w:t xml:space="preserve">10.1007/978-3-319-46448-0_2</w:t>
+        </w:r>
+      </w:hyperlink>
+      <w:r>
+        <w:t xml:space="preserve">.</w:t>
+      </w:r>
+      <w:bookmarkEnd w:id="1092"/>
+    </w:p>
+    <w:p>
+      <w:pPr>
+        <w:pStyle w:val="Normal"/>
+        <w:spacing w:line="360" w:lineRule="auto"/>
+        <w:jc w:val="left"/>
+        <w:ind w:left="720" w:hanging="720"/>
+        <w:keepLines w:val="1"/>
+      </w:pPr>
+      <w:bookmarkStart w:id="1093" w:name="bib_ref_9"/>
+      <w:r>
+        <w:t xml:space="preserve">[9] M. Tan, R. Pang, and Q. V. Le, “EfficientDet: Scalable and Efficient Object Detection,” in 2020 IEEE/CVF Conference on Computer Vision and Pattern Recognition (CVPR), Jun. 2020, pp. 10781–10790. doi: </w:t>
+      </w:r>
+      <w:hyperlink r:id="rIdBib8" w:history="1">
+        <w:r>
+          <w:t xml:space="preserve">10.1109/CVPR42600.2020.01079</w:t>
+        </w:r>
+      </w:hyperlink>
+      <w:r>
+        <w:t xml:space="preserve">.</w:t>
+      </w:r>
+      <w:bookmarkEnd w:id="1093"/>
+    </w:p>
+    <w:p>
+      <w:pPr>
+        <w:jc w:val="left"/>
+        <w:keepLines w:val="1"/>
+      </w:pPr>
+      <w:bookmarkStart w:id="1094" w:name="bib_ref_10"/>
+      <w:r>
+        <w:t>[10] D. F. Cerda Leon, “Sistema de identificación y localización espacial de objetos basado en visión por computador para asistencia a personas con discapacidad visual,” Propuesta de pasantía en investigación, Universidad del Magdalena, documento del proyecto. Disponible en Documents/Propuesta Pasantia de Investigación - Diomedes Cerda.pdf.</w:t>
+      </w:r>
+      <w:bookmarkEnd w:id="1094"/>
+    </w:p>
+    <w:p>
+      <w:pPr>
+        <w:pStyle w:val="Normal"/>
+        <w:spacing w:line="360" w:lineRule="auto"/>
+        <w:jc w:val="left"/>
+        <w:ind w:left="720" w:hanging="720"/>
+        <w:keepLines w:val="1"/>
+      </w:pPr>
+      <w:bookmarkStart w:id="1095" w:name="bib_ref_11"/>
+      <w:r>
+        <w:t>[11] Universidad del Magdalena, “Plan de Desarrollo UNIMAGDALENA Comprometida 2020–2030,” Santa Marta, Colombia, 2020.</w:t>
+      </w:r>
+      <w:bookmarkEnd w:id="1095"/>
+    </w:p>
+    <w:p>
+      <w:pPr>
+        <w:pStyle w:val="Normal"/>
+        <w:spacing w:line="360" w:lineRule="auto"/>
+        <w:jc w:val="left"/>
+        <w:ind w:left="720" w:hanging="720"/>
+        <w:keepLines w:val="1"/>
+      </w:pPr>
+      <w:bookmarkStart w:id="1096" w:name="bib_ref_12"/>
+      <w:r>
+        <w:t>[12] Universidad del Magdalena, “Plan de Gobierno Rectoral 2024–2028,” Santa Marta, Colombia, 2024.</w:t>
+      </w:r>
+      <w:bookmarkEnd w:id="1096"/>
+    </w:p>
+    <w:p>
+      <w:pPr>
+        <w:pStyle w:val="Normal"/>
+        <w:spacing w:line="360" w:lineRule="auto"/>
+        <w:jc w:val="left"/>
+        <w:ind w:left="720" w:hanging="720"/>
+        <w:keepLines w:val="1"/>
+      </w:pPr>
+      <w:bookmarkStart w:id="1097" w:name="bib_ref_13"/>
+      <w:r>
+        <w:t xml:space="preserve">[13] D. R. Pawar, “Deep Learning-Driven Assistive Technology for Blind Users: Real-Time Object Detection and Speech Feedback on Android,” preprint, may. 2025. doi: </w:t>
+      </w:r>
+      <w:hyperlink r:id="rIdBib34" w:history="1">
+        <w:r>
+          <w:t xml:space="preserve">10.13140/RG.2.2.28125.12005</w:t>
+        </w:r>
+      </w:hyperlink>
+      <w:r>
+        <w:t xml:space="preserve">.</w:t>
+      </w:r>
+      <w:bookmarkEnd w:id="1097"/>
+    </w:p>
+    <w:p>
+      <w:pPr>
+        <w:pStyle w:val="Normal"/>
+        <w:spacing w:line="360" w:lineRule="auto"/>
+        <w:jc w:val="left"/>
+        <w:ind w:left="720" w:hanging="720"/>
+        <w:keepLines w:val="1"/>
+      </w:pPr>
+      <w:bookmarkStart w:id="1098" w:name="bib_ref_14"/>
+      <w:r>
+        <w:t xml:space="preserve">[14] J. Figura, R. Kuźmiczuk, and M. Badurowicz, “Analysis of object recognition systems using augmented reality glasses,” Journal of Computer Sciences Institute, vol. 34, pp. 8–13, 2025. doi: </w:t>
+      </w:r>
+      <w:hyperlink r:id="rIdBib35" w:history="1">
+        <w:r>
+          <w:t xml:space="preserve">10.35784/jcsi.6469</w:t>
+        </w:r>
+      </w:hyperlink>
+      <w:r>
+        <w:t xml:space="preserve">.</w:t>
+      </w:r>
+      <w:bookmarkEnd w:id="1098"/>
+    </w:p>
+    <w:p>
+      <w:pPr>
+        <w:pStyle w:val="Normal"/>
+        <w:spacing w:line="360" w:lineRule="auto"/>
+        <w:jc w:val="left"/>
+        <w:ind w:left="720" w:hanging="720"/>
+        <w:keepLines w:val="1"/>
+      </w:pPr>
+      <w:bookmarkStart w:id="1099" w:name="bib_ref_15"/>
+      <w:r>
+        <w:t xml:space="preserve">[15] A. G. Howard, M. Zhu, B. Chen, D. Kalenichenko, W. Wang, T. Weyand, M. Andreetto, and H. Adam, “MobileNets: Efficient Convolutional Neural Networks for Mobile Vision Applications,” </w:t>
+      </w:r>
+      <w:hyperlink r:id="rIdBib13" w:history="1">
+        <w:r>
+          <w:t xml:space="preserve">arXiv:1704.04861</w:t>
+        </w:r>
+      </w:hyperlink>
+      <w:r>
+        <w:t xml:space="preserve">, 2017.</w:t>
+      </w:r>
+      <w:bookmarkEnd w:id="1099"/>
+    </w:p>
+    <w:p>
+      <w:pPr>
+        <w:pStyle w:val="Normal"/>
+        <w:spacing w:line="360" w:lineRule="auto"/>
+        <w:jc w:val="left"/>
+        <w:ind w:left="720" w:hanging="720"/>
+        <w:keepLines w:val="1"/>
+      </w:pPr>
+      <w:bookmarkStart w:id="1100" w:name="bib_ref_16"/>
+      <w:r>
+        <w:t xml:space="preserve">[16] M. Sandler, A. Howard, M. Zhu, A. Zhmoginov, and L.-C. Chen, “MobileNetV2: Inverted Residuals and Linear Bottlenecks,” in 2018 IEEE/CVF Conference on Computer Vision and Pattern Recognition (CVPR), Jun. 2018, pp. 4510–4520. doi: </w:t>
+      </w:r>
+      <w:hyperlink r:id="rIdBib14" w:history="1">
+        <w:r>
+          <w:t xml:space="preserve">10.1109/CVPR.2018.00474</w:t>
+        </w:r>
+      </w:hyperlink>
+      <w:r>
+        <w:t xml:space="preserve">.</w:t>
+      </w:r>
+      <w:bookmarkEnd w:id="1100"/>
+    </w:p>
+    <w:p>
+      <w:pPr>
+        <w:pStyle w:val="Normal"/>
+        <w:spacing w:line="360" w:lineRule="auto"/>
+        <w:jc w:val="left"/>
+        <w:ind w:left="720" w:hanging="720"/>
+        <w:keepLines w:val="1"/>
+      </w:pPr>
+      <w:bookmarkStart w:id="1101" w:name="bib_ref_17"/>
+      <w:r>
+        <w:t xml:space="preserve">[17] J. Dai, “Real-time and accurate object detection on edge device with TensorFlow Lite,” Journal of Physics: Conference Series, vol. 1651, no. 1, Art. no. 012114, 2020. doi: </w:t>
+      </w:r>
+      <w:hyperlink r:id="rIdBib15" w:history="1">
+        <w:r>
+          <w:t xml:space="preserve">10.1088/1742-6596/1651/1/012114</w:t>
+        </w:r>
+      </w:hyperlink>
+      <w:r>
+        <w:t xml:space="preserve">.</w:t>
+      </w:r>
+      <w:bookmarkEnd w:id="1101"/>
+    </w:p>
+    <w:p>
+      <w:pPr>
+        <w:pStyle w:val="Normal"/>
+        <w:spacing w:line="360" w:lineRule="auto"/>
+        <w:jc w:val="left"/>
+        <w:ind w:left="720" w:hanging="720"/>
+        <w:keepLines w:val="1"/>
+      </w:pPr>
+      <w:bookmarkStart w:id="1102" w:name="bib_ref_18"/>
+      <w:r>
+        <w:t xml:space="preserve">[18] A. Magdy, M. S. Moustafa, H. M. Ebied, and M. F. Tolba, “Lightweight faster R-CNN for object detection in optical remote sensing images,” Scientific Reports, vol. 15, Art. no. 16163, 2025. doi: </w:t>
+      </w:r>
+      <w:hyperlink r:id="rIdBib16" w:history="1">
+        <w:r>
+          <w:t xml:space="preserve">10.1038/s41598-025-99242-y</w:t>
+        </w:r>
+      </w:hyperlink>
+      <w:r>
+        <w:t xml:space="preserve">.</w:t>
+      </w:r>
+      <w:bookmarkEnd w:id="1102"/>
+    </w:p>
+    <w:p>
+      <w:pPr>
+        <w:pStyle w:val="Normal"/>
+        <w:spacing w:line="360" w:lineRule="auto"/>
+        <w:jc w:val="left"/>
+        <w:ind w:left="720" w:hanging="720"/>
+        <w:keepLines w:val="1"/>
+      </w:pPr>
+      <w:bookmarkStart w:id="1103" w:name="bib_ref_19"/>
+      <w:r>
+        <w:t xml:space="preserve">[19] Google, “Object Detection with TensorFlow Lite Model Maker,” Google AI Edge. [Online]. Available: </w:t>
+      </w:r>
+      <w:hyperlink r:id="rIdBib36" w:history="1">
+        <w:r>
+          <w:t xml:space="preserve">https://developers.google.com/edge/litert/libraries/modify/object_detection</w:t>
+        </w:r>
+      </w:hyperlink>
+      <w:r>
+        <w:t xml:space="preserve">. Consultado: 20 oct. 2026.</w:t>
+      </w:r>
+      <w:bookmarkEnd w:id="1103"/>
+    </w:p>
+    <w:p>
+      <w:pPr>
+        <w:pStyle w:val="Normal"/>
+        <w:spacing w:line="360" w:lineRule="auto"/>
+        <w:jc w:val="left"/>
+        <w:ind w:left="720" w:hanging="720"/>
+        <w:keepLines w:val="1"/>
+      </w:pPr>
+      <w:bookmarkStart w:id="1104" w:name="bib_ref_20"/>
+      <w:r>
+        <w:t xml:space="preserve">[20] Ultralytics, “Explore Ultralytics YOLOv8,” Ultralytics documentation. [Online]. Available: </w:t>
+      </w:r>
+      <w:hyperlink r:id="rIdBib37" w:history="1">
+        <w:r>
+          <w:t xml:space="preserve">https://docs.ultralytics.com/models/yolov8/</w:t>
+        </w:r>
+      </w:hyperlink>
+      <w:r>
+        <w:t xml:space="preserve">. Consultado: 20 oct. 2026.</w:t>
+      </w:r>
+      <w:bookmarkEnd w:id="1104"/>
+    </w:p>
+    <w:p>
+      <w:pPr>
+        <w:pStyle w:val="Normal"/>
+        <w:spacing w:line="360" w:lineRule="auto"/>
+        <w:jc w:val="left"/>
+        <w:ind w:left="720" w:hanging="720"/>
+        <w:keepLines w:val="1"/>
+      </w:pPr>
+      <w:bookmarkStart w:id="1105" w:name="bib_ref_21"/>
+      <w:r>
+        <w:t xml:space="preserve">[21] Ultralytics, “Ultralytics YOLO11,” Ultralytics documentation. [Online]. Available: </w:t>
+      </w:r>
+      <w:hyperlink r:id="rIdBib38" w:history="1">
+        <w:r>
+          <w:t xml:space="preserve">https://docs.ultralytics.com/models/yolo11/</w:t>
+        </w:r>
+      </w:hyperlink>
+      <w:r>
+        <w:t xml:space="preserve">. Consultado: 20 oct. 2026.</w:t>
+      </w:r>
+      <w:bookmarkEnd w:id="1105"/>
+    </w:p>
+    <w:p>
+      <w:pPr>
+        <w:pStyle w:val="Normal"/>
+        <w:spacing w:line="360" w:lineRule="auto"/>
+        <w:jc w:val="left"/>
+        <w:ind w:left="720" w:hanging="720"/>
+        <w:keepLines w:val="1"/>
+      </w:pPr>
+      <w:bookmarkStart w:id="1106" w:name="bib_ref_22"/>
+      <w:r>
+        <w:t xml:space="preserve">[22] T.-Y. Lin et al., “Microsoft COCO: Common Objects in Context,” in Computer Vision – ECCV 2014, Cham: Springer International Publishing, 2014, pp. 740–755. doi: </w:t>
+      </w:r>
+      <w:hyperlink r:id="rIdBib12" w:history="1">
+        <w:r>
+          <w:t xml:space="preserve">10.1007/978-3-319-10602-1_48</w:t>
+        </w:r>
+      </w:hyperlink>
+      <w:r>
+        <w:t xml:space="preserve">.</w:t>
+      </w:r>
+      <w:bookmarkEnd w:id="1106"/>
+    </w:p>
+    <w:p>
+      <w:pPr>
+        <w:pStyle w:val="Normal"/>
+        <w:spacing w:line="360" w:lineRule="auto"/>
+        <w:jc w:val="left"/>
+        <w:ind w:left="720" w:hanging="720"/>
+        <w:keepLines w:val="1"/>
+      </w:pPr>
+      <w:bookmarkStart w:id="1107" w:name="bib_ref_23"/>
+      <w:r>
+        <w:t xml:space="preserve">[23] A. Kuznetsova et al., “The Open Images Dataset V4: Unified image classification, object detection, and visual relationship detection at scale,” International Journal of Computer Vision, vol. 128, pp. 1956–1981, 2020. doi: </w:t>
+      </w:r>
+      <w:hyperlink r:id="rIdBib17" w:history="1">
+        <w:r>
+          <w:t xml:space="preserve">10.1007/s11263-020-01316-z</w:t>
+        </w:r>
+      </w:hyperlink>
+      <w:r>
+        <w:t xml:space="preserve">.</w:t>
+      </w:r>
+      <w:bookmarkEnd w:id="1107"/>
+    </w:p>
+    <w:p>
+      <w:pPr>
+        <w:pStyle w:val="Normal"/>
+        <w:spacing w:line="360" w:lineRule="auto"/>
+        <w:jc w:val="left"/>
+        <w:ind w:left="720" w:hanging="720"/>
+        <w:keepLines w:val="1"/>
+      </w:pPr>
+      <w:bookmarkStart w:id="1108" w:name="bib_ref_24"/>
+      <w:r>
+        <w:t xml:space="preserve">[24] “ONNX Runtime,” ONNX Runtime. [Online]. Available: </w:t>
+      </w:r>
+      <w:hyperlink r:id="rIdBib18" w:history="1">
+        <w:r>
+          <w:t xml:space="preserve">https://onnxruntime.ai/docs/</w:t>
+        </w:r>
+      </w:hyperlink>
+      <w:r>
+        <w:t xml:space="preserve">.</w:t>
+      </w:r>
+      <w:bookmarkEnd w:id="1108"/>
+    </w:p>
+    <w:p>
+      <w:pPr>
+        <w:pStyle w:val="Normal"/>
+        <w:spacing w:line="360" w:lineRule="auto"/>
+        <w:jc w:val="left"/>
+        <w:ind w:left="720" w:hanging="720"/>
+        <w:keepLines w:val="1"/>
+      </w:pPr>
+      <w:bookmarkStart w:id="1109" w:name="bib_ref_25"/>
+      <w:r>
+        <w:t xml:space="preserve">[25] “ExecuTorch Documentation,” PyTorch. [Online]. Available: </w:t>
+      </w:r>
+      <w:hyperlink r:id="rIdBib19" w:history="1">
+        <w:r>
+          <w:t xml:space="preserve">https://pytorch.org/executorch/stable/</w:t>
+        </w:r>
+      </w:hyperlink>
+      <w:r>
+        <w:t xml:space="preserve">.</w:t>
+      </w:r>
+      <w:bookmarkEnd w:id="1109"/>
+    </w:p>
+    <w:p>
+      <w:pPr>
+        <w:pStyle w:val="Normal"/>
+        <w:spacing w:line="360" w:lineRule="auto"/>
+        <w:jc w:val="left"/>
+        <w:ind w:left="720" w:hanging="720"/>
+        <w:keepLines w:val="1"/>
+      </w:pPr>
+      <w:bookmarkStart w:id="1110" w:name="bib_ref_26"/>
+      <w:r>
+        <w:t xml:space="preserve">[26] N. Carion, F. Massa, G. Synnaeve, N. Usunier, A. Kirillov, and S. Zagoruyko, “End-to-End Object Detection with Transformers,” in Computer Vision – ECCV 2020, Cham: Springer International Publishing, 2020, pp. 213–229. doi: </w:t>
+      </w:r>
+      <w:hyperlink r:id="rIdBib20" w:history="1">
+        <w:r>
+          <w:t xml:space="preserve">10.1007/978-3-030-58452-8_13</w:t>
+        </w:r>
+      </w:hyperlink>
+      <w:r>
+        <w:t xml:space="preserve">.</w:t>
+      </w:r>
+      <w:bookmarkEnd w:id="1110"/>
+    </w:p>
+    <w:p>
+      <w:pPr>
+        <w:pStyle w:val="Normal"/>
+        <w:spacing w:line="360" w:lineRule="auto"/>
+        <w:jc w:val="left"/>
+        <w:ind w:left="720" w:hanging="720"/>
+        <w:keepLines w:val="1"/>
+      </w:pPr>
+      <w:bookmarkStart w:id="1111" w:name="bib_ref_27"/>
+      <w:r>
+        <w:t xml:space="preserve">[27] COCO dataset contributors, “COCO API: PythonAPI/pycocotools/cocoeval.py,” repositorio de software. [Online]. Available: </w:t>
+      </w:r>
+      <w:hyperlink r:id="rIdBib39" w:history="1">
+        <w:r>
+          <w:t xml:space="preserve">https://github.com/cocodataset/cocoapi/blob/master/PythonAPI/pycocotools/cocoeval.py</w:t>
+        </w:r>
+      </w:hyperlink>
+      <w:r>
+        <w:t xml:space="preserve">. Consultado: 20 oct. 2026.</w:t>
+      </w:r>
+      <w:bookmarkEnd w:id="1111"/>
+    </w:p>
+    <w:p>
+      <w:pPr>
+        <w:pStyle w:val="Normal"/>
+        <w:spacing w:line="360" w:lineRule="auto"/>
+        <w:jc w:val="left"/>
+        <w:ind w:left="720" w:hanging="720"/>
+        <w:keepLines w:val="1"/>
+      </w:pPr>
+      <w:bookmarkStart w:id="1112" w:name="bib_ref_28"/>
+      <w:r>
+        <w:t xml:space="preserve">[28] C. D. Manning, P. Raghavan, and H. Schütze, Introduction to Information Retrieval. Cambridge University Press, 2008, sec. 8.3. [Online]. Available: </w:t>
+      </w:r>
+      <w:hyperlink r:id="rIdBib40" w:history="1">
+        <w:r>
+          <w:t xml:space="preserve">https://nlp.stanford.edu/IR-book/html/htmledition/evaluation-of-unranked-retrieval-sets-1.html</w:t>
+        </w:r>
+      </w:hyperlink>
+      <w:r>
+        <w:t xml:space="preserve">.</w:t>
+      </w:r>
+      <w:bookmarkEnd w:id="1112"/>
+    </w:p>
+    <w:p>
+      <w:pPr>
+        <w:pStyle w:val="Normal"/>
+        <w:spacing w:line="360" w:lineRule="auto"/>
+        <w:jc w:val="left"/>
+        <w:ind w:left="720" w:hanging="720"/>
+        <w:keepLines w:val="1"/>
+      </w:pPr>
+      <w:bookmarkStart w:id="1113" w:name="bib_ref_29"/>
+      <w:r>
+        <w:t xml:space="preserve">[29] TensorFlow contributors, “Performance measurement,” TensorFlow Lite documentation, archivo performance/measurement.md. [Online]. Available: </w:t>
+      </w:r>
+      <w:hyperlink r:id="rIdBib41" w:history="1">
+        <w:r>
+          <w:t xml:space="preserve">https://github.com/tensorflow/tensorflow/blob/master/tensorflow/lite/g3doc/performance/measurement.md</w:t>
+        </w:r>
+      </w:hyperlink>
+      <w:r>
+        <w:t xml:space="preserve">. Consultado: 20 oct. 2026.</w:t>
+      </w:r>
+      <w:bookmarkEnd w:id="1113"/>
+    </w:p>
+    <w:p>
+      <w:pPr>
+        <w:pStyle w:val="Normal"/>
+        <w:spacing w:line="360" w:lineRule="auto"/>
+        <w:jc w:val="left"/>
+        <w:ind w:left="720" w:hanging="720"/>
+        <w:keepLines w:val="1"/>
+      </w:pPr>
+      <w:bookmarkStart w:id="1114" w:name="bib_ref_30"/>
+      <w:r>
+        <w:t xml:space="preserve">[30] Android Developers, “Android Debug Bridge (adb),” Android Studio. [Online]. Available: </w:t>
+      </w:r>
+      <w:hyperlink r:id="rIdBib22" w:history="1">
+        <w:r>
+          <w:t xml:space="preserve">https://developer.android.com/tools/adb</w:t>
+        </w:r>
+      </w:hyperlink>
+      <w:r>
+        <w:t xml:space="preserve">.</w:t>
+      </w:r>
+      <w:bookmarkEnd w:id="1114"/>
+    </w:p>
+    <w:p>
+      <w:pPr>
+        <w:pStyle w:val="Normal"/>
+        <w:spacing w:line="360" w:lineRule="auto"/>
+        <w:jc w:val="left"/>
+        <w:ind w:left="720" w:hanging="720"/>
+        <w:keepLines w:val="1"/>
+      </w:pPr>
+      <w:bookmarkStart w:id="1115" w:name="bib_ref_31"/>
+      <w:r>
+        <w:t xml:space="preserve">[31] Google, “GPU acceleration delegate with Interpreter API,” Google AI Edge. [Online]. Available: </w:t>
+      </w:r>
+      <w:hyperlink r:id="rIdBib23" w:history="1">
+        <w:r>
+          <w:t xml:space="preserve">https://developers.google.com/edge/litert/android/gpu</w:t>
+        </w:r>
+      </w:hyperlink>
+      <w:r>
+        <w:t xml:space="preserve">.</w:t>
+      </w:r>
+      <w:bookmarkEnd w:id="1115"/>
+    </w:p>
+    <w:p>
+      <w:pPr>
+        <w:pStyle w:val="Normal"/>
+        <w:spacing w:line="360" w:lineRule="auto"/>
+        <w:jc w:val="left"/>
+        <w:ind w:left="720" w:hanging="720"/>
+        <w:keepLines w:val="1"/>
+      </w:pPr>
+      <w:bookmarkStart w:id="1116" w:name="bib_ref_32"/>
+      <w:r>
+        <w:t xml:space="preserve">[32] Khronos Group, “OpenCL – The Open Standard for Parallel Programming of Heterogeneous Systems.” [Online]. Available: </w:t>
+      </w:r>
+      <w:hyperlink r:id="rIdBib25" w:history="1">
+        <w:r>
+          <w:t xml:space="preserve">https://www.khronos.org/opencl/</w:t>
+        </w:r>
+      </w:hyperlink>
+      <w:r>
+        <w:t xml:space="preserve">.</w:t>
+      </w:r>
+      <w:bookmarkEnd w:id="1116"/>
+    </w:p>
+    <w:p>
+      <w:pPr>
+        <w:pStyle w:val="Normal"/>
+        <w:spacing w:line="360" w:lineRule="auto"/>
+        <w:jc w:val="left"/>
+        <w:ind w:left="720" w:hanging="720"/>
+        <w:keepLines w:val="1"/>
+      </w:pPr>
+      <w:bookmarkStart w:id="1117" w:name="bib_ref_33"/>
+      <w:r>
+        <w:t xml:space="preserve">[33] Roboflow, “Roboflow: Computer vision tools for developers and enterprises.” [Online]. Available: </w:t>
+      </w:r>
+      <w:hyperlink r:id="rIdBib24" w:history="1">
+        <w:r>
+          <w:t xml:space="preserve">https://roboflow.com/</w:t>
+        </w:r>
+      </w:hyperlink>
+      <w:r>
+        <w:t xml:space="preserve">.</w:t>
+      </w:r>
+      <w:bookmarkEnd w:id="1117"/>
+    </w:p>
+    <w:p>
+      <w:pPr>
+        <w:jc w:val="left"/>
+        <w:keepLines w:val="1"/>
+      </w:pPr>
+      <w:bookmarkStart w:id="1118" w:name="bib_ref_34"/>
+      <w:r>
+        <w:t xml:space="preserve">[34] D. Cerda, “AssistiveVision,” código fuente, revisión 85c852ddcb543bce1bd69ad0db307f895d597881. [Online]. Available: </w:t>
+      </w:r>
+      <w:hyperlink r:id="rIdBib30" w:history="1">
+        <w:r>
+          <w:t xml:space="preserve">https://github.com/diomedescerda/AssistiveVision</w:t>
+        </w:r>
+      </w:hyperlink>
+      <w:r>
+        <w:t xml:space="preserve">.</w:t>
+      </w:r>
+      <w:bookmarkEnd w:id="1118"/>
+    </w:p>
+    <w:p>
+      <w:pPr>
+        <w:pStyle w:val="Normal"/>
+        <w:spacing w:line="360" w:lineRule="auto"/>
+        <w:jc w:val="left"/>
+        <w:ind w:left="720" w:hanging="720"/>
+        <w:keepLines w:val="1"/>
+      </w:pPr>
+      <w:bookmarkStart w:id="1119" w:name="bib_ref_35"/>
+      <w:r>
+        <w:t xml:space="preserve">[35] Google, “CameraX,” Android Developers. [Online]. Available: </w:t>
+      </w:r>
+      <w:hyperlink r:id="rIdBib26" w:history="1">
+        <w:r>
+          <w:t xml:space="preserve">https://developer.android.com/media/camera/camerax</w:t>
+        </w:r>
+      </w:hyperlink>
+      <w:r>
+        <w:t xml:space="preserve">.</w:t>
+      </w:r>
+      <w:bookmarkEnd w:id="1119"/>
+    </w:p>
+    <w:p>
+      <w:pPr>
+        <w:jc w:val="left"/>
+        <w:keepLines w:val="1"/>
+      </w:pPr>
+      <w:bookmarkStart w:id="1120" w:name="bib_ref_36"/>
+      <w:r>
+        <w:t xml:space="preserve">[36] Google, “LiteRT for Android,” Google AI Edge. [Online]. Available: </w:t>
+      </w:r>
+      <w:hyperlink r:id="rIdBib29" w:history="1">
+        <w:r>
+          <w:t xml:space="preserve">https://developers.google.com/edge/litert/android</w:t>
+        </w:r>
+      </w:hyperlink>
+      <w:r>
+        <w:t xml:space="preserve">. Consultado: 14 oct. 2026.</w:t>
+      </w:r>
+      <w:bookmarkEnd w:id="1120"/>
+    </w:p>
+    <w:p>
+      <w:pPr>
+        <w:jc w:val="left"/>
+        <w:keepLines w:val="1"/>
+      </w:pPr>
+      <w:bookmarkStart w:id="1121" w:name="bib_ref_37"/>
+      <w:r>
+        <w:t xml:space="preserve">[37] k2-fsa, “Text-to-speech,” sherpa-onnx documentation. [Online]. Available: </w:t>
+      </w:r>
+      <w:hyperlink r:id="rIdBib28" w:history="1">
+        <w:r>
+          <w:t xml:space="preserve">https://k2-fsa.github.io/sherpa/onnx/tts/index.html</w:t>
+        </w:r>
+      </w:hyperlink>
+      <w:r>
+        <w:t xml:space="preserve">. Consultado: 14 oct. 2026.</w:t>
+      </w:r>
+      <w:bookmarkEnd w:id="1121"/>
+    </w:p>
+    <w:p>
+      <w:pPr>
+        <w:pStyle w:val="Normal"/>
+        <w:spacing w:line="360" w:lineRule="auto"/>
+        <w:jc w:val="left"/>
+        <w:ind w:left="720" w:hanging="720"/>
+        <w:keepLines w:val="1"/>
+      </w:pPr>
+      <w:bookmarkStart w:id="1122" w:name="bib_ref_38"/>
+      <w:r>
+        <w:t xml:space="preserve">[38] J. Kim, J. Kong, and J. Son, “Conditional Variational Autoencoder with Adversarial Learning for End-to-End Text-to-Speech,” </w:t>
+      </w:r>
+      <w:hyperlink r:id="rIdBib42" w:history="1">
+        <w:r>
+          <w:t xml:space="preserve">arXiv:2106.06103</w:t>
+        </w:r>
+      </w:hyperlink>
+      <w:r>
+        <w:t xml:space="preserve">, 2021. doi: </w:t>
+      </w:r>
+      <w:hyperlink r:id="rIdBib43" w:history="1">
+        <w:r>
+          <w:t xml:space="preserve">10.48550/arXiv.2106.06103</w:t>
+        </w:r>
+      </w:hyperlink>
+      <w:r>
+        <w:t xml:space="preserve">.</w:t>
+      </w:r>
+      <w:bookmarkEnd w:id="1122"/>
+    </w:p>
+    <w:p>
+      <w:pPr>
+        <w:pStyle w:val="Normal"/>
+        <w:spacing w:line="360" w:lineRule="auto"/>
+        <w:jc w:val="left"/>
+        <w:ind w:left="720" w:hanging="720"/>
+        <w:keepLines w:val="1"/>
+      </w:pPr>
+      <w:bookmarkStart w:id="1123" w:name="bib_ref_39"/>
+      <w:r>
+        <w:t xml:space="preserve">[39] Rhasspy contributors, “Piper: A fast, local neural text to speech system,” repositorio de software. [Online]. Available: </w:t>
+      </w:r>
+      <w:hyperlink r:id="rIdBib44" w:history="1">
+        <w:r>
+          <w:t xml:space="preserve">https://github.com/rhasspy/piper</w:t>
+        </w:r>
+      </w:hyperlink>
+      <w:r>
+        <w:t xml:space="preserve">. Consultado: 20 oct. 2026.</w:t>
+      </w:r>
+      <w:bookmarkEnd w:id="1123"/>
+    </w:p>
+    <w:p>
+      <w:pPr>
+        <w:pStyle w:val="Normal"/>
+        <w:spacing w:line="360" w:lineRule="auto"/>
+        <w:jc w:val="left"/>
+        <w:ind w:left="720" w:hanging="720"/>
+        <w:keepLines w:val="1"/>
+      </w:pPr>
+      <w:bookmarkStart w:id="1124" w:name="bib_ref_40"/>
+      <w:r>
+        <w:t xml:space="preserve">[40] Google, “AudioTrack,” Android Developers. [Online]. Available: </w:t>
+      </w:r>
+      <w:hyperlink r:id="rIdBib45" w:history="1">
+        <w:r>
+          <w:t xml:space="preserve">https://developer.android.com/reference/android/media/AudioTrack</w:t>
+        </w:r>
+      </w:hyperlink>
+      <w:r>
+        <w:t xml:space="preserve">. Consultado: 20 oct. 2026.</w:t>
+      </w:r>
+      <w:bookmarkEnd w:id="1124"/>
+    </w:p>
+    <w:p>
+      <w:pPr>
+        <w:pStyle w:val="Normal"/>
+        <w:spacing w:line="360" w:lineRule="auto"/>
+        <w:jc w:val="left"/>
+        <w:ind w:left="720" w:hanging="720"/>
+        <w:keepLines w:val="1"/>
+      </w:pPr>
+      <w:bookmarkStart w:id="1125" w:name="bib_ref_41"/>
+      <w:r>
+        <w:t xml:space="preserve">[41] Google, “DataStore,” Android Developers. [Online]. Available: </w:t>
+      </w:r>
+      <w:hyperlink r:id="rIdBib46" w:history="1">
+        <w:r>
+          <w:t xml:space="preserve">https://developer.android.com/topic/libraries/architecture/datastore</w:t>
+        </w:r>
+      </w:hyperlink>
+      <w:r>
+        <w:t xml:space="preserve">. Consultado: 20 oct. 2026.</w:t>
+      </w:r>
+      <w:bookmarkEnd w:id="1125"/>
+    </w:p>
+    <w:p>
+      <w:pPr>
+        <w:pStyle w:val="Normal"/>
+        <w:spacing w:line="360" w:lineRule="auto"/>
+        <w:jc w:val="left"/>
+        <w:ind w:left="720" w:hanging="720"/>
+        <w:keepLines w:val="1"/>
+      </w:pPr>
+      <w:bookmarkStart w:id="1126" w:name="bib_ref_42"/>
+      <w:r>
+        <w:t xml:space="preserve">[42] NIST/SEMATECH, “Analysis of paired observations,” e-Handbook of Statistical Methods, sec. 7.3.1.1. [Online]. Available: </w:t>
+      </w:r>
+      <w:hyperlink r:id="rIdBib47" w:history="1">
+        <w:r>
+          <w:t xml:space="preserve">https://www.itl.nist.gov/div898/handbook/prc/section3/prc311.htm</w:t>
+        </w:r>
+      </w:hyperlink>
+      <w:r>
+        <w:t xml:space="preserve">. Consultado: 20 oct. 2026.</w:t>
+      </w:r>
+      <w:bookmarkEnd w:id="1126"/>
+    </w:p>
+    <w:p>
+      <w:pPr>
+        <w:pStyle w:val="Normal"/>
+        <w:spacing w:line="360" w:lineRule="auto"/>
+        <w:jc w:val="left"/>
+        <w:ind w:left="720" w:hanging="720"/>
+        <w:keepLines w:val="1"/>
+      </w:pPr>
+      <w:bookmarkStart w:id="1127" w:name="bib_ref_43"/>
+      <w:r>
+        <w:t xml:space="preserve">[43] B. Efron, “Bootstrap Methods: Another Look at the Jackknife,” The Annals of Statistics, vol. 7, no. 1, pp. 1–26, 1979. doi: </w:t>
+      </w:r>
+      <w:hyperlink r:id="rIdBib48" w:history="1">
+        <w:r>
+          <w:t xml:space="preserve">10.1214/aos/1176344552</w:t>
+        </w:r>
+      </w:hyperlink>
+      <w:r>
+        <w:t xml:space="preserve">.</w:t>
+      </w:r>
+      <w:bookmarkEnd w:id="1127"/>
+    </w:p>
+    <w:p>
+      <w:pPr>
+        <w:pStyle w:val="Normal"/>
+        <w:spacing w:line="360" w:lineRule="auto"/>
+        <w:jc w:val="left"/>
+        <w:ind w:left="720" w:hanging="720"/>
+        <w:keepLines w:val="1"/>
+      </w:pPr>
+      <w:bookmarkStart w:id="1128" w:name="bib_ref_44"/>
+      <w:r>
+        <w:t xml:space="preserve">[44] C. A. Field and A. H. Welsh, “Bootstrapping clustered data,” Journal of the Royal Statistical Society: Series B (Statistical Methodology), vol. 69, no. 3, pp. 369–390, 2007. doi: </w:t>
+      </w:r>
+      <w:hyperlink r:id="rIdBib49" w:history="1">
+        <w:r>
+          <w:t xml:space="preserve">10.1111/j.1467-9868.2007.00593.x</w:t>
+        </w:r>
+      </w:hyperlink>
+      <w:r>
+        <w:t xml:space="preserve">.</w:t>
+      </w:r>
+      <w:bookmarkEnd w:id="1128"/>
+    </w:p>
+    <w:p>
+      <w:pPr>
+        <w:pStyle w:val="Normal"/>
+        <w:spacing w:line="360" w:lineRule="auto"/>
+        <w:jc w:val="left"/>
+        <w:ind w:left="720" w:hanging="720"/>
+        <w:keepLines w:val="1"/>
+      </w:pPr>
+      <w:bookmarkStart w:id="1129" w:name="bib_ref_45"/>
+      <w:r>
+        <w:t xml:space="preserve">[45] R. Szeliski, “Computer Vision: Algorithms and Applications,” Springer-Verlag, Heidelberg, Berlin, 2010. [Online]. Available: </w:t>
       </w:r>
       <w:hyperlink r:id="rIdBib1" w:history="1">
         <w:r>
@@ -25601,7 +26878,7 @@
       <w:r>
         <w:t xml:space="preserve">.</w:t>
       </w:r>
-      <w:bookmarkEnd w:id="1085"/>
+      <w:bookmarkEnd w:id="1129"/>
     </w:p>
     <w:p>
       <w:pPr>
@@ -25609,20 +26886,21 @@
         <w:spacing w:line="360" w:lineRule="auto"/>
         <w:jc w:val="left"/>
         <w:ind w:left="720" w:hanging="720"/>
-      </w:pPr>
-      <w:bookmarkStart w:id="1086" w:name="bib_ref_2"/>
-      <w:r>
-        <w:t xml:space="preserve">[2] World Health Organization, “World report on vision,” Geneva, Switzerland: World Health Organization, 2019. [Online]. Available: </w:t>
-      </w:r>
-      <w:hyperlink r:id="rIdBib2" w:history="1">
+        <w:keepLines w:val="1"/>
+      </w:pPr>
+      <w:bookmarkStart w:id="1130" w:name="bib_ref_46"/>
+      <w:r>
+        <w:t xml:space="preserve">[46] Camera &amp; Imaging Products Association, Exif 2.31 metadata for XMP, borrador CIPA DC-X010-2017, 2017, campo FocalLengthIn35mmFilm. [Online]. Available: </w:t>
+      </w:r>
+      <w:hyperlink r:id="rIdBib50" w:history="1">
         <w:r>
-          <w:t xml:space="preserve">https://www.who.int/publications-detail/world-report-on-vision</w:t>
+          <w:t xml:space="preserve">https://www.cipa.jp/std/documents/e/DC-X010-2017.pdf</w:t>
         </w:r>
       </w:hyperlink>
       <w:r>
         <w:t xml:space="preserve">.</w:t>
       </w:r>
-      <w:bookmarkEnd w:id="1086"/>
+      <w:bookmarkEnd w:id="1130"/>
     </w:p>
     <w:p>
       <w:pPr>
@@ -25630,635 +26908,38 @@
         <w:spacing w:line="360" w:lineRule="auto"/>
         <w:jc w:val="left"/>
         <w:ind w:left="720" w:hanging="720"/>
-      </w:pPr>
-      <w:bookmarkStart w:id="1087" w:name="bib_ref_3"/>
-      <w:r>
-        <w:t xml:space="preserve">[3] TensorFlow, “TensorFlow Lite,” TensorFlow. [Online]. Available: </w:t>
-      </w:r>
-      <w:hyperlink r:id="rIdBib3" w:history="1">
+        <w:keepLines w:val="1"/>
+      </w:pPr>
+      <w:bookmarkStart w:id="1131" w:name="bib_ref_47"/>
+      <w:r>
+        <w:t xml:space="preserve">[47] NumPy developers, “numpy.quantile,” NumPy documentation. [Online]. Available: </w:t>
+      </w:r>
+      <w:hyperlink r:id="rIdBib51" w:history="1">
         <w:r>
-          <w:t xml:space="preserve">https://www.tensorflow.org/lite/guide</w:t>
+          <w:t xml:space="preserve">https://numpy.org/doc/stable/reference/generated/numpy.quantile.html</w:t>
         </w:r>
       </w:hyperlink>
       <w:r>
-        <w:t xml:space="preserve">.</w:t>
-      </w:r>
-      <w:bookmarkEnd w:id="1087"/>
-    </w:p>
-    <w:p>
-      <w:pPr>
-        <w:pStyle w:val="Normal"/>
-        <w:spacing w:line="360" w:lineRule="auto"/>
+        <w:t xml:space="preserve">. Consultado: 20 oct. 2026.</w:t>
+      </w:r>
+      <w:bookmarkEnd w:id="1131"/>
+    </w:p>
+    <w:p>
+      <w:pPr>
         <w:jc w:val="left"/>
-        <w:ind w:left="720" w:hanging="720"/>
-      </w:pPr>
-      <w:bookmarkStart w:id="1088" w:name="bib_ref_4"/>
-      <w:r>
-        <w:t xml:space="preserve">[4] S. Ren, K. He, R. Girshick, and J. Sun, “Faster R-CNN: Towards Real-Time Object Detection with Region Proposal Networks,” Jan. 06, 2016, </w:t>
-      </w:r>
-      <w:hyperlink r:id="rIdBib4" w:history="1">
+        <w:keepLines w:val="1"/>
+      </w:pPr>
+      <w:bookmarkStart w:id="1132" w:name="bib_ref_48"/>
+      <w:r>
+        <w:t xml:space="preserve">[48] Pillow contributors, “Image.convert and ImageStat,” Pillow documentation. [Online]. Available: </w:t>
+      </w:r>
+      <w:hyperlink r:id="rIdBib52" w:history="1">
         <w:r>
-          <w:t xml:space="preserve">arXiv:1506.01497</w:t>
+          <w:t xml:space="preserve">https://pillow.readthedocs.io/en/stable/reference/Image.html#PIL.Image.Image.convert</w:t>
         </w:r>
       </w:hyperlink>
       <w:r>
-        <w:t xml:space="preserve">. doi: </w:t>
-      </w:r>
-      <w:hyperlink r:id="rIdBib5" w:history="1">
-        <w:r>
-          <w:t xml:space="preserve">10.48550/arXiv.1506.01497</w:t>
-        </w:r>
-      </w:hyperlink>
-      <w:r>
-        <w:t xml:space="preserve">.</w:t>
-      </w:r>
-      <w:bookmarkEnd w:id="1088"/>
-    </w:p>
-    <w:p>
-      <w:pPr>
-        <w:pStyle w:val="Normal"/>
-        <w:spacing w:line="360" w:lineRule="auto"/>
-        <w:jc w:val="left"/>
-        <w:ind w:left="720" w:hanging="720"/>
-      </w:pPr>
-      <w:bookmarkStart w:id="1089" w:name="bib_ref_5"/>
-      <w:r>
-        <w:t xml:space="preserve">[5] J. Redmon, S. Divvala, R. Girshick, and A. Farhadi, “You Only Look Once: Unified, Real-Time Object Detection,” in 2016 IEEE Conference on Computer Vision and Pattern Recognition (CVPR), Jun. 2016, pp. 779–788. doi: </w:t>
-      </w:r>
-      <w:hyperlink r:id="rIdBib6" w:history="1">
-        <w:r>
-          <w:t xml:space="preserve">10.1109/CVPR.2016.91</w:t>
-        </w:r>
-      </w:hyperlink>
-      <w:r>
-        <w:t xml:space="preserve">.</w:t>
-      </w:r>
-      <w:bookmarkEnd w:id="1089"/>
-    </w:p>
-    <w:p>
-      <w:pPr>
-        <w:pStyle w:val="Normal"/>
-        <w:spacing w:line="360" w:lineRule="auto"/>
-        <w:jc w:val="left"/>
-        <w:ind w:left="720" w:hanging="720"/>
-      </w:pPr>
-      <w:bookmarkStart w:id="1090" w:name="bib_ref_6"/>
-      <w:r>
-        <w:t xml:space="preserve">[6] W. Liu et al., “SSD: Single Shot MultiBox Detector,” in Computer Vision – ECCV 2016, Cham: Springer International Publishing, 2016, pp. 21–37. doi: </w:t>
-      </w:r>
-      <w:hyperlink r:id="rIdBib7" w:history="1">
-        <w:r>
-          <w:t xml:space="preserve">10.1007/978-3-319-46448-0_2</w:t>
-        </w:r>
-      </w:hyperlink>
-      <w:r>
-        <w:t xml:space="preserve">.</w:t>
-      </w:r>
-      <w:bookmarkEnd w:id="1090"/>
-    </w:p>
-    <w:p>
-      <w:pPr>
-        <w:pStyle w:val="Normal"/>
-        <w:spacing w:line="360" w:lineRule="auto"/>
-        <w:jc w:val="left"/>
-        <w:ind w:left="720" w:hanging="720"/>
-      </w:pPr>
-      <w:bookmarkStart w:id="1091" w:name="bib_ref_7"/>
-      <w:r>
-        <w:t xml:space="preserve">[7] M. Tan, R. Pang, and Q. V. Le, “EfficientDet: Scalable and Efficient Object Detection,” in 2020 IEEE/CVF Conference on Computer Vision and Pattern Recognition (CVPR), Jun. 2020, pp. 10781–10790. doi: </w:t>
-      </w:r>
-      <w:hyperlink r:id="rIdBib8" w:history="1">
-        <w:r>
-          <w:t xml:space="preserve">10.1109/CVPR42600.2020.01079</w:t>
-        </w:r>
-      </w:hyperlink>
-      <w:r>
-        <w:t xml:space="preserve">.</w:t>
-      </w:r>
-      <w:bookmarkEnd w:id="1091"/>
-    </w:p>
-    <w:p>
-      <w:pPr>
-        <w:pStyle w:val="Normal"/>
-        <w:spacing w:line="360" w:lineRule="auto"/>
-        <w:jc w:val="left"/>
-        <w:ind w:left="720" w:hanging="720"/>
-      </w:pPr>
-      <w:bookmarkStart w:id="1092" w:name="bib_ref_8"/>
-      <w:r>
-        <w:t xml:space="preserve">[8] S. S. More, N. Patil, V. B. Lobo, N. Shet, D. Goswami, and P. Rane, “Empowering the Visually Impaired: YOLOv8-based Object Detection in Android Applications,” Procedia Computer Science, vol. 252, pp. 457–469, 2025. doi: </w:t>
-      </w:r>
-      <w:hyperlink r:id="rIdBib9" w:history="1">
-        <w:r>
-          <w:t xml:space="preserve">10.1016/j.procs.2025.01.054</w:t>
-        </w:r>
-      </w:hyperlink>
-      <w:r>
-        <w:t xml:space="preserve">.</w:t>
-      </w:r>
-      <w:bookmarkEnd w:id="1092"/>
-    </w:p>
-    <w:p>
-      <w:pPr>
-        <w:pStyle w:val="Normal"/>
-        <w:spacing w:line="360" w:lineRule="auto"/>
-        <w:jc w:val="left"/>
-        <w:ind w:left="720" w:hanging="720"/>
-      </w:pPr>
-      <w:bookmarkStart w:id="1093" w:name="bib_ref_9"/>
-      <w:r>
-        <w:t xml:space="preserve">[9] Universidad del Magdalena, “Plan de Desarrollo UNIMAGDALENA Comprometida 2020–2030,” Santa Marta, Colombia, 2020.</w:t>
-      </w:r>
-      <w:bookmarkEnd w:id="1093"/>
-    </w:p>
-    <w:p>
-      <w:pPr>
-        <w:pStyle w:val="Normal"/>
-        <w:spacing w:line="360" w:lineRule="auto"/>
-        <w:jc w:val="left"/>
-        <w:ind w:left="720" w:hanging="720"/>
-      </w:pPr>
-      <w:bookmarkStart w:id="1094" w:name="bib_ref_10"/>
-      <w:r>
-        <w:t xml:space="preserve">[10] Universidad del Magdalena, “Plan de Gobierno Rectoral 2024–2028,” Santa Marta, Colombia, 2024.</w:t>
-      </w:r>
-      <w:bookmarkEnd w:id="1094"/>
-    </w:p>
-    <w:p>
-      <w:pPr>
-        <w:pStyle w:val="Normal"/>
-        <w:spacing w:line="360" w:lineRule="auto"/>
-        <w:jc w:val="left"/>
-        <w:ind w:left="720" w:hanging="720"/>
-      </w:pPr>
-      <w:bookmarkStart w:id="1095" w:name="bib_ref_11"/>
-      <w:r>
-        <w:t xml:space="preserve">[11] R. Meenakshi, R. Ponnusamy, S. Alghamdi, O. I. Khalaf, and Y. Alotaibi, “Development of Mobile App to Support the Mobility of Visually Impaired People,” Computers, Materials &amp; Continua, vol. 73, no. 2, pp. 3473–3495, 2022. doi: </w:t>
-      </w:r>
-      <w:hyperlink r:id="rIdBib10" w:history="1">
-        <w:r>
-          <w:t xml:space="preserve">10.32604/cmc.2022.028540</w:t>
-        </w:r>
-      </w:hyperlink>
-      <w:r>
-        <w:t xml:space="preserve">.</w:t>
-      </w:r>
-      <w:bookmarkEnd w:id="1095"/>
-    </w:p>
-    <w:p>
-      <w:pPr>
-        <w:pStyle w:val="Normal"/>
-        <w:spacing w:line="360" w:lineRule="auto"/>
-        <w:jc w:val="left"/>
-        <w:ind w:left="720" w:hanging="720"/>
-      </w:pPr>
-      <w:bookmarkStart w:id="1096" w:name="bib_ref_12"/>
-      <w:r>
-        <w:t xml:space="preserve">[12] K. Guravaiah, Y. S. Bhavadeesha, P. Shwejana, A. H. Vardhan, and L. Saa, “Third Eye: Object Recognition and Speech Generation for Visually Impaired,” Procedia Computer Science, vol. 218, pp. 1144–1155, 2023. doi: </w:t>
-      </w:r>
-      <w:hyperlink r:id="rIdBib11" w:history="1">
-        <w:r>
-          <w:t xml:space="preserve">10.1016/j.procs.2023.01.093</w:t>
-        </w:r>
-      </w:hyperlink>
-      <w:r>
-        <w:t xml:space="preserve">.</w:t>
-      </w:r>
-      <w:bookmarkEnd w:id="1096"/>
-    </w:p>
-    <w:p>
-      <w:pPr>
-        <w:pStyle w:val="Normal"/>
-        <w:spacing w:line="360" w:lineRule="auto"/>
-        <w:jc w:val="left"/>
-        <w:ind w:left="720" w:hanging="720"/>
-      </w:pPr>
-      <w:bookmarkStart w:id="1097" w:name="bib_ref_13"/>
-      <w:r>
-        <w:t xml:space="preserve">[13] T.-Y. Lin et al., “Microsoft COCO: Common Objects in Context,” in Computer Vision – ECCV 2014, Cham: Springer International Publishing, 2014, pp. 740–755. doi: </w:t>
-      </w:r>
-      <w:hyperlink r:id="rIdBib12" w:history="1">
-        <w:r>
-          <w:t xml:space="preserve">10.1007/978-3-319-10602-1_48</w:t>
-        </w:r>
-      </w:hyperlink>
-      <w:r>
-        <w:t xml:space="preserve">.</w:t>
-      </w:r>
-      <w:bookmarkEnd w:id="1097"/>
-    </w:p>
-    <w:p>
-      <w:pPr>
-        <w:pStyle w:val="Normal"/>
-        <w:spacing w:line="360" w:lineRule="auto"/>
-        <w:jc w:val="left"/>
-        <w:ind w:left="720" w:hanging="720"/>
-      </w:pPr>
-      <w:bookmarkStart w:id="1098" w:name="bib_ref_14"/>
-      <w:r>
-        <w:t xml:space="preserve">[14] D. R. Pawar, “Deep Learning-Driven Assistive Technology for Blind Users: Real-Time Object Detection and Speech Feedback on Android,” 2025.</w:t>
-      </w:r>
-      <w:bookmarkEnd w:id="1098"/>
-    </w:p>
-    <w:p>
-      <w:pPr>
-        <w:pStyle w:val="Normal"/>
-        <w:spacing w:line="360" w:lineRule="auto"/>
-        <w:jc w:val="left"/>
-        <w:ind w:left="720" w:hanging="720"/>
-      </w:pPr>
-      <w:bookmarkStart w:id="1099" w:name="bib_ref_15"/>
-      <w:r>
-        <w:t xml:space="preserve">[15] J. Figura, R. Kuźmiczuk, and M. Badurowicz, “Analysis of object recognition systems using augmented reality glasses,” Journal of Computer Sciences Institute, vol. 34, pp. 8–13, 2025.</w:t>
-      </w:r>
-      <w:bookmarkEnd w:id="1099"/>
-    </w:p>
-    <w:p>
-      <w:pPr>
-        <w:pStyle w:val="Normal"/>
-        <w:spacing w:line="360" w:lineRule="auto"/>
-        <w:jc w:val="left"/>
-        <w:ind w:left="720" w:hanging="720"/>
-      </w:pPr>
-      <w:bookmarkStart w:id="1100" w:name="bib_ref_16"/>
-      <w:r>
-        <w:t xml:space="preserve">[16] A. G. Howard, M. Zhu, B. Chen, D. Kalenichenko, W. Wang, T. Weyand, M. Andreetto, and H. Adam, “MobileNets: Efficient Convolutional Neural Networks for Mobile Vision Applications,” </w:t>
-      </w:r>
-      <w:hyperlink r:id="rIdBib13" w:history="1">
-        <w:r>
-          <w:t xml:space="preserve">arXiv:1704.04861</w:t>
-        </w:r>
-      </w:hyperlink>
-      <w:r>
-        <w:t xml:space="preserve">, 2017.</w:t>
-      </w:r>
-      <w:bookmarkEnd w:id="1100"/>
-    </w:p>
-    <w:p>
-      <w:pPr>
-        <w:pStyle w:val="Normal"/>
-        <w:spacing w:line="360" w:lineRule="auto"/>
-        <w:jc w:val="left"/>
-        <w:ind w:left="720" w:hanging="720"/>
-      </w:pPr>
-      <w:bookmarkStart w:id="1101" w:name="bib_ref_17"/>
-      <w:r>
-        <w:t xml:space="preserve">[17] M. Sandler, A. Howard, M. Zhu, A. Zhmoginov, and L.-C. Chen, “MobileNetV2: Inverted Residuals and Linear Bottlenecks,” in 2018 IEEE/CVF Conference on Computer Vision and Pattern Recognition (CVPR), Jun. 2018, pp. 4510–4520. doi: </w:t>
-      </w:r>
-      <w:hyperlink r:id="rIdBib14" w:history="1">
-        <w:r>
-          <w:t xml:space="preserve">10.1109/CVPR.2018.00474</w:t>
-        </w:r>
-      </w:hyperlink>
-      <w:r>
-        <w:t xml:space="preserve">.</w:t>
-      </w:r>
-      <w:bookmarkEnd w:id="1101"/>
-    </w:p>
-    <w:p>
-      <w:pPr>
-        <w:pStyle w:val="Normal"/>
-        <w:spacing w:line="360" w:lineRule="auto"/>
-        <w:jc w:val="left"/>
-        <w:ind w:left="720" w:hanging="720"/>
-      </w:pPr>
-      <w:bookmarkStart w:id="1102" w:name="bib_ref_18"/>
-      <w:r>
-        <w:t xml:space="preserve">[18] J. Dai, “Real-time and accurate object detection on edge device with TensorFlow Lite,” Journal of Physics: Conference Series, vol. 1651, no. 1, Art. no. 012114, 2020. doi: </w:t>
-      </w:r>
-      <w:hyperlink r:id="rIdBib15" w:history="1">
-        <w:r>
-          <w:t xml:space="preserve">10.1088/1742-6596/1651/1/012114</w:t>
-        </w:r>
-      </w:hyperlink>
-      <w:r>
-        <w:t xml:space="preserve">.</w:t>
-      </w:r>
-      <w:bookmarkEnd w:id="1102"/>
-    </w:p>
-    <w:p>
-      <w:pPr>
-        <w:pStyle w:val="Normal"/>
-        <w:spacing w:line="360" w:lineRule="auto"/>
-        <w:jc w:val="left"/>
-        <w:ind w:left="720" w:hanging="720"/>
-      </w:pPr>
-      <w:bookmarkStart w:id="1103" w:name="bib_ref_19"/>
-      <w:r>
-        <w:t xml:space="preserve">[19] A. Magdy, M. S. Moustafa, H. M. Ebied, and M. F. Tolba, “Lightweight faster R-CNN for object detection in optical remote sensing images,” Scientific Reports, vol. 15, Art. no. 16163, 2025. doi: </w:t>
-      </w:r>
-      <w:hyperlink r:id="rIdBib16" w:history="1">
-        <w:r>
-          <w:t xml:space="preserve">10.1038/s41598-025-99242-y</w:t>
-        </w:r>
-      </w:hyperlink>
-      <w:r>
-        <w:t xml:space="preserve">.</w:t>
-      </w:r>
-      <w:bookmarkEnd w:id="1103"/>
-    </w:p>
-    <w:p>
-      <w:pPr>
-        <w:pStyle w:val="Normal"/>
-        <w:spacing w:line="360" w:lineRule="auto"/>
-        <w:jc w:val="left"/>
-        <w:ind w:left="720" w:hanging="720"/>
-      </w:pPr>
-      <w:bookmarkStart w:id="1104" w:name="bib_ref_20"/>
-      <w:r>
-        <w:t xml:space="preserve">[20] A. Kuznetsova et al., “The Open Images Dataset V4: Unified image classification, object detection, and visual relationship detection at scale,” International Journal of Computer Vision, vol. 128, pp. 1956–1981, 2020. doi: </w:t>
-      </w:r>
-      <w:hyperlink r:id="rIdBib17" w:history="1">
-        <w:r>
-          <w:t xml:space="preserve">10.1007/s11263-020-01316-z</w:t>
-        </w:r>
-      </w:hyperlink>
-      <w:r>
-        <w:t xml:space="preserve">.</w:t>
-      </w:r>
-      <w:bookmarkEnd w:id="1104"/>
-    </w:p>
-    <w:p>
-      <w:pPr>
-        <w:pStyle w:val="Normal"/>
-        <w:spacing w:line="360" w:lineRule="auto"/>
-        <w:jc w:val="left"/>
-        <w:ind w:left="720" w:hanging="720"/>
-      </w:pPr>
-      <w:bookmarkStart w:id="1105" w:name="bib_ref_21"/>
-      <w:r>
-        <w:t xml:space="preserve">[21] “ONNX Runtime,” ONNX Runtime. [Online]. Available: </w:t>
-      </w:r>
-      <w:hyperlink r:id="rIdBib18" w:history="1">
-        <w:r>
-          <w:t xml:space="preserve">https://onnxruntime.ai/docs/</w:t>
-        </w:r>
-      </w:hyperlink>
-      <w:r>
-        <w:t xml:space="preserve">.</w:t>
-      </w:r>
-      <w:bookmarkEnd w:id="1105"/>
-    </w:p>
-    <w:p>
-      <w:pPr>
-        <w:pStyle w:val="Normal"/>
-        <w:spacing w:line="360" w:lineRule="auto"/>
-        <w:jc w:val="left"/>
-        <w:ind w:left="720" w:hanging="720"/>
-      </w:pPr>
-      <w:bookmarkStart w:id="1106" w:name="bib_ref_22"/>
-      <w:r>
-        <w:t xml:space="preserve">[22] “ExecuTorch Documentation,” PyTorch. [Online]. Available: </w:t>
-      </w:r>
-      <w:hyperlink r:id="rIdBib19" w:history="1">
-        <w:r>
-          <w:t xml:space="preserve">https://pytorch.org/executorch/stable/</w:t>
-        </w:r>
-      </w:hyperlink>
-      <w:r>
-        <w:t xml:space="preserve">.</w:t>
-      </w:r>
-      <w:bookmarkEnd w:id="1106"/>
-    </w:p>
-    <w:p>
-      <w:pPr>
-        <w:pStyle w:val="Normal"/>
-        <w:spacing w:line="360" w:lineRule="auto"/>
-        <w:jc w:val="left"/>
-        <w:ind w:left="720" w:hanging="720"/>
-      </w:pPr>
-      <w:bookmarkStart w:id="1107" w:name="bib_ref_23"/>
-      <w:r>
-        <w:t xml:space="preserve">[23] N. Carion, F. Massa, G. Synnaeve, N. Usunier, A. Kirillov, and S. Zagoruyko, “End-to-End Object Detection with Transformers,” in Computer Vision – ECCV 2020, Cham: Springer International Publishing, 2020, pp. 213–229. doi: </w:t>
-      </w:r>
-      <w:hyperlink r:id="rIdBib20" w:history="1">
-        <w:r>
-          <w:t xml:space="preserve">10.1007/978-3-030-58452-8_13</w:t>
-        </w:r>
-      </w:hyperlink>
-      <w:r>
-        <w:t xml:space="preserve">.</w:t>
-      </w:r>
-      <w:bookmarkEnd w:id="1107"/>
-    </w:p>
-    <w:p>
-      <w:pPr>
-        <w:pStyle w:val="Normal"/>
-        <w:spacing w:line="360" w:lineRule="auto"/>
-        <w:jc w:val="left"/>
-        <w:ind w:left="720" w:hanging="720"/>
-      </w:pPr>
-      <w:bookmarkStart w:id="1108" w:name="bib_ref_24"/>
-      <w:r>
-        <w:t xml:space="preserve">[24] Google, “Benchmark CompiledModel API,” Google AI Edge. [Online]. Available: </w:t>
-      </w:r>
-      <w:hyperlink r:id="rIdBib21" w:history="1">
-        <w:r>
-          <w:t xml:space="preserve">https://developers.google.com/edge/litert/next/benchmark</w:t>
-        </w:r>
-      </w:hyperlink>
-      <w:r>
-        <w:t xml:space="preserve">.</w:t>
-      </w:r>
-      <w:bookmarkEnd w:id="1108"/>
-    </w:p>
-    <w:p>
-      <w:pPr>
-        <w:pStyle w:val="Normal"/>
-        <w:spacing w:line="360" w:lineRule="auto"/>
-        <w:jc w:val="left"/>
-        <w:ind w:left="720" w:hanging="720"/>
-      </w:pPr>
-      <w:bookmarkStart w:id="1109" w:name="bib_ref_25"/>
-      <w:r>
-        <w:t xml:space="preserve">[25] Android Developers, “Android Debug Bridge (adb),” Android Studio. [Online]. Available: </w:t>
-      </w:r>
-      <w:hyperlink r:id="rIdBib22" w:history="1">
-        <w:r>
-          <w:t xml:space="preserve">https://developer.android.com/tools/adb</w:t>
-        </w:r>
-      </w:hyperlink>
-      <w:r>
-        <w:t xml:space="preserve">.</w:t>
-      </w:r>
-      <w:bookmarkEnd w:id="1109"/>
-    </w:p>
-    <w:p>
-      <w:pPr>
-        <w:pStyle w:val="Normal"/>
-        <w:spacing w:line="360" w:lineRule="auto"/>
-        <w:jc w:val="left"/>
-        <w:ind w:left="720" w:hanging="720"/>
-      </w:pPr>
-      <w:bookmarkStart w:id="1110" w:name="bib_ref_26"/>
-      <w:r>
-        <w:t xml:space="preserve">[26] Google, “GPU acceleration delegate with Interpreter API,” Google AI Edge. [Online]. Available: </w:t>
-      </w:r>
-      <w:hyperlink r:id="rIdBib23" w:history="1">
-        <w:r>
-          <w:t xml:space="preserve">https://developers.google.com/edge/litert/android/gpu</w:t>
-        </w:r>
-      </w:hyperlink>
-      <w:r>
-        <w:t xml:space="preserve">.</w:t>
-      </w:r>
-      <w:bookmarkEnd w:id="1110"/>
-    </w:p>
-    <w:p>
-      <w:pPr>
-        <w:pStyle w:val="Normal"/>
-        <w:spacing w:line="360" w:lineRule="auto"/>
-        <w:jc w:val="left"/>
-        <w:ind w:left="720" w:hanging="720"/>
-      </w:pPr>
-      <w:bookmarkStart w:id="1111" w:name="bib_ref_27"/>
-      <w:r>
-        <w:t xml:space="preserve">[27] Roboflow, “Roboflow: Computer vision tools for developers and enterprises.” [Online]. Available: </w:t>
-      </w:r>
-      <w:hyperlink r:id="rIdBib24" w:history="1">
-        <w:r>
-          <w:t xml:space="preserve">https://roboflow.com/</w:t>
-        </w:r>
-      </w:hyperlink>
-      <w:r>
-        <w:t xml:space="preserve">.</w:t>
-      </w:r>
-      <w:bookmarkEnd w:id="1111"/>
-    </w:p>
-    <w:p>
-      <w:pPr>
-        <w:pStyle w:val="Normal"/>
-        <w:spacing w:line="360" w:lineRule="auto"/>
-        <w:jc w:val="left"/>
-        <w:ind w:left="720" w:hanging="720"/>
-      </w:pPr>
-      <w:bookmarkStart w:id="1112" w:name="bib_ref_28"/>
-      <w:r>
-        <w:t xml:space="preserve">[28] Khronos Group, “OpenCL – The Open Standard for Parallel Programming of Heterogeneous Systems.” [Online]. Available: </w:t>
-      </w:r>
-      <w:hyperlink r:id="rIdBib25" w:history="1">
-        <w:r>
-          <w:t xml:space="preserve">https://www.khronos.org/opencl/</w:t>
-        </w:r>
-      </w:hyperlink>
-      <w:r>
-        <w:t xml:space="preserve">.</w:t>
-      </w:r>
-      <w:bookmarkEnd w:id="1112"/>
-    </w:p>
-    <w:p>
-      <w:pPr>
-        <w:pStyle w:val="Normal"/>
-        <w:spacing w:line="360" w:lineRule="auto"/>
-        <w:jc w:val="left"/>
-        <w:ind w:left="720" w:hanging="720"/>
-      </w:pPr>
-      <w:bookmarkStart w:id="1113" w:name="bib_ref_29"/>
-      <w:r>
-        <w:t xml:space="preserve">[29] Google, “CameraX,” Android Developers. [Online]. Available: </w:t>
-      </w:r>
-      <w:hyperlink r:id="rIdBib26" w:history="1">
-        <w:r>
-          <w:t xml:space="preserve">https://developer.android.com/media/camera/camerax</w:t>
-        </w:r>
-      </w:hyperlink>
-      <w:r>
-        <w:t xml:space="preserve">.</w:t>
-      </w:r>
-      <w:bookmarkEnd w:id="1113"/>
-    </w:p>
-    <w:p>
-      <w:pPr>
-        <w:pStyle w:val="Normal"/>
-        <w:spacing w:line="360" w:lineRule="auto"/>
-        <w:jc w:val="left"/>
-        <w:ind w:left="720" w:hanging="720"/>
-      </w:pPr>
-      <w:bookmarkStart w:id="1114" w:name="bib_ref_30"/>
-      <w:r>
-        <w:t xml:space="preserve">[30] Google, “TextToSpeech,” Android Developers. [Online]. Available: </w:t>
-      </w:r>
-      <w:hyperlink r:id="rIdBib27" w:history="1">
-        <w:r>
-          <w:t xml:space="preserve">https://developer.android.com/reference/android/speech/tts/TextToSpeech</w:t>
-        </w:r>
-      </w:hyperlink>
-      <w:r>
-        <w:t xml:space="preserve">.</w:t>
-      </w:r>
-      <w:bookmarkEnd w:id="1114"/>
-    </w:p>
-    <w:p>
-      <w:pPr>
-        <w:jc w:val="left"/>
-      </w:pPr>
-      <w:bookmarkStart w:id="1115" w:name="bib_ref_31"/>
-      <w:r>
-        <w:t xml:space="preserve">[31] k2-fsa, “Text-to-speech,” sherpa-onnx documentation. [Online]. Available: </w:t>
-      </w:r>
-      <w:hyperlink r:id="rIdBib28" w:history="1">
-        <w:r>
-          <w:t xml:space="preserve">https://k2-fsa.github.io/sherpa/onnx/tts/index.html</w:t>
-        </w:r>
-      </w:hyperlink>
-      <w:r>
-        <w:t xml:space="preserve">. Consultado: 14 oct. 2026.</w:t>
-      </w:r>
-      <w:bookmarkEnd w:id="1115"/>
-    </w:p>
-    <w:p>
-      <w:pPr>
-        <w:jc w:val="left"/>
-      </w:pPr>
-      <w:bookmarkStart w:id="1116" w:name="bib_ref_32"/>
-      <w:r>
-        <w:t xml:space="preserve">[32] Google, “LiteRT for Android,” Google AI Edge. [Online]. Available: </w:t>
-      </w:r>
-      <w:hyperlink r:id="rIdBib29" w:history="1">
-        <w:r>
-          <w:t xml:space="preserve">https://developers.google.com/edge/litert/android</w:t>
-        </w:r>
-      </w:hyperlink>
-      <w:r>
-        <w:t xml:space="preserve">. Consultado: 14 oct. 2026.</w:t>
-      </w:r>
-      <w:bookmarkEnd w:id="1116"/>
-    </w:p>
-    <w:p>
-      <w:pPr>
-        <w:jc w:val="left"/>
-      </w:pPr>
-      <w:bookmarkStart w:id="1117" w:name="bib_ref_33"/>
-      <w:r>
-        <w:t xml:space="preserve">[33] D. Cerda, “AssistiveVision,” código fuente, revisión 85c852ddcb543bce1bd69ad0db307f895d597881. [Online]. Available: </w:t>
-      </w:r>
-      <w:hyperlink r:id="rIdBib30" w:history="1">
-        <w:r>
-          <w:t xml:space="preserve">https://github.com/diomedescerda/AssistiveVision</w:t>
-        </w:r>
-      </w:hyperlink>
-      <w:r>
-        <w:t xml:space="preserve">.</w:t>
-      </w:r>
-      <w:bookmarkEnd w:id="1117"/>
-    </w:p>
-    <w:p>
-      <w:pPr>
-        <w:jc w:val="left"/>
-      </w:pPr>
-      <w:bookmarkStart w:id="1118" w:name="bib_ref_34"/>
-      <w:r>
-        <w:t>[34] D. F. Cerda Leon, “Sistema de identificación y localización espacial de objetos basado en visión por computador para asistencia a personas con discapacidad visual,” Propuesta de pasantía en investigación, Universidad del Magdalena, documento del proyecto. Disponible en Documents/Propuesta Pasantia de Investigación - Diomedes Cerda.pdf.</w:t>
-      </w:r>
-      <w:bookmarkEnd w:id="1118"/>
-    </w:p>
-    <w:p>
-      <w:pPr>
-        <w:jc w:val="left"/>
-      </w:pPr>
-      <w:bookmarkStart w:id="1119" w:name="bib_ref_35"/>
-      <w:r>
-        <w:t xml:space="preserve">[35] Pillow contributors, “ImageStat module,” Pillow documentation. [Online]. Available: </w:t>
+        <w:t xml:space="preserve"> and </w:t>
       </w:r>
       <w:hyperlink r:id="rIdBib31" w:history="1">
         <w:r>
@@ -26266,9 +26947,31 @@
         </w:r>
       </w:hyperlink>
       <w:r>
-        <w:t xml:space="preserve">. El análisis utiliza conversión RGB a L y media de píxeles.</w:t>
-      </w:r>
-      <w:bookmarkEnd w:id="1119"/>
+        <w:t xml:space="preserve">. Consultado: 20 oct. 2026.</w:t>
+      </w:r>
+      <w:bookmarkEnd w:id="1132"/>
+    </w:p>
+    <w:p>
+      <w:pPr>
+        <w:pStyle w:val="Normal"/>
+        <w:spacing w:line="360" w:lineRule="auto"/>
+        <w:jc w:val="left"/>
+        <w:ind w:left="720" w:hanging="720"/>
+        <w:keepLines w:val="1"/>
+      </w:pPr>
+      <w:bookmarkStart w:id="1133" w:name="bib_ref_49"/>
+      <w:r>
+        <w:t xml:space="preserve">[49] J. D. Hunter, “Matplotlib: A 2D Graphics Environment,” Computing in Science &amp; Engineering, vol. 9, no. 3, pp. 90–95, 2007. doi: </w:t>
+      </w:r>
+      <w:hyperlink r:id="rIdBib53" w:history="1">
+        <w:r>
+          <w:t xml:space="preserve">10.1109/MCSE.2007.55</w:t>
+        </w:r>
+      </w:hyperlink>
+      <w:r>
+        <w:t xml:space="preserve">.</w:t>
+      </w:r>
+      <w:bookmarkEnd w:id="1133"/>
     </w:p>
     <w:sectPr>
       <w:headerReference w:type="even" r:id="rId41"/>

</xml_diff>

<commit_message>
Completa preliminares y cierra edición del informe para presentación
</commit_message>
<xml_diff>
--- a/Documents/Informe_Final_Trabajo_de_Grado_AssistiveVision.docx
+++ b/Documents/Informe_Final_Trabajo_de_Grado_AssistiveVision.docx
@@ -693,7 +693,7 @@
           <w:rFonts w:cs="Arial"/>
           <w:szCs w:val="22"/>
         </w:rPr>
-        <w:t>[PENDIENTE: línea de investigación]</w:t>
+        <w:t>Inteligencia artificial y visión por computador aplicadas a tecnologías de asistencia</w:t>
       </w:r>
     </w:p>
     <w:p>
@@ -846,7 +846,7 @@
           <w:headerReference w:type="even" r:id="rId10"/>
           <w:headerReference w:type="default" r:id="rId11"/>
           <w:headerReference w:type="first" r:id="rId12"/>
-          <w:type w:val="oddPage"/>
+          <w:type w:val="nextPage"/>
           <w:pgSz w:w="12240" w:h="15840" w:code="1"/>
           <w:pgMar w:top="1440" w:right="1440" w:bottom="1440" w:left="2041" w:header="709" w:footer="709" w:gutter="0"/>
           <w:pgNumType w:fmt="upperRoman"/>
@@ -865,355 +865,6 @@
     </w:p>
     <w:p>
       <w:pPr>
-        <w:pStyle w:val="Ttulo"/>
-        <w:jc w:val="left"/>
-        <w:rPr>
-          <w:b w:val="0"/>
-        </w:rPr>
-      </w:pPr>
-      <w:r>
-        <w:lastRenderedPageBreak/>
-        <w:t>Nota</w:t>
-      </w:r>
-      <w:r>
-        <w:t xml:space="preserve"> de aceptación:</w:t>
-      </w:r>
-    </w:p>
-    <w:p>
-      <w:pPr>
-        <w:spacing w:after="0"/>
-        <w:ind w:left="4253"/>
-        <w:rPr>
-          <w:b/>
-        </w:rPr>
-      </w:pPr>
-      <w:r>
-        <w:rPr>
-          <w:b/>
-        </w:rPr>
-        <w:t>Aprobado por el Consejo de Programa en cumplimiento de los requisitos exigidos por la Universidad del Magdalena para optar al título de Ingeniero de Sistemas</w:t>
-      </w:r>
-    </w:p>
-    <w:p>
-      <w:pPr>
-        <w:spacing w:after="0"/>
-        <w:ind w:left="4253"/>
-      </w:pPr>
-    </w:p>
-    <w:p>
-      <w:pPr>
-        <w:spacing w:after="0"/>
-        <w:ind w:left="4253"/>
-      </w:pPr>
-    </w:p>
-    <w:p>
-      <w:pPr>
-        <w:spacing w:after="0"/>
-        <w:ind w:left="4253"/>
-      </w:pPr>
-    </w:p>
-    <w:p>
-      <w:pPr>
-        <w:spacing w:after="0"/>
-        <w:ind w:left="4253"/>
-      </w:pPr>
-    </w:p>
-    <w:p>
-      <w:pPr>
-        <w:spacing w:after="0"/>
-        <w:ind w:left="4253"/>
-      </w:pPr>
-    </w:p>
-    <w:p>
-      <w:pPr>
-        <w:spacing w:after="0"/>
-        <w:ind w:left="4253"/>
-      </w:pPr>
-    </w:p>
-    <w:p>
-      <w:pPr>
-        <w:spacing w:after="0"/>
-        <w:ind w:left="4253"/>
-      </w:pPr>
-    </w:p>
-    <w:p>
-      <w:pPr>
-        <w:spacing w:after="0"/>
-        <w:ind w:left="4253"/>
-      </w:pPr>
-    </w:p>
-    <w:p>
-      <w:pPr>
-        <w:spacing w:after="0"/>
-        <w:ind w:left="4253"/>
-        <w:rPr>
-          <w:b/>
-        </w:rPr>
-      </w:pPr>
-    </w:p>
-    <w:tbl>
-      <w:tblPr>
-        <w:tblStyle w:val="Tablaconcuadrcula"/>
-        <w:tblW w:w="0" w:type="auto"/>
-        <w:tblInd w:w="4253" w:type="dxa"/>
-        <w:tblBorders>
-          <w:top w:val="none" w:sz="0" w:space="0" w:color="auto"/>
-          <w:left w:val="none" w:sz="0" w:space="0" w:color="auto"/>
-          <w:bottom w:val="none" w:sz="0" w:space="0" w:color="auto"/>
-          <w:right w:val="none" w:sz="0" w:space="0" w:color="auto"/>
-          <w:insideH w:val="single" w:sz="4" w:space="0" w:color="auto"/>
-          <w:insideV w:val="none" w:sz="0" w:space="0" w:color="auto"/>
-        </w:tblBorders>
-        <w:tblLook w:val="04A0" w:firstRow="1" w:lastRow="0" w:firstColumn="1" w:lastColumn="0" w:noHBand="0" w:noVBand="1"/>
-      </w:tblPr>
-      <w:tblGrid>
-        <w:gridCol w:w="4506"/>
-      </w:tblGrid>
-      <w:tr>
-        <w:tc>
-          <w:tcPr>
-            <w:tcW w:w="4585" w:type="dxa"/>
-            <w:tcMar>
-              <w:left w:w="0" w:type="dxa"/>
-              <w:right w:w="0" w:type="dxa"/>
-            </w:tcMar>
-            <w:vAlign w:val="center"/>
-          </w:tcPr>
-          <w:p>
-            <w:pPr>
-              <w:rPr>
-                <w:b/>
-              </w:rPr>
-            </w:pPr>
-          </w:p>
-        </w:tc>
-      </w:tr>
-      <w:tr>
-        <w:tc>
-          <w:tcPr>
-            <w:tcW w:w="4585" w:type="dxa"/>
-            <w:tcMar>
-              <w:left w:w="0" w:type="dxa"/>
-              <w:right w:w="0" w:type="dxa"/>
-            </w:tcMar>
-            <w:vAlign w:val="center"/>
-          </w:tcPr>
-          <w:p>
-            <w:r>
-              <w:rPr>
-                <w:b/>
-              </w:rPr>
-              <w:t>Jurado</w:t>
-            </w:r>
-          </w:p>
-        </w:tc>
-      </w:tr>
-    </w:tbl>
-    <w:p>
-      <w:pPr>
-        <w:spacing w:after="0"/>
-        <w:ind w:left="4253"/>
-      </w:pPr>
-    </w:p>
-    <w:p>
-      <w:pPr>
-        <w:spacing w:after="0"/>
-        <w:ind w:left="4253"/>
-      </w:pPr>
-    </w:p>
-    <w:p>
-      <w:pPr>
-        <w:spacing w:after="0"/>
-        <w:ind w:left="4253"/>
-      </w:pPr>
-    </w:p>
-    <w:p>
-      <w:pPr>
-        <w:spacing w:after="0"/>
-        <w:ind w:left="4253"/>
-      </w:pPr>
-    </w:p>
-    <w:p>
-      <w:pPr>
-        <w:spacing w:after="0"/>
-        <w:ind w:left="4253"/>
-      </w:pPr>
-    </w:p>
-    <w:p>
-      <w:pPr>
-        <w:spacing w:after="0"/>
-        <w:ind w:left="4253"/>
-      </w:pPr>
-    </w:p>
-    <w:p>
-      <w:pPr>
-        <w:spacing w:after="0"/>
-        <w:ind w:left="4253"/>
-      </w:pPr>
-    </w:p>
-    <w:p>
-      <w:pPr>
-        <w:ind w:left="4253"/>
-      </w:pPr>
-    </w:p>
-    <w:tbl>
-      <w:tblPr>
-        <w:tblStyle w:val="Tablaconcuadrcula"/>
-        <w:tblW w:w="0" w:type="auto"/>
-        <w:tblInd w:w="4253" w:type="dxa"/>
-        <w:tblBorders>
-          <w:top w:val="none" w:sz="0" w:space="0" w:color="auto"/>
-          <w:left w:val="none" w:sz="0" w:space="0" w:color="auto"/>
-          <w:bottom w:val="none" w:sz="0" w:space="0" w:color="auto"/>
-          <w:right w:val="none" w:sz="0" w:space="0" w:color="auto"/>
-          <w:insideH w:val="single" w:sz="4" w:space="0" w:color="auto"/>
-          <w:insideV w:val="none" w:sz="0" w:space="0" w:color="auto"/>
-        </w:tblBorders>
-        <w:tblLook w:val="04A0" w:firstRow="1" w:lastRow="0" w:firstColumn="1" w:lastColumn="0" w:noHBand="0" w:noVBand="1"/>
-      </w:tblPr>
-      <w:tblGrid>
-        <w:gridCol w:w="4506"/>
-      </w:tblGrid>
-      <w:tr>
-        <w:tc>
-          <w:tcPr>
-            <w:tcW w:w="4585" w:type="dxa"/>
-            <w:tcMar>
-              <w:left w:w="0" w:type="dxa"/>
-              <w:right w:w="0" w:type="dxa"/>
-            </w:tcMar>
-            <w:vAlign w:val="center"/>
-          </w:tcPr>
-          <w:p>
-            <w:pPr>
-              <w:rPr>
-                <w:b/>
-              </w:rPr>
-            </w:pPr>
-          </w:p>
-        </w:tc>
-      </w:tr>
-      <w:tr>
-        <w:tc>
-          <w:tcPr>
-            <w:tcW w:w="4585" w:type="dxa"/>
-            <w:tcMar>
-              <w:left w:w="0" w:type="dxa"/>
-              <w:right w:w="0" w:type="dxa"/>
-            </w:tcMar>
-            <w:vAlign w:val="center"/>
-          </w:tcPr>
-          <w:p>
-            <w:r>
-              <w:rPr>
-                <w:b/>
-              </w:rPr>
-              <w:t>Jurado</w:t>
-            </w:r>
-          </w:p>
-        </w:tc>
-      </w:tr>
-    </w:tbl>
-    <w:p>
-      <w:pPr>
-        <w:ind w:left="4253"/>
-      </w:pPr>
-    </w:p>
-    <w:p>
-      <w:pPr>
-        <w:ind w:left="4253"/>
-      </w:pPr>
-    </w:p>
-    <w:p>
-      <w:pPr>
-        <w:ind w:left="4253"/>
-      </w:pPr>
-    </w:p>
-    <w:p/>
-    <w:p>
-      <w:pPr>
-        <w:rPr>
-          <w:rFonts w:cs="Arial"/>
-          <w:i/>
-        </w:rPr>
-      </w:pPr>
-      <w:r>
-        <w:rPr>
-          <w:b/>
-        </w:rPr>
-        <w:t>Santa Marta, ____ de ____del ________</w:t>
-      </w:r>
-    </w:p>
-    <w:p>
-      <w:pPr>
-        <w:pStyle w:val="Prrafodelista"/>
-        <w:rPr>
-          <w:rFonts w:cs="Arial"/>
-          <w:i/>
-          <w:szCs w:val="22"/>
-          <w:lang w:val="es-CO"/>
-        </w:rPr>
-      </w:pPr>
-    </w:p>
-    <w:p>
-      <w:pPr>
-        <w:pStyle w:val="Prrafodelista"/>
-        <w:rPr>
-          <w:rFonts w:cs="Arial"/>
-          <w:i/>
-          <w:szCs w:val="22"/>
-        </w:rPr>
-      </w:pPr>
-    </w:p>
-    <w:p>
-      <w:pPr>
-        <w:pStyle w:val="Prrafodelista"/>
-        <w:rPr>
-          <w:rFonts w:cs="Arial"/>
-          <w:i/>
-          <w:szCs w:val="22"/>
-        </w:rPr>
-      </w:pPr>
-    </w:p>
-    <w:p>
-      <w:pPr>
-        <w:pStyle w:val="Prrafodelista"/>
-        <w:rPr>
-          <w:rFonts w:cs="Arial"/>
-          <w:i/>
-          <w:szCs w:val="22"/>
-        </w:rPr>
-      </w:pPr>
-    </w:p>
-    <w:p>
-      <w:pPr>
-        <w:pStyle w:val="Prrafodelista"/>
-        <w:rPr>
-          <w:rFonts w:cs="Arial"/>
-          <w:i/>
-          <w:szCs w:val="22"/>
-        </w:rPr>
-      </w:pPr>
-    </w:p>
-    <w:p>
-      <w:pPr>
-        <w:pStyle w:val="Prrafodelista"/>
-        <w:rPr>
-          <w:rFonts w:cs="Arial"/>
-          <w:i/>
-          <w:szCs w:val="22"/>
-        </w:rPr>
-      </w:pPr>
-      <w:r>
-        <w:rPr>
-          <w:rFonts w:cs="Arial"/>
-          <w:i/>
-          <w:szCs w:val="22"/>
-        </w:rPr>
-      </w:r>
-    </w:p>
-    <w:p>
-      <w:pPr>
         <w:pStyle w:val="Ttulosposteriores"/>
         <w:jc w:val="left"/>
       </w:pPr>
@@ -1233,7 +884,7 @@
         <w:rPr>
           <w:rFonts w:cs="Arial"/>
         </w:rPr>
-        <w:t>[PENDIENTE: agradecimientos (opcional)]</w:t>
+        <w:t>Agradezco a la Universidad del Magdalena y al Programa de Ingeniería de Sistemas por el marco académico en el que se desarrolló este trabajo. A Idanis Beatriz Diaz Bolaño, directora, y a Aquiles Alfonso Cohen Llanes, codirector, les expreso mi agradecimiento por la orientación académica del proyecto.</w:t>
       </w:r>
     </w:p>
     <w:p>
@@ -1277,7 +928,7 @@
           <w:rFonts w:cs="Arial"/>
         </w:rPr>
         <w:sectPr>
-          <w:type w:val="oddPage"/>
+          <w:type w:val="nextPage"/>
           <w:pgSz w:w="12240" w:h="15840" w:code="1"/>
           <w:pgMar w:top="1440" w:right="1440" w:bottom="1440" w:left="2041" w:header="709" w:footer="709" w:gutter="0"/>
           <w:pgNumType w:fmt="upperRoman"/>
@@ -1417,7 +1068,7 @@
           <w:footerReference w:type="even" r:id="rId52"/>
           <w:headerReference w:type="first" r:id="rId15"/>
           <w:footerReference w:type="default" r:id="rId52"/>
-          <w:type w:val="oddPage"/>
+          <w:type w:val="nextPage"/>
           <w:pgSz w:w="12240" w:h="15840" w:code="1"/>
           <w:pgMar w:top="426" w:right="1467" w:bottom="1440" w:left="2041" w:header="709" w:footer="709" w:gutter="0"/>
           <w:pgNumType w:fmt="upperRoman"/>
@@ -1462,7 +1113,7 @@
         <w:tab/>
       </w:r>
       <w:r>
-        <w:t>V</w:t>
+        <w:t>IV</w:t>
       </w:r>
     </w:p>
     <w:p>
@@ -1479,7 +1130,7 @@
         <w:tab/>
       </w:r>
       <w:r>
-        <w:t>VI</w:t>
+        <w:t>V</w:t>
       </w:r>
     </w:p>
     <w:p>
@@ -1496,7 +1147,7 @@
         <w:tab/>
       </w:r>
       <w:r>
-        <w:t>VII</w:t>
+        <w:t>VI</w:t>
       </w:r>
     </w:p>
     <w:p>
@@ -1513,7 +1164,7 @@
         <w:tab/>
       </w:r>
       <w:r>
-        <w:t>IX</w:t>
+        <w:t>VIII</w:t>
       </w:r>
     </w:p>
     <w:p>
@@ -1530,7 +1181,7 @@
         <w:tab/>
       </w:r>
       <w:r>
-        <w:t>X</w:t>
+        <w:t>IX</w:t>
       </w:r>
     </w:p>
     <w:p>
@@ -1547,7 +1198,7 @@
         <w:tab/>
       </w:r>
       <w:r>
-        <w:t>XI</w:t>
+        <w:t>X</w:t>
       </w:r>
     </w:p>
     <w:p>
@@ -4067,7 +3718,7 @@
         <w:jc w:val="both"/>
       </w:pPr>
       <w:r>
-        <w:t>Estos antecedentes justifican una arquitectura que ejecute la inferencia localmente, limite la información anunciada y traduzca la caja detectada a una zona espacial comprensible. AssistiveVision adopta un modo manual bajo demanda y una localización bidimensional por zonas. El capítulo 4 explora la relación entre detección y distancia estimada; la validación con distancias medidas permanece pendiente.</w:t>
+        <w:t>Estos antecedentes justifican una arquitectura que ejecute la inferencia localmente, limite la información anunciada y traduzca la caja detectada a una zona espacial comprensible. AssistiveVision adopta un modo manual bajo demanda y una localización bidimensional por zonas. El capítulo 4 explora la relación entre detección y distancia estimada; el estudio no incluyó validación con distancias medidas.</w:t>
       </w:r>
     </w:p>
     <w:p>
@@ -15383,7 +15034,7 @@
                 <w:b w:val="0"/>
                 <w:sz w:val="20"/>
               </w:rPr>
-              <w:t>SpeechFormatter, AudioModule y catálogo de voces; claridad auditiva pendiente.</w:t>
+              <w:t>SpeechFormatter, AudioModule y catálogo de voces; claridad auditiva no evaluada.</w:t>
             </w:r>
           </w:p>
         </w:tc>

</xml_diff>

<commit_message>
Presenta AssistiveVision como sistema integrado en resumen abstract y conclusiones
</commit_message>
<xml_diff>
--- a/Documents/Informe_Final_Trabajo_de_Grado_AssistiveVision.docx
+++ b/Documents/Informe_Final_Trabajo_de_Grado_AssistiveVision.docx
@@ -975,7 +975,7 @@
         </w:rPr>
       </w:pPr>
       <w:r>
-        <w:t>Se desarrolló AssistiveVision, una aplicación Android que identifica diez clases de objetos y comunica su posición relativa mediante voz local en español e inglés. La selección inicial comparó seis configuraciones de detectores sobre 80 imágenes y 257 anotaciones; EfficientDet-Lite2 obtuvo AP50 de 0,648 y una latencia aislada de 124,9 ms en CPU de un Redmi Note 13. Para evaluar el montaje y el lente se construyó un segundo conjunto de 198 fotografías de iPhone, organizadas en 33 grupos de seis capturas sucesivas y corregidas manualmente hasta obtener 889 anotaciones. Las imágenes se reprodujeron con los módulos de producción de Android en un emulador Pixel 8, con confianza 0,30 e IoU mínimo 0,50. Gorillapod 0,5x produjo el mayor número de detecciones correctas (82), mientras el arnés de pecho 1x obtuvo la mayor F1 (61,9 %). La ventaja del Gorillapod sobre pecho 1x fue de 0,515 detecciones por escena, con IC bootstrap del 95 % de 0,121 a 0,939; frente a pecho 0,5x no quedó establecida. La profundidad se exploró mediante estimaciones geométricas, sin validar un rango operativo. Los resultados sustentan una selección provisional por cobertura y requieren confirmación con escenas nuevas, distancias medidas, el teléfono de destino y usuarios finales.</w:t>
+        <w:t xml:space="preserve">Se diseñó e implementó AssistiveVision, un sistema móvil Android orientado al apoyo de la percepción de entornos interiores para personas con discapacidad visual. Integra captura manual, preprocesamiento, detección de diez clases de objetos, selección configurable, localización relativa en seis zonas y descripción auditiva local en español e inglés. Su arquitectura modular incorpora CameraX, EfficientDet-Lite2 y síntesis de voz con sherpa-onnx; procesa y anuncia la escena bajo demanda, sin conexión a internet. El desarrollo comprendió revisión conceptual, selección del detector, integración y evaluación técnica. Se compararon seis configuraciones sobre 80 imágenes y 257 anotaciones; EfficientDet-Lite2 obtuvo AP50 de 0,648 y latencia aislada de 124,9 ms en CPU de Redmi Note 13. Se verificó la lógica con 34 pruebas JVM y se reprodujeron 198 fotografías mediante instrumentación Android en emulador Pixel 8. Las 889 anotaciones y 33 grupos permitieron comparar montajes y lentes: Gorillapod 0,5x alcanzó 82 detecciones correctas y pecho 1x, F1 de 61,9 %. También se analizaron tiempos de procesamiento, brillo, oclusión y distancia estimada. El resultado es un prototipo integrado y reproducible; la evaluación no mide comprensión auditiva, autonomía ni latencia completa hasta la voz.</w:t>
       </w:r>
     </w:p>
     <w:p>
@@ -1018,7 +1018,7 @@
         </w:rPr>
       </w:pPr>
       <w:r>
-        <w:t>AssistiveVision was developed as an Android application that identifies ten object classes and describes their relative position through offline speech in Spanish and English. An initial comparison of six detector configurations used 80 images and 257 annotations; EfficientDet-Lite2 achieved AP50 of 0.648 and isolated CPU latency of 124.9 ms on a Redmi Note 13. Mount and lens evaluation used a separate set of 198 iPhone photographs arranged in 33 successive six-capture groups, with 889 manually corrected annotations. Production Android preprocessing and detection modules replayed all photographs on a Pixel 8 emulator, using confidence 0.30 and minimum IoU 0.50. Gorillapod 0.5x produced the most correct detections (82), whereas chest harness 1x achieved the highest F1 (61.9%). Gorillapod exceeded chest 1x by 0.515 correct detections per scene, with a paired 95% bootstrap interval of 0.121 to 0.939; its advantage over chest 0.5x was not established. Geometric distance estimates supported an exploratory depth analysis rather than a validated operating range. The findings support a provisional coverage-based choice, subject to validation on new scenes, measured distances, the target phone and end users.</w:t>
+        <w:t xml:space="preserve">AssistiveVision was designed and implemented as an Android mobile system to support perception of indoor environments for people with visual impairments. It integrates manual capture, preprocessing, detection of ten object classes, configurable selection, relative localization in six image regions, and offline spoken descriptions in Spanish and English. Its modular architecture combines CameraX, EfficientDet-Lite2, and speech synthesis through sherpa-onnx to process and announce scenes on demand without internet connectivity. Development covered conceptual review, detector selection, integration, and technical evaluation. Six configurations were compared using 80 images and 257 annotations; EfficientDet-Lite2 achieved AP50 of 0.648 and isolated CPU latency of 124.9 ms on a Redmi Note 13. System logic was checked with 34 JVM tests, and Android instrumentation replayed 198 photographs on a Pixel 8 emulator. The 889 annotations and 33 capture groups supported mount and lens comparisons: Gorillapod 0.5x yielded 82 correct detections, while chest harness 1x achieved F1 of 61.9%. Processing times, digital brightness, occlusion, and estimated distance were also analyzed. The outcome is an integrated, reproducible prototype; evaluation does not measure speech comprehension, autonomy, or complete response latency through audio playback.</w:t>
       </w:r>
     </w:p>
     <w:p>
@@ -3461,16 +3461,16 @@
         <w:jc w:val="both"/>
       </w:pPr>
       <w:r>
-        <w:t xml:space="preserve">El resultado del proyecto es un prototipo funcional de bajo costo que demuestra la viabilidad de ejecutar un </w:t>
+        <w:t xml:space="preserve">El resultado del proyecto es un prototipo funcional que demuestra la viabilidad de ejecutar un </w:t>
       </w:r>
       <w:r>
         <w:rPr>
           <w:i/>
         </w:rPr>
-        <w:t>pipeline</w:t>
-      </w:r>
-      <w:r>
-        <w:t xml:space="preserve"> completo de detección, localización espacial y descripción auditiva de escenas interiores sobre un teléfono inteligente de gama media, sentando las bases para una ayuda técnica de apoyo a la percepción del entorno para personas con discapacidad visual. En el contexto institucional, este propósito se relaciona con los compromisos de la Universidad del Magdalena con la innovación tecnológica, la investigación y la inclusión, expresados en el Plan de Desarrollo UNIMAGDALENA Comprometida 2020-2030 </w:t>
+        <w:t xml:space="preserve">flujo inte</w:t>
+      </w:r>
+      <w:r>
+        <w:t xml:space="preserve">grado de captura, detección, selección de objetos, localización relativa y descripción auditiva de escenas interiores sobre un teléfono inteligente de gama media, sentando las bases para una ayuda técnica de apoyo a la percepción del entorno para personas con discapacidad visual. En el contexto institucional, este propósito se relaciona con los compromisos de la Universidad del Magdalena con la innovación tecnológica, la investigación y la inclusión, expresados en el Plan de Desarrollo UNIMAGDALENA Comprometida 2020-2030 </w:t>
       </w:r>
       <w:hyperlink w:anchor="bib_ref_11" w:history="1">
         <w:r>
@@ -10756,7 +10756,7 @@
         <w:jc w:val="both"/>
       </w:pPr>
       <w:r>
-        <w:t xml:space="preserve">YOLOv8s obtuvo el mayor mAP50-95 (0.514) del conjunto evaluado, representando la mejor localización espacial. Sin embargo, su latencia en Android CPU supera los 620 ms en todas sus variantes, equivalente a menos de 2 FPS, lo que lo hace inviable para tiempo real en el hardware objetivo.</w:t>
+        <w:t xml:space="preserve">YOLOv8s obtuvo el mayor mAP50-95 (0,514) del conjunto evaluado. Esta métrica combina coincidencia de clase y solapamiento de cajas; no mide directamente la exactitud de la zona anunciada. Su latencia aislada en Android CPU supera los 620 ms en ambas variantes, equivalente a menos de dos inferencias por segundo, lo que incrementa el costo temporal del componente de detección en el hardware evaluado.</w:t>
       </w:r>
     </w:p>
     <w:p>
@@ -10778,7 +10778,7 @@
         <w:jc w:val="both"/>
       </w:pPr>
       <w:r>
-        <w:t xml:space="preserve">EfficientDet-Lite2 presentó el mayor mAP50 del conjunto (0.648) y una latencia de 124.9 ms en Android CPU (8.00 FPS), posicionándose como el modelo más preciso en detección general dentro del umbral de rendimiento funcional.</w:t>
+        <w:t xml:space="preserve">EfficientDet-Lite2 presentó el mayor mAP50 del conjunto (0,648) y una latencia aislada de 124,9 ms en Android CPU (8,00 inferencias/s). Estos resultados sustentan la selección del componente de detección bajo las condiciones evaluadas; no representan la frecuencia del ciclo completo de captura y voz.</w:t>
       </w:r>
     </w:p>
     <w:p>
@@ -18550,7 +18550,7 @@
         <w:t>recall</w:t>
       </w:r>
       <w:r>
-        <w:t xml:space="preserve"> 52,4%, AP50-95 42,2%) y el máximo de objetos correctos es del Gorillapod 0,5x (82 de 174 instancias visibles). Como la cantidad de objetos anunciados es el objetivo para la utilidad del sistema, el análisis principal compara el Gorillapod 0,5x contra cada alternativa en los mismos 33 grupos de captura.</w:t>
+        <w:t xml:space="preserve"> 52,4%, AP50-95 42,2%) y el máximo de objetos correctos es del Gorillapod 0,5x (82 de 174 instancias visibles). Para explorar la cobertura de detección disponible antes del límite de anuncios, el análisis principal compara el Gorillapod 0,5x contra cada alternativa en los mismos 33 grupos de captura.</w:t>
       </w:r>
     </w:p>
     <w:p>
@@ -19565,7 +19565,7 @@
         <w:jc w:val="both"/>
       </w:pPr>
       <w:r>
-        <w:t>La elección definitiva depende del objetivo del sistema: para maximizar los objetos anunciados al usuario, el Gorillapod 0,5x es el candidato provisional; para maximizar el equilibrio precisión/</w:t>
+        <w:t xml:space="preserve">La elección definitiva depende del objetivo del sistema: para priorizar el número de detecciones correctas antes de limitar la salida de voz, el Gorillapod 0,5x es el candidato provisional; para maximizar el equilibrio precisión/</w:t>
       </w:r>
       <w:r>
         <w:rPr>
@@ -25053,7 +25053,7 @@
         <w:jc w:val="both"/>
       </w:pPr>
       <w:r>
-        <w:t xml:space="preserve">La comparación inicial sustentó la selección de EfficientDet-Lite2 para el Redmi Note 13: AP50 de 0,648, </w:t>
+        <w:t xml:space="preserve">Se desarrolló un sistema integrado de asistencia visual en Android que conecta captura bajo demanda, preprocesamiento, detección, selección configurable de objetos, localización relativa en seis zonas y descripción auditiva local en español e inglés. La arquitectura modular incorpora CameraX, EfficientDet-Lite2, geometría letterbox y síntesis de voz con sherpa-onnx. La selección del detector se sustentó en AP50 de 0,648, </w:t>
       </w:r>
       <w:r>
         <w:rPr>
@@ -25062,16 +25062,16 @@
         <w:t>recall</w:t>
       </w:r>
       <w:r>
-        <w:t xml:space="preserve"> de 0,677 y latencia aislada de 124,9 ms. La aplicación actual integra CameraX, LiteRT, geometría </w:t>
+        <w:t xml:space="preserve"> de 0,677 y latencia aislada de 124,9 ms</w:t>
       </w:r>
       <w:r>
         <w:rPr>
           <w:i/>
         </w:rPr>
-        <w:t>letterbox</w:t>
-      </w:r>
-      <w:r>
-        <w:t>, localización en seis zonas y síntesis de voz local con sherpa-onnx. Las pruebas de lógica y la reproducción Android respaldan la ejecución de los componentes; no constituyen validación con usuarios finales.</w:t>
+        <w:t xml:space="preserve"/>
+      </w:r>
+      <w:r>
+        <w:t xml:space="preserve"> en Redmi Note 13. Las 34 pruebas JVM y la reproducción instrumentada en Android respaldan la verificación técnica de componentes; no constituyen validación de comprensión auditiva ni de uso con personas con discapacidad visual.</w:t>
       </w:r>
     </w:p>
     <w:p>

</xml_diff>